<commit_message>
Reformat literature review: justified alignment, 1.5 line spacing
Co-Authored-By: Claude Fable 5 <noreply@anthropic.com>
Claude-Session: https://claude.ai/code/session_01UxjctmnUe9fGqd8WLWUStd
</commit_message>
<xml_diff>
--- a/seminar/סקירת ספרות - אבו קארם.docx
+++ b/seminar/סקירת ספרות - אבו קארם.docx
@@ -245,8 +245,8 @@
       <w:pPr>
         <w:pageBreakBefore/>
         <w:bidi/>
-        <w:spacing w:after="240" w:line="480" w:lineRule="auto"/>
-        <w:jc w:val="right"/>
+        <w:spacing w:after="240" w:line="360" w:lineRule="auto"/>
+        <w:jc w:val="both"/>
       </w:pPr>
       <w:r>
         <w:rPr>
@@ -265,8 +265,8 @@
     <w:p>
       <w:pPr>
         <w:bidi/>
-        <w:spacing w:after="120" w:line="480" w:lineRule="auto"/>
-        <w:jc w:val="right"/>
+        <w:spacing w:after="120" w:line="360" w:lineRule="auto"/>
+        <w:jc w:val="both"/>
       </w:pPr>
       <w:r>
         <w:rPr>
@@ -338,8 +338,8 @@
       <w:pPr>
         <w:pageBreakBefore/>
         <w:bidi/>
-        <w:spacing w:after="240" w:line="480" w:lineRule="auto"/>
-        <w:jc w:val="right"/>
+        <w:spacing w:after="240" w:line="360" w:lineRule="auto"/>
+        <w:jc w:val="both"/>
       </w:pPr>
       <w:r>
         <w:rPr>
@@ -358,8 +358,8 @@
     <w:p>
       <w:pPr>
         <w:bidi/>
-        <w:spacing w:after="180" w:line="480" w:lineRule="auto"/>
-        <w:jc w:val="right"/>
+        <w:spacing w:after="180" w:line="360" w:lineRule="auto"/>
+        <w:jc w:val="both"/>
       </w:pPr>
       <w:r>
         <w:rPr>
@@ -378,8 +378,8 @@
     <w:p>
       <w:pPr>
         <w:bidi/>
-        <w:spacing w:after="120" w:line="480" w:lineRule="auto"/>
-        <w:jc w:val="right"/>
+        <w:spacing w:after="120" w:line="360" w:lineRule="auto"/>
+        <w:jc w:val="both"/>
       </w:pPr>
       <w:r>
         <w:rPr>
@@ -398,8 +398,8 @@
     <w:p>
       <w:pPr>
         <w:bidi/>
-        <w:spacing w:after="180" w:line="480" w:lineRule="auto"/>
-        <w:jc w:val="right"/>
+        <w:spacing w:after="180" w:line="360" w:lineRule="auto"/>
+        <w:jc w:val="both"/>
       </w:pPr>
       <w:r>
         <w:rPr>
@@ -418,8 +418,8 @@
     <w:p>
       <w:pPr>
         <w:bidi/>
-        <w:spacing w:after="120" w:line="480" w:lineRule="auto"/>
-        <w:jc w:val="right"/>
+        <w:spacing w:after="120" w:line="360" w:lineRule="auto"/>
+        <w:jc w:val="both"/>
       </w:pPr>
       <w:r>
         <w:rPr>
@@ -477,8 +477,8 @@
     <w:p>
       <w:pPr>
         <w:bidi/>
-        <w:spacing w:after="180" w:line="480" w:lineRule="auto"/>
-        <w:jc w:val="right"/>
+        <w:spacing w:after="180" w:line="360" w:lineRule="auto"/>
+        <w:jc w:val="both"/>
       </w:pPr>
       <w:r>
         <w:rPr>
@@ -497,8 +497,8 @@
     <w:p>
       <w:pPr>
         <w:bidi/>
-        <w:spacing w:after="120" w:line="480" w:lineRule="auto"/>
-        <w:jc w:val="right"/>
+        <w:spacing w:after="120" w:line="360" w:lineRule="auto"/>
+        <w:jc w:val="both"/>
       </w:pPr>
       <w:r>
         <w:rPr>
@@ -583,8 +583,8 @@
       <w:pPr>
         <w:pageBreakBefore/>
         <w:bidi/>
-        <w:spacing w:after="240" w:line="480" w:lineRule="auto"/>
-        <w:jc w:val="right"/>
+        <w:spacing w:after="240" w:line="360" w:lineRule="auto"/>
+        <w:jc w:val="both"/>
       </w:pPr>
       <w:r>
         <w:rPr>
@@ -603,8 +603,8 @@
     <w:p>
       <w:pPr>
         <w:bidi/>
-        <w:spacing w:after="180" w:line="480" w:lineRule="auto"/>
-        <w:jc w:val="right"/>
+        <w:spacing w:after="180" w:line="360" w:lineRule="auto"/>
+        <w:jc w:val="both"/>
       </w:pPr>
       <w:r>
         <w:rPr>
@@ -623,8 +623,8 @@
     <w:p>
       <w:pPr>
         <w:bidi/>
-        <w:spacing w:after="120" w:line="480" w:lineRule="auto"/>
-        <w:jc w:val="right"/>
+        <w:spacing w:after="120" w:line="360" w:lineRule="auto"/>
+        <w:jc w:val="both"/>
       </w:pPr>
       <w:r>
         <w:rPr>
@@ -643,8 +643,8 @@
     <w:p>
       <w:pPr>
         <w:bidi/>
-        <w:spacing w:after="180" w:line="480" w:lineRule="auto"/>
-        <w:jc w:val="right"/>
+        <w:spacing w:after="180" w:line="360" w:lineRule="auto"/>
+        <w:jc w:val="both"/>
       </w:pPr>
       <w:r>
         <w:rPr>
@@ -663,8 +663,8 @@
     <w:p>
       <w:pPr>
         <w:bidi/>
-        <w:spacing w:after="120" w:line="480" w:lineRule="auto"/>
-        <w:jc w:val="right"/>
+        <w:spacing w:after="120" w:line="360" w:lineRule="auto"/>
+        <w:jc w:val="both"/>
       </w:pPr>
       <w:r>
         <w:rPr>
@@ -696,8 +696,8 @@
     <w:p>
       <w:pPr>
         <w:bidi/>
-        <w:spacing w:after="180" w:line="480" w:lineRule="auto"/>
-        <w:jc w:val="right"/>
+        <w:spacing w:after="180" w:line="360" w:lineRule="auto"/>
+        <w:jc w:val="both"/>
       </w:pPr>
       <w:r>
         <w:rPr>
@@ -755,8 +755,8 @@
     <w:p>
       <w:pPr>
         <w:bidi/>
-        <w:spacing w:after="120" w:line="480" w:lineRule="auto"/>
-        <w:jc w:val="right"/>
+        <w:spacing w:after="120" w:line="360" w:lineRule="auto"/>
+        <w:jc w:val="both"/>
       </w:pPr>
       <w:r>
         <w:rPr>
@@ -827,8 +827,8 @@
     <w:p>
       <w:pPr>
         <w:bidi/>
-        <w:spacing w:after="120" w:line="480" w:lineRule="auto"/>
-        <w:jc w:val="right"/>
+        <w:spacing w:after="120" w:line="360" w:lineRule="auto"/>
+        <w:jc w:val="both"/>
       </w:pPr>
       <w:r>
         <w:rPr>
@@ -1004,8 +1004,8 @@
       <w:pPr>
         <w:pageBreakBefore/>
         <w:bidi/>
-        <w:spacing w:after="240" w:line="480" w:lineRule="auto"/>
-        <w:jc w:val="right"/>
+        <w:spacing w:after="240" w:line="360" w:lineRule="auto"/>
+        <w:jc w:val="both"/>
       </w:pPr>
       <w:r>
         <w:rPr>
@@ -1024,8 +1024,8 @@
     <w:p>
       <w:pPr>
         <w:bidi/>
-        <w:spacing w:after="180" w:line="480" w:lineRule="auto"/>
-        <w:jc w:val="right"/>
+        <w:spacing w:after="180" w:line="360" w:lineRule="auto"/>
+        <w:jc w:val="both"/>
       </w:pPr>
       <w:r>
         <w:rPr>
@@ -1044,8 +1044,8 @@
     <w:p>
       <w:pPr>
         <w:bidi/>
-        <w:spacing w:after="120" w:line="480" w:lineRule="auto"/>
-        <w:jc w:val="right"/>
+        <w:spacing w:after="120" w:line="360" w:lineRule="auto"/>
+        <w:jc w:val="both"/>
       </w:pPr>
       <w:r>
         <w:rPr>
@@ -1155,8 +1155,8 @@
     <w:p>
       <w:pPr>
         <w:bidi/>
-        <w:spacing w:after="180" w:line="480" w:lineRule="auto"/>
-        <w:jc w:val="right"/>
+        <w:spacing w:after="180" w:line="360" w:lineRule="auto"/>
+        <w:jc w:val="both"/>
       </w:pPr>
       <w:r>
         <w:rPr>
@@ -1175,8 +1175,8 @@
     <w:p>
       <w:pPr>
         <w:bidi/>
-        <w:spacing w:after="120" w:line="480" w:lineRule="auto"/>
-        <w:jc w:val="right"/>
+        <w:spacing w:after="120" w:line="360" w:lineRule="auto"/>
+        <w:jc w:val="both"/>
       </w:pPr>
       <w:r>
         <w:rPr>
@@ -1260,8 +1260,8 @@
     <w:p>
       <w:pPr>
         <w:bidi/>
-        <w:spacing w:after="180" w:line="480" w:lineRule="auto"/>
-        <w:jc w:val="right"/>
+        <w:spacing w:after="180" w:line="360" w:lineRule="auto"/>
+        <w:jc w:val="both"/>
       </w:pPr>
       <w:r>
         <w:rPr>
@@ -1280,8 +1280,8 @@
     <w:p>
       <w:pPr>
         <w:bidi/>
-        <w:spacing w:after="120" w:line="480" w:lineRule="auto"/>
-        <w:jc w:val="right"/>
+        <w:spacing w:after="120" w:line="360" w:lineRule="auto"/>
+        <w:jc w:val="both"/>
       </w:pPr>
       <w:r>
         <w:rPr>
@@ -1352,8 +1352,8 @@
     <w:p>
       <w:pPr>
         <w:bidi/>
-        <w:spacing w:after="180" w:line="480" w:lineRule="auto"/>
-        <w:jc w:val="right"/>
+        <w:spacing w:after="180" w:line="360" w:lineRule="auto"/>
+        <w:jc w:val="both"/>
       </w:pPr>
       <w:r>
         <w:rPr>
@@ -1385,8 +1385,8 @@
     <w:p>
       <w:pPr>
         <w:bidi/>
-        <w:spacing w:after="120" w:line="480" w:lineRule="auto"/>
-        <w:jc w:val="right"/>
+        <w:spacing w:after="120" w:line="360" w:lineRule="auto"/>
+        <w:jc w:val="both"/>
       </w:pPr>
       <w:r>
         <w:rPr>
@@ -1471,8 +1471,8 @@
       <w:pPr>
         <w:pageBreakBefore/>
         <w:bidi/>
-        <w:spacing w:after="240" w:line="480" w:lineRule="auto"/>
-        <w:jc w:val="right"/>
+        <w:spacing w:after="240" w:line="360" w:lineRule="auto"/>
+        <w:jc w:val="both"/>
       </w:pPr>
       <w:r>
         <w:rPr>
@@ -1491,8 +1491,8 @@
     <w:p>
       <w:pPr>
         <w:bidi/>
-        <w:spacing w:after="180" w:line="480" w:lineRule="auto"/>
-        <w:jc w:val="right"/>
+        <w:spacing w:after="180" w:line="360" w:lineRule="auto"/>
+        <w:jc w:val="both"/>
       </w:pPr>
       <w:r>
         <w:rPr>
@@ -1511,8 +1511,8 @@
     <w:p>
       <w:pPr>
         <w:bidi/>
-        <w:spacing w:after="120" w:line="480" w:lineRule="auto"/>
-        <w:jc w:val="right"/>
+        <w:spacing w:after="120" w:line="360" w:lineRule="auto"/>
+        <w:jc w:val="both"/>
       </w:pPr>
       <w:r>
         <w:rPr>
@@ -1570,8 +1570,8 @@
     <w:p>
       <w:pPr>
         <w:bidi/>
-        <w:spacing w:after="180" w:line="480" w:lineRule="auto"/>
-        <w:jc w:val="right"/>
+        <w:spacing w:after="180" w:line="360" w:lineRule="auto"/>
+        <w:jc w:val="both"/>
       </w:pPr>
       <w:r>
         <w:rPr>
@@ -1590,8 +1590,8 @@
     <w:p>
       <w:pPr>
         <w:bidi/>
-        <w:spacing w:after="120" w:line="480" w:lineRule="auto"/>
-        <w:jc w:val="right"/>
+        <w:spacing w:after="120" w:line="360" w:lineRule="auto"/>
+        <w:jc w:val="both"/>
       </w:pPr>
       <w:r>
         <w:rPr>
@@ -1636,8 +1636,8 @@
     <w:p>
       <w:pPr>
         <w:bidi/>
-        <w:spacing w:after="180" w:line="480" w:lineRule="auto"/>
-        <w:jc w:val="right"/>
+        <w:spacing w:after="180" w:line="360" w:lineRule="auto"/>
+        <w:jc w:val="both"/>
       </w:pPr>
       <w:r>
         <w:rPr>
@@ -1656,8 +1656,8 @@
     <w:p>
       <w:pPr>
         <w:bidi/>
-        <w:spacing w:after="120" w:line="480" w:lineRule="auto"/>
-        <w:jc w:val="right"/>
+        <w:spacing w:after="120" w:line="360" w:lineRule="auto"/>
+        <w:jc w:val="both"/>
       </w:pPr>
       <w:r>
         <w:rPr>
@@ -1742,8 +1742,8 @@
       <w:pPr>
         <w:pageBreakBefore/>
         <w:bidi/>
-        <w:spacing w:after="240" w:line="480" w:lineRule="auto"/>
-        <w:jc w:val="right"/>
+        <w:spacing w:after="240" w:line="360" w:lineRule="auto"/>
+        <w:jc w:val="both"/>
       </w:pPr>
       <w:r>
         <w:rPr>
@@ -1762,8 +1762,8 @@
     <w:p>
       <w:pPr>
         <w:bidi/>
-        <w:spacing w:after="180" w:line="480" w:lineRule="auto"/>
-        <w:jc w:val="right"/>
+        <w:spacing w:after="180" w:line="360" w:lineRule="auto"/>
+        <w:jc w:val="both"/>
       </w:pPr>
       <w:r>
         <w:rPr>
@@ -1782,8 +1782,8 @@
     <w:p>
       <w:pPr>
         <w:bidi/>
-        <w:spacing w:after="120" w:line="480" w:lineRule="auto"/>
-        <w:jc w:val="right"/>
+        <w:spacing w:after="120" w:line="360" w:lineRule="auto"/>
+        <w:jc w:val="both"/>
       </w:pPr>
       <w:r>
         <w:rPr>
@@ -1841,8 +1841,8 @@
     <w:p>
       <w:pPr>
         <w:bidi/>
-        <w:spacing w:after="180" w:line="480" w:lineRule="auto"/>
-        <w:jc w:val="right"/>
+        <w:spacing w:after="180" w:line="360" w:lineRule="auto"/>
+        <w:jc w:val="both"/>
       </w:pPr>
       <w:r>
         <w:rPr>
@@ -1861,8 +1861,8 @@
     <w:p>
       <w:pPr>
         <w:bidi/>
-        <w:spacing w:after="120" w:line="480" w:lineRule="auto"/>
-        <w:jc w:val="right"/>
+        <w:spacing w:after="120" w:line="360" w:lineRule="auto"/>
+        <w:jc w:val="both"/>
       </w:pPr>
       <w:r>
         <w:rPr>
@@ -1920,8 +1920,8 @@
     <w:p>
       <w:pPr>
         <w:bidi/>
-        <w:spacing w:after="180" w:line="480" w:lineRule="auto"/>
-        <w:jc w:val="right"/>
+        <w:spacing w:after="180" w:line="360" w:lineRule="auto"/>
+        <w:jc w:val="both"/>
       </w:pPr>
       <w:r>
         <w:rPr>
@@ -1940,8 +1940,8 @@
     <w:p>
       <w:pPr>
         <w:bidi/>
-        <w:spacing w:after="120" w:line="480" w:lineRule="auto"/>
-        <w:jc w:val="right"/>
+        <w:spacing w:after="120" w:line="360" w:lineRule="auto"/>
+        <w:jc w:val="both"/>
       </w:pPr>
       <w:r>
         <w:rPr>
@@ -2025,8 +2025,8 @@
     <w:p>
       <w:pPr>
         <w:bidi/>
-        <w:spacing w:after="180" w:line="480" w:lineRule="auto"/>
-        <w:jc w:val="right"/>
+        <w:spacing w:after="180" w:line="360" w:lineRule="auto"/>
+        <w:jc w:val="both"/>
       </w:pPr>
       <w:r>
         <w:rPr>
@@ -2045,8 +2045,8 @@
     <w:p>
       <w:pPr>
         <w:bidi/>
-        <w:spacing w:after="120" w:line="480" w:lineRule="auto"/>
-        <w:jc w:val="right"/>
+        <w:spacing w:after="120" w:line="360" w:lineRule="auto"/>
+        <w:jc w:val="both"/>
       </w:pPr>
       <w:r>
         <w:rPr>
@@ -2131,8 +2131,8 @@
       <w:pPr>
         <w:pageBreakBefore/>
         <w:bidi/>
-        <w:spacing w:after="240" w:line="480" w:lineRule="auto"/>
-        <w:jc w:val="right"/>
+        <w:spacing w:after="240" w:line="360" w:lineRule="auto"/>
+        <w:jc w:val="both"/>
       </w:pPr>
       <w:r>
         <w:rPr>
@@ -2151,8 +2151,8 @@
     <w:p>
       <w:pPr>
         <w:bidi/>
-        <w:spacing w:after="180" w:line="480" w:lineRule="auto"/>
-        <w:jc w:val="right"/>
+        <w:spacing w:after="180" w:line="360" w:lineRule="auto"/>
+        <w:jc w:val="both"/>
       </w:pPr>
       <w:r>
         <w:rPr>
@@ -2171,8 +2171,8 @@
     <w:p>
       <w:pPr>
         <w:bidi/>
-        <w:spacing w:after="120" w:line="480" w:lineRule="auto"/>
-        <w:jc w:val="right"/>
+        <w:spacing w:after="120" w:line="360" w:lineRule="auto"/>
+        <w:jc w:val="both"/>
       </w:pPr>
       <w:r>
         <w:rPr>
@@ -2243,8 +2243,8 @@
     <w:p>
       <w:pPr>
         <w:bidi/>
-        <w:spacing w:after="180" w:line="480" w:lineRule="auto"/>
-        <w:jc w:val="right"/>
+        <w:spacing w:after="180" w:line="360" w:lineRule="auto"/>
+        <w:jc w:val="both"/>
       </w:pPr>
       <w:r>
         <w:rPr>
@@ -2276,8 +2276,8 @@
     <w:p>
       <w:pPr>
         <w:bidi/>
-        <w:spacing w:after="120" w:line="480" w:lineRule="auto"/>
-        <w:jc w:val="right"/>
+        <w:spacing w:after="120" w:line="360" w:lineRule="auto"/>
+        <w:jc w:val="both"/>
       </w:pPr>
       <w:r>
         <w:rPr>
@@ -2387,8 +2387,8 @@
     <w:p>
       <w:pPr>
         <w:bidi/>
-        <w:spacing w:after="180" w:line="480" w:lineRule="auto"/>
-        <w:jc w:val="right"/>
+        <w:spacing w:after="180" w:line="360" w:lineRule="auto"/>
+        <w:jc w:val="both"/>
       </w:pPr>
       <w:r>
         <w:rPr>
@@ -2433,8 +2433,8 @@
     <w:p>
       <w:pPr>
         <w:bidi/>
-        <w:spacing w:after="120" w:line="480" w:lineRule="auto"/>
-        <w:jc w:val="right"/>
+        <w:spacing w:after="120" w:line="360" w:lineRule="auto"/>
+        <w:jc w:val="both"/>
       </w:pPr>
       <w:r>
         <w:rPr>
@@ -2570,8 +2570,8 @@
     <w:p>
       <w:pPr>
         <w:bidi/>
-        <w:spacing w:after="180" w:line="480" w:lineRule="auto"/>
-        <w:jc w:val="right"/>
+        <w:spacing w:after="180" w:line="360" w:lineRule="auto"/>
+        <w:jc w:val="both"/>
       </w:pPr>
       <w:r>
         <w:rPr>
@@ -2590,8 +2590,8 @@
     <w:p>
       <w:pPr>
         <w:bidi/>
-        <w:spacing w:after="120" w:line="480" w:lineRule="auto"/>
-        <w:jc w:val="right"/>
+        <w:spacing w:after="120" w:line="360" w:lineRule="auto"/>
+        <w:jc w:val="both"/>
       </w:pPr>
       <w:r>
         <w:rPr>
@@ -2636,8 +2636,8 @@
     <w:p>
       <w:pPr>
         <w:bidi/>
-        <w:spacing w:after="120" w:line="480" w:lineRule="auto"/>
-        <w:jc w:val="right"/>
+        <w:spacing w:after="120" w:line="360" w:lineRule="auto"/>
+        <w:jc w:val="both"/>
       </w:pPr>
       <w:r>
         <w:rPr>
@@ -2722,8 +2722,8 @@
       <w:pPr>
         <w:pageBreakBefore/>
         <w:bidi/>
-        <w:spacing w:after="240" w:line="480" w:lineRule="auto"/>
-        <w:jc w:val="right"/>
+        <w:spacing w:after="240" w:line="360" w:lineRule="auto"/>
+        <w:jc w:val="both"/>
       </w:pPr>
       <w:r>
         <w:rPr>
@@ -2742,8 +2742,8 @@
     <w:p>
       <w:pPr>
         <w:bidi/>
-        <w:spacing w:after="180" w:line="480" w:lineRule="auto"/>
-        <w:jc w:val="right"/>
+        <w:spacing w:after="180" w:line="360" w:lineRule="auto"/>
+        <w:jc w:val="both"/>
       </w:pPr>
       <w:r>
         <w:rPr>
@@ -2762,8 +2762,8 @@
     <w:p>
       <w:pPr>
         <w:bidi/>
-        <w:spacing w:after="120" w:line="480" w:lineRule="auto"/>
-        <w:jc w:val="right"/>
+        <w:spacing w:after="120" w:line="360" w:lineRule="auto"/>
+        <w:jc w:val="both"/>
       </w:pPr>
       <w:r>
         <w:rPr>
@@ -2795,8 +2795,8 @@
     <w:p>
       <w:pPr>
         <w:bidi/>
-        <w:spacing w:after="180" w:line="480" w:lineRule="auto"/>
-        <w:jc w:val="right"/>
+        <w:spacing w:after="180" w:line="360" w:lineRule="auto"/>
+        <w:jc w:val="both"/>
       </w:pPr>
       <w:r>
         <w:rPr>
@@ -2815,8 +2815,8 @@
     <w:p>
       <w:pPr>
         <w:bidi/>
-        <w:spacing w:after="120" w:line="480" w:lineRule="auto"/>
-        <w:jc w:val="right"/>
+        <w:spacing w:after="120" w:line="360" w:lineRule="auto"/>
+        <w:jc w:val="both"/>
       </w:pPr>
       <w:r>
         <w:rPr>
@@ -2861,8 +2861,8 @@
     <w:p>
       <w:pPr>
         <w:bidi/>
-        <w:spacing w:after="180" w:line="480" w:lineRule="auto"/>
-        <w:jc w:val="right"/>
+        <w:spacing w:after="180" w:line="360" w:lineRule="auto"/>
+        <w:jc w:val="both"/>
       </w:pPr>
       <w:r>
         <w:rPr>
@@ -2881,8 +2881,8 @@
     <w:p>
       <w:pPr>
         <w:bidi/>
-        <w:spacing w:after="120" w:line="480" w:lineRule="auto"/>
-        <w:jc w:val="right"/>
+        <w:spacing w:after="120" w:line="360" w:lineRule="auto"/>
+        <w:jc w:val="both"/>
       </w:pPr>
       <w:r>
         <w:rPr>
@@ -2967,8 +2967,8 @@
       <w:pPr>
         <w:pageBreakBefore/>
         <w:bidi/>
-        <w:spacing w:after="240" w:line="480" w:lineRule="auto"/>
-        <w:jc w:val="right"/>
+        <w:spacing w:after="240" w:line="360" w:lineRule="auto"/>
+        <w:jc w:val="both"/>
       </w:pPr>
       <w:r>
         <w:rPr>
@@ -2987,8 +2987,8 @@
     <w:p>
       <w:pPr>
         <w:bidi/>
-        <w:spacing w:after="120" w:line="480" w:lineRule="auto"/>
-        <w:jc w:val="right"/>
+        <w:spacing w:after="120" w:line="360" w:lineRule="auto"/>
+        <w:jc w:val="both"/>
       </w:pPr>
       <w:r>
         <w:rPr>
@@ -3033,8 +3033,8 @@
     <w:p>
       <w:pPr>
         <w:bidi/>
-        <w:spacing w:after="120" w:line="480" w:lineRule="auto"/>
-        <w:jc w:val="right"/>
+        <w:spacing w:after="120" w:line="360" w:lineRule="auto"/>
+        <w:jc w:val="both"/>
       </w:pPr>
       <w:r>
         <w:rPr>
@@ -3158,8 +3158,8 @@
       <w:pPr>
         <w:pageBreakBefore/>
         <w:bidi/>
-        <w:spacing w:after="240" w:line="480" w:lineRule="auto"/>
-        <w:jc w:val="right"/>
+        <w:spacing w:after="240" w:line="360" w:lineRule="auto"/>
+        <w:jc w:val="both"/>
       </w:pPr>
       <w:r>
         <w:rPr>
@@ -3178,9 +3178,9 @@
     <w:p>
       <w:pPr>
         <w:bidi/>
-        <w:spacing w:after="120" w:line="480" w:lineRule="auto"/>
+        <w:spacing w:after="120" w:line="360" w:lineRule="auto"/>
         <w:ind w:start="709" w:hanging="709"/>
-        <w:jc w:val="right"/>
+        <w:jc w:val="both"/>
       </w:pPr>
       <w:r>
         <w:rPr>
@@ -3251,9 +3251,9 @@
     <w:p>
       <w:pPr>
         <w:bidi/>
-        <w:spacing w:after="120" w:line="480" w:lineRule="auto"/>
+        <w:spacing w:after="120" w:line="360" w:lineRule="auto"/>
         <w:ind w:start="709" w:hanging="709"/>
-        <w:jc w:val="right"/>
+        <w:jc w:val="both"/>
       </w:pPr>
       <w:r>
         <w:rPr>
@@ -3298,9 +3298,9 @@
     <w:p>
       <w:pPr>
         <w:bidi/>
-        <w:spacing w:after="120" w:line="480" w:lineRule="auto"/>
+        <w:spacing w:after="120" w:line="360" w:lineRule="auto"/>
         <w:ind w:start="709" w:hanging="709"/>
-        <w:jc w:val="right"/>
+        <w:jc w:val="both"/>
       </w:pPr>
       <w:r>
         <w:rPr>
@@ -3319,9 +3319,9 @@
     <w:p>
       <w:pPr>
         <w:bidi/>
-        <w:spacing w:after="120" w:line="480" w:lineRule="auto"/>
+        <w:spacing w:after="120" w:line="360" w:lineRule="auto"/>
         <w:ind w:start="709" w:hanging="709"/>
-        <w:jc w:val="right"/>
+        <w:jc w:val="both"/>
       </w:pPr>
       <w:r>
         <w:rPr>
@@ -3366,9 +3366,9 @@
     <w:p>
       <w:pPr>
         <w:bidi/>
-        <w:spacing w:after="120" w:line="480" w:lineRule="auto"/>
+        <w:spacing w:after="120" w:line="360" w:lineRule="auto"/>
         <w:ind w:start="709" w:hanging="709"/>
-        <w:jc w:val="right"/>
+        <w:jc w:val="both"/>
       </w:pPr>
       <w:r>
         <w:rPr>
@@ -3413,9 +3413,9 @@
     <w:p>
       <w:pPr>
         <w:bidi/>
-        <w:spacing w:after="120" w:line="480" w:lineRule="auto"/>
+        <w:spacing w:after="120" w:line="360" w:lineRule="auto"/>
         <w:ind w:start="709" w:hanging="709"/>
-        <w:jc w:val="right"/>
+        <w:jc w:val="both"/>
       </w:pPr>
       <w:r>
         <w:rPr>
@@ -3460,9 +3460,9 @@
     <w:p>
       <w:pPr>
         <w:bidi/>
-        <w:spacing w:after="120" w:line="480" w:lineRule="auto"/>
+        <w:spacing w:after="120" w:line="360" w:lineRule="auto"/>
         <w:ind w:start="709" w:hanging="709"/>
-        <w:jc w:val="right"/>
+        <w:jc w:val="both"/>
       </w:pPr>
       <w:r>
         <w:rPr>
@@ -3507,9 +3507,9 @@
     <w:p>
       <w:pPr>
         <w:bidi w:val="false"/>
-        <w:spacing w:after="120" w:line="480" w:lineRule="auto"/>
+        <w:spacing w:after="120" w:line="360" w:lineRule="auto"/>
         <w:ind w:left="709" w:hanging="709"/>
-        <w:jc w:val="left"/>
+        <w:jc w:val="both"/>
       </w:pPr>
       <w:r>
         <w:rPr>
@@ -3554,9 +3554,9 @@
     <w:p>
       <w:pPr>
         <w:bidi w:val="false"/>
-        <w:spacing w:after="120" w:line="480" w:lineRule="auto"/>
+        <w:spacing w:after="120" w:line="360" w:lineRule="auto"/>
         <w:ind w:left="709" w:hanging="709"/>
-        <w:jc w:val="left"/>
+        <w:jc w:val="both"/>
       </w:pPr>
       <w:r>
         <w:rPr>
@@ -3601,9 +3601,9 @@
     <w:p>
       <w:pPr>
         <w:bidi w:val="false"/>
-        <w:spacing w:after="120" w:line="480" w:lineRule="auto"/>
+        <w:spacing w:after="120" w:line="360" w:lineRule="auto"/>
         <w:ind w:left="709" w:hanging="709"/>
-        <w:jc w:val="left"/>
+        <w:jc w:val="both"/>
       </w:pPr>
       <w:r>
         <w:rPr>
@@ -3648,9 +3648,9 @@
     <w:p>
       <w:pPr>
         <w:bidi w:val="false"/>
-        <w:spacing w:after="120" w:line="480" w:lineRule="auto"/>
+        <w:spacing w:after="120" w:line="360" w:lineRule="auto"/>
         <w:ind w:left="709" w:hanging="709"/>
-        <w:jc w:val="left"/>
+        <w:jc w:val="both"/>
       </w:pPr>
       <w:r>
         <w:rPr>
@@ -3695,9 +3695,9 @@
     <w:p>
       <w:pPr>
         <w:bidi w:val="false"/>
-        <w:spacing w:after="120" w:line="480" w:lineRule="auto"/>
+        <w:spacing w:after="120" w:line="360" w:lineRule="auto"/>
         <w:ind w:left="709" w:hanging="709"/>
-        <w:jc w:val="left"/>
+        <w:jc w:val="both"/>
       </w:pPr>
       <w:r>
         <w:rPr>
@@ -3742,9 +3742,9 @@
     <w:p>
       <w:pPr>
         <w:bidi w:val="false"/>
-        <w:spacing w:after="120" w:line="480" w:lineRule="auto"/>
+        <w:spacing w:after="120" w:line="360" w:lineRule="auto"/>
         <w:ind w:left="709" w:hanging="709"/>
-        <w:jc w:val="left"/>
+        <w:jc w:val="both"/>
       </w:pPr>
       <w:r>
         <w:rPr>
@@ -3789,9 +3789,9 @@
     <w:p>
       <w:pPr>
         <w:bidi w:val="false"/>
-        <w:spacing w:after="120" w:line="480" w:lineRule="auto"/>
+        <w:spacing w:after="120" w:line="360" w:lineRule="auto"/>
         <w:ind w:left="709" w:hanging="709"/>
-        <w:jc w:val="left"/>
+        <w:jc w:val="both"/>
       </w:pPr>
       <w:r>
         <w:rPr>
@@ -3836,9 +3836,9 @@
     <w:p>
       <w:pPr>
         <w:bidi w:val="false"/>
-        <w:spacing w:after="120" w:line="480" w:lineRule="auto"/>
+        <w:spacing w:after="120" w:line="360" w:lineRule="auto"/>
         <w:ind w:left="709" w:hanging="709"/>
-        <w:jc w:val="left"/>
+        <w:jc w:val="both"/>
       </w:pPr>
       <w:r>
         <w:rPr>
@@ -3883,9 +3883,9 @@
     <w:p>
       <w:pPr>
         <w:bidi w:val="false"/>
-        <w:spacing w:after="120" w:line="480" w:lineRule="auto"/>
+        <w:spacing w:after="120" w:line="360" w:lineRule="auto"/>
         <w:ind w:left="709" w:hanging="709"/>
-        <w:jc w:val="left"/>
+        <w:jc w:val="both"/>
       </w:pPr>
       <w:r>
         <w:rPr>
@@ -3930,9 +3930,9 @@
     <w:p>
       <w:pPr>
         <w:bidi w:val="false"/>
-        <w:spacing w:after="120" w:line="480" w:lineRule="auto"/>
+        <w:spacing w:after="120" w:line="360" w:lineRule="auto"/>
         <w:ind w:left="709" w:hanging="709"/>
-        <w:jc w:val="left"/>
+        <w:jc w:val="both"/>
       </w:pPr>
       <w:r>
         <w:rPr>
@@ -3977,9 +3977,9 @@
     <w:p>
       <w:pPr>
         <w:bidi w:val="false"/>
-        <w:spacing w:after="120" w:line="480" w:lineRule="auto"/>
+        <w:spacing w:after="120" w:line="360" w:lineRule="auto"/>
         <w:ind w:left="709" w:hanging="709"/>
-        <w:jc w:val="left"/>
+        <w:jc w:val="both"/>
       </w:pPr>
       <w:r>
         <w:rPr>
@@ -4024,9 +4024,9 @@
     <w:p>
       <w:pPr>
         <w:bidi w:val="false"/>
-        <w:spacing w:after="120" w:line="480" w:lineRule="auto"/>
+        <w:spacing w:after="120" w:line="360" w:lineRule="auto"/>
         <w:ind w:left="709" w:hanging="709"/>
-        <w:jc w:val="left"/>
+        <w:jc w:val="both"/>
       </w:pPr>
       <w:r>
         <w:rPr>
@@ -4071,9 +4071,9 @@
     <w:p>
       <w:pPr>
         <w:bidi w:val="false"/>
-        <w:spacing w:after="120" w:line="480" w:lineRule="auto"/>
+        <w:spacing w:after="120" w:line="360" w:lineRule="auto"/>
         <w:ind w:left="709" w:hanging="709"/>
-        <w:jc w:val="left"/>
+        <w:jc w:val="both"/>
       </w:pPr>
       <w:r>
         <w:rPr>
@@ -4118,9 +4118,9 @@
     <w:p>
       <w:pPr>
         <w:bidi w:val="false"/>
-        <w:spacing w:after="120" w:line="480" w:lineRule="auto"/>
+        <w:spacing w:after="120" w:line="360" w:lineRule="auto"/>
         <w:ind w:left="709" w:hanging="709"/>
-        <w:jc w:val="left"/>
+        <w:jc w:val="both"/>
       </w:pPr>
       <w:r>
         <w:rPr>
@@ -4165,9 +4165,9 @@
     <w:p>
       <w:pPr>
         <w:bidi w:val="false"/>
-        <w:spacing w:after="120" w:line="480" w:lineRule="auto"/>
+        <w:spacing w:after="120" w:line="360" w:lineRule="auto"/>
         <w:ind w:left="709" w:hanging="709"/>
-        <w:jc w:val="left"/>
+        <w:jc w:val="both"/>
       </w:pPr>
       <w:r>
         <w:rPr>
@@ -4212,9 +4212,9 @@
     <w:p>
       <w:pPr>
         <w:bidi w:val="false"/>
-        <w:spacing w:after="120" w:line="480" w:lineRule="auto"/>
+        <w:spacing w:after="120" w:line="360" w:lineRule="auto"/>
         <w:ind w:left="709" w:hanging="709"/>
-        <w:jc w:val="left"/>
+        <w:jc w:val="both"/>
       </w:pPr>
       <w:r>
         <w:rPr>
@@ -4259,9 +4259,9 @@
     <w:p>
       <w:pPr>
         <w:bidi w:val="false"/>
-        <w:spacing w:after="120" w:line="480" w:lineRule="auto"/>
+        <w:spacing w:after="120" w:line="360" w:lineRule="auto"/>
         <w:ind w:left="709" w:hanging="709"/>
-        <w:jc w:val="left"/>
+        <w:jc w:val="both"/>
       </w:pPr>
       <w:r>
         <w:rPr>
@@ -4306,9 +4306,9 @@
     <w:p>
       <w:pPr>
         <w:bidi w:val="false"/>
-        <w:spacing w:after="120" w:line="480" w:lineRule="auto"/>
+        <w:spacing w:after="120" w:line="360" w:lineRule="auto"/>
         <w:ind w:left="709" w:hanging="709"/>
-        <w:jc w:val="left"/>
+        <w:jc w:val="both"/>
       </w:pPr>
       <w:r>
         <w:rPr>
@@ -4353,9 +4353,9 @@
     <w:p>
       <w:pPr>
         <w:bidi w:val="false"/>
-        <w:spacing w:after="120" w:line="480" w:lineRule="auto"/>
+        <w:spacing w:after="120" w:line="360" w:lineRule="auto"/>
         <w:ind w:left="709" w:hanging="709"/>
-        <w:jc w:val="left"/>
+        <w:jc w:val="both"/>
       </w:pPr>
       <w:r>
         <w:rPr>

</xml_diff>

<commit_message>
Expand literature review with detailed findings and model components
Roughly doubles each chapter: full TPACK/XK/SAMR component detail,
GenAI properties, coordination domain, Israeli regulation specifics,
AI literacy vs readiness distinction, CEFR curriculum context, young
learner acquisition, TAM/AIDUA stage-by-stage constructs, Israeli
AIDUA study findings, AI-anxiety dimensions, and a three-paragraph
research-gap closing chapter. Also keeps in-text citations unbroken
across line wraps (single LTR run + non-breaking spaces).

Co-Authored-By: Claude Fable 5 <noreply@anthropic.com>
Claude-Session: https://claude.ai/code/session_01UxjctmnUe9fGqd8WLWUStd
</commit_message>
<xml_diff>
--- a/seminar/סקירת ספרות - אבו קארם.docx
+++ b/seminar/סקירת ספרות - אבו קארם.docx
@@ -112,7 +112,7 @@
           <w:szCs w:val="30"/>
           <w:rtl/>
         </w:rPr>
-        <w:t xml:space="preserve">תפיסות ועמדות של מורי אנגלית כשפה זרה (</w:t>
+        <w:t xml:space="preserve">תפיסות ועמדות של מורי אנגלית כשפה זרה </w:t>
       </w:r>
       <w:r>
         <w:rPr>
@@ -125,7 +125,7 @@
           <w:szCs w:val="30"/>
           <w:rtl w:val="false"/>
         </w:rPr>
-        <w:t xml:space="preserve">EFL) </w:t>
+        <w:t xml:space="preserve">(EFL) </w:t>
       </w:r>
       <w:r>
         <w:rPr>
@@ -305,20 +305,20 @@
           <w:szCs w:val="24"/>
           <w:rtl/>
         </w:rPr>
-        <w:t xml:space="preserve">נכנסו בשנים האחרונות אל שגרת העבודה של מורים בישראל ובעולם, ומערכת החינוך נדרשת להחליט כיצד לשלבם בהוראה ובלמידה (דשן ואחרים, 2026; משרד החינוך, 2025). הוראת האנגלית כשפה זרה היא זירה מעניינת במיוחד לבחינת השאלה הזו, משום שמדובר בטכנולוגיה שמייצרת שפה, כלומר בכלי הפועל בליבת התחום הנלמד עצמו (</w:t>
-      </w:r>
-      <w:r>
-        <w:rPr>
-          <w:rFonts w:ascii="Times New Roman" w:cs="Times New Roman" w:hAnsi="Times New Roman"/>
-          <w:b w:val="false"/>
-          <w:bCs w:val="false"/>
-          <w:i w:val="false"/>
-          <w:iCs w:val="false"/>
-          <w:sz w:val="24"/>
-          <w:szCs w:val="24"/>
-          <w:rtl w:val="false"/>
-        </w:rPr>
-        <w:t xml:space="preserve">Kohnke et al., 2023). </w:t>
+        <w:t xml:space="preserve">נכנסו בשנים האחרונות אל שגרת העבודה של מורים בישראל ובעולם, ומערכת החינוך נדרשת להחליט כיצד לשלבם בהוראה ובלמידה (דשן ואחרים, 2026; משרד החינוך, 2025). הוראת האנגלית כשפה זרה היא זירה מעניינת במיוחד לבחינת השאלה הזו, משום שמדובר בטכנולוגיה שמייצרת שפה, כלומר בכלי הפועל בליבת התחום הנלמד עצמו </w:t>
+      </w:r>
+      <w:r>
+        <w:rPr>
+          <w:rFonts w:ascii="Times New Roman" w:cs="Times New Roman" w:hAnsi="Times New Roman"/>
+          <w:b w:val="false"/>
+          <w:bCs w:val="false"/>
+          <w:i w:val="false"/>
+          <w:iCs w:val="false"/>
+          <w:sz w:val="24"/>
+          <w:szCs w:val="24"/>
+          <w:rtl w:val="false"/>
+        </w:rPr>
+        <w:t xml:space="preserve">(Kohnke et al., 2023). </w:t>
       </w:r>
       <w:r>
         <w:rPr>
@@ -392,7 +392,40 @@
           <w:szCs w:val="24"/>
           <w:rtl/>
         </w:rPr>
-        <w:t xml:space="preserve">פדגוגיה חדשנית מתוארת בספרות המקצועית כתפיסת חינוך הוליסטית, שבמרכזה שלושה עקרונות: פרט, רציפות והתאמה לתקופה. עקרון הפרט משמעו התאמת הלמידה ליכולותיו ולרצונותיו של הלומד, כך שהלומד מוביל את הלמידה ולוקח עליה אחריות. עקרון הרציפות מתייחס לרציפות של זמן ומקום, לרציפות בין-תחומית ולמעגלי למידה המתרחבים מן הפרט אל הקהילה. עקרון ההתאמה לתקופה נוגע לעדכון מתמיד של התכנים ושל הכלים, מתוך תפיסה הומניסטית השואפת ללמידה איכותית (לוי עצמון, 2024).</w:t>
+        <w:t xml:space="preserve">פדגוגיה חדשנית מתוארת בספרות המקצועית כתפיסת חינוך הוליסטית והומניסטית, שבמרכזה שלושה עקרונות: פרט, רציפות והתאמה לתקופה. עקרון הפרט משמעו התאמת הלמידה ליכולותיו, לצרכיו ולרצונותיו של הלומד, כך שהלומד מוביל את הלמידה של עצמו ולוקח עליה אחריות, בניגוד להוראה אחידה שבה כל הלומדים מתקדמים באותו קצב ובאותו מסלול. עקרון הרציפות מתייחס לרציפות של זמן ומקום, כלומר למידה שאינה מוגבלת לשיעור ולכיתה, לרציפות בין-תחומית המחברת בין תחומי דעת, ולמעגלי למידה המתרחבים מן הפרט אל הקבוצה ואל הקהילה. עקרון ההתאמה לתקופה נוגע לעדכון מתמיד של תוכני הלימוד ושל כלי ההוראה, כך שהלמידה תישאר רלוונטית לעולם שבו הלומד חי (לוי עצמון, 2024).</w:t>
+      </w:r>
+    </w:p>
+    <w:p>
+      <w:pPr>
+        <w:bidi/>
+        <w:spacing w:after="120" w:line="360" w:lineRule="auto"/>
+        <w:jc w:val="both"/>
+      </w:pPr>
+      <w:r>
+        <w:rPr>
+          <w:rFonts w:ascii="David" w:cs="David" w:hAnsi="David"/>
+          <w:b w:val="false"/>
+          <w:bCs w:val="false"/>
+          <w:i w:val="false"/>
+          <w:iCs w:val="false"/>
+          <w:sz w:val="24"/>
+          <w:szCs w:val="24"/>
+          <w:rtl/>
+        </w:rPr>
+        <w:t xml:space="preserve">היעד של תפיסה זו איננו שליטה בחומר בלבד אלא למידה איכותית: למידה פעילה ומשמעותית, שבה הלומד בונה ידע, מפתח הבנה עמוקה וחווה שייכות ומסוגלות (לוי עצמון, 2024). הגדרה זו של פדגוגיה חדשנית תשמש בסיס להמשך הסקירה, שכן שאלת שילובן של טכנולוגיות בכלל ושל בינה מלאכותית בפרט נבחנת בספרות תמיד ביחס לפדגוגיה שהטכנולוגיה אמורה לשרת </w:t>
+      </w:r>
+      <w:r>
+        <w:rPr>
+          <w:rFonts w:ascii="Times New Roman" w:cs="Times New Roman" w:hAnsi="Times New Roman"/>
+          <w:b w:val="false"/>
+          <w:bCs w:val="false"/>
+          <w:i w:val="false"/>
+          <w:iCs w:val="false"/>
+          <w:sz w:val="24"/>
+          <w:szCs w:val="24"/>
+          <w:rtl w:val="false"/>
+        </w:rPr>
+        <w:t xml:space="preserve">(Prensky, 2008).</w:t>
       </w:r>
     </w:p>
     <w:p>
@@ -432,46 +465,118 @@
           <w:szCs w:val="24"/>
           <w:rtl/>
         </w:rPr>
-        <w:t xml:space="preserve">הרחבה של אותה תפיסה מוצעת במסגרת הפדגוגיה מוטת העתיד של משרד החינוך. זוהי פדגוגיה הנגזרת מניתוח מגמות חברתיות וטכנולוגיות ומחיזוי התנהלותן, והיא מכוונת להכשיר את הלומד למציאות עתידית משתנה ולהצמיח בוגר משגשג (מורגנשטרן ואחרים, 2020). לצדה התגבש השיח על מיומנויות המאה ה-21, ובו הודגשו כישורי למידה וחדשנות: תקשורתיות, שיתופיות, חשיבה ביקורתית ופתרון בעיות וחשיבה יצירתית. בעשור האחרון נתפסות מיומנויות אלה כחלק ממודל רחב יותר, מצפן הלמידה, המדגיש פיתוח מיומנויות קוגניטיביות, חברתיות, רגשיות ופיזיות לצד עמדות וערכים, כאשר השלומות (</w:t>
-      </w:r>
-      <w:r>
-        <w:rPr>
-          <w:rFonts w:ascii="Times New Roman" w:cs="Times New Roman" w:hAnsi="Times New Roman"/>
-          <w:b w:val="false"/>
-          <w:bCs w:val="false"/>
-          <w:i w:val="false"/>
-          <w:iCs w:val="false"/>
-          <w:sz w:val="24"/>
-          <w:szCs w:val="24"/>
-          <w:rtl w:val="false"/>
-        </w:rPr>
-        <w:t xml:space="preserve">well-being) </w:t>
-      </w:r>
-      <w:r>
-        <w:rPr>
-          <w:rFonts w:ascii="David" w:cs="David" w:hAnsi="David"/>
-          <w:b w:val="false"/>
-          <w:bCs w:val="false"/>
-          <w:i w:val="false"/>
-          <w:iCs w:val="false"/>
-          <w:sz w:val="24"/>
-          <w:szCs w:val="24"/>
-          <w:rtl/>
-        </w:rPr>
-        <w:t xml:space="preserve">של הלומד היא היעד (</w:t>
-      </w:r>
-      <w:r>
-        <w:rPr>
-          <w:rFonts w:ascii="Times New Roman" w:cs="Times New Roman" w:hAnsi="Times New Roman"/>
-          <w:b w:val="false"/>
-          <w:bCs w:val="false"/>
-          <w:i w:val="false"/>
-          <w:iCs w:val="false"/>
-          <w:sz w:val="24"/>
-          <w:szCs w:val="24"/>
-          <w:rtl w:val="false"/>
-        </w:rPr>
-        <w:t xml:space="preserve">OECD, 2019).</w:t>
+        <w:t xml:space="preserve">הרחבה מערכתית של אותה תפיסה מוצעת במסגרת הפדגוגיה מוטת העתיד שפיתח משרד החינוך. זוהי פדגוגיה הנגזרת מניתוח מגמות חברתיות, טכנולוגיות וכלכליות ומחיזוי התנהלותן, והיא מכוונת קדימה, אל צורכי העתיד של הלומדים. בבסיסה עומדת ההנחה שהחינוך חייב להיות רלוונטי ומשמעותי, להכשיר את הלומד למציאות עתידית שאינה ידועה מראש ולהצמיח בוגר משגשג. המסמך מגדיר עקרונות פעולה, ובהם פרסונליות, שיתופיות ואי-פורמליות, ומציע למערכת החינוך דרכי היערכות בתכנים, בדרכי ההוראה ובארגון הלמידה (מורגנשטרן ואחרים, 2020).</w:t>
+      </w:r>
+    </w:p>
+    <w:p>
+      <w:pPr>
+        <w:bidi/>
+        <w:spacing w:after="120" w:line="360" w:lineRule="auto"/>
+        <w:jc w:val="both"/>
+      </w:pPr>
+      <w:r>
+        <w:rPr>
+          <w:rFonts w:ascii="David" w:cs="David" w:hAnsi="David"/>
+          <w:b w:val="false"/>
+          <w:bCs w:val="false"/>
+          <w:i w:val="false"/>
+          <w:iCs w:val="false"/>
+          <w:sz w:val="24"/>
+          <w:szCs w:val="24"/>
+          <w:rtl/>
+        </w:rPr>
+        <w:t xml:space="preserve">במקביל התגבש בעולם השיח על מיומנויות המאה ה-21, כלומר על הכישורים שמערכת החינוך נדרשת לפתח כדי להכשיר את בוגריה לחיים ולעבודה בעולם משתנה. מתוך כלל המיומנויות הודגשו מיומנויות-על של למידה וחדשנות: תקשורתיות, שיתופיות, חשיבה ביקורתית ופתרון בעיות וחשיבה יצירתית. בעשור האחרון נתפסות מיומנויות אלה כחלק ממודל רחב יותר, מצפן הלמידה 2030 של ארגון ה-</w:t>
+      </w:r>
+      <w:r>
+        <w:rPr>
+          <w:rFonts w:ascii="Times New Roman" w:cs="Times New Roman" w:hAnsi="Times New Roman"/>
+          <w:b w:val="false"/>
+          <w:bCs w:val="false"/>
+          <w:i w:val="false"/>
+          <w:iCs w:val="false"/>
+          <w:sz w:val="24"/>
+          <w:szCs w:val="24"/>
+          <w:rtl w:val="false"/>
+        </w:rPr>
+        <w:t xml:space="preserve">OECD, </w:t>
+      </w:r>
+      <w:r>
+        <w:rPr>
+          <w:rFonts w:ascii="David" w:cs="David" w:hAnsi="David"/>
+          <w:b w:val="false"/>
+          <w:bCs w:val="false"/>
+          <w:i w:val="false"/>
+          <w:iCs w:val="false"/>
+          <w:sz w:val="24"/>
+          <w:szCs w:val="24"/>
+          <w:rtl/>
+        </w:rPr>
+        <w:t xml:space="preserve">המדגיש פיתוח משולב של ידע, מיומנויות קוגניטיביות, חברתיות, רגשיות ופיזיות, לצד עמדות וערכים, ומעמיד את השלומות </w:t>
+      </w:r>
+      <w:r>
+        <w:rPr>
+          <w:rFonts w:ascii="Times New Roman" w:cs="Times New Roman" w:hAnsi="Times New Roman"/>
+          <w:b w:val="false"/>
+          <w:bCs w:val="false"/>
+          <w:i w:val="false"/>
+          <w:iCs w:val="false"/>
+          <w:sz w:val="24"/>
+          <w:szCs w:val="24"/>
+          <w:rtl w:val="false"/>
+        </w:rPr>
+        <w:t xml:space="preserve">(well-being) </w:t>
+      </w:r>
+      <w:r>
+        <w:rPr>
+          <w:rFonts w:ascii="David" w:cs="David" w:hAnsi="David"/>
+          <w:b w:val="false"/>
+          <w:bCs w:val="false"/>
+          <w:i w:val="false"/>
+          <w:iCs w:val="false"/>
+          <w:sz w:val="24"/>
+          <w:szCs w:val="24"/>
+          <w:rtl/>
+        </w:rPr>
+        <w:t xml:space="preserve">של הלומד ושל החברה כיעד הסופי של הלמידה. המצפן מדגיש גם את סוכנות הלומד, כלומר את יכולתו להציב מטרות, לפעול באחריות ולהשפיע על סביבתו </w:t>
+      </w:r>
+      <w:r>
+        <w:rPr>
+          <w:rFonts w:ascii="Times New Roman" w:cs="Times New Roman" w:hAnsi="Times New Roman"/>
+          <w:b w:val="false"/>
+          <w:bCs w:val="false"/>
+          <w:i w:val="false"/>
+          <w:iCs w:val="false"/>
+          <w:sz w:val="24"/>
+          <w:szCs w:val="24"/>
+          <w:rtl w:val="false"/>
+        </w:rPr>
+        <w:t xml:space="preserve">(OECD, 2019). </w:t>
+      </w:r>
+      <w:r>
+        <w:rPr>
+          <w:rFonts w:ascii="David" w:cs="David" w:hAnsi="David"/>
+          <w:b w:val="false"/>
+          <w:bCs w:val="false"/>
+          <w:i w:val="false"/>
+          <w:iCs w:val="false"/>
+          <w:sz w:val="24"/>
+          <w:szCs w:val="24"/>
+          <w:rtl/>
+        </w:rPr>
+        <w:t xml:space="preserve">מיומנויות אלה, ובראשן החשיבה הביקורתית, יחזרו ויעלו בהמשך הסקירה כתנאי לשימוש מושכל בבינה מלאכותית </w:t>
+      </w:r>
+      <w:r>
+        <w:rPr>
+          <w:rFonts w:ascii="Times New Roman" w:cs="Times New Roman" w:hAnsi="Times New Roman"/>
+          <w:b w:val="false"/>
+          <w:bCs w:val="false"/>
+          <w:i w:val="false"/>
+          <w:iCs w:val="false"/>
+          <w:sz w:val="24"/>
+          <w:szCs w:val="24"/>
+          <w:rtl w:val="false"/>
+        </w:rPr>
+        <w:t xml:space="preserve">(Ng et al., 2021).</w:t>
       </w:r>
     </w:p>
     <w:p>
@@ -511,72 +616,92 @@
           <w:szCs w:val="24"/>
           <w:rtl/>
         </w:rPr>
-        <w:t xml:space="preserve">פרנסקי (</w:t>
-      </w:r>
-      <w:r>
-        <w:rPr>
-          <w:rFonts w:ascii="Times New Roman" w:cs="Times New Roman" w:hAnsi="Times New Roman"/>
-          <w:b w:val="false"/>
-          <w:bCs w:val="false"/>
-          <w:i w:val="false"/>
-          <w:iCs w:val="false"/>
-          <w:sz w:val="24"/>
-          <w:szCs w:val="24"/>
-          <w:rtl w:val="false"/>
-        </w:rPr>
-        <w:t xml:space="preserve">Prensky, 2008) </w:t>
-      </w:r>
-      <w:r>
-        <w:rPr>
-          <w:rFonts w:ascii="David" w:cs="David" w:hAnsi="David"/>
-          <w:b w:val="false"/>
-          <w:bCs w:val="false"/>
-          <w:i w:val="false"/>
-          <w:iCs w:val="false"/>
-          <w:sz w:val="24"/>
-          <w:szCs w:val="24"/>
-          <w:rtl/>
-        </w:rPr>
-        <w:t xml:space="preserve">טוען שתפקידה של הטכנולוגיה בכיתה הוא לאפשר ללומדים ללמד את עצמם, בהנחיית המורה. לפי גישה זו הטכנולוגיה איננה מטרה אלא מדיום שמאפשר קיומה של פדגוגיה חדשנית: הלומד הופך לפעיל ולאחראי על הבניית הידע שלו, והמורה עובר מתפקיד של מוסר ידע לתפקיד של מנחה ומעצב סביבות למידה (</w:t>
-      </w:r>
-      <w:r>
-        <w:rPr>
-          <w:rFonts w:ascii="Times New Roman" w:cs="Times New Roman" w:hAnsi="Times New Roman"/>
-          <w:b w:val="false"/>
-          <w:bCs w:val="false"/>
-          <w:i w:val="false"/>
-          <w:iCs w:val="false"/>
-          <w:sz w:val="24"/>
-          <w:szCs w:val="24"/>
-          <w:rtl w:val="false"/>
-        </w:rPr>
-        <w:t xml:space="preserve">Prensky, 2008). </w:t>
-      </w:r>
-      <w:r>
-        <w:rPr>
-          <w:rFonts w:ascii="David" w:cs="David" w:hAnsi="David"/>
-          <w:b w:val="false"/>
-          <w:bCs w:val="false"/>
-          <w:i w:val="false"/>
-          <w:iCs w:val="false"/>
-          <w:sz w:val="24"/>
-          <w:szCs w:val="24"/>
-          <w:rtl/>
-        </w:rPr>
-        <w:t xml:space="preserve">שינוי תפקידים זה הוא הרקע שעליו יש לבחון גם את כניסתה של הבינה המלאכותית היוצרת לכיתה, שכן שאלת חלוקת העבודה בין המורה, הלומד והטכנולוגיה מתחדדת ככל שהטכנולוגיה עצמאית יותר (</w:t>
-      </w:r>
-      <w:r>
-        <w:rPr>
-          <w:rFonts w:ascii="Times New Roman" w:cs="Times New Roman" w:hAnsi="Times New Roman"/>
-          <w:b w:val="false"/>
-          <w:bCs w:val="false"/>
-          <w:i w:val="false"/>
-          <w:iCs w:val="false"/>
-          <w:sz w:val="24"/>
-          <w:szCs w:val="24"/>
-          <w:rtl w:val="false"/>
-        </w:rPr>
-        <w:t xml:space="preserve">Gašević et al., 2023).</w:t>
+        <w:t xml:space="preserve">פרנסקי </w:t>
+      </w:r>
+      <w:r>
+        <w:rPr>
+          <w:rFonts w:ascii="Times New Roman" w:cs="Times New Roman" w:hAnsi="Times New Roman"/>
+          <w:b w:val="false"/>
+          <w:bCs w:val="false"/>
+          <w:i w:val="false"/>
+          <w:iCs w:val="false"/>
+          <w:sz w:val="24"/>
+          <w:szCs w:val="24"/>
+          <w:rtl w:val="false"/>
+        </w:rPr>
+        <w:t xml:space="preserve">(Prensky, 2008) </w:t>
+      </w:r>
+      <w:r>
+        <w:rPr>
+          <w:rFonts w:ascii="David" w:cs="David" w:hAnsi="David"/>
+          <w:b w:val="false"/>
+          <w:bCs w:val="false"/>
+          <w:i w:val="false"/>
+          <w:iCs w:val="false"/>
+          <w:sz w:val="24"/>
+          <w:szCs w:val="24"/>
+          <w:rtl/>
+        </w:rPr>
+        <w:t xml:space="preserve">טוען שתפקידה של הטכנולוגיה בכיתה הוא אחד: לאפשר ללומדים ללמד את עצמם, בהנחיית המורה. לפי גישה זו הטכנולוגיה איננה מטרה ואיננה תחליף למורה, אלא מדיום שמאפשר קיומה של פדגוגיה חדשנית: הלומד הופך לפעיל, חוקר ואחראי על הבניית הידע שלו, והמורה עובר מתפקיד של מוסר ידע העומד מול הכיתה לתפקיד של מנחה, מכוון ומעצב סביבות למידה. פרנסקי מדגיש שכאשר הטכנולוגיה משמשת רק להמחשת ההרצאה של המורה, הפוטנציאל שלה מוחמץ, שכן השינוי האמיתי מתרחש כאשר הכלים נמצאים בידי הלומדים עצמם </w:t>
+      </w:r>
+      <w:r>
+        <w:rPr>
+          <w:rFonts w:ascii="Times New Roman" w:cs="Times New Roman" w:hAnsi="Times New Roman"/>
+          <w:b w:val="false"/>
+          <w:bCs w:val="false"/>
+          <w:i w:val="false"/>
+          <w:iCs w:val="false"/>
+          <w:sz w:val="24"/>
+          <w:szCs w:val="24"/>
+          <w:rtl w:val="false"/>
+        </w:rPr>
+        <w:t xml:space="preserve">(Prensky, 2008).</w:t>
+      </w:r>
+    </w:p>
+    <w:p>
+      <w:pPr>
+        <w:bidi/>
+        <w:spacing w:after="120" w:line="360" w:lineRule="auto"/>
+        <w:jc w:val="both"/>
+      </w:pPr>
+      <w:r>
+        <w:rPr>
+          <w:rFonts w:ascii="David" w:cs="David" w:hAnsi="David"/>
+          <w:b w:val="false"/>
+          <w:bCs w:val="false"/>
+          <w:i w:val="false"/>
+          <w:iCs w:val="false"/>
+          <w:sz w:val="24"/>
+          <w:szCs w:val="24"/>
+          <w:rtl/>
+        </w:rPr>
+        <w:t xml:space="preserve">שינוי תפקידים זה הוא הרקע שעליו יש לבחון גם את כניסתה של הבינה המלאכותית היוצרת לכיתה. ככל שהטכנולוגיה עצמאית ומתוחכמת יותר, מתחדדת שאלת חלוקת העבודה בין המורה, הלומד והמכונה: אילו משימות ראוי להעביר לטכנולוגיה, אילו חייבות להישאר בידי האדם, וכיצד מבטיחים שהטכנולוגיה תתמוך בחשיבה של הלומד ולא תחליף אותה </w:t>
+      </w:r>
+      <w:r>
+        <w:rPr>
+          <w:rFonts w:ascii="Times New Roman" w:cs="Times New Roman" w:hAnsi="Times New Roman"/>
+          <w:b w:val="false"/>
+          <w:bCs w:val="false"/>
+          <w:i w:val="false"/>
+          <w:iCs w:val="false"/>
+          <w:sz w:val="24"/>
+          <w:szCs w:val="24"/>
+          <w:rtl w:val="false"/>
+        </w:rPr>
+        <w:t xml:space="preserve">(Gašević et al., 2023). </w:t>
+      </w:r>
+      <w:r>
+        <w:rPr>
+          <w:rFonts w:ascii="David" w:cs="David" w:hAnsi="David"/>
+          <w:b w:val="false"/>
+          <w:bCs w:val="false"/>
+          <w:i w:val="false"/>
+          <w:iCs w:val="false"/>
+          <w:sz w:val="24"/>
+          <w:szCs w:val="24"/>
+          <w:rtl/>
+        </w:rPr>
+        <w:t xml:space="preserve">בכך נבדלת הבינה המלאכותית מגלי טכנולוגיה קודמים, והדיון בה מחייב תחילה הבנה של הדרך שבה מערכות חינוך הטמיעו טכנולוגיות עד כה.</w:t>
       </w:r>
     </w:p>
     <w:p>
@@ -637,7 +762,66 @@
           <w:szCs w:val="24"/>
           <w:rtl/>
         </w:rPr>
-        <w:t xml:space="preserve">הניסיונות לשלב טכנולוגיות דיגיטליות בהוראה מלווים את מערכות החינוך מזה עשורים, אך קצב האימוץ בפועל היה לרוב איטי מקצב ההתפתחות הטכנולוגית. נקודת מפנה התרחשה במגפת הקורונה, כאשר המעבר הכפוי להוראה מרחוק חייב את כלל המורים ומכשירי המורים להשתמש בכלים דיגיטליים. מחקר שנערך במכללות להכשרת מורים בישראל מצא שרוב בעלי התפקידים הבכירים תיארו את המגפה כחלון הזדמנויות לצמיחה ולהמצאה מחדש של ההוראה, וששיעור ההשתתפות בהשתלמויות טכנולוגיות הוכפל באותה תקופה, לצד מיעוט שחווה את התקופה כמשבר והתמקד בהישרדות (חיאק ואבידב-אונגר, 2022).</w:t>
+        <w:t xml:space="preserve">הניסיונות לשלב טכנולוגיות דיגיטליות בהוראה מלווים את מערכות החינוך מזה עשורים: ממעבדות המחשבים והלומדות של שנות השמונים והתשעים, דרך המחשבים הניידים, המקרנים והלוחות האינטראקטיביים, ועד סביבות הלמידה המקוונות והמכשירים האישיים. עם זאת, קצב האימוץ בפועל היה לרוב איטי בהרבה מקצב ההתפתחות הטכנולוגית, והפער בין הציוד שנרכש ובין השימוש הפדגוגי שנעשה בו נותר אחת הבעיות המתועדות ביותר בתחום </w:t>
+      </w:r>
+      <w:r>
+        <w:rPr>
+          <w:rFonts w:ascii="Times New Roman" w:cs="Times New Roman" w:hAnsi="Times New Roman"/>
+          <w:b w:val="false"/>
+          <w:bCs w:val="false"/>
+          <w:i w:val="false"/>
+          <w:iCs w:val="false"/>
+          <w:sz w:val="24"/>
+          <w:szCs w:val="24"/>
+          <w:rtl w:val="false"/>
+        </w:rPr>
+        <w:t xml:space="preserve">(Prensky, 2008). </w:t>
+      </w:r>
+      <w:r>
+        <w:rPr>
+          <w:rFonts w:ascii="David" w:cs="David" w:hAnsi="David"/>
+          <w:b w:val="false"/>
+          <w:bCs w:val="false"/>
+          <w:i w:val="false"/>
+          <w:iCs w:val="false"/>
+          <w:sz w:val="24"/>
+          <w:szCs w:val="24"/>
+          <w:rtl/>
+        </w:rPr>
+        <w:t xml:space="preserve">ההסבר לפער זה אינו טכני בעיקרו: שילוב מוצלח תלוי בידע של המורה, בעמדותיו ובהקשר הארגוני שבו הוא פועל </w:t>
+      </w:r>
+      <w:r>
+        <w:rPr>
+          <w:rFonts w:ascii="Times New Roman" w:cs="Times New Roman" w:hAnsi="Times New Roman"/>
+          <w:b w:val="false"/>
+          <w:bCs w:val="false"/>
+          <w:i w:val="false"/>
+          <w:iCs w:val="false"/>
+          <w:sz w:val="24"/>
+          <w:szCs w:val="24"/>
+          <w:rtl w:val="false"/>
+        </w:rPr>
+        <w:t xml:space="preserve">(Mishra &amp; Koehler, 2009).</w:t>
+      </w:r>
+    </w:p>
+    <w:p>
+      <w:pPr>
+        <w:bidi/>
+        <w:spacing w:after="120" w:line="360" w:lineRule="auto"/>
+        <w:jc w:val="both"/>
+      </w:pPr>
+      <w:r>
+        <w:rPr>
+          <w:rFonts w:ascii="David" w:cs="David" w:hAnsi="David"/>
+          <w:b w:val="false"/>
+          <w:bCs w:val="false"/>
+          <w:i w:val="false"/>
+          <w:iCs w:val="false"/>
+          <w:sz w:val="24"/>
+          <w:szCs w:val="24"/>
+          <w:rtl/>
+        </w:rPr>
+        <w:t xml:space="preserve">נקודת מפנה התרחשה במגפת הקורונה, כאשר המעבר הכפוי להוראה מרחוק חייב את כלל המורים ומכשירי המורים להשתמש בכלים דיגיטליים בבת אחת. מחקר איכותני שנערך בישראל, שבמסגרתו רואיינו 25 בעלי תפקידים בכירים מ-13 מכללות להכשרת מורים, מצא שרובם (19 מתוך 25) תיארו את המגפה כחלון הזדמנויות לצמיחה ולהמצאה מחדש של ההוראה: מרצים "קפצו למים" ולמדו כלים חדשים, ושיעור ההשתתפות בהשתלמויות טכנולוגיות הוכפל, לאחר שלפני המגפה השתלמויות דומות עמדו כמעט ריקות. מיעוט מן המרואיינים חווה את התקופה דווקא כמשבר, ותיאר שיתוק, "כיבוי שרפות" והתמקדות בהישרדות (חיאק ואבידב-אונגר, 2022). המסקנה העולה מן המחקר היא שבעת משבר מצטמצם הקיטוב סביב סוגיות ארגוניות מהותיות, ונוצרת מציאות חדשה המשלבת בין הקטבים (חיאק ואבידב-אונגר, 2022).</w:t>
       </w:r>
     </w:p>
     <w:p>
@@ -677,20 +861,66 @@
           <w:szCs w:val="24"/>
           <w:rtl/>
         </w:rPr>
-        <w:t xml:space="preserve">אותו מחקר מדגים גם את המתח המבני שבין הטמעה "מלמעלה למטה", ביוזמת ההנהלה והמדיניות, ובין צמיחה "מלמטה למעלה", ביוזמת הסגל. חלק מהמרואיינים תיארו מדיניות מחייבת, אחרים הדגישו את החופש האקדמי ואת היוזמה האישית, והמסקנה שעלתה היא שהטמעה מוצלחת דורשת מפגש רצונות: חזון ניהולי ברור לצד אוטונומיה ודיאלוג פתוח עם הסגל (חיאק ואבידב-אונגר, 2022). עיקרון נוסף העולה מן הספרות הוא שהטכנולוגיה צריכה לשרת את הפדגוגיה ולא להפך, כלומר נקודת המוצא היא הצורך הלימודי, והכלי נבחר בהתאם לו (</w:t>
-      </w:r>
-      <w:r>
-        <w:rPr>
-          <w:rFonts w:ascii="Times New Roman" w:cs="Times New Roman" w:hAnsi="Times New Roman"/>
-          <w:b w:val="false"/>
-          <w:bCs w:val="false"/>
-          <w:i w:val="false"/>
-          <w:iCs w:val="false"/>
-          <w:sz w:val="24"/>
-          <w:szCs w:val="24"/>
-          <w:rtl w:val="false"/>
-        </w:rPr>
-        <w:t xml:space="preserve">Prensky, 2008).</w:t>
+        <w:t xml:space="preserve">אותו מחקר מדגים את המתח המבני המרכזי של תהליכי הטמעה: הטמעה "מלמעלה למטה", ביוזמת ההנהלה והמדיניות, מול צמיחה "מלמטה למעלה", ביוזמת הסגל. 11 מן המרואיינים תיארו מדיניות מחייבת, למשל נשיא מכללה שחייב את כל הסגל להשתתף בהכשרות; 10 הדגישו את החופש האקדמי ואת היוזמה האישית של המרצים; וארבעה תמכו במפורש בשילוב בין הגישות, שכונה "מפגש רצונות" בין חזון ההנהלה ובין האוטונומיה של הסגל. תוצאה דומה עלתה גם בציר של שמרנות מול חדשנות: לצד רוב שתיאר מאמצי חדשנות נרחבים, יחידות חדשנות דיגיטלית, רכישת טכנולוגיות מתקדמות ותקציבי פיתוח מקצועי, תוארו גם קיבעון של חלק מהסגל, עומס דרישות ופערי מיומנויות בסיסיות (חיאק ואבידב-אונגר, 2022). המסקנה המעשית לקובעי מדיניות היא לעבור מניהול משבר להובלת שינוי, באמצעות בניית חזון משותף ודיאלוג פתוח עם הסגל (חיאק ואבידב-אונגר, 2022).</w:t>
+      </w:r>
+    </w:p>
+    <w:p>
+      <w:pPr>
+        <w:bidi/>
+        <w:spacing w:after="120" w:line="360" w:lineRule="auto"/>
+        <w:jc w:val="both"/>
+      </w:pPr>
+      <w:r>
+        <w:rPr>
+          <w:rFonts w:ascii="David" w:cs="David" w:hAnsi="David"/>
+          <w:b w:val="false"/>
+          <w:bCs w:val="false"/>
+          <w:i w:val="false"/>
+          <w:iCs w:val="false"/>
+          <w:sz w:val="24"/>
+          <w:szCs w:val="24"/>
+          <w:rtl/>
+        </w:rPr>
+        <w:t xml:space="preserve">עיקרון נוסף העולה מן הספרות הוא סדר הפעולות הנכון: נקודת המוצא היא הצורך הפדגוגי, והכלי הטכנולוגי נבחר בהתאם לו, ולא להפך. הטכנולוגיה נועדה לשרת את הפדגוגיה, לאפשר ללומד להוביל את הלמידה של עצמו ולהבנות ידע </w:t>
+      </w:r>
+      <w:r>
+        <w:rPr>
+          <w:rFonts w:ascii="Times New Roman" w:cs="Times New Roman" w:hAnsi="Times New Roman"/>
+          <w:b w:val="false"/>
+          <w:bCs w:val="false"/>
+          <w:i w:val="false"/>
+          <w:iCs w:val="false"/>
+          <w:sz w:val="24"/>
+          <w:szCs w:val="24"/>
+          <w:rtl w:val="false"/>
+        </w:rPr>
+        <w:t xml:space="preserve">(Prensky, 2008). </w:t>
+      </w:r>
+      <w:r>
+        <w:rPr>
+          <w:rFonts w:ascii="David" w:cs="David" w:hAnsi="David"/>
+          <w:b w:val="false"/>
+          <w:bCs w:val="false"/>
+          <w:i w:val="false"/>
+          <w:iCs w:val="false"/>
+          <w:sz w:val="24"/>
+          <w:szCs w:val="24"/>
+          <w:rtl/>
+        </w:rPr>
+        <w:t xml:space="preserve">עקרונות אלה, שגובשו סביב טכנולוגיות "רגילות", יעמדו למבחן מחודש עם כניסת הבינה המלאכותית היוצרת, שמאפייניה שונים מהותית </w:t>
+      </w:r>
+      <w:r>
+        <w:rPr>
+          <w:rFonts w:ascii="Times New Roman" w:cs="Times New Roman" w:hAnsi="Times New Roman"/>
+          <w:b w:val="false"/>
+          <w:bCs w:val="false"/>
+          <w:i w:val="false"/>
+          <w:iCs w:val="false"/>
+          <w:sz w:val="24"/>
+          <w:szCs w:val="24"/>
+          <w:rtl w:val="false"/>
+        </w:rPr>
+        <w:t xml:space="preserve">(Mishra et al., 2023).</w:t>
       </w:r>
     </w:p>
     <w:p>
@@ -795,105 +1025,255 @@
           <w:szCs w:val="24"/>
           <w:rtl/>
         </w:rPr>
-        <w:t xml:space="preserve">המודל מתאר שלושה מרחבי ידע, ידע תוכן, ידע פדגוגי וידע טכנולוגי, ואת החפיפות ביניהם, כאשר במרכז נמצא הידע הטכנולוגי-פדגוגי-תוכני: היכולת לבחור טכנולוגיה, לעצב בעזרתה הוראה ולהתאימה לתוכן הנלמד. מישרה וקוהלר (</w:t>
-      </w:r>
-      <w:r>
-        <w:rPr>
-          <w:rFonts w:ascii="Times New Roman" w:cs="Times New Roman" w:hAnsi="Times New Roman"/>
-          <w:b w:val="false"/>
-          <w:bCs w:val="false"/>
-          <w:i w:val="false"/>
-          <w:iCs w:val="false"/>
-          <w:sz w:val="24"/>
-          <w:szCs w:val="24"/>
-          <w:rtl w:val="false"/>
-        </w:rPr>
-        <w:t xml:space="preserve">Mishra &amp; Koehler, 2009) </w:t>
-      </w:r>
-      <w:r>
-        <w:rPr>
-          <w:rFonts w:ascii="David" w:cs="David" w:hAnsi="David"/>
-          <w:b w:val="false"/>
-          <w:bCs w:val="false"/>
-          <w:i w:val="false"/>
-          <w:iCs w:val="false"/>
-          <w:sz w:val="24"/>
-          <w:szCs w:val="24"/>
-          <w:rtl/>
-        </w:rPr>
-        <w:t xml:space="preserve">מדגישים שרוב הטכנולוגיות שמורים משתמשים בהן לא פותחו לצרכים חינוכיים, ולכן נדרש מהמורה "מיחזור יצירתי" שלהן, וכן שהמערכת נמצאת בשיווי משקל דינמי: שינוי באחד הרכיבים מחייב התאמה של האחרים.</w:t>
-      </w:r>
-    </w:p>
-    <w:p>
-      <w:pPr>
-        <w:bidi/>
-        <w:spacing w:after="120" w:line="360" w:lineRule="auto"/>
-        <w:jc w:val="both"/>
-      </w:pPr>
-      <w:r>
-        <w:rPr>
-          <w:rFonts w:ascii="David" w:cs="David" w:hAnsi="David"/>
-          <w:b w:val="false"/>
-          <w:bCs w:val="false"/>
-          <w:i w:val="false"/>
-          <w:iCs w:val="false"/>
-          <w:sz w:val="24"/>
-          <w:szCs w:val="24"/>
-          <w:rtl/>
-        </w:rPr>
-        <w:t xml:space="preserve">בגרסה מעודכנת של המודל שודרג מעגל ההקשר החיצוני למרחב ידע עצמאי, ידע הקשרי (</w:t>
-      </w:r>
-      <w:r>
-        <w:rPr>
-          <w:rFonts w:ascii="Times New Roman" w:cs="Times New Roman" w:hAnsi="Times New Roman"/>
-          <w:b w:val="false"/>
-          <w:bCs w:val="false"/>
-          <w:i w:val="false"/>
-          <w:iCs w:val="false"/>
-          <w:sz w:val="24"/>
-          <w:szCs w:val="24"/>
-          <w:rtl w:val="false"/>
-        </w:rPr>
-        <w:t xml:space="preserve">Contextual Knowledge, XK): </w:t>
-      </w:r>
-      <w:r>
-        <w:rPr>
-          <w:rFonts w:ascii="David" w:cs="David" w:hAnsi="David"/>
-          <w:b w:val="false"/>
-          <w:bCs w:val="false"/>
-          <w:i w:val="false"/>
-          <w:iCs w:val="false"/>
-          <w:sz w:val="24"/>
-          <w:szCs w:val="24"/>
-          <w:rtl/>
-        </w:rPr>
-        <w:t xml:space="preserve">ידיעת המורה את בית הספר, את המדיניות, את המשאבים ואת התרבות הארגונית שבתוכם הוא פועל. לטענת מישרה (</w:t>
-      </w:r>
-      <w:r>
-        <w:rPr>
-          <w:rFonts w:ascii="Times New Roman" w:cs="Times New Roman" w:hAnsi="Times New Roman"/>
-          <w:b w:val="false"/>
-          <w:bCs w:val="false"/>
-          <w:i w:val="false"/>
-          <w:iCs w:val="false"/>
-          <w:sz w:val="24"/>
-          <w:szCs w:val="24"/>
-          <w:rtl w:val="false"/>
-        </w:rPr>
-        <w:t xml:space="preserve">Mishra, 2019), </w:t>
-      </w:r>
-      <w:r>
-        <w:rPr>
-          <w:rFonts w:ascii="David" w:cs="David" w:hAnsi="David"/>
-          <w:b w:val="false"/>
-          <w:bCs w:val="false"/>
-          <w:i w:val="false"/>
-          <w:iCs w:val="false"/>
-          <w:sz w:val="24"/>
-          <w:szCs w:val="24"/>
-          <w:rtl/>
-        </w:rPr>
-        <w:t xml:space="preserve">היעדר ידע הקשרי מגביל כל ניסיון לשילוב טכנולוגיה, ומורה בעל ידע הקשרי פועל כ"יזם פנים-ארגוני" המכיר את מנופי ההשפעה בארגונו. מודל משלים, </w:t>
+        <w:t xml:space="preserve">המודל מתאר שלושה מרחבי ידע: ידע תוכן </w:t>
+      </w:r>
+      <w:r>
+        <w:rPr>
+          <w:rFonts w:ascii="Times New Roman" w:cs="Times New Roman" w:hAnsi="Times New Roman"/>
+          <w:b w:val="false"/>
+          <w:bCs w:val="false"/>
+          <w:i w:val="false"/>
+          <w:iCs w:val="false"/>
+          <w:sz w:val="24"/>
+          <w:szCs w:val="24"/>
+          <w:rtl w:val="false"/>
+        </w:rPr>
+        <w:t xml:space="preserve">(CK), </w:t>
+      </w:r>
+      <w:r>
+        <w:rPr>
+          <w:rFonts w:ascii="David" w:cs="David" w:hAnsi="David"/>
+          <w:b w:val="false"/>
+          <w:bCs w:val="false"/>
+          <w:i w:val="false"/>
+          <w:iCs w:val="false"/>
+          <w:sz w:val="24"/>
+          <w:szCs w:val="24"/>
+          <w:rtl/>
+        </w:rPr>
+        <w:t xml:space="preserve">הידע בתחום הדעת הנלמד; ידע פדגוגי </w:t>
+      </w:r>
+      <w:r>
+        <w:rPr>
+          <w:rFonts w:ascii="Times New Roman" w:cs="Times New Roman" w:hAnsi="Times New Roman"/>
+          <w:b w:val="false"/>
+          <w:bCs w:val="false"/>
+          <w:i w:val="false"/>
+          <w:iCs w:val="false"/>
+          <w:sz w:val="24"/>
+          <w:szCs w:val="24"/>
+          <w:rtl w:val="false"/>
+        </w:rPr>
+        <w:t xml:space="preserve">(PK), </w:t>
+      </w:r>
+      <w:r>
+        <w:rPr>
+          <w:rFonts w:ascii="David" w:cs="David" w:hAnsi="David"/>
+          <w:b w:val="false"/>
+          <w:bCs w:val="false"/>
+          <w:i w:val="false"/>
+          <w:iCs w:val="false"/>
+          <w:sz w:val="24"/>
+          <w:szCs w:val="24"/>
+          <w:rtl/>
+        </w:rPr>
+        <w:t xml:space="preserve">הידע על הוראה, למידה וניהול כיתה; וידע טכנולוגי </w:t>
+      </w:r>
+      <w:r>
+        <w:rPr>
+          <w:rFonts w:ascii="Times New Roman" w:cs="Times New Roman" w:hAnsi="Times New Roman"/>
+          <w:b w:val="false"/>
+          <w:bCs w:val="false"/>
+          <w:i w:val="false"/>
+          <w:iCs w:val="false"/>
+          <w:sz w:val="24"/>
+          <w:szCs w:val="24"/>
+          <w:rtl w:val="false"/>
+        </w:rPr>
+        <w:t xml:space="preserve">(TK), </w:t>
+      </w:r>
+      <w:r>
+        <w:rPr>
+          <w:rFonts w:ascii="David" w:cs="David" w:hAnsi="David"/>
+          <w:b w:val="false"/>
+          <w:bCs w:val="false"/>
+          <w:i w:val="false"/>
+          <w:iCs w:val="false"/>
+          <w:sz w:val="24"/>
+          <w:szCs w:val="24"/>
+          <w:rtl/>
+        </w:rPr>
+        <w:t xml:space="preserve">ההיכרות עם הכלים הטכנולוגיים ועם אפשרויותיהם. מן החפיפות בין המרחבים נגזרים ידע פדגוגי-תוכני, ידע טכנולוגי-תוכני וידע טכנולוגי-פדגוגי, ובמרכז נמצא הידע הטכנולוגי-פדגוגי-תוכני: היכולת לבחור טכנולוגיה, לעצב בעזרתה הוראה ולהתאימה לתוכן הנלמד וללומדים </w:t>
+      </w:r>
+      <w:r>
+        <w:rPr>
+          <w:rFonts w:ascii="Times New Roman" w:cs="Times New Roman" w:hAnsi="Times New Roman"/>
+          <w:b w:val="false"/>
+          <w:bCs w:val="false"/>
+          <w:i w:val="false"/>
+          <w:iCs w:val="false"/>
+          <w:sz w:val="24"/>
+          <w:szCs w:val="24"/>
+          <w:rtl w:val="false"/>
+        </w:rPr>
+        <w:t xml:space="preserve">(Mishra &amp; Koehler, 2009).</w:t>
+      </w:r>
+    </w:p>
+    <w:p>
+      <w:pPr>
+        <w:bidi/>
+        <w:spacing w:after="120" w:line="360" w:lineRule="auto"/>
+        <w:jc w:val="both"/>
+      </w:pPr>
+      <w:r>
+        <w:rPr>
+          <w:rFonts w:ascii="David" w:cs="David" w:hAnsi="David"/>
+          <w:b w:val="false"/>
+          <w:bCs w:val="false"/>
+          <w:i w:val="false"/>
+          <w:iCs w:val="false"/>
+          <w:sz w:val="24"/>
+          <w:szCs w:val="24"/>
+          <w:rtl/>
+        </w:rPr>
+        <w:t xml:space="preserve">מישרה וקוהלר </w:t>
+      </w:r>
+      <w:r>
+        <w:rPr>
+          <w:rFonts w:ascii="Times New Roman" w:cs="Times New Roman" w:hAnsi="Times New Roman"/>
+          <w:b w:val="false"/>
+          <w:bCs w:val="false"/>
+          <w:i w:val="false"/>
+          <w:iCs w:val="false"/>
+          <w:sz w:val="24"/>
+          <w:szCs w:val="24"/>
+          <w:rtl w:val="false"/>
+        </w:rPr>
+        <w:t xml:space="preserve">(Mishra &amp; Koehler, 2009) </w:t>
+      </w:r>
+      <w:r>
+        <w:rPr>
+          <w:rFonts w:ascii="David" w:cs="David" w:hAnsi="David"/>
+          <w:b w:val="false"/>
+          <w:bCs w:val="false"/>
+          <w:i w:val="false"/>
+          <w:iCs w:val="false"/>
+          <w:sz w:val="24"/>
+          <w:szCs w:val="24"/>
+          <w:rtl/>
+        </w:rPr>
+        <w:t xml:space="preserve">מדגישים שרוב הטכנולוגיות שמורים משתמשים בהן, מרשתות חברתיות ועד תוכנות משרדיות, לא פותחו כלל לצרכים חינוכיים, ולכן נדרש מהמורה "מיחזור יצירתי" שלהן: להבין אילו כללים אפשר לכופף ואילו לשבור כדי להפוך כלי כללי לכלי הוראה. הם מדגימים זאת, בין השאר, בשימוש ברשת חברתית להרחבת הדיון הכיתתי ובתוכנת מוזיקה להוראת שברים ויחסים. עוד הם מדגישים שהמערכת נמצאת בשיווי משקל דינמי: שינוי באחד הרכיבים, למשל הופעת טכנולוגיה חדשה, מחייב התאמה מחודשת של הפדגוגיה ושל התוכן </w:t>
+      </w:r>
+      <w:r>
+        <w:rPr>
+          <w:rFonts w:ascii="Times New Roman" w:cs="Times New Roman" w:hAnsi="Times New Roman"/>
+          <w:b w:val="false"/>
+          <w:bCs w:val="false"/>
+          <w:i w:val="false"/>
+          <w:iCs w:val="false"/>
+          <w:sz w:val="24"/>
+          <w:szCs w:val="24"/>
+          <w:rtl w:val="false"/>
+        </w:rPr>
+        <w:t xml:space="preserve">(Mishra &amp; Koehler, 2009).</w:t>
+      </w:r>
+    </w:p>
+    <w:p>
+      <w:pPr>
+        <w:bidi/>
+        <w:spacing w:after="120" w:line="360" w:lineRule="auto"/>
+        <w:jc w:val="both"/>
+      </w:pPr>
+      <w:r>
+        <w:rPr>
+          <w:rFonts w:ascii="David" w:cs="David" w:hAnsi="David"/>
+          <w:b w:val="false"/>
+          <w:bCs w:val="false"/>
+          <w:i w:val="false"/>
+          <w:iCs w:val="false"/>
+          <w:sz w:val="24"/>
+          <w:szCs w:val="24"/>
+          <w:rtl/>
+        </w:rPr>
+        <w:t xml:space="preserve">בגרסה מעודכנת של המודל שודרג מעגל ההקשר, שהופיע בתרשים המקורי כרקע בלבד, למרחב ידע עצמאי: ידע הקשרי </w:t>
+      </w:r>
+      <w:r>
+        <w:rPr>
+          <w:rFonts w:ascii="Times New Roman" w:cs="Times New Roman" w:hAnsi="Times New Roman"/>
+          <w:b w:val="false"/>
+          <w:bCs w:val="false"/>
+          <w:i w:val="false"/>
+          <w:iCs w:val="false"/>
+          <w:sz w:val="24"/>
+          <w:szCs w:val="24"/>
+          <w:rtl w:val="false"/>
+        </w:rPr>
+        <w:t xml:space="preserve">(Contextual Knowledge, XK). </w:t>
+      </w:r>
+      <w:r>
+        <w:rPr>
+          <w:rFonts w:ascii="David" w:cs="David" w:hAnsi="David"/>
+          <w:b w:val="false"/>
+          <w:bCs w:val="false"/>
+          <w:i w:val="false"/>
+          <w:iCs w:val="false"/>
+          <w:sz w:val="24"/>
+          <w:szCs w:val="24"/>
+          <w:rtl/>
+        </w:rPr>
+        <w:t xml:space="preserve">זהו ידע המורה על בית הספר, על המדיניות המקומית והארצית, על המשאבים הזמינים ועל התרבות הארגונית שבתוכם הוא פועל. מישרה </w:t>
+      </w:r>
+      <w:r>
+        <w:rPr>
+          <w:rFonts w:ascii="Times New Roman" w:cs="Times New Roman" w:hAnsi="Times New Roman"/>
+          <w:b w:val="false"/>
+          <w:bCs w:val="false"/>
+          <w:i w:val="false"/>
+          <w:iCs w:val="false"/>
+          <w:sz w:val="24"/>
+          <w:szCs w:val="24"/>
+          <w:rtl w:val="false"/>
+        </w:rPr>
+        <w:t xml:space="preserve">(Mishra, 2019) </w:t>
+      </w:r>
+      <w:r>
+        <w:rPr>
+          <w:rFonts w:ascii="David" w:cs="David" w:hAnsi="David"/>
+          <w:b w:val="false"/>
+          <w:bCs w:val="false"/>
+          <w:i w:val="false"/>
+          <w:iCs w:val="false"/>
+          <w:sz w:val="24"/>
+          <w:szCs w:val="24"/>
+          <w:rtl/>
+        </w:rPr>
+        <w:t xml:space="preserve">טוען שהיעדר ידע הקשרי מגביל את הצלחתו של כל ניסיון לשילוב טכנולוגיה, גם כאשר המורה שולט בתוכן, בפדגוגיה ובטכנולוגיה, ושמורה בעל ידע הקשרי פועל כ"יזם פנים-ארגוני" המכיר את מנופי ההשפעה בארגונו ומסוגל להוביל שינוי בר-קיימא. הגדרת ההקשר כמרחב ידע נושאת גם משמעות מעשית: אפשר לפתח אותו, ללמד אותו ולמדוד אותו בהכשרת מורים, כמו כל רכיב אחר במודל </w:t>
+      </w:r>
+      <w:r>
+        <w:rPr>
+          <w:rFonts w:ascii="Times New Roman" w:cs="Times New Roman" w:hAnsi="Times New Roman"/>
+          <w:b w:val="false"/>
+          <w:bCs w:val="false"/>
+          <w:i w:val="false"/>
+          <w:iCs w:val="false"/>
+          <w:sz w:val="24"/>
+          <w:szCs w:val="24"/>
+          <w:rtl w:val="false"/>
+        </w:rPr>
+        <w:t xml:space="preserve">(Mishra, 2019). </w:t>
+      </w:r>
+      <w:r>
+        <w:rPr>
+          <w:rFonts w:ascii="David" w:cs="David" w:hAnsi="David"/>
+          <w:b w:val="false"/>
+          <w:bCs w:val="false"/>
+          <w:i w:val="false"/>
+          <w:iCs w:val="false"/>
+          <w:sz w:val="24"/>
+          <w:szCs w:val="24"/>
+          <w:rtl/>
+        </w:rPr>
+        <w:t xml:space="preserve">מודל משלים, </w:t>
       </w:r>
       <w:r>
         <w:rPr>
@@ -919,20 +1299,20 @@
           <w:szCs w:val="24"/>
           <w:rtl/>
         </w:rPr>
-        <w:t xml:space="preserve">מציע סולם לבחינת עומק השילוב, מהחלפה ושיפור של פעולה קיימת ועד שינוי והמצאה מחדש של המשימה הלימודית (</w:t>
-      </w:r>
-      <w:r>
-        <w:rPr>
-          <w:rFonts w:ascii="Times New Roman" w:cs="Times New Roman" w:hAnsi="Times New Roman"/>
-          <w:b w:val="false"/>
-          <w:bCs w:val="false"/>
-          <w:i w:val="false"/>
-          <w:iCs w:val="false"/>
-          <w:sz w:val="24"/>
-          <w:szCs w:val="24"/>
-          <w:rtl w:val="false"/>
-        </w:rPr>
-        <w:t xml:space="preserve">Puentedura, 2006). </w:t>
+        <w:t xml:space="preserve">מציע סולם לבחינת עומק השילוב בארבע רמות: החלפה של אמצעי קיים ללא שינוי מהותי, הרחבה המוסיפה שיפור תפקודי, שינוי המעצב מחדש את המשימה, והגדרה מחדש המאפשרת משימות שלא היו אפשריות קודם </w:t>
+      </w:r>
+      <w:r>
+        <w:rPr>
+          <w:rFonts w:ascii="Times New Roman" w:cs="Times New Roman" w:hAnsi="Times New Roman"/>
+          <w:b w:val="false"/>
+          <w:bCs w:val="false"/>
+          <w:i w:val="false"/>
+          <w:iCs w:val="false"/>
+          <w:sz w:val="24"/>
+          <w:szCs w:val="24"/>
+          <w:rtl w:val="false"/>
+        </w:rPr>
+        <w:t xml:space="preserve">(Puentedura, 2006). </w:t>
       </w:r>
       <w:r>
         <w:rPr>
@@ -1058,98 +1438,144 @@
           <w:szCs w:val="24"/>
           <w:rtl/>
         </w:rPr>
-        <w:t xml:space="preserve">בינה מלאכותית היא תוכנת מחשב המדמה תהליכי חשיבה אנושיים לשם ביצוע משימות, והיא נשענת על כריית נתונים בהיקפים גדולים, על זיהוי דפוסים וחיזוי מגמות, על למידת מכונה ועל מידה של אוטונומיה בקבלת החלטות (</w:t>
-      </w:r>
-      <w:r>
-        <w:rPr>
-          <w:rFonts w:ascii="Times New Roman" w:cs="Times New Roman" w:hAnsi="Times New Roman"/>
-          <w:b w:val="false"/>
-          <w:bCs w:val="false"/>
-          <w:i w:val="false"/>
-          <w:iCs w:val="false"/>
-          <w:sz w:val="24"/>
-          <w:szCs w:val="24"/>
-          <w:rtl w:val="false"/>
-        </w:rPr>
-        <w:t xml:space="preserve">Holmes &amp; Miao, 2023). </w:t>
-      </w:r>
-      <w:r>
-        <w:rPr>
-          <w:rFonts w:ascii="David" w:cs="David" w:hAnsi="David"/>
-          <w:b w:val="false"/>
-          <w:bCs w:val="false"/>
-          <w:i w:val="false"/>
-          <w:iCs w:val="false"/>
-          <w:sz w:val="24"/>
-          <w:szCs w:val="24"/>
-          <w:rtl/>
-        </w:rPr>
-        <w:t xml:space="preserve">בינה מלאכותית יוצרת (</w:t>
-      </w:r>
-      <w:r>
-        <w:rPr>
-          <w:rFonts w:ascii="Times New Roman" w:cs="Times New Roman" w:hAnsi="Times New Roman"/>
-          <w:b w:val="false"/>
-          <w:bCs w:val="false"/>
-          <w:i w:val="false"/>
-          <w:iCs w:val="false"/>
-          <w:sz w:val="24"/>
-          <w:szCs w:val="24"/>
-          <w:rtl w:val="false"/>
-        </w:rPr>
-        <w:t xml:space="preserve">Generative AI) </w:t>
-      </w:r>
-      <w:r>
-        <w:rPr>
-          <w:rFonts w:ascii="David" w:cs="David" w:hAnsi="David"/>
-          <w:b w:val="false"/>
-          <w:bCs w:val="false"/>
-          <w:i w:val="false"/>
-          <w:iCs w:val="false"/>
-          <w:sz w:val="24"/>
-          <w:szCs w:val="24"/>
-          <w:rtl/>
-        </w:rPr>
-        <w:t xml:space="preserve">היא התפתחות חדשה יחסית: יישומים המייצרים תוכן חדש, טקסט, תמונה, קול או קוד, על בסיס דפוסים סטטיסטיים שנלמדו ממאגרי עתק. מישרה ואחרים (</w:t>
-      </w:r>
-      <w:r>
-        <w:rPr>
-          <w:rFonts w:ascii="Times New Roman" w:cs="Times New Roman" w:hAnsi="Times New Roman"/>
-          <w:b w:val="false"/>
-          <w:bCs w:val="false"/>
-          <w:i w:val="false"/>
-          <w:iCs w:val="false"/>
-          <w:sz w:val="24"/>
-          <w:szCs w:val="24"/>
-          <w:rtl w:val="false"/>
-        </w:rPr>
-        <w:t xml:space="preserve">Mishra et al., 2023) </w:t>
-      </w:r>
-      <w:r>
-        <w:rPr>
-          <w:rFonts w:ascii="David" w:cs="David" w:hAnsi="David"/>
-          <w:b w:val="false"/>
-          <w:bCs w:val="false"/>
-          <w:i w:val="false"/>
-          <w:iCs w:val="false"/>
-          <w:sz w:val="24"/>
-          <w:szCs w:val="24"/>
-          <w:rtl/>
-        </w:rPr>
-        <w:t xml:space="preserve">מדגישים שמודל שפה גדול איננו מנוע חיפוש: הוא אינו שולף טקסט קיים אלא מחולל תשובה חדשה בכל פנייה. לצד שלוש תכונות המאפיינות כל טכנולוגיה דיגיטלית, רב-שימושיות, אטימות ואי-יציבות, הם מציינים שתי תכונות ייחודיות לבינה מלאכותית יוצרת: היא יוצרת, כלומר מפיקה תוצר ייחודי בכל אינטראקציה, והיא חברתית, כלומר בני אדם נוטים להאניש אותה ולתקשר איתה כאילו הייתה זולת ממשי (</w:t>
-      </w:r>
-      <w:r>
-        <w:rPr>
-          <w:rFonts w:ascii="Times New Roman" w:cs="Times New Roman" w:hAnsi="Times New Roman"/>
-          <w:b w:val="false"/>
-          <w:bCs w:val="false"/>
-          <w:i w:val="false"/>
-          <w:iCs w:val="false"/>
-          <w:sz w:val="24"/>
-          <w:szCs w:val="24"/>
-          <w:rtl w:val="false"/>
-        </w:rPr>
-        <w:t xml:space="preserve">Mishra et al., 2023).</w:t>
+        <w:t xml:space="preserve">בינה מלאכותית היא תוכנת מחשב המדמה תהליכי חשיבה אנושיים לשם ביצוע משימות. פעולתה נשענת על ארבעה עקרונות: כריית נתונים בהיקפים גדולים; זיהוי דפוסים והקשרים המאפשר חיזוי מגמות; למידת מכונה, שבה המערכת משפרת את ביצועיה מתוך הנתונים עצמם; ואוטונומיה, כלומר קבלת החלטות עצמאית על בסיס ניתוח הנתונים, תוך למידה, התפתחות ותגובה בזמן אמת </w:t>
+      </w:r>
+      <w:r>
+        <w:rPr>
+          <w:rFonts w:ascii="Times New Roman" w:cs="Times New Roman" w:hAnsi="Times New Roman"/>
+          <w:b w:val="false"/>
+          <w:bCs w:val="false"/>
+          <w:i w:val="false"/>
+          <w:iCs w:val="false"/>
+          <w:sz w:val="24"/>
+          <w:szCs w:val="24"/>
+          <w:rtl w:val="false"/>
+        </w:rPr>
+        <w:t xml:space="preserve">(Holmes &amp; Miao, 2023).</w:t>
+      </w:r>
+    </w:p>
+    <w:p>
+      <w:pPr>
+        <w:bidi/>
+        <w:spacing w:after="120" w:line="360" w:lineRule="auto"/>
+        <w:jc w:val="both"/>
+      </w:pPr>
+      <w:r>
+        <w:rPr>
+          <w:rFonts w:ascii="David" w:cs="David" w:hAnsi="David"/>
+          <w:b w:val="false"/>
+          <w:bCs w:val="false"/>
+          <w:i w:val="false"/>
+          <w:iCs w:val="false"/>
+          <w:sz w:val="24"/>
+          <w:szCs w:val="24"/>
+          <w:rtl/>
+        </w:rPr>
+        <w:t xml:space="preserve">בינה מלאכותית יוצרת </w:t>
+      </w:r>
+      <w:r>
+        <w:rPr>
+          <w:rFonts w:ascii="Times New Roman" w:cs="Times New Roman" w:hAnsi="Times New Roman"/>
+          <w:b w:val="false"/>
+          <w:bCs w:val="false"/>
+          <w:i w:val="false"/>
+          <w:iCs w:val="false"/>
+          <w:sz w:val="24"/>
+          <w:szCs w:val="24"/>
+          <w:rtl w:val="false"/>
+        </w:rPr>
+        <w:t xml:space="preserve">(Generative AI) </w:t>
+      </w:r>
+      <w:r>
+        <w:rPr>
+          <w:rFonts w:ascii="David" w:cs="David" w:hAnsi="David"/>
+          <w:b w:val="false"/>
+          <w:bCs w:val="false"/>
+          <w:i w:val="false"/>
+          <w:iCs w:val="false"/>
+          <w:sz w:val="24"/>
+          <w:szCs w:val="24"/>
+          <w:rtl/>
+        </w:rPr>
+        <w:t xml:space="preserve">היא התפתחות חדשה יחסית בתוך התחום: יישומים המייצרים תוכן חדש, טקסט, תמונה, קול, וידאו או קוד, על בסיס דפוסים סטטיסטיים שנלמדו ממאגרי עתק. מודלי שפה גדולים, דוגמת אלה שבבסיס </w:t>
+      </w:r>
+      <w:r>
+        <w:rPr>
+          <w:rFonts w:ascii="Times New Roman" w:cs="Times New Roman" w:hAnsi="Times New Roman"/>
+          <w:b w:val="false"/>
+          <w:bCs w:val="false"/>
+          <w:i w:val="false"/>
+          <w:iCs w:val="false"/>
+          <w:sz w:val="24"/>
+          <w:szCs w:val="24"/>
+          <w:rtl w:val="false"/>
+        </w:rPr>
+        <w:t xml:space="preserve">ChatGPT, </w:t>
+      </w:r>
+      <w:r>
+        <w:rPr>
+          <w:rFonts w:ascii="David" w:cs="David" w:hAnsi="David"/>
+          <w:b w:val="false"/>
+          <w:bCs w:val="false"/>
+          <w:i w:val="false"/>
+          <w:iCs w:val="false"/>
+          <w:sz w:val="24"/>
+          <w:szCs w:val="24"/>
+          <w:rtl/>
+        </w:rPr>
+        <w:t xml:space="preserve">אומנו על מיליארדי משפטים, ומישרה ואחרים </w:t>
+      </w:r>
+      <w:r>
+        <w:rPr>
+          <w:rFonts w:ascii="Times New Roman" w:cs="Times New Roman" w:hAnsi="Times New Roman"/>
+          <w:b w:val="false"/>
+          <w:bCs w:val="false"/>
+          <w:i w:val="false"/>
+          <w:iCs w:val="false"/>
+          <w:sz w:val="24"/>
+          <w:szCs w:val="24"/>
+          <w:rtl w:val="false"/>
+        </w:rPr>
+        <w:t xml:space="preserve">(Mishra et al., 2023) </w:t>
+      </w:r>
+      <w:r>
+        <w:rPr>
+          <w:rFonts w:ascii="David" w:cs="David" w:hAnsi="David"/>
+          <w:b w:val="false"/>
+          <w:bCs w:val="false"/>
+          <w:i w:val="false"/>
+          <w:iCs w:val="false"/>
+          <w:sz w:val="24"/>
+          <w:szCs w:val="24"/>
+          <w:rtl/>
+        </w:rPr>
+        <w:t xml:space="preserve">מדגישים שאין מדובר במנוע חיפוש: המודל אינו שולף טקסט קיים ממאגר אלא מחולל תשובה חדשה בכל פנייה. לטכנולוגיה זו שלוש תכונות המאפיינות כל טכנולוגיה דיגיטלית אך מופיעות בה בעוצמה יתרה: היא רב-שימושית, כלומר משמשת מטרות רבות ושונות; היא אטומה, שכן דרך פעולתה הפנימית סמויה גם ממפתחיה; והיא בלתי יציבה, נוטה לטעויות ול"הזיות", כלומר להמצאת מידע שנשמע אמין אך אינו נכון. נוסף על אלה, מישרה ואחרים </w:t>
+      </w:r>
+      <w:r>
+        <w:rPr>
+          <w:rFonts w:ascii="Times New Roman" w:cs="Times New Roman" w:hAnsi="Times New Roman"/>
+          <w:b w:val="false"/>
+          <w:bCs w:val="false"/>
+          <w:i w:val="false"/>
+          <w:iCs w:val="false"/>
+          <w:sz w:val="24"/>
+          <w:szCs w:val="24"/>
+          <w:rtl w:val="false"/>
+        </w:rPr>
+        <w:t xml:space="preserve">(Mishra et al., 2023) </w:t>
+      </w:r>
+      <w:r>
+        <w:rPr>
+          <w:rFonts w:ascii="David" w:cs="David" w:hAnsi="David"/>
+          <w:b w:val="false"/>
+          <w:bCs w:val="false"/>
+          <w:i w:val="false"/>
+          <w:iCs w:val="false"/>
+          <w:sz w:val="24"/>
+          <w:szCs w:val="24"/>
+          <w:rtl/>
+        </w:rPr>
+        <w:t xml:space="preserve">מזהים שתי תכונות מהפכניות ייחודיות לה: היא יוצרת, שכן כל תגובה שלה ייחודית ונוצרת בזמן אמת, באופן שמפתיע לעיתים גם את מתכנניה, והיא חברתית, שכן בני אדם מתקשרים איתה בשפה טבעית ונוטים כמעט אוטומטית להאניש אותה ולייחס לה אישיות וכוונות.</w:t>
       </w:r>
     </w:p>
     <w:p>
@@ -1189,72 +1615,105 @@
           <w:szCs w:val="24"/>
           <w:rtl/>
         </w:rPr>
-        <w:t xml:space="preserve">סקירה שיטתית של המחקר על בינה מלאכותית בעבודת מורים מיפתה יישומים בשלושה שלבי הוראה: בתכנון, ביצירת חומרי למידה ובהתאמתם לרמות שונות; ביישום, בהוראה מותאמת אישית ובמתן משוב בזמן אמת; ובהערכה, בבדיקה אוטומטית ובזיהוי קשיים של לומדים (</w:t>
-      </w:r>
-      <w:r>
-        <w:rPr>
-          <w:rFonts w:ascii="Times New Roman" w:cs="Times New Roman" w:hAnsi="Times New Roman"/>
-          <w:b w:val="false"/>
-          <w:bCs w:val="false"/>
-          <w:i w:val="false"/>
-          <w:iCs w:val="false"/>
-          <w:sz w:val="24"/>
-          <w:szCs w:val="24"/>
-          <w:rtl w:val="false"/>
-        </w:rPr>
-        <w:t xml:space="preserve">Celik et al., 2022). </w:t>
-      </w:r>
-      <w:r>
-        <w:rPr>
-          <w:rFonts w:ascii="David" w:cs="David" w:hAnsi="David"/>
-          <w:b w:val="false"/>
-          <w:bCs w:val="false"/>
-          <w:i w:val="false"/>
-          <w:iCs w:val="false"/>
-          <w:sz w:val="24"/>
-          <w:szCs w:val="24"/>
-          <w:rtl/>
-        </w:rPr>
-        <w:t xml:space="preserve">לצד היישומים הממוקדים במורה, מתפתח שיח על "תחום התיאום": חלוקת התפקידים והמשימות בין האדם ובין הבינה המלאכותית בתהלכי למידה וקוגניציה, כך שהטכנולוגיה תתמוך בלמידה ולא תחליף את החשיבה של הלומד (</w:t>
-      </w:r>
-      <w:r>
-        <w:rPr>
-          <w:rFonts w:ascii="Times New Roman" w:cs="Times New Roman" w:hAnsi="Times New Roman"/>
-          <w:b w:val="false"/>
-          <w:bCs w:val="false"/>
-          <w:i w:val="false"/>
-          <w:iCs w:val="false"/>
-          <w:sz w:val="24"/>
-          <w:szCs w:val="24"/>
-          <w:rtl w:val="false"/>
-        </w:rPr>
-        <w:t xml:space="preserve">Gašević et al., 2023). </w:t>
-      </w:r>
-      <w:r>
-        <w:rPr>
-          <w:rFonts w:ascii="David" w:cs="David" w:hAnsi="David"/>
-          <w:b w:val="false"/>
-          <w:bCs w:val="false"/>
-          <w:i w:val="false"/>
-          <w:iCs w:val="false"/>
-          <w:sz w:val="24"/>
-          <w:szCs w:val="24"/>
-          <w:rtl/>
-        </w:rPr>
-        <w:t xml:space="preserve">גישת אונסק"ו מדגישה בהקשר זה שילוב ממוקד אדם, שבו ההחלטות הפדגוגיות נשארות בידי אנשי החינוך (</w:t>
-      </w:r>
-      <w:r>
-        <w:rPr>
-          <w:rFonts w:ascii="Times New Roman" w:cs="Times New Roman" w:hAnsi="Times New Roman"/>
-          <w:b w:val="false"/>
-          <w:bCs w:val="false"/>
-          <w:i w:val="false"/>
-          <w:iCs w:val="false"/>
-          <w:sz w:val="24"/>
-          <w:szCs w:val="24"/>
-          <w:rtl w:val="false"/>
-        </w:rPr>
-        <w:t xml:space="preserve">Holmes &amp; Miao, 2023).</w:t>
+        <w:t xml:space="preserve">סקירה שיטתית של המחקר על בינה מלאכותית בעבודת מורים מיפתה את היישומים לפי שלושה שלבי הוראה. בשלב התכנון הכלים מסייעים בבניית מערכי שיעור, ביצירת חומרי למידה ובהתאמתם לרמות שונות של לומדים. בשלב היישום הם מאפשרים הוראה מותאמת אישית, תרגול מודרך ומתן משוב בזמן אמת לכל לומד. בשלב ההערכה הם תומכים בבדיקה אוטומטית של משימות, בניתוח דפוסי למידה ובזיהוי מוקדם של קשיים </w:t>
+      </w:r>
+      <w:r>
+        <w:rPr>
+          <w:rFonts w:ascii="Times New Roman" w:cs="Times New Roman" w:hAnsi="Times New Roman"/>
+          <w:b w:val="false"/>
+          <w:bCs w:val="false"/>
+          <w:i w:val="false"/>
+          <w:iCs w:val="false"/>
+          <w:sz w:val="24"/>
+          <w:szCs w:val="24"/>
+          <w:rtl w:val="false"/>
+        </w:rPr>
+        <w:t xml:space="preserve">(Celik et al., 2022). </w:t>
+      </w:r>
+      <w:r>
+        <w:rPr>
+          <w:rFonts w:ascii="David" w:cs="David" w:hAnsi="David"/>
+          <w:b w:val="false"/>
+          <w:bCs w:val="false"/>
+          <w:i w:val="false"/>
+          <w:iCs w:val="false"/>
+          <w:sz w:val="24"/>
+          <w:szCs w:val="24"/>
+          <w:rtl/>
+        </w:rPr>
+        <w:t xml:space="preserve">המחברים מציינים שהמחקר בתחום נוטה להתמקד בפוטנציאל הטכנולוגי, ושקולם של המורים עצמם, צורכיהם והכשרתם, נשמע בו פחות </w:t>
+      </w:r>
+      <w:r>
+        <w:rPr>
+          <w:rFonts w:ascii="Times New Roman" w:cs="Times New Roman" w:hAnsi="Times New Roman"/>
+          <w:b w:val="false"/>
+          <w:bCs w:val="false"/>
+          <w:i w:val="false"/>
+          <w:iCs w:val="false"/>
+          <w:sz w:val="24"/>
+          <w:szCs w:val="24"/>
+          <w:rtl w:val="false"/>
+        </w:rPr>
+        <w:t xml:space="preserve">(Celik et al., 2022).</w:t>
+      </w:r>
+    </w:p>
+    <w:p>
+      <w:pPr>
+        <w:bidi/>
+        <w:spacing w:after="120" w:line="360" w:lineRule="auto"/>
+        <w:jc w:val="both"/>
+      </w:pPr>
+      <w:r>
+        <w:rPr>
+          <w:rFonts w:ascii="David" w:cs="David" w:hAnsi="David"/>
+          <w:b w:val="false"/>
+          <w:bCs w:val="false"/>
+          <w:i w:val="false"/>
+          <w:iCs w:val="false"/>
+          <w:sz w:val="24"/>
+          <w:szCs w:val="24"/>
+          <w:rtl/>
+        </w:rPr>
+        <w:t xml:space="preserve">לצד היישומים הממוקדים במורה מתפתח שיח רחב יותר על "תחום התיאום": הממשק וחלוקת התפקידים בין האדם ובין הבינה המלאכותית בהקשרים של למידה וקוגניציה. השאלה המרכזית היא אילו תהליכים קוגניטיביים ראוי שהלומד יבצע בעצמו כדי שתתרחש למידה, ואילו אפשר להפקיד בידי המכונה מבלי לרוקן את הלמידה מתוכן. הפקדה גורפת של החשיבה בידי הכלי עלולה לפגוע דווקא במיומנויות שהלמידה נועדה לפתח </w:t>
+      </w:r>
+      <w:r>
+        <w:rPr>
+          <w:rFonts w:ascii="Times New Roman" w:cs="Times New Roman" w:hAnsi="Times New Roman"/>
+          <w:b w:val="false"/>
+          <w:bCs w:val="false"/>
+          <w:i w:val="false"/>
+          <w:iCs w:val="false"/>
+          <w:sz w:val="24"/>
+          <w:szCs w:val="24"/>
+          <w:rtl w:val="false"/>
+        </w:rPr>
+        <w:t xml:space="preserve">(Gašević et al., 2023). </w:t>
+      </w:r>
+      <w:r>
+        <w:rPr>
+          <w:rFonts w:ascii="David" w:cs="David" w:hAnsi="David"/>
+          <w:b w:val="false"/>
+          <w:bCs w:val="false"/>
+          <w:i w:val="false"/>
+          <w:iCs w:val="false"/>
+          <w:sz w:val="24"/>
+          <w:szCs w:val="24"/>
+          <w:rtl/>
+        </w:rPr>
+        <w:t xml:space="preserve">ברוח דומה, גישת אונסק"ו מדגישה שילוב ממוקד אדם: ההחלטות הפדגוגיות והאחריות עליהן נשארות בידי אנשי החינוך, והטכנולוגיה נבחנת תמיד לפי תרומתה ללמידה וליכולת האנושית </w:t>
+      </w:r>
+      <w:r>
+        <w:rPr>
+          <w:rFonts w:ascii="Times New Roman" w:cs="Times New Roman" w:hAnsi="Times New Roman"/>
+          <w:b w:val="false"/>
+          <w:bCs w:val="false"/>
+          <w:i w:val="false"/>
+          <w:iCs w:val="false"/>
+          <w:sz w:val="24"/>
+          <w:szCs w:val="24"/>
+          <w:rtl w:val="false"/>
+        </w:rPr>
+        <w:t xml:space="preserve">(Holmes &amp; Miao, 2023).</w:t>
       </w:r>
     </w:p>
     <w:p>
@@ -1294,59 +1753,105 @@
           <w:szCs w:val="24"/>
           <w:rtl/>
         </w:rPr>
-        <w:t xml:space="preserve">היתרונות המתועדים בספרות כוללים למידה מותאמת אישית, משוב מיידי, הנגשה של תכנים ללומדים מתקשים והפחתת עומס העבודה של המורה (</w:t>
-      </w:r>
-      <w:r>
-        <w:rPr>
-          <w:rFonts w:ascii="Times New Roman" w:cs="Times New Roman" w:hAnsi="Times New Roman"/>
-          <w:b w:val="false"/>
-          <w:bCs w:val="false"/>
-          <w:i w:val="false"/>
-          <w:iCs w:val="false"/>
-          <w:sz w:val="24"/>
-          <w:szCs w:val="24"/>
-          <w:rtl w:val="false"/>
-        </w:rPr>
-        <w:t xml:space="preserve">Celik et al., 2022; Mishra et al., 2023). </w:t>
-      </w:r>
-      <w:r>
-        <w:rPr>
-          <w:rFonts w:ascii="David" w:cs="David" w:hAnsi="David"/>
-          <w:b w:val="false"/>
-          <w:bCs w:val="false"/>
-          <w:i w:val="false"/>
-          <w:iCs w:val="false"/>
-          <w:sz w:val="24"/>
-          <w:szCs w:val="24"/>
-          <w:rtl/>
-        </w:rPr>
-        <w:t xml:space="preserve">מנגד עולים אתגרים של ממש: פגיעה אפשרית ביושרה האקדמית, מידע שגוי ו"הזיות" של המודלים, הטיות מגדריות ותרבותיות המוטמעות בנתוני האימון, פערי נגישות בין לומדים וסוגיות של זכויות יוצרים (</w:t>
-      </w:r>
-      <w:r>
-        <w:rPr>
-          <w:rFonts w:ascii="Times New Roman" w:cs="Times New Roman" w:hAnsi="Times New Roman"/>
-          <w:b w:val="false"/>
-          <w:bCs w:val="false"/>
-          <w:i w:val="false"/>
-          <w:iCs w:val="false"/>
-          <w:sz w:val="24"/>
-          <w:szCs w:val="24"/>
-          <w:rtl w:val="false"/>
-        </w:rPr>
-        <w:t xml:space="preserve">Holmes &amp; Miao, 2023; Mishra et al., 2023). </w:t>
-      </w:r>
-      <w:r>
-        <w:rPr>
-          <w:rFonts w:ascii="David" w:cs="David" w:hAnsi="David"/>
-          <w:b w:val="false"/>
-          <w:bCs w:val="false"/>
-          <w:i w:val="false"/>
-          <w:iCs w:val="false"/>
-          <w:sz w:val="24"/>
-          <w:szCs w:val="24"/>
-          <w:rtl/>
-        </w:rPr>
-        <w:t xml:space="preserve">בישראל משרד החינוך מעודד את השילוב אך מסדיר אותו: ההנחיות מגדירות קוד אתי הכולל עקרונות של פרטיות, שוויון ומניעת הטיה, שקיפות, אחריותיות ואמינות, ומחייבות הסכמה מודעת של הורים, שימוש בכלים מאושרים בלבד, התאמת השימוש לגיל והכשרה של מורים ותלמידים (משרד החינוך, 2025).</w:t>
+        <w:t xml:space="preserve">היתרונות המתועדים בספרות ניכרים: למידה מותאמת אישית בקנה מידה שלא היה אפשרי קודם, משוב מיידי וזמין לכל לומד, הנגשת תכנים ללומדים מתקשים וללומדים בעלי צרכים מיוחדים, תמיכה בביטוי יצירתי והפחתה של ממש בעומס העבודה של המורה בהכנת חומרים ובבדיקתם </w:t>
+      </w:r>
+      <w:r>
+        <w:rPr>
+          <w:rFonts w:ascii="Times New Roman" w:cs="Times New Roman" w:hAnsi="Times New Roman"/>
+          <w:b w:val="false"/>
+          <w:bCs w:val="false"/>
+          <w:i w:val="false"/>
+          <w:iCs w:val="false"/>
+          <w:sz w:val="24"/>
+          <w:szCs w:val="24"/>
+          <w:rtl w:val="false"/>
+        </w:rPr>
+        <w:t xml:space="preserve">(Celik et al., 2022; Mishra et al., 2023). </w:t>
+      </w:r>
+      <w:r>
+        <w:rPr>
+          <w:rFonts w:ascii="David" w:cs="David" w:hAnsi="David"/>
+          <w:b w:val="false"/>
+          <w:bCs w:val="false"/>
+          <w:i w:val="false"/>
+          <w:iCs w:val="false"/>
+          <w:sz w:val="24"/>
+          <w:szCs w:val="24"/>
+          <w:rtl/>
+        </w:rPr>
+        <w:t xml:space="preserve">מנגד עולים אתגרים כבדי משקל: חשש לפגיעה ביושרה האקדמית כאשר לומדים מגישים תוצרים שהכלי יצר, ובצדו כלי זיהוי בלתי אמינים המייצרים האשמות שווא; מידע שגוי ו"הזיות" של המודלים; הטיות מגדריות, תרבותיות וגזעיות המוטמעות בנתוני האימון; פערי נגישות בין לומדים ובין בתי ספר; וסוגיות פתוחות של זכויות יוצרים </w:t>
+      </w:r>
+      <w:r>
+        <w:rPr>
+          <w:rFonts w:ascii="Times New Roman" w:cs="Times New Roman" w:hAnsi="Times New Roman"/>
+          <w:b w:val="false"/>
+          <w:bCs w:val="false"/>
+          <w:i w:val="false"/>
+          <w:iCs w:val="false"/>
+          <w:sz w:val="24"/>
+          <w:szCs w:val="24"/>
+          <w:rtl w:val="false"/>
+        </w:rPr>
+        <w:t xml:space="preserve">(Holmes &amp; Miao, 2023; Mishra et al., 2023). </w:t>
+      </w:r>
+      <w:r>
+        <w:rPr>
+          <w:rFonts w:ascii="David" w:cs="David" w:hAnsi="David"/>
+          <w:b w:val="false"/>
+          <w:bCs w:val="false"/>
+          <w:i w:val="false"/>
+          <w:iCs w:val="false"/>
+          <w:sz w:val="24"/>
+          <w:szCs w:val="24"/>
+          <w:rtl/>
+        </w:rPr>
+        <w:t xml:space="preserve">מישרה ואחרים </w:t>
+      </w:r>
+      <w:r>
+        <w:rPr>
+          <w:rFonts w:ascii="Times New Roman" w:cs="Times New Roman" w:hAnsi="Times New Roman"/>
+          <w:b w:val="false"/>
+          <w:bCs w:val="false"/>
+          <w:i w:val="false"/>
+          <w:iCs w:val="false"/>
+          <w:sz w:val="24"/>
+          <w:szCs w:val="24"/>
+          <w:rtl w:val="false"/>
+        </w:rPr>
+        <w:t xml:space="preserve">(Mishra et al., 2023) </w:t>
+      </w:r>
+      <w:r>
+        <w:rPr>
+          <w:rFonts w:ascii="David" w:cs="David" w:hAnsi="David"/>
+          <w:b w:val="false"/>
+          <w:bCs w:val="false"/>
+          <w:i w:val="false"/>
+          <w:iCs w:val="false"/>
+          <w:sz w:val="24"/>
+          <w:szCs w:val="24"/>
+          <w:rtl/>
+        </w:rPr>
+        <w:t xml:space="preserve">מזהירים מפני חשיבה דיכוטומית של איסור גורף או אימוץ נלהב: הכלים כאן כדי להישאר, ותפקיד אנשי החינוך הוא להבין את חוזקותיהם ואת חולשותיהם.</w:t>
+      </w:r>
+    </w:p>
+    <w:p>
+      <w:pPr>
+        <w:bidi/>
+        <w:spacing w:after="120" w:line="360" w:lineRule="auto"/>
+        <w:jc w:val="both"/>
+      </w:pPr>
+      <w:r>
+        <w:rPr>
+          <w:rFonts w:ascii="David" w:cs="David" w:hAnsi="David"/>
+          <w:b w:val="false"/>
+          <w:bCs w:val="false"/>
+          <w:i w:val="false"/>
+          <w:iCs w:val="false"/>
+          <w:sz w:val="24"/>
+          <w:szCs w:val="24"/>
+          <w:rtl/>
+        </w:rPr>
+        <w:t xml:space="preserve">בישראל משרד החינוך מעודד את השילוב אך מסדיר אותו ברגולציה מחייבת. ההנחיות מגדירות קוד אתי בן חמישה עקרונות: פרטיות; שוויון ומניעת אפליה והטיה; שקיפות והסברתיות; אחריותיות; ואמינות, עמידות, אבטחה ובטיחות. בצד העקרונות נקבעו כללים מעשיים: חובת הסכמה מודעת של ההורים לשימוש, שמירה על אנונימיות ואיסור שיתוף מידע אישי או רגיש, מחיקת היסטוריית שיחות, התאמת השימוש לגיל הלומדים, שימוש בכלים מאושרים בלבד וחובת הכשרה למורים ולתלמידים (משרד החינוך, 2025). לרגולציה זו חשיבות כפולה למחקר הנוכחי: היא מעצבת את ההקשר שבו פועלים מורי בית הספר היסודי, והיא רלוונטית במיוחד בעבודה עם לומדים צעירים שהם קטינים.</w:t>
       </w:r>
     </w:p>
     <w:p>
@@ -1399,20 +1904,20 @@
           <w:szCs w:val="24"/>
           <w:rtl/>
         </w:rPr>
-        <w:t xml:space="preserve">מישרה ואחרים (</w:t>
-      </w:r>
-      <w:r>
-        <w:rPr>
-          <w:rFonts w:ascii="Times New Roman" w:cs="Times New Roman" w:hAnsi="Times New Roman"/>
-          <w:b w:val="false"/>
-          <w:bCs w:val="false"/>
-          <w:i w:val="false"/>
-          <w:iCs w:val="false"/>
-          <w:sz w:val="24"/>
-          <w:szCs w:val="24"/>
-          <w:rtl w:val="false"/>
-        </w:rPr>
-        <w:t xml:space="preserve">Mishra et al., 2023) </w:t>
+        <w:t xml:space="preserve">מישרה ואחרים </w:t>
+      </w:r>
+      <w:r>
+        <w:rPr>
+          <w:rFonts w:ascii="Times New Roman" w:cs="Times New Roman" w:hAnsi="Times New Roman"/>
+          <w:b w:val="false"/>
+          <w:bCs w:val="false"/>
+          <w:i w:val="false"/>
+          <w:iCs w:val="false"/>
+          <w:sz w:val="24"/>
+          <w:szCs w:val="24"/>
+          <w:rtl w:val="false"/>
+        </w:rPr>
+        <w:t xml:space="preserve">(Mishra et al., 2023) </w:t>
       </w:r>
       <w:r>
         <w:rPr>
@@ -1451,20 +1956,53 @@
           <w:szCs w:val="24"/>
           <w:rtl/>
         </w:rPr>
-        <w:t xml:space="preserve">על הבינה המלאכותית היוצרת ושואלים מה על מורים לדעת כדי להשתמש בה ביעילות. בממד הטכנולוגי-פדגוגי, על המורה להעריך אילו שימושים הולמים תהליכי הוראה ולמידה ואילו לא, לעצב מחדש את ההערכה, למשל באמצעות משימות שבהן הלומד מבקר טיוטה שיצר הכלי, ולסייע ללומדים לעמוד בפני הנטייה להאנשה באמצעות חשיבה ביקורתית. בממד ההקשרי, הידע ההקשרי הוא שיכריע בין הצלחה לכישלון של השילוב: דרישות תכנית הלימודים, תרבות בית הספר וחזונו, המשאבים הזמינים וצורכי הלומדים. מסקנתם הפילוסופית היא שהמורים והבינה המלאכותית הם יוצרים-שותפים, ושהגבולות בין האנושי לטכנולוגי הולכים ומיטשטשים (</w:t>
-      </w:r>
-      <w:r>
-        <w:rPr>
-          <w:rFonts w:ascii="Times New Roman" w:cs="Times New Roman" w:hAnsi="Times New Roman"/>
-          <w:b w:val="false"/>
-          <w:bCs w:val="false"/>
-          <w:i w:val="false"/>
-          <w:iCs w:val="false"/>
-          <w:sz w:val="24"/>
-          <w:szCs w:val="24"/>
-          <w:rtl w:val="false"/>
-        </w:rPr>
-        <w:t xml:space="preserve">Mishra et al., 2023).</w:t>
+        <w:t xml:space="preserve">על הבינה המלאכותית היוצרת ושואלים מה על מורים לדעת כדי להשתמש בה ביעילות. בממד הטכנולוגי-פדגוגי, על המורה להעריך אילו שימושים הולמים תהליכי הוראה ולמידה ואילו אינם הולמים, ולעצב מחדש את ההערכה: למשל, במקום מטלת כתיבה שהכלי מסוגל לבצע, משימה שבה הלומד מבקר, משפר ומעריך טיוטה שיצר הכלי, באופן המזמן חשיבה מסדר גבוה. עליו גם ללמד ניסוח הנחיות מדויק ולסייע ללומדים לעמוד בפני הנטייה להאניש את הכלי, באמצעות חשיבה ביקורתית ואיטית. בממד הטכנולוגי-תוכני, הבינה המלאכותית צפויה לשנות כל מקצוע עתיר ידע, ולכן יש לשוב ולבחון מה ראוי ללמד בכל תחום דעת, בדומה לשאלות שעוררו המחשבונים בהוראת המתמטיקה </w:t>
+      </w:r>
+      <w:r>
+        <w:rPr>
+          <w:rFonts w:ascii="Times New Roman" w:cs="Times New Roman" w:hAnsi="Times New Roman"/>
+          <w:b w:val="false"/>
+          <w:bCs w:val="false"/>
+          <w:i w:val="false"/>
+          <w:iCs w:val="false"/>
+          <w:sz w:val="24"/>
+          <w:szCs w:val="24"/>
+          <w:rtl w:val="false"/>
+        </w:rPr>
+        <w:t xml:space="preserve">(Mishra et al., 2023).</w:t>
+      </w:r>
+    </w:p>
+    <w:p>
+      <w:pPr>
+        <w:bidi/>
+        <w:spacing w:after="120" w:line="360" w:lineRule="auto"/>
+        <w:jc w:val="both"/>
+      </w:pPr>
+      <w:r>
+        <w:rPr>
+          <w:rFonts w:ascii="David" w:cs="David" w:hAnsi="David"/>
+          <w:b w:val="false"/>
+          <w:bCs w:val="false"/>
+          <w:i w:val="false"/>
+          <w:iCs w:val="false"/>
+          <w:sz w:val="24"/>
+          <w:szCs w:val="24"/>
+          <w:rtl/>
+        </w:rPr>
+        <w:t xml:space="preserve">הממד השלישי, הידע ההקשרי, מקבל במודל זה מעמד מכריע. הצלחת השילוב תלויה בדרישות תכנית הלימודים, בתרבות בית הספר ובחזונו, במשאבים הזמינים ובצרכים הספציפיים של הלומדים, ומדיניות אוסרת עלולה לסכל גם את המורה המיומן ביותר. המחברים מרחיבים את מושג ההקשר עוד יותר: הבינה המלאכותית היוצרת משפיעה על הפרט ועל החברה כולה, ולכן תשנה גם את ההקשר החינוכי הרחב, והידע ההקשרי הוא שיבחין בין הצלחה לכישלון של השילוב. מסקנתם היא שהמורים והבינה המלאכותית הם יוצרים-שותפים, המעצבים זה את זה, ושהגבולות בין האנושי לטכנולוגי הולכים ומיטשטשים </w:t>
+      </w:r>
+      <w:r>
+        <w:rPr>
+          <w:rFonts w:ascii="Times New Roman" w:cs="Times New Roman" w:hAnsi="Times New Roman"/>
+          <w:b w:val="false"/>
+          <w:bCs w:val="false"/>
+          <w:i w:val="false"/>
+          <w:iCs w:val="false"/>
+          <w:sz w:val="24"/>
+          <w:szCs w:val="24"/>
+          <w:rtl w:val="false"/>
+        </w:rPr>
+        <w:t xml:space="preserve">(Mishra et al., 2023).</w:t>
       </w:r>
     </w:p>
     <w:p>
@@ -1525,46 +2063,59 @@
           <w:szCs w:val="24"/>
           <w:rtl/>
         </w:rPr>
-        <w:t xml:space="preserve">אוריינות בינה מלאכותית מוגדרת כמכלול של ידע, כישורים ועמדות המאפשרים לפרט להבין טכנולוגיות בינה מלאכותית, להשתמש בהן ולהעריך אותן באופן מושכל, אתי וביקורתי. בספרות מקובלת חלוקה לארבעה מרכיבים: הבנה מושגית של הטכנולוגיה, שימוש יעיל בה, חשיבה ביקורתית עליה והתנהלות אתית (</w:t>
-      </w:r>
-      <w:r>
-        <w:rPr>
-          <w:rFonts w:ascii="Times New Roman" w:cs="Times New Roman" w:hAnsi="Times New Roman"/>
-          <w:b w:val="false"/>
-          <w:bCs w:val="false"/>
-          <w:i w:val="false"/>
-          <w:iCs w:val="false"/>
-          <w:sz w:val="24"/>
-          <w:szCs w:val="24"/>
-          <w:rtl w:val="false"/>
-        </w:rPr>
-        <w:t xml:space="preserve">Ng et al., 2021). </w:t>
-      </w:r>
-      <w:r>
-        <w:rPr>
-          <w:rFonts w:ascii="David" w:cs="David" w:hAnsi="David"/>
-          <w:b w:val="false"/>
-          <w:bCs w:val="false"/>
-          <w:i w:val="false"/>
-          <w:iCs w:val="false"/>
-          <w:sz w:val="24"/>
-          <w:szCs w:val="24"/>
-          <w:rtl/>
-        </w:rPr>
-        <w:t xml:space="preserve">ההדגשה איננה על כישורים טכניים בלבד; עיקרה של האוריינות הוא הבנה ביקורתית, אתית וחברתית, והיא נתפסת כיום כאוריינות אזרחית הנחוצה לכלל האוכלוסייה (</w:t>
-      </w:r>
-      <w:r>
-        <w:rPr>
-          <w:rFonts w:ascii="Times New Roman" w:cs="Times New Roman" w:hAnsi="Times New Roman"/>
-          <w:b w:val="false"/>
-          <w:bCs w:val="false"/>
-          <w:i w:val="false"/>
-          <w:iCs w:val="false"/>
-          <w:sz w:val="24"/>
-          <w:szCs w:val="24"/>
-          <w:rtl w:val="false"/>
-        </w:rPr>
-        <w:t xml:space="preserve">Ng et al., 2021).</w:t>
+        <w:t xml:space="preserve">אוריינות בינה מלאכותית מוגדרת כמכלול של ידע, כישורים ועמדות המאפשרים לפרט להבין טכנולוגיות בינה מלאכותית, להשתמש בהן ולהעריך אותן באופן מושכל, אתי וביקורתי. בספרות מקובלת חלוקה לארבעה מרכיבים: הבנה מושגית של הטכנולוגיה ושל עקרונות פעולתה; שימוש יעיל בה לצרכים ממשיים; חשיבה ביקורתית על תוצריה, על מגבלותיה ועל הטיותיה; והתנהלות אתית ואחראית </w:t>
+      </w:r>
+      <w:r>
+        <w:rPr>
+          <w:rFonts w:ascii="Times New Roman" w:cs="Times New Roman" w:hAnsi="Times New Roman"/>
+          <w:b w:val="false"/>
+          <w:bCs w:val="false"/>
+          <w:i w:val="false"/>
+          <w:iCs w:val="false"/>
+          <w:sz w:val="24"/>
+          <w:szCs w:val="24"/>
+          <w:rtl w:val="false"/>
+        </w:rPr>
+        <w:t xml:space="preserve">(Ng et al., 2021). </w:t>
+      </w:r>
+      <w:r>
+        <w:rPr>
+          <w:rFonts w:ascii="David" w:cs="David" w:hAnsi="David"/>
+          <w:b w:val="false"/>
+          <w:bCs w:val="false"/>
+          <w:i w:val="false"/>
+          <w:iCs w:val="false"/>
+          <w:sz w:val="24"/>
+          <w:szCs w:val="24"/>
+          <w:rtl/>
+        </w:rPr>
+        <w:t xml:space="preserve">נג ואחרים </w:t>
+      </w:r>
+      <w:r>
+        <w:rPr>
+          <w:rFonts w:ascii="Times New Roman" w:cs="Times New Roman" w:hAnsi="Times New Roman"/>
+          <w:b w:val="false"/>
+          <w:bCs w:val="false"/>
+          <w:i w:val="false"/>
+          <w:iCs w:val="false"/>
+          <w:sz w:val="24"/>
+          <w:szCs w:val="24"/>
+          <w:rtl w:val="false"/>
+        </w:rPr>
+        <w:t xml:space="preserve">(Ng et al., 2021) </w:t>
+      </w:r>
+      <w:r>
+        <w:rPr>
+          <w:rFonts w:ascii="David" w:cs="David" w:hAnsi="David"/>
+          <w:b w:val="false"/>
+          <w:bCs w:val="false"/>
+          <w:i w:val="false"/>
+          <w:iCs w:val="false"/>
+          <w:sz w:val="24"/>
+          <w:szCs w:val="24"/>
+          <w:rtl/>
+        </w:rPr>
+        <w:t xml:space="preserve">מדגישים שאוריינות בינה מלאכותית איננה שקולה לידע תכנות או לכישורים טכניים: עיקרה הבנה ביקורתית, אתית וחברתית של הטכנולוגיה והשלכותיה, והיא נתפסת כיום כאוריינות אזרחית הנחוצה לכלל האוכלוסייה, בדומה לאוריינות הקריאה והמדיה.</w:t>
       </w:r>
     </w:p>
     <w:p>
@@ -1604,33 +2155,46 @@
           <w:szCs w:val="24"/>
           <w:rtl/>
         </w:rPr>
-        <w:t xml:space="preserve">מוכנות לבינה מלאכותית היא המידה שבה יחיד, ארגון או מערכת ערוכים לאמץ את הטכנולוגיה ולממש את הפוטנציאל שלה. בהקשר החינוכי מדובר במצב ההיערכות של אנשי חינוך לשילוב בינה מלאכותית בהוראה, הכולל גם גישה חיובית כלפי השילוב. וואנג ואחרים (</w:t>
-      </w:r>
-      <w:r>
-        <w:rPr>
-          <w:rFonts w:ascii="Times New Roman" w:cs="Times New Roman" w:hAnsi="Times New Roman"/>
-          <w:b w:val="false"/>
-          <w:bCs w:val="false"/>
-          <w:i w:val="false"/>
-          <w:iCs w:val="false"/>
-          <w:sz w:val="24"/>
-          <w:szCs w:val="24"/>
-          <w:rtl w:val="false"/>
-        </w:rPr>
-        <w:t xml:space="preserve">Wang et al., 2023) </w:t>
-      </w:r>
-      <w:r>
-        <w:rPr>
-          <w:rFonts w:ascii="David" w:cs="David" w:hAnsi="David"/>
-          <w:b w:val="false"/>
-          <w:bCs w:val="false"/>
-          <w:i w:val="false"/>
-          <w:iCs w:val="false"/>
-          <w:sz w:val="24"/>
-          <w:szCs w:val="24"/>
-          <w:rtl/>
-        </w:rPr>
-        <w:t xml:space="preserve">ממשיגים את מוכנות המורים בארבעה ממדים: ידע (קוגניציה), יכולת, חזון ואתיקה, ומראים אמפירית שמורים ברמת מוכנות גבוהה מחזיקים בידע ובמיומנויות הנדרשים לחדשנות ונוטים להתנסות בהזדמנויות שהטכנולוגיה מציעה.</w:t>
+        <w:t xml:space="preserve">מוכנות לבינה מלאכותית היא המידה שבה יחיד, ארגון או מערכת ערוכים לאמץ את הטכנולוגיה, ליישמה ולממש את הפוטנציאל שלה. בהקשר החינוכי מדובר במצב ההיערכות של אנשי חינוך לשילוב בינה מלאכותית בהוראה, הכולל גם גישה ועמדה חיובית כלפי השילוב. וואנג ואחרים </w:t>
+      </w:r>
+      <w:r>
+        <w:rPr>
+          <w:rFonts w:ascii="Times New Roman" w:cs="Times New Roman" w:hAnsi="Times New Roman"/>
+          <w:b w:val="false"/>
+          <w:bCs w:val="false"/>
+          <w:i w:val="false"/>
+          <w:iCs w:val="false"/>
+          <w:sz w:val="24"/>
+          <w:szCs w:val="24"/>
+          <w:rtl w:val="false"/>
+        </w:rPr>
+        <w:t xml:space="preserve">(Wang et al., 2023) </w:t>
+      </w:r>
+      <w:r>
+        <w:rPr>
+          <w:rFonts w:ascii="David" w:cs="David" w:hAnsi="David"/>
+          <w:b w:val="false"/>
+          <w:bCs w:val="false"/>
+          <w:i w:val="false"/>
+          <w:iCs w:val="false"/>
+          <w:sz w:val="24"/>
+          <w:szCs w:val="24"/>
+          <w:rtl/>
+        </w:rPr>
+        <w:t xml:space="preserve">ממשיגים את מוכנות המורים בארבעה ממדים: ידע (קוגניציה), כלומר הבנת הטכנולוגיה ואפשרויותיה; יכולת, כלומר מיומנות מעשית להשתמש בה בהוראה; חזון, כלומר תפיסה של האופן שבו הטכנולוגיה יכולה לקדם את הלמידה; ואתיקה, כלומר מודעות לשימוש אחראי. במחקרם האמפירי הם מראים שמורים ברמת מוכנות גבוהה מחזיקים בידע ובמיומנויות הנדרשים לחדשנות, מתנסים בהזדמנויות שהטכנולוגיה מציעה ומשלבים אותן בעבודתם </w:t>
+      </w:r>
+      <w:r>
+        <w:rPr>
+          <w:rFonts w:ascii="Times New Roman" w:cs="Times New Roman" w:hAnsi="Times New Roman"/>
+          <w:b w:val="false"/>
+          <w:bCs w:val="false"/>
+          <w:i w:val="false"/>
+          <w:iCs w:val="false"/>
+          <w:sz w:val="24"/>
+          <w:szCs w:val="24"/>
+          <w:rtl w:val="false"/>
+        </w:rPr>
+        <w:t xml:space="preserve">(Wang et al., 2023).</w:t>
       </w:r>
     </w:p>
     <w:p>
@@ -1670,72 +2234,92 @@
           <w:szCs w:val="24"/>
           <w:rtl/>
         </w:rPr>
-        <w:t xml:space="preserve">שני המושגים קרובים אך אינם זהים: המוכנות מתמקדת ביכולתו של המורה להשתמש בטכנולוגיה בפועל ולשלבה בפדגוגיה, ואילו האוריינות נוגעת להבנה רחבה של הטכנולוגיה, של השלכותיה ושל האחריות החברתית הכרוכה בשימוש בה (</w:t>
-      </w:r>
-      <w:r>
-        <w:rPr>
-          <w:rFonts w:ascii="Times New Roman" w:cs="Times New Roman" w:hAnsi="Times New Roman"/>
-          <w:b w:val="false"/>
-          <w:bCs w:val="false"/>
-          <w:i w:val="false"/>
-          <w:iCs w:val="false"/>
-          <w:sz w:val="24"/>
-          <w:szCs w:val="24"/>
-          <w:rtl w:val="false"/>
-        </w:rPr>
-        <w:t xml:space="preserve">Ng et al., 2021; Wang et al., 2023). </w:t>
-      </w:r>
-      <w:r>
-        <w:rPr>
-          <w:rFonts w:ascii="David" w:cs="David" w:hAnsi="David"/>
-          <w:b w:val="false"/>
-          <w:bCs w:val="false"/>
-          <w:i w:val="false"/>
-          <w:iCs w:val="false"/>
-          <w:sz w:val="24"/>
-          <w:szCs w:val="24"/>
-          <w:rtl/>
-        </w:rPr>
-        <w:t xml:space="preserve">הקשר ביניהם נבחן גם אמפירית: במחקר שנערך בקרב 368 מורים נמצא שאוריינות טכנולוגית כללית מנבאת את המוכנות ללמד בינה מלאכותית, ושתחושת המסוגלות של המורה היא המנבא החזק ביותר של הכוונה לעסוק בכך בכיתה (</w:t>
-      </w:r>
-      <w:r>
-        <w:rPr>
-          <w:rFonts w:ascii="Times New Roman" w:cs="Times New Roman" w:hAnsi="Times New Roman"/>
-          <w:b w:val="false"/>
-          <w:bCs w:val="false"/>
-          <w:i w:val="false"/>
-          <w:iCs w:val="false"/>
-          <w:sz w:val="24"/>
-          <w:szCs w:val="24"/>
-          <w:rtl w:val="false"/>
-        </w:rPr>
-        <w:t xml:space="preserve">Ayanwale et al., 2022). </w:t>
-      </w:r>
-      <w:r>
-        <w:rPr>
-          <w:rFonts w:ascii="David" w:cs="David" w:hAnsi="David"/>
-          <w:b w:val="false"/>
-          <w:bCs w:val="false"/>
-          <w:i w:val="false"/>
-          <w:iCs w:val="false"/>
-          <w:sz w:val="24"/>
-          <w:szCs w:val="24"/>
-          <w:rtl/>
-        </w:rPr>
-        <w:t xml:space="preserve">מכאן שהמורה נדרש להיות בעצמו לומד אורייני, המעדכן את הידע שלו באופן מתמיד, וכי השקעה בפיתוח מקצועי היא תנאי לשילוב מוצלח (</w:t>
-      </w:r>
-      <w:r>
-        <w:rPr>
-          <w:rFonts w:ascii="Times New Roman" w:cs="Times New Roman" w:hAnsi="Times New Roman"/>
-          <w:b w:val="false"/>
-          <w:bCs w:val="false"/>
-          <w:i w:val="false"/>
-          <w:iCs w:val="false"/>
-          <w:sz w:val="24"/>
-          <w:szCs w:val="24"/>
-          <w:rtl w:val="false"/>
-        </w:rPr>
-        <w:t xml:space="preserve">Ayanwale et al., 2022; Wang et al., 2023).</w:t>
+        <w:t xml:space="preserve">שני המושגים קרובים אך אינם זהים, וההבחנה ביניהם חשובה לניתוח עמדות מורים. המוכנות מתמקדת ביכולתו של המורה להשתמש בטכנולוגיה בפועל ולשלבה בפדגוגיה, בדגש על יישום והיערכות מקצועית, ואילו האוריינות נוגעת להבנה רחבה של הטכנולוגיה, של השלכותיה ושל האחריות החברתית והאתית הכרוכה בשימוש בה </w:t>
+      </w:r>
+      <w:r>
+        <w:rPr>
+          <w:rFonts w:ascii="Times New Roman" w:cs="Times New Roman" w:hAnsi="Times New Roman"/>
+          <w:b w:val="false"/>
+          <w:bCs w:val="false"/>
+          <w:i w:val="false"/>
+          <w:iCs w:val="false"/>
+          <w:sz w:val="24"/>
+          <w:szCs w:val="24"/>
+          <w:rtl w:val="false"/>
+        </w:rPr>
+        <w:t xml:space="preserve">(Ng et al., 2021; Wang et al., 2023). </w:t>
+      </w:r>
+      <w:r>
+        <w:rPr>
+          <w:rFonts w:ascii="David" w:cs="David" w:hAnsi="David"/>
+          <w:b w:val="false"/>
+          <w:bCs w:val="false"/>
+          <w:i w:val="false"/>
+          <w:iCs w:val="false"/>
+          <w:sz w:val="24"/>
+          <w:szCs w:val="24"/>
+          <w:rtl/>
+        </w:rPr>
+        <w:t xml:space="preserve">מורה יכול להיות אורייני, כלומר להבין היטב מהי בינה מלאכותית ומהן מגבלותיה, ועדיין לא להיות מוכן לשלבה בשיעוריו, ולהפך.</w:t>
+      </w:r>
+    </w:p>
+    <w:p>
+      <w:pPr>
+        <w:bidi/>
+        <w:spacing w:after="120" w:line="360" w:lineRule="auto"/>
+        <w:jc w:val="both"/>
+      </w:pPr>
+      <w:r>
+        <w:rPr>
+          <w:rFonts w:ascii="David" w:cs="David" w:hAnsi="David"/>
+          <w:b w:val="false"/>
+          <w:bCs w:val="false"/>
+          <w:i w:val="false"/>
+          <w:iCs w:val="false"/>
+          <w:sz w:val="24"/>
+          <w:szCs w:val="24"/>
+          <w:rtl/>
+        </w:rPr>
+        <w:t xml:space="preserve">הקשר בין המושגים נבחן גם אמפירית. במחקר שנערך בקרב 368 מורים בפועל, מבית הספר היסודי ועד התיכון, נמצא שאוריינות טכנולוגית כללית מנבאת את מוכנות המורים ללמד בינה מלאכותית, ושתחושת הביטחון של המורה ביכולתו ללמד את התחום היא המנבא החזק ביותר של כוונתו לעשות זאת בפועל. הרלוונטיות הנתפסת של התחום נמצאה המנבא החזק ביותר של המוכנות עצמה, והמודל כולו הסביר כשמונים אחוזים מהשונות בכוונת ההוראה </w:t>
+      </w:r>
+      <w:r>
+        <w:rPr>
+          <w:rFonts w:ascii="Times New Roman" w:cs="Times New Roman" w:hAnsi="Times New Roman"/>
+          <w:b w:val="false"/>
+          <w:bCs w:val="false"/>
+          <w:i w:val="false"/>
+          <w:iCs w:val="false"/>
+          <w:sz w:val="24"/>
+          <w:szCs w:val="24"/>
+          <w:rtl w:val="false"/>
+        </w:rPr>
+        <w:t xml:space="preserve">(Ayanwale et al., 2022). </w:t>
+      </w:r>
+      <w:r>
+        <w:rPr>
+          <w:rFonts w:ascii="David" w:cs="David" w:hAnsi="David"/>
+          <w:b w:val="false"/>
+          <w:bCs w:val="false"/>
+          <w:i w:val="false"/>
+          <w:iCs w:val="false"/>
+          <w:sz w:val="24"/>
+          <w:szCs w:val="24"/>
+          <w:rtl/>
+        </w:rPr>
+        <w:t xml:space="preserve">מכאן שהמורה נדרש להיות בעצמו לומד אורייני, המעדכן את הידע שלו באופן מתמיד, ושהשקעה בפיתוח מקצועי מעשי היא תנאי לשילוב מוצלח </w:t>
+      </w:r>
+      <w:r>
+        <w:rPr>
+          <w:rFonts w:ascii="Times New Roman" w:cs="Times New Roman" w:hAnsi="Times New Roman"/>
+          <w:b w:val="false"/>
+          <w:bCs w:val="false"/>
+          <w:i w:val="false"/>
+          <w:iCs w:val="false"/>
+          <w:sz w:val="24"/>
+          <w:szCs w:val="24"/>
+          <w:rtl w:val="false"/>
+        </w:rPr>
+        <w:t xml:space="preserve">(Ayanwale et al., 2022; Wang et al., 2023).</w:t>
       </w:r>
     </w:p>
     <w:p>
@@ -1796,46 +2380,118 @@
           <w:szCs w:val="24"/>
           <w:rtl/>
         </w:rPr>
-        <w:t xml:space="preserve">האנגלית נלמדת בישראל כשפה זרה ראשונה והיא מקצוע חובה מבית הספר היסודי ועד סוף התיכון. תכנית הלימודים הארצית מגדירה את האנגלית כשפה בינלאומית, שרכישתה נועדה לאפשר לבוגרי המערכת תקשורת עם דוברי שפות אחרות, גישה למידע ולהשכלה גבוהה והשתלבות בשוק העבודה. התכנית העדכנית מיישרת קו עם המסגרת האירופית המשותפת לשפות (</w:t>
-      </w:r>
-      <w:r>
-        <w:rPr>
-          <w:rFonts w:ascii="Times New Roman" w:cs="Times New Roman" w:hAnsi="Times New Roman"/>
-          <w:b w:val="false"/>
-          <w:bCs w:val="false"/>
-          <w:i w:val="false"/>
-          <w:iCs w:val="false"/>
-          <w:sz w:val="24"/>
-          <w:szCs w:val="24"/>
-          <w:rtl w:val="false"/>
-        </w:rPr>
-        <w:t xml:space="preserve">CEFR) </w:t>
-      </w:r>
-      <w:r>
-        <w:rPr>
-          <w:rFonts w:ascii="David" w:cs="David" w:hAnsi="David"/>
-          <w:b w:val="false"/>
-          <w:bCs w:val="false"/>
-          <w:i w:val="false"/>
-          <w:iCs w:val="false"/>
-          <w:sz w:val="24"/>
-          <w:szCs w:val="24"/>
-          <w:rtl/>
-        </w:rPr>
-        <w:t xml:space="preserve">וקובעת רמות בקיאות מדורגות ואבני דרך לכל שלב גיל, החל מבית הספר היסודי (</w:t>
-      </w:r>
-      <w:r>
-        <w:rPr>
-          <w:rFonts w:ascii="Times New Roman" w:cs="Times New Roman" w:hAnsi="Times New Roman"/>
-          <w:b w:val="false"/>
-          <w:bCs w:val="false"/>
-          <w:i w:val="false"/>
-          <w:iCs w:val="false"/>
-          <w:sz w:val="24"/>
-          <w:szCs w:val="24"/>
-          <w:rtl w:val="false"/>
-        </w:rPr>
-        <w:t xml:space="preserve">Ministry of Education, 2020).</w:t>
+        <w:t xml:space="preserve">האנגלית נלמדת בישראל כשפה זרה ראשונה והיא מקצוע חובה מבית הספר היסודי ועד סוף התיכון. תכנית הלימודים הארצית מגדירה את האנגלית כשפה בינלאומית: שפה שרכישתה נועדה לאפשר לבוגרי המערכת תקשורת עם דוברי שפות אחרות ברחבי העולם, גישה למידע, לתרבות ולהשכלה גבוהה, והשתלבות בשוק עבודה גלובלי </w:t>
+      </w:r>
+      <w:r>
+        <w:rPr>
+          <w:rFonts w:ascii="Times New Roman" w:cs="Times New Roman" w:hAnsi="Times New Roman"/>
+          <w:b w:val="false"/>
+          <w:bCs w:val="false"/>
+          <w:i w:val="false"/>
+          <w:iCs w:val="false"/>
+          <w:sz w:val="24"/>
+          <w:szCs w:val="24"/>
+          <w:rtl w:val="false"/>
+        </w:rPr>
+        <w:t xml:space="preserve">(Ministry of Education, 2020). </w:t>
+      </w:r>
+      <w:r>
+        <w:rPr>
+          <w:rFonts w:ascii="David" w:cs="David" w:hAnsi="David"/>
+          <w:b w:val="false"/>
+          <w:bCs w:val="false"/>
+          <w:i w:val="false"/>
+          <w:iCs w:val="false"/>
+          <w:sz w:val="24"/>
+          <w:szCs w:val="24"/>
+          <w:rtl/>
+        </w:rPr>
+        <w:t xml:space="preserve">מעמדה של האנגלית כשער להשכלה ולתעסוקה מקנה למקצוע חשיבות חברתית מעבר להישג הלימודי עצמו, והפערים בהישגי האנגלית בין קבוצות אוכלוסייה נדונים בישראל גם כסוגיה של שוויון הזדמנויות </w:t>
+      </w:r>
+      <w:r>
+        <w:rPr>
+          <w:rFonts w:ascii="Times New Roman" w:cs="Times New Roman" w:hAnsi="Times New Roman"/>
+          <w:b w:val="false"/>
+          <w:bCs w:val="false"/>
+          <w:i w:val="false"/>
+          <w:iCs w:val="false"/>
+          <w:sz w:val="24"/>
+          <w:szCs w:val="24"/>
+          <w:rtl w:val="false"/>
+        </w:rPr>
+        <w:t xml:space="preserve">(Ministry of Education, 2020).</w:t>
+      </w:r>
+    </w:p>
+    <w:p>
+      <w:pPr>
+        <w:bidi/>
+        <w:spacing w:after="120" w:line="360" w:lineRule="auto"/>
+        <w:jc w:val="both"/>
+      </w:pPr>
+      <w:r>
+        <w:rPr>
+          <w:rFonts w:ascii="David" w:cs="David" w:hAnsi="David"/>
+          <w:b w:val="false"/>
+          <w:bCs w:val="false"/>
+          <w:i w:val="false"/>
+          <w:iCs w:val="false"/>
+          <w:sz w:val="24"/>
+          <w:szCs w:val="24"/>
+          <w:rtl/>
+        </w:rPr>
+        <w:t xml:space="preserve">התכנית העדכנית, שנכנסה לתוקף בשנת 2020, מיישרת קו עם המסגרת האירופית המשותפת לשפות </w:t>
+      </w:r>
+      <w:r>
+        <w:rPr>
+          <w:rFonts w:ascii="Times New Roman" w:cs="Times New Roman" w:hAnsi="Times New Roman"/>
+          <w:b w:val="false"/>
+          <w:bCs w:val="false"/>
+          <w:i w:val="false"/>
+          <w:iCs w:val="false"/>
+          <w:sz w:val="24"/>
+          <w:szCs w:val="24"/>
+          <w:rtl w:val="false"/>
+        </w:rPr>
+        <w:t xml:space="preserve">(CEFR): </w:t>
+      </w:r>
+      <w:r>
+        <w:rPr>
+          <w:rFonts w:ascii="David" w:cs="David" w:hAnsi="David"/>
+          <w:b w:val="false"/>
+          <w:bCs w:val="false"/>
+          <w:i w:val="false"/>
+          <w:iCs w:val="false"/>
+          <w:sz w:val="24"/>
+          <w:szCs w:val="24"/>
+          <w:rtl/>
+        </w:rPr>
+        <w:t xml:space="preserve">היא קובעת רמות בקיאות מדורגות ואבני דרך מוגדרות לכל שלב גיל, מראשית היסודי ועד סוף התיכון, בארבע מיומנויות השפה, האזנה, דיבור, קריאה וכתיבה, ובצדן יעדי אוצר מילים מדורגים </w:t>
+      </w:r>
+      <w:r>
+        <w:rPr>
+          <w:rFonts w:ascii="Times New Roman" w:cs="Times New Roman" w:hAnsi="Times New Roman"/>
+          <w:b w:val="false"/>
+          <w:bCs w:val="false"/>
+          <w:i w:val="false"/>
+          <w:iCs w:val="false"/>
+          <w:sz w:val="24"/>
+          <w:szCs w:val="24"/>
+          <w:rtl w:val="false"/>
+        </w:rPr>
+        <w:t xml:space="preserve">(Ministry of Education, 2020). </w:t>
+      </w:r>
+      <w:r>
+        <w:rPr>
+          <w:rFonts w:ascii="David" w:cs="David" w:hAnsi="David"/>
+          <w:b w:val="false"/>
+          <w:bCs w:val="false"/>
+          <w:i w:val="false"/>
+          <w:iCs w:val="false"/>
+          <w:sz w:val="24"/>
+          <w:szCs w:val="24"/>
+          <w:rtl/>
+        </w:rPr>
+        <w:t xml:space="preserve">מבנה זה מאפשר למורה למקם כל לומד על רצף התקדמות ברור, אך גם מחייב הוראה מובחנת בכיתות שבהן פערי הרמות גדולים.</w:t>
       </w:r>
     </w:p>
     <w:p>
@@ -1875,46 +2531,72 @@
           <w:szCs w:val="24"/>
           <w:rtl/>
         </w:rPr>
-        <w:t xml:space="preserve">בשלב היסודי מציבה תכנית הלימודים דגש על הבנת הנשמע והנקרא, על הבעה בעל פה ובכתב ברמה בסיסית ועל בניית אוצר מילים מדורג, מתוך גישה תקשורתית שבה השפה נרכשת דרך שימוש משמעותי בה ולא דרך שינון חוקים בלבד (</w:t>
-      </w:r>
-      <w:r>
-        <w:rPr>
-          <w:rFonts w:ascii="Times New Roman" w:cs="Times New Roman" w:hAnsi="Times New Roman"/>
-          <w:b w:val="false"/>
-          <w:bCs w:val="false"/>
-          <w:i w:val="false"/>
-          <w:iCs w:val="false"/>
-          <w:sz w:val="24"/>
-          <w:szCs w:val="24"/>
-          <w:rtl w:val="false"/>
-        </w:rPr>
-        <w:t xml:space="preserve">Ministry of Education, 2020). </w:t>
-      </w:r>
-      <w:r>
-        <w:rPr>
-          <w:rFonts w:ascii="David" w:cs="David" w:hAnsi="David"/>
-          <w:b w:val="false"/>
-          <w:bCs w:val="false"/>
-          <w:i w:val="false"/>
-          <w:iCs w:val="false"/>
-          <w:sz w:val="24"/>
-          <w:szCs w:val="24"/>
-          <w:rtl/>
-        </w:rPr>
-        <w:t xml:space="preserve">המורה לאנגלית ביסודי נדרש לתווך שפה זרה ללומדים צעירים שרובם אינם פוגשים אותה מחוץ לכיתה, ולכן איכות החשיפה בשיעור, מגוון התרגול והמשוב שהלומד מקבל משפיעים במיוחד על ההתקדמות (</w:t>
-      </w:r>
-      <w:r>
-        <w:rPr>
-          <w:rFonts w:ascii="Times New Roman" w:cs="Times New Roman" w:hAnsi="Times New Roman"/>
-          <w:b w:val="false"/>
-          <w:bCs w:val="false"/>
-          <w:i w:val="false"/>
-          <w:iCs w:val="false"/>
-          <w:sz w:val="24"/>
-          <w:szCs w:val="24"/>
-          <w:rtl w:val="false"/>
-        </w:rPr>
-        <w:t xml:space="preserve">Cameron, 2001).</w:t>
+        <w:t xml:space="preserve">בשלב היסודי מציבה תכנית הלימודים דגש על הבנת הנשמע והנקרא, על הבעה בעל פה ובכתב ברמה בסיסית ועל בניית אוצר מילים מדורג, מתוך גישה תקשורתית שבה השפה נרכשת דרך שימוש משמעותי בה, בהקשרים אותנטיים, ולא דרך שינון חוקי דקדוק בלבד </w:t>
+      </w:r>
+      <w:r>
+        <w:rPr>
+          <w:rFonts w:ascii="Times New Roman" w:cs="Times New Roman" w:hAnsi="Times New Roman"/>
+          <w:b w:val="false"/>
+          <w:bCs w:val="false"/>
+          <w:i w:val="false"/>
+          <w:iCs w:val="false"/>
+          <w:sz w:val="24"/>
+          <w:szCs w:val="24"/>
+          <w:rtl w:val="false"/>
+        </w:rPr>
+        <w:t xml:space="preserve">(Ministry of Education, 2020). </w:t>
+      </w:r>
+      <w:r>
+        <w:rPr>
+          <w:rFonts w:ascii="David" w:cs="David" w:hAnsi="David"/>
+          <w:b w:val="false"/>
+          <w:bCs w:val="false"/>
+          <w:i w:val="false"/>
+          <w:iCs w:val="false"/>
+          <w:sz w:val="24"/>
+          <w:szCs w:val="24"/>
+          <w:rtl/>
+        </w:rPr>
+        <w:t xml:space="preserve">המורה לאנגלית ביסודי פועל בתנאים ייחודיים: הוא מתווך שפה זרה ללומדים צעירים שרובם אינם פוגשים אותה בסביבתם היומיומית מחוץ לכיתה, ולכן איכות החשיפה בשיעור, מגוון התרגול והמשוב שהלומד מקבל משפיעים במיוחד על ההתקדמות </w:t>
+      </w:r>
+      <w:r>
+        <w:rPr>
+          <w:rFonts w:ascii="Times New Roman" w:cs="Times New Roman" w:hAnsi="Times New Roman"/>
+          <w:b w:val="false"/>
+          <w:bCs w:val="false"/>
+          <w:i w:val="false"/>
+          <w:iCs w:val="false"/>
+          <w:sz w:val="24"/>
+          <w:szCs w:val="24"/>
+          <w:rtl w:val="false"/>
+        </w:rPr>
+        <w:t xml:space="preserve">(Cameron, 2001). </w:t>
+      </w:r>
+      <w:r>
+        <w:rPr>
+          <w:rFonts w:ascii="David" w:cs="David" w:hAnsi="David"/>
+          <w:b w:val="false"/>
+          <w:bCs w:val="false"/>
+          <w:i w:val="false"/>
+          <w:iCs w:val="false"/>
+          <w:sz w:val="24"/>
+          <w:szCs w:val="24"/>
+          <w:rtl/>
+        </w:rPr>
+        <w:t xml:space="preserve">בכיתה הטרוגנית, שבה חלק מהלומדים נחשפים לאנגלית גם בבית ובמדיה וחלקם כלל לא, נדרשת מהמורה הוראה מובחנת שקשה לקיימה באמצעים מסורתיים בלבד </w:t>
+      </w:r>
+      <w:r>
+        <w:rPr>
+          <w:rFonts w:ascii="Times New Roman" w:cs="Times New Roman" w:hAnsi="Times New Roman"/>
+          <w:b w:val="false"/>
+          <w:bCs w:val="false"/>
+          <w:i w:val="false"/>
+          <w:iCs w:val="false"/>
+          <w:sz w:val="24"/>
+          <w:szCs w:val="24"/>
+          <w:rtl w:val="false"/>
+        </w:rPr>
+        <w:t xml:space="preserve">(Cameron, 2001).</w:t>
       </w:r>
     </w:p>
     <w:p>
@@ -1954,72 +2636,131 @@
           <w:szCs w:val="24"/>
           <w:rtl/>
         </w:rPr>
-        <w:t xml:space="preserve">רכישת שפה זרה נשענת על קלט מובן: הלומד מתקדם כאשר הוא נחשף לשפה ברמה מעט גבוהה מרמתו הנוכחית, ובתנאי שהמסנן הרגשי שלו נמוך, כלומר שהחרדה מועטה והמוטיבציה גבוהה (</w:t>
-      </w:r>
-      <w:r>
-        <w:rPr>
-          <w:rFonts w:ascii="Times New Roman" w:cs="Times New Roman" w:hAnsi="Times New Roman"/>
-          <w:b w:val="false"/>
-          <w:bCs w:val="false"/>
-          <w:i w:val="false"/>
-          <w:iCs w:val="false"/>
-          <w:sz w:val="24"/>
-          <w:szCs w:val="24"/>
-          <w:rtl w:val="false"/>
-        </w:rPr>
-        <w:t xml:space="preserve">Krashen, 1982). </w:t>
-      </w:r>
-      <w:r>
-        <w:rPr>
-          <w:rFonts w:ascii="David" w:cs="David" w:hAnsi="David"/>
-          <w:b w:val="false"/>
-          <w:bCs w:val="false"/>
-          <w:i w:val="false"/>
-          <w:iCs w:val="false"/>
-          <w:sz w:val="24"/>
-          <w:szCs w:val="24"/>
-          <w:rtl/>
-        </w:rPr>
-        <w:t xml:space="preserve">לומדים צעירים מתאפיינים בלמידה דרך פעילות והתנסות, בהישענות על הערוץ הדבור לפני הכתוב, בטווח קשב קצר ובצורך בהקשרים מוחשיים ומשמעותיים; הוראה אפקטיבית בגילים אלה משלבת משחק, סיפור ושיר ומדגישה הצלחות קטנות ותכופות (</w:t>
-      </w:r>
-      <w:r>
-        <w:rPr>
-          <w:rFonts w:ascii="Times New Roman" w:cs="Times New Roman" w:hAnsi="Times New Roman"/>
-          <w:b w:val="false"/>
-          <w:bCs w:val="false"/>
-          <w:i w:val="false"/>
-          <w:iCs w:val="false"/>
-          <w:sz w:val="24"/>
-          <w:szCs w:val="24"/>
-          <w:rtl w:val="false"/>
-        </w:rPr>
-        <w:t xml:space="preserve">Cameron, 2001). </w:t>
-      </w:r>
-      <w:r>
-        <w:rPr>
-          <w:rFonts w:ascii="David" w:cs="David" w:hAnsi="David"/>
-          <w:b w:val="false"/>
-          <w:bCs w:val="false"/>
-          <w:i w:val="false"/>
-          <w:iCs w:val="false"/>
-          <w:sz w:val="24"/>
-          <w:szCs w:val="24"/>
-          <w:rtl/>
-        </w:rPr>
-        <w:t xml:space="preserve">מאפיינים אלה מסבירים מדוע כלים המסוגלים לייצר טקסטים מדורגים, דיאלוגים ומשוב מיידי מעוררים עניין רב דווקא בהוראת שפות בגיל הצעיר (</w:t>
-      </w:r>
-      <w:r>
-        <w:rPr>
-          <w:rFonts w:ascii="Times New Roman" w:cs="Times New Roman" w:hAnsi="Times New Roman"/>
-          <w:b w:val="false"/>
-          <w:bCs w:val="false"/>
-          <w:i w:val="false"/>
-          <w:iCs w:val="false"/>
-          <w:sz w:val="24"/>
-          <w:szCs w:val="24"/>
-          <w:rtl w:val="false"/>
-        </w:rPr>
-        <w:t xml:space="preserve">Kohnke et al., 2023).</w:t>
+        <w:t xml:space="preserve">רכישת שפה זרה נשענת לפי קראשן </w:t>
+      </w:r>
+      <w:r>
+        <w:rPr>
+          <w:rFonts w:ascii="Times New Roman" w:cs="Times New Roman" w:hAnsi="Times New Roman"/>
+          <w:b w:val="false"/>
+          <w:bCs w:val="false"/>
+          <w:i w:val="false"/>
+          <w:iCs w:val="false"/>
+          <w:sz w:val="24"/>
+          <w:szCs w:val="24"/>
+          <w:rtl w:val="false"/>
+        </w:rPr>
+        <w:t xml:space="preserve">(Krashen, 1982) </w:t>
+      </w:r>
+      <w:r>
+        <w:rPr>
+          <w:rFonts w:ascii="David" w:cs="David" w:hAnsi="David"/>
+          <w:b w:val="false"/>
+          <w:bCs w:val="false"/>
+          <w:i w:val="false"/>
+          <w:iCs w:val="false"/>
+          <w:sz w:val="24"/>
+          <w:szCs w:val="24"/>
+          <w:rtl/>
+        </w:rPr>
+        <w:t xml:space="preserve">על קלט מובן: הלומד מתקדם כאשר הוא נחשף לשפה ברמה מעט גבוהה מרמתו הנוכחית, באופן שהוא מסוגל להבין מתוך ההקשר. תנאי נוסף הוא מסנן רגשי נמוך: חרדה, לחץ וחשש מטעויות חוסמים את הרכישה, ואילו מוטיבציה, ביטחון ואווירה תומכת מאפשרים אותה. מכאן החשיבות שמייחסת הספרות לסביבת למידה מרובת קלט ודלת איומים, שבה הלומד מעז להתנסות בשפה </w:t>
+      </w:r>
+      <w:r>
+        <w:rPr>
+          <w:rFonts w:ascii="Times New Roman" w:cs="Times New Roman" w:hAnsi="Times New Roman"/>
+          <w:b w:val="false"/>
+          <w:bCs w:val="false"/>
+          <w:i w:val="false"/>
+          <w:iCs w:val="false"/>
+          <w:sz w:val="24"/>
+          <w:szCs w:val="24"/>
+          <w:rtl w:val="false"/>
+        </w:rPr>
+        <w:t xml:space="preserve">(Krashen, 1982).</w:t>
+      </w:r>
+    </w:p>
+    <w:p>
+      <w:pPr>
+        <w:bidi/>
+        <w:spacing w:after="120" w:line="360" w:lineRule="auto"/>
+        <w:jc w:val="both"/>
+      </w:pPr>
+      <w:r>
+        <w:rPr>
+          <w:rFonts w:ascii="David" w:cs="David" w:hAnsi="David"/>
+          <w:b w:val="false"/>
+          <w:bCs w:val="false"/>
+          <w:i w:val="false"/>
+          <w:iCs w:val="false"/>
+          <w:sz w:val="24"/>
+          <w:szCs w:val="24"/>
+          <w:rtl/>
+        </w:rPr>
+        <w:t xml:space="preserve">לומדים צעירים נבדלים מלומדים בוגרים בדרכי הלמידה שלהם: הם לומדים דרך פעילות והתנסות, נשענים על הערוץ הדבור לפני הכתוב, מתאפיינים בטווח קשב קצר וזקוקים להקשרים מוחשיים ומשמעותיים. הוראה אפקטיבית בגילים אלה משלבת משחק, סיפור, שיר ותנועה, ומדגישה הצלחות קטנות ותכופות הבונות תחושת מסוגלות </w:t>
+      </w:r>
+      <w:r>
+        <w:rPr>
+          <w:rFonts w:ascii="Times New Roman" w:cs="Times New Roman" w:hAnsi="Times New Roman"/>
+          <w:b w:val="false"/>
+          <w:bCs w:val="false"/>
+          <w:i w:val="false"/>
+          <w:iCs w:val="false"/>
+          <w:sz w:val="24"/>
+          <w:szCs w:val="24"/>
+          <w:rtl w:val="false"/>
+        </w:rPr>
+        <w:t xml:space="preserve">(Cameron, 2001). </w:t>
+      </w:r>
+      <w:r>
+        <w:rPr>
+          <w:rFonts w:ascii="David" w:cs="David" w:hAnsi="David"/>
+          <w:b w:val="false"/>
+          <w:bCs w:val="false"/>
+          <w:i w:val="false"/>
+          <w:iCs w:val="false"/>
+          <w:sz w:val="24"/>
+          <w:szCs w:val="24"/>
+          <w:rtl/>
+        </w:rPr>
+        <w:t xml:space="preserve">מאפיינים אלה מסבירים מדוע כלים המסוגלים לייצר טקסטים מדורגים לפי רמה, דיאלוגים מותאמים ומשוב מיידי ואישי מעוררים עניין רב דווקא בהוראת שפות בגיל הצעיר </w:t>
+      </w:r>
+      <w:r>
+        <w:rPr>
+          <w:rFonts w:ascii="Times New Roman" w:cs="Times New Roman" w:hAnsi="Times New Roman"/>
+          <w:b w:val="false"/>
+          <w:bCs w:val="false"/>
+          <w:i w:val="false"/>
+          <w:iCs w:val="false"/>
+          <w:sz w:val="24"/>
+          <w:szCs w:val="24"/>
+          <w:rtl w:val="false"/>
+        </w:rPr>
+        <w:t xml:space="preserve">(Kohnke et al., 2023). </w:t>
+      </w:r>
+      <w:r>
+        <w:rPr>
+          <w:rFonts w:ascii="David" w:cs="David" w:hAnsi="David"/>
+          <w:b w:val="false"/>
+          <w:bCs w:val="false"/>
+          <w:i w:val="false"/>
+          <w:iCs w:val="false"/>
+          <w:sz w:val="24"/>
+          <w:szCs w:val="24"/>
+          <w:rtl/>
+        </w:rPr>
+        <w:t xml:space="preserve">בה בעת הם מציבים רף זהירות גבוה, שכן מדובר בלומדים שטרם גיבשו חשיבה ביקורתית בשלה כלפי מקורות מידע </w:t>
+      </w:r>
+      <w:r>
+        <w:rPr>
+          <w:rFonts w:ascii="Times New Roman" w:cs="Times New Roman" w:hAnsi="Times New Roman"/>
+          <w:b w:val="false"/>
+          <w:bCs w:val="false"/>
+          <w:i w:val="false"/>
+          <w:iCs w:val="false"/>
+          <w:sz w:val="24"/>
+          <w:szCs w:val="24"/>
+          <w:rtl w:val="false"/>
+        </w:rPr>
+        <w:t xml:space="preserve">(Ng et al., 2021).</w:t>
       </w:r>
     </w:p>
     <w:p>
@@ -2059,33 +2800,33 @@
           <w:szCs w:val="24"/>
           <w:rtl/>
         </w:rPr>
-        <w:t xml:space="preserve">הוראת השפות אימצה לאורך השנים כלים דיגיטליים רבים, ממילונים מקוונים ואפליקציות תרגול ועד סביבות למידה מתוקשבות, אך הבינה המלאכותית היוצרת מסמנת שינוי מסדר אחר. קונקה ואחרים (</w:t>
-      </w:r>
-      <w:r>
-        <w:rPr>
-          <w:rFonts w:ascii="Times New Roman" w:cs="Times New Roman" w:hAnsi="Times New Roman"/>
-          <w:b w:val="false"/>
-          <w:bCs w:val="false"/>
-          <w:i w:val="false"/>
-          <w:iCs w:val="false"/>
-          <w:sz w:val="24"/>
-          <w:szCs w:val="24"/>
-          <w:rtl w:val="false"/>
-        </w:rPr>
-        <w:t xml:space="preserve">Kohnke et al., 2023) </w:t>
-      </w:r>
-      <w:r>
-        <w:rPr>
-          <w:rFonts w:ascii="David" w:cs="David" w:hAnsi="David"/>
-          <w:b w:val="false"/>
-          <w:bCs w:val="false"/>
-          <w:i w:val="false"/>
-          <w:iCs w:val="false"/>
-          <w:sz w:val="24"/>
-          <w:szCs w:val="24"/>
-          <w:rtl/>
-        </w:rPr>
-        <w:t xml:space="preserve">מראים כיצד </w:t>
+        <w:t xml:space="preserve">הוראת השפות אימצה לאורך השנים כלים דיגיטליים רבים, ממילונים מקוונים ואפליקציות לתרגול אוצר מילים ועד סביבות למידה מתוקשבות ומשחקי שפה, אך הבינה המלאכותית היוצרת מסמנת שינוי מסדר אחר, משום שהיא פועלת בחומר הגלם של המקצוע עצמו: השפה. קונקה ואחרים </w:t>
+      </w:r>
+      <w:r>
+        <w:rPr>
+          <w:rFonts w:ascii="Times New Roman" w:cs="Times New Roman" w:hAnsi="Times New Roman"/>
+          <w:b w:val="false"/>
+          <w:bCs w:val="false"/>
+          <w:i w:val="false"/>
+          <w:iCs w:val="false"/>
+          <w:sz w:val="24"/>
+          <w:szCs w:val="24"/>
+          <w:rtl w:val="false"/>
+        </w:rPr>
+        <w:t xml:space="preserve">(Kohnke et al., 2023) </w:t>
+      </w:r>
+      <w:r>
+        <w:rPr>
+          <w:rFonts w:ascii="David" w:cs="David" w:hAnsi="David"/>
+          <w:b w:val="false"/>
+          <w:bCs w:val="false"/>
+          <w:i w:val="false"/>
+          <w:iCs w:val="false"/>
+          <w:sz w:val="24"/>
+          <w:szCs w:val="24"/>
+          <w:rtl/>
+        </w:rPr>
+        <w:t xml:space="preserve">ממפים את האפשרויות שכלי דוגמת </w:t>
       </w:r>
       <w:r>
         <w:rPr>
@@ -2111,20 +2852,66 @@
           <w:szCs w:val="24"/>
           <w:rtl/>
         </w:rPr>
-        <w:t xml:space="preserve">יכול לשמש בן שיח זמין לתרגול, לחולל טקסטים ברמות קושי מותאמות, להסביר אוצר מילים בהקשר, לייצר שאלות הבנה ומבדקים ולסייע למורה בהכנת חומרים מובחנים. לצד זאת הם מדגישים שהשימוש מחייב כשירויות דיגיטליות של המורה ומודעות למגבלות הכלי, ובהן אי-דיוקים עובדתיים והטיות תרבותיות, וכן חשיבה מחודשת על דרכי ההערכה בשיעורי השפה (</w:t>
-      </w:r>
-      <w:r>
-        <w:rPr>
-          <w:rFonts w:ascii="Times New Roman" w:cs="Times New Roman" w:hAnsi="Times New Roman"/>
-          <w:b w:val="false"/>
-          <w:bCs w:val="false"/>
-          <w:i w:val="false"/>
-          <w:iCs w:val="false"/>
-          <w:sz w:val="24"/>
-          <w:szCs w:val="24"/>
-          <w:rtl w:val="false"/>
-        </w:rPr>
-        <w:t xml:space="preserve">Kohnke et al., 2023).</w:t>
+        <w:t xml:space="preserve">פותח בפני מורי השפה: בן שיח זמין לתרגול דיאלוגים במגוון משלבים והקשרים; חילול טקסטים ברמות קושי מותאמות לכל לומד; הסבר אוצר מילים בהקשר, על ניואנסים ומשמעויות מרובות; יצירת שאלות הבנה, מבדקים ותרגילים; וסיוע למורה בהכנת חומרים מובחנים בזמן קצר. עבור הלומד, הכלי מציע סביבת תרגול פרטית ונטולת שיפוטיות, שבה אפשר לטעות ללא מבוכה </w:t>
+      </w:r>
+      <w:r>
+        <w:rPr>
+          <w:rFonts w:ascii="Times New Roman" w:cs="Times New Roman" w:hAnsi="Times New Roman"/>
+          <w:b w:val="false"/>
+          <w:bCs w:val="false"/>
+          <w:i w:val="false"/>
+          <w:iCs w:val="false"/>
+          <w:sz w:val="24"/>
+          <w:szCs w:val="24"/>
+          <w:rtl w:val="false"/>
+        </w:rPr>
+        <w:t xml:space="preserve">(Kohnke et al., 2023).</w:t>
+      </w:r>
+    </w:p>
+    <w:p>
+      <w:pPr>
+        <w:bidi/>
+        <w:spacing w:after="120" w:line="360" w:lineRule="auto"/>
+        <w:jc w:val="both"/>
+      </w:pPr>
+      <w:r>
+        <w:rPr>
+          <w:rFonts w:ascii="David" w:cs="David" w:hAnsi="David"/>
+          <w:b w:val="false"/>
+          <w:bCs w:val="false"/>
+          <w:i w:val="false"/>
+          <w:iCs w:val="false"/>
+          <w:sz w:val="24"/>
+          <w:szCs w:val="24"/>
+          <w:rtl/>
+        </w:rPr>
+        <w:t xml:space="preserve">לצד הפוטנציאל, המחברים מדגישים שהשימוש מחייב כשירויות דיגיטליות של המורה ומודעות למגבלות הכלי: הטקסטים שהוא מפיק עלולים לכלול אי-דיוקים עובדתיים והטיות תרבותיות, איכות התוצר תלויה באיכות ההנחיה, ויכולתו של הכלי לבצע מטלות כתיבה שלמות מחייבת חשיבה מחודשת על דרכי ההערכה בשיעורי השפה </w:t>
+      </w:r>
+      <w:r>
+        <w:rPr>
+          <w:rFonts w:ascii="Times New Roman" w:cs="Times New Roman" w:hAnsi="Times New Roman"/>
+          <w:b w:val="false"/>
+          <w:bCs w:val="false"/>
+          <w:i w:val="false"/>
+          <w:iCs w:val="false"/>
+          <w:sz w:val="24"/>
+          <w:szCs w:val="24"/>
+          <w:rtl w:val="false"/>
+        </w:rPr>
+        <w:t xml:space="preserve">(Kohnke et al., 2023). </w:t>
+      </w:r>
+      <w:r>
+        <w:rPr>
+          <w:rFonts w:ascii="David" w:cs="David" w:hAnsi="David"/>
+          <w:b w:val="false"/>
+          <w:bCs w:val="false"/>
+          <w:i w:val="false"/>
+          <w:iCs w:val="false"/>
+          <w:sz w:val="24"/>
+          <w:szCs w:val="24"/>
+          <w:rtl/>
+        </w:rPr>
+        <w:t xml:space="preserve">שאלת המפתח, כפי שעולה גם מהפרקים הקודמים, איננה אם הכלי מסוגל לתרום להוראת האנגלית אלא כיצד המורים תופסים אותו ומה יקבע אם ישלבו אותו בפועל, וזהו עניינו של הפרק הבא.</w:t>
       </w:r>
     </w:p>
     <w:p>
@@ -2185,59 +2972,79 @@
           <w:szCs w:val="24"/>
           <w:rtl/>
         </w:rPr>
-        <w:t xml:space="preserve">תפיסה (</w:t>
-      </w:r>
-      <w:r>
-        <w:rPr>
-          <w:rFonts w:ascii="Times New Roman" w:cs="Times New Roman" w:hAnsi="Times New Roman"/>
-          <w:b w:val="false"/>
-          <w:bCs w:val="false"/>
-          <w:i w:val="false"/>
-          <w:iCs w:val="false"/>
-          <w:sz w:val="24"/>
-          <w:szCs w:val="24"/>
-          <w:rtl w:val="false"/>
-        </w:rPr>
-        <w:t xml:space="preserve">perception) </w:t>
-      </w:r>
-      <w:r>
-        <w:rPr>
-          <w:rFonts w:ascii="David" w:cs="David" w:hAnsi="David"/>
-          <w:b w:val="false"/>
-          <w:bCs w:val="false"/>
-          <w:i w:val="false"/>
-          <w:iCs w:val="false"/>
-          <w:sz w:val="24"/>
-          <w:szCs w:val="24"/>
-          <w:rtl/>
-        </w:rPr>
-        <w:t xml:space="preserve">היא התהליך שבו הפרט קולט, מעבד ומפרש מידע על סביבתו, ואילו עמדה (</w:t>
-      </w:r>
-      <w:r>
-        <w:rPr>
-          <w:rFonts w:ascii="Times New Roman" w:cs="Times New Roman" w:hAnsi="Times New Roman"/>
-          <w:b w:val="false"/>
-          <w:bCs w:val="false"/>
-          <w:i w:val="false"/>
-          <w:iCs w:val="false"/>
-          <w:sz w:val="24"/>
-          <w:szCs w:val="24"/>
-          <w:rtl w:val="false"/>
-        </w:rPr>
-        <w:t xml:space="preserve">attitude) </w:t>
-      </w:r>
-      <w:r>
-        <w:rPr>
-          <w:rFonts w:ascii="David" w:cs="David" w:hAnsi="David"/>
-          <w:b w:val="false"/>
-          <w:bCs w:val="false"/>
-          <w:i w:val="false"/>
-          <w:iCs w:val="false"/>
-          <w:sz w:val="24"/>
-          <w:szCs w:val="24"/>
-          <w:rtl/>
-        </w:rPr>
-        <w:t xml:space="preserve">היא מערכת של אמונות, רגשות ונטיות התנהגותיות כלפי מושא מסוים. לעמדה שלושה מרכיבים: קוגניטיבי, הכולל את דעותיו ואמונותיו של הפרט, רגשי, הנוגע למה שהפרט מרגיש כלפי המושא, והתנהגותי, המבטא את נטייתו לפעול. עמדות הן לרוב יציבות אך ניתנות לשינוי, ועוצמתן משתנה מנושא לנושא (לוי עצמון ורונן, 2026). מחקר תפיסות בוחן כיצד אנשים חווים ומפרשים תופעה, ומחקר עמדות בוחן מה הם חושבים עליה וכיצד בכוונתם לנהוג; שניהם נחקרים בכלים איכותניים, דוגמת ראיונות עומק, ובכלים כמותניים, דוגמת שאלונים (לוי עצמון ורונן, 2026).</w:t>
+        <w:t xml:space="preserve">תפיסה </w:t>
+      </w:r>
+      <w:r>
+        <w:rPr>
+          <w:rFonts w:ascii="Times New Roman" w:cs="Times New Roman" w:hAnsi="Times New Roman"/>
+          <w:b w:val="false"/>
+          <w:bCs w:val="false"/>
+          <w:i w:val="false"/>
+          <w:iCs w:val="false"/>
+          <w:sz w:val="24"/>
+          <w:szCs w:val="24"/>
+          <w:rtl w:val="false"/>
+        </w:rPr>
+        <w:t xml:space="preserve">(perception) </w:t>
+      </w:r>
+      <w:r>
+        <w:rPr>
+          <w:rFonts w:ascii="David" w:cs="David" w:hAnsi="David"/>
+          <w:b w:val="false"/>
+          <w:bCs w:val="false"/>
+          <w:i w:val="false"/>
+          <w:iCs w:val="false"/>
+          <w:sz w:val="24"/>
+          <w:szCs w:val="24"/>
+          <w:rtl/>
+        </w:rPr>
+        <w:t xml:space="preserve">היא התהליך שבו הפרט קולט, מעבד ומפרש מידע על סביבתו, והיא כוללת מודעות, הבנה והתרשמות; מדובר בחוויה דינמית של פירוש המציאות. עמדה </w:t>
+      </w:r>
+      <w:r>
+        <w:rPr>
+          <w:rFonts w:ascii="Times New Roman" w:cs="Times New Roman" w:hAnsi="Times New Roman"/>
+          <w:b w:val="false"/>
+          <w:bCs w:val="false"/>
+          <w:i w:val="false"/>
+          <w:iCs w:val="false"/>
+          <w:sz w:val="24"/>
+          <w:szCs w:val="24"/>
+          <w:rtl w:val="false"/>
+        </w:rPr>
+        <w:t xml:space="preserve">(attitude) </w:t>
+      </w:r>
+      <w:r>
+        <w:rPr>
+          <w:rFonts w:ascii="David" w:cs="David" w:hAnsi="David"/>
+          <w:b w:val="false"/>
+          <w:bCs w:val="false"/>
+          <w:i w:val="false"/>
+          <w:iCs w:val="false"/>
+          <w:sz w:val="24"/>
+          <w:szCs w:val="24"/>
+          <w:rtl/>
+        </w:rPr>
+        <w:t xml:space="preserve">היא מערכת של אמונות, רגשות ונטיות התנהגותיות כלפי מושא מסוים. לעמדה שלושה מרכיבים: קוגניטיבי, הכולל את דעותיו, מחשבותיו ואמונותיו של הפרט על נשוא העמדה; רגשי, הנוגע למה שהפרט מרגיש כלפיו; והתנהגותי, המבטא את נטייתו לפעול ביחס אליו, להבדיל מהתנהגותו בפועל. עמדות הן כלליות ואינן מתייחסות לאירוע יחיד, הן חיוביות או שליליות, עוצמתן משתנה מנושא לנושא, והן יציבות לרוב אך ניתנות לשינוי (לוי עצמון ורונן, 2026).</w:t>
+      </w:r>
+    </w:p>
+    <w:p>
+      <w:pPr>
+        <w:bidi/>
+        <w:spacing w:after="120" w:line="360" w:lineRule="auto"/>
+        <w:jc w:val="both"/>
+      </w:pPr>
+      <w:r>
+        <w:rPr>
+          <w:rFonts w:ascii="David" w:cs="David" w:hAnsi="David"/>
+          <w:b w:val="false"/>
+          <w:bCs w:val="false"/>
+          <w:i w:val="false"/>
+          <w:iCs w:val="false"/>
+          <w:sz w:val="24"/>
+          <w:szCs w:val="24"/>
+          <w:rtl/>
+        </w:rPr>
+        <w:t xml:space="preserve">ההבחנה בין המושגים חשובה לעיצוב מחקר: מחקר תפיסות בוחן כיצד אנשים חווים, קולטים ומפרשים תופעה, ואילו מחקר עמדות בוחן מה הם חושבים עליה וכיצד בכוונתם לנהוג. שני הסוגים נחקרים הן בכלים איכותניים, ובראשם ראיונות עומק המאפשרים להבין את עולמם של המשתתפים במילותיהם שלהם, הן בכלים כמותניים דוגמת שאלונים (לוי עצמון ורונן, 2026). מודלים תיאורטיים של אימוץ טכנולוגיה מספקים למחקרים אלה מסגרת מושגית: הם מגדירים אילו תפיסות ועמדות משפיעות על ההחלטה להשתמש בטכנולוגיה, ומאפשרים לנתח ממצאים ולגבש המלצות (לוי עצמון ורונן, 2026).</w:t>
       </w:r>
     </w:p>
     <w:p>
@@ -2316,72 +3123,105 @@
           <w:szCs w:val="24"/>
           <w:rtl/>
         </w:rPr>
-        <w:t xml:space="preserve">של דיוויס (</w:t>
-      </w:r>
-      <w:r>
-        <w:rPr>
-          <w:rFonts w:ascii="Times New Roman" w:cs="Times New Roman" w:hAnsi="Times New Roman"/>
-          <w:b w:val="false"/>
-          <w:bCs w:val="false"/>
-          <w:i w:val="false"/>
-          <w:iCs w:val="false"/>
-          <w:sz w:val="24"/>
-          <w:szCs w:val="24"/>
-          <w:rtl w:val="false"/>
-        </w:rPr>
-        <w:t xml:space="preserve">Davis, 1989) </w:t>
-      </w:r>
-      <w:r>
-        <w:rPr>
-          <w:rFonts w:ascii="David" w:cs="David" w:hAnsi="David"/>
-          <w:b w:val="false"/>
-          <w:bCs w:val="false"/>
-          <w:i w:val="false"/>
-          <w:iCs w:val="false"/>
-          <w:sz w:val="24"/>
-          <w:szCs w:val="24"/>
-          <w:rtl/>
-        </w:rPr>
-        <w:t xml:space="preserve">הוא נקודת המוצא של חקר אימוץ טכנולוגיות. לפי המודל, השימוש בטכנולוגיה מושפע מהכוונה להשתמש בה, והכוונה מעוצבת על ידי שתי תפיסות סובייקטיביות: תפיסת השימושיות, כלומר עד כמה האדם מאמין שהטכנולוגיה תשפר את ביצועיו, ותפיסת קלות השימוש, כלומר עד כמה השימוש בה ייתפס כפשוט ונטול מאמץ. ככל שהטכנולוגיה נתפסת שימושית וקלה יותר, גדלה הסבירות שתאומץ, כאשר תפיסת השימושיות נמצאה במחקרים כגורם המשפיע יותר (</w:t>
-      </w:r>
-      <w:r>
-        <w:rPr>
-          <w:rFonts w:ascii="Times New Roman" w:cs="Times New Roman" w:hAnsi="Times New Roman"/>
-          <w:b w:val="false"/>
-          <w:bCs w:val="false"/>
-          <w:i w:val="false"/>
-          <w:iCs w:val="false"/>
-          <w:sz w:val="24"/>
-          <w:szCs w:val="24"/>
-          <w:rtl w:val="false"/>
-        </w:rPr>
-        <w:t xml:space="preserve">Davis, 1989). </w:t>
-      </w:r>
-      <w:r>
-        <w:rPr>
-          <w:rFonts w:ascii="David" w:cs="David" w:hAnsi="David"/>
-          <w:b w:val="false"/>
-          <w:bCs w:val="false"/>
-          <w:i w:val="false"/>
-          <w:iCs w:val="false"/>
-          <w:sz w:val="24"/>
-          <w:szCs w:val="24"/>
-          <w:rtl/>
-        </w:rPr>
-        <w:t xml:space="preserve">חוזקו של המודל בפשטותו ובביסוסו האמפירי הרחב, אך הוא פותח עבור טכנולוגיות מידע שגרתיות, ולא עבור טכנולוגיות בעלות מאפיינים אנושיים (</w:t>
-      </w:r>
-      <w:r>
-        <w:rPr>
-          <w:rFonts w:ascii="Times New Roman" w:cs="Times New Roman" w:hAnsi="Times New Roman"/>
-          <w:b w:val="false"/>
-          <w:bCs w:val="false"/>
-          <w:i w:val="false"/>
-          <w:iCs w:val="false"/>
-          <w:sz w:val="24"/>
-          <w:szCs w:val="24"/>
-          <w:rtl w:val="false"/>
-        </w:rPr>
-        <w:t xml:space="preserve">Gursoy et al., 2019).</w:t>
+        <w:t xml:space="preserve">של דיוויס </w:t>
+      </w:r>
+      <w:r>
+        <w:rPr>
+          <w:rFonts w:ascii="Times New Roman" w:cs="Times New Roman" w:hAnsi="Times New Roman"/>
+          <w:b w:val="false"/>
+          <w:bCs w:val="false"/>
+          <w:i w:val="false"/>
+          <w:iCs w:val="false"/>
+          <w:sz w:val="24"/>
+          <w:szCs w:val="24"/>
+          <w:rtl w:val="false"/>
+        </w:rPr>
+        <w:t xml:space="preserve">(Davis, 1989) </w:t>
+      </w:r>
+      <w:r>
+        <w:rPr>
+          <w:rFonts w:ascii="David" w:cs="David" w:hAnsi="David"/>
+          <w:b w:val="false"/>
+          <w:bCs w:val="false"/>
+          <w:i w:val="false"/>
+          <w:iCs w:val="false"/>
+          <w:sz w:val="24"/>
+          <w:szCs w:val="24"/>
+          <w:rtl/>
+        </w:rPr>
+        <w:t xml:space="preserve">הוא נקודת המוצא של חקר אימוץ טכנולוגיות, והוא מהמודלים המבוססים אמפירית בתחום: כלי המדידה שלו הראו תקפות ומהימנות במאות מחקרים. לפי המודל, השימוש בטכנולוגיה מושפע מהכוונה להשתמש בה, והכוונה מעוצבת על ידי העמדה כלפי השימוש, המושפעת בתורה משתי תפיסות סובייקטיביות. הראשונה היא תפיסת השימושיות: המידה שבה האדם מאמין שהשימוש בטכנולוגיה ישפר את ביצועיו בעבודתו. השנייה היא תפיסת קלות השימוש: המידה שבה הוא מאמין שהשימוש יהיה פשוט ונטול מאמץ גופני ונפשי. קלות השימוש משפיעה גם על השימושיות עצמה, שכן כלי קל לתפעול מפנה זמן וקשב לעבודה עצמה </w:t>
+      </w:r>
+      <w:r>
+        <w:rPr>
+          <w:rFonts w:ascii="Times New Roman" w:cs="Times New Roman" w:hAnsi="Times New Roman"/>
+          <w:b w:val="false"/>
+          <w:bCs w:val="false"/>
+          <w:i w:val="false"/>
+          <w:iCs w:val="false"/>
+          <w:sz w:val="24"/>
+          <w:szCs w:val="24"/>
+          <w:rtl w:val="false"/>
+        </w:rPr>
+        <w:t xml:space="preserve">(Davis, 1989).</w:t>
+      </w:r>
+    </w:p>
+    <w:p>
+      <w:pPr>
+        <w:bidi/>
+        <w:spacing w:after="120" w:line="360" w:lineRule="auto"/>
+        <w:jc w:val="both"/>
+      </w:pPr>
+      <w:r>
+        <w:rPr>
+          <w:rFonts w:ascii="David" w:cs="David" w:hAnsi="David"/>
+          <w:b w:val="false"/>
+          <w:bCs w:val="false"/>
+          <w:i w:val="false"/>
+          <w:iCs w:val="false"/>
+          <w:sz w:val="24"/>
+          <w:szCs w:val="24"/>
+          <w:rtl/>
+        </w:rPr>
+        <w:t xml:space="preserve">ממצא מרכזי של דיוויס </w:t>
+      </w:r>
+      <w:r>
+        <w:rPr>
+          <w:rFonts w:ascii="Times New Roman" w:cs="Times New Roman" w:hAnsi="Times New Roman"/>
+          <w:b w:val="false"/>
+          <w:bCs w:val="false"/>
+          <w:i w:val="false"/>
+          <w:iCs w:val="false"/>
+          <w:sz w:val="24"/>
+          <w:szCs w:val="24"/>
+          <w:rtl w:val="false"/>
+        </w:rPr>
+        <w:t xml:space="preserve">(Davis, 1989) </w:t>
+      </w:r>
+      <w:r>
+        <w:rPr>
+          <w:rFonts w:ascii="David" w:cs="David" w:hAnsi="David"/>
+          <w:b w:val="false"/>
+          <w:bCs w:val="false"/>
+          <w:i w:val="false"/>
+          <w:iCs w:val="false"/>
+          <w:sz w:val="24"/>
+          <w:szCs w:val="24"/>
+          <w:rtl/>
+        </w:rPr>
+        <w:t xml:space="preserve">הוא שתפיסת השימושיות משפיעה על השימוש יותר מקלות השימוש: משתמשים מוכנים להתמודד עם כלי מסובך אם הם משוכנעים בתועלתו, אך שום קלות שימוש לא תפצה על כלי הנתפס חסר תועלת. חשוב שמדובר בתפיסות סובייקטיביות ובאמונות אישיות, ולא בתכונות אובייקטיביות של הטכנולוגיה: אותו כלי עצמו יכול להיתפס שימושי בעיני מורה אחד וחסר ערך בעיני אחר, ולכן חקר התפיסות הוא המפתח להבנת האימוץ. עם זאת, המודל פותח עבור טכנולוגיות מידע שגרתיות, שהמשתמש נדרש ללמוד ולתפעל, והספרות העדכנית מטילה ספק בדיותו לטכנולוגיות בעלות מאפיינים אנושיים </w:t>
+      </w:r>
+      <w:r>
+        <w:rPr>
+          <w:rFonts w:ascii="Times New Roman" w:cs="Times New Roman" w:hAnsi="Times New Roman"/>
+          <w:b w:val="false"/>
+          <w:bCs w:val="false"/>
+          <w:i w:val="false"/>
+          <w:iCs w:val="false"/>
+          <w:sz w:val="24"/>
+          <w:szCs w:val="24"/>
+          <w:rtl w:val="false"/>
+        </w:rPr>
+        <w:t xml:space="preserve">(Gursoy et al., 2019).</w:t>
       </w:r>
     </w:p>
     <w:p>
@@ -2447,7 +3287,7 @@
           <w:szCs w:val="24"/>
           <w:rtl/>
         </w:rPr>
-        <w:t xml:space="preserve">בדיוק על רקע זה פותח מודל </w:t>
+        <w:t xml:space="preserve">על רקע זה פותח מודל </w:t>
       </w:r>
       <w:r>
         <w:rPr>
@@ -2473,33 +3313,79 @@
           <w:szCs w:val="24"/>
           <w:rtl/>
         </w:rPr>
-        <w:t xml:space="preserve">המבקש להסביר קבלה של התקנים מבוססי בינה מלאכותית. גורסוי ואחרים (</w:t>
-      </w:r>
-      <w:r>
-        <w:rPr>
-          <w:rFonts w:ascii="Times New Roman" w:cs="Times New Roman" w:hAnsi="Times New Roman"/>
-          <w:b w:val="false"/>
-          <w:bCs w:val="false"/>
-          <w:i w:val="false"/>
-          <w:iCs w:val="false"/>
-          <w:sz w:val="24"/>
-          <w:szCs w:val="24"/>
-          <w:rtl w:val="false"/>
-        </w:rPr>
-        <w:t xml:space="preserve">Gursoy et al., 2019) </w:t>
-      </w:r>
-      <w:r>
-        <w:rPr>
-          <w:rFonts w:ascii="David" w:cs="David" w:hAnsi="David"/>
-          <w:b w:val="false"/>
-          <w:bCs w:val="false"/>
-          <w:i w:val="false"/>
-          <w:iCs w:val="false"/>
-          <w:sz w:val="24"/>
-          <w:szCs w:val="24"/>
-          <w:rtl/>
-        </w:rPr>
-        <w:t xml:space="preserve">טוענים שמודלים קלאסיים אינם מספיקים לתיאור אימוץ של טכנולוגיה "חושבת", ומציעים תהליך פסיכולוגי בן שלושה שלבים. בשלב ההערכה הראשונית הפרט בוחן את הרלוונטיות של הטכנולוגיה עבורו לאור שלושה גורמים: השפעה חברתית, מוטיבציה נהנתנית והאנשה, כלומר המידה שבה הכלי נתפס כבעל מאפיינים אנושיים. בשלב ההערכה המשנית נערך חשבון עלות-תועלת דרך ציפייה לביצועים וציפייה למאמץ, המקבילות לתפיסות היסוד של </w:t>
+        <w:t xml:space="preserve">המבקש להסביר קבלה של התקנים ויישומים מבוססי בינה מלאכותית. גורסוי ואחרים </w:t>
+      </w:r>
+      <w:r>
+        <w:rPr>
+          <w:rFonts w:ascii="Times New Roman" w:cs="Times New Roman" w:hAnsi="Times New Roman"/>
+          <w:b w:val="false"/>
+          <w:bCs w:val="false"/>
+          <w:i w:val="false"/>
+          <w:iCs w:val="false"/>
+          <w:sz w:val="24"/>
+          <w:szCs w:val="24"/>
+          <w:rtl w:val="false"/>
+        </w:rPr>
+        <w:t xml:space="preserve">(Gursoy et al., 2019) </w:t>
+      </w:r>
+      <w:r>
+        <w:rPr>
+          <w:rFonts w:ascii="David" w:cs="David" w:hAnsi="David"/>
+          <w:b w:val="false"/>
+          <w:bCs w:val="false"/>
+          <w:i w:val="false"/>
+          <w:iCs w:val="false"/>
+          <w:sz w:val="24"/>
+          <w:szCs w:val="24"/>
+          <w:rtl/>
+        </w:rPr>
+        <w:t xml:space="preserve">טוענים שמודלים קלאסיים דוגמת </w:t>
+      </w:r>
+      <w:r>
+        <w:rPr>
+          <w:rFonts w:ascii="Times New Roman" w:cs="Times New Roman" w:hAnsi="Times New Roman"/>
+          <w:b w:val="false"/>
+          <w:bCs w:val="false"/>
+          <w:i w:val="false"/>
+          <w:iCs w:val="false"/>
+          <w:sz w:val="24"/>
+          <w:szCs w:val="24"/>
+          <w:rtl w:val="false"/>
+        </w:rPr>
+        <w:t xml:space="preserve">TAM </w:t>
+      </w:r>
+      <w:r>
+        <w:rPr>
+          <w:rFonts w:ascii="David" w:cs="David" w:hAnsi="David"/>
+          <w:b w:val="false"/>
+          <w:bCs w:val="false"/>
+          <w:i w:val="false"/>
+          <w:iCs w:val="false"/>
+          <w:sz w:val="24"/>
+          <w:szCs w:val="24"/>
+          <w:rtl/>
+        </w:rPr>
+        <w:t xml:space="preserve">אינם מספיקים לתיאור אימוץ של טכנולוגיה "חושבת", בעלת מאפיינים אנושיים, שאינה דורשת תפעול במובן המסורתי, ומציעים במקומם תהליך פסיכולוגי בן שלושה שלבים, הנשען על תיאוריית ההערכה הקוגניטיבית של רגשות. בשלב ההערכה הראשונית הפרט שואל את עצמו מה הרושם הראשוני שלו, ובוחן שלושה גורמים: השפעה חברתית, כלומר מה חושבים ועושים האנשים החשובים לו וסביבתו המקצועית; מוטיבציה נהנתנית, כלומר עד כמה השימוש נתפס מהנה, מסקרן ומעניין; והאנשה, כלומר המידה שבה הכלי נתפס כבעל מאפיינים אנושיים, דוגמת קול אנושי או ניהול דיאלוג אישי.</w:t>
+      </w:r>
+    </w:p>
+    <w:p>
+      <w:pPr>
+        <w:bidi/>
+        <w:spacing w:after="120" w:line="360" w:lineRule="auto"/>
+        <w:jc w:val="both"/>
+      </w:pPr>
+      <w:r>
+        <w:rPr>
+          <w:rFonts w:ascii="David" w:cs="David" w:hAnsi="David"/>
+          <w:b w:val="false"/>
+          <w:bCs w:val="false"/>
+          <w:i w:val="false"/>
+          <w:iCs w:val="false"/>
+          <w:sz w:val="24"/>
+          <w:szCs w:val="24"/>
+          <w:rtl/>
+        </w:rPr>
+        <w:t xml:space="preserve">בשלב ההערכה המשנית נערך חשבון עלות-תועלת אישי: ציפייה לביצועים, כלומר האם הכלי ישפר את התוצאות ויחסוך זמן, וציפייה למאמץ, כלומר כמה קשה יהיה ללמוד אותו ולהשתמש בו, שני ממדים המקבילים לתפיסות היסוד של </w:t>
       </w:r>
       <w:r>
         <w:rPr>
@@ -2525,46 +3411,59 @@
           <w:szCs w:val="24"/>
           <w:rtl/>
         </w:rPr>
-        <w:t xml:space="preserve">ייחודו של המודל בשלב השלישי: ההערכות מולידות חוויה רגשית, חיובית או שלילית, והרגש הוא הגורם הישיר שמכריע בין נכונות להשתמש ובין התנגדות (</w:t>
-      </w:r>
-      <w:r>
-        <w:rPr>
-          <w:rFonts w:ascii="Times New Roman" w:cs="Times New Roman" w:hAnsi="Times New Roman"/>
-          <w:b w:val="false"/>
-          <w:bCs w:val="false"/>
-          <w:i w:val="false"/>
-          <w:iCs w:val="false"/>
-          <w:sz w:val="24"/>
-          <w:szCs w:val="24"/>
-          <w:rtl w:val="false"/>
-        </w:rPr>
-        <w:t xml:space="preserve">Gursoy et al., 2019). </w:t>
-      </w:r>
-      <w:r>
-        <w:rPr>
-          <w:rFonts w:ascii="David" w:cs="David" w:hAnsi="David"/>
-          <w:b w:val="false"/>
-          <w:bCs w:val="false"/>
-          <w:i w:val="false"/>
-          <w:iCs w:val="false"/>
-          <w:sz w:val="24"/>
-          <w:szCs w:val="24"/>
-          <w:rtl/>
-        </w:rPr>
-        <w:t xml:space="preserve">במחקר האימות הוסבר חלק ניכר מהשונות בנכונות השימוש, ונמצא בין השאר שמוטיבציה נהנתנית מנבאת בעוצמה את הציפייה לביצועים, ושהאנשה דווקא מעלה את המאמץ הצפוי (</w:t>
-      </w:r>
-      <w:r>
-        <w:rPr>
-          <w:rFonts w:ascii="Times New Roman" w:cs="Times New Roman" w:hAnsi="Times New Roman"/>
-          <w:b w:val="false"/>
-          <w:bCs w:val="false"/>
-          <w:i w:val="false"/>
-          <w:iCs w:val="false"/>
-          <w:sz w:val="24"/>
-          <w:szCs w:val="24"/>
-          <w:rtl w:val="false"/>
-        </w:rPr>
-        <w:t xml:space="preserve">Gursoy et al., 2019).</w:t>
+        <w:t xml:space="preserve">ייחודו של המודל בשלב השלישי: ההערכות אינן מובילות ישירות להחלטה אלא מולידות חוויה רגשית, סקרנות, התלהבות וביטחון מצד אחד, או חשש, חרדה וחוסר אמון מצד אחר, והרגש הוא הגורם הישיר שמכריע בין נכונות להשתמש ובין התנגדות </w:t>
+      </w:r>
+      <w:r>
+        <w:rPr>
+          <w:rFonts w:ascii="Times New Roman" w:cs="Times New Roman" w:hAnsi="Times New Roman"/>
+          <w:b w:val="false"/>
+          <w:bCs w:val="false"/>
+          <w:i w:val="false"/>
+          <w:iCs w:val="false"/>
+          <w:sz w:val="24"/>
+          <w:szCs w:val="24"/>
+          <w:rtl w:val="false"/>
+        </w:rPr>
+        <w:t xml:space="preserve">(Gursoy et al., 2019). </w:t>
+      </w:r>
+      <w:r>
+        <w:rPr>
+          <w:rFonts w:ascii="David" w:cs="David" w:hAnsi="David"/>
+          <w:b w:val="false"/>
+          <w:bCs w:val="false"/>
+          <w:i w:val="false"/>
+          <w:iCs w:val="false"/>
+          <w:sz w:val="24"/>
+          <w:szCs w:val="24"/>
+          <w:rtl/>
+        </w:rPr>
+        <w:t xml:space="preserve">במחקר האימות, שנערך בקרב 439 משתתפים, נתמכו שמונה מעשר ההשערות: המוטיבציה הנהנתנית ניבאה בעוצמה את הציפייה לביצועים והפחיתה את המאמץ הצפוי, ההאנשה דווקא העלתה את המאמץ הצפוי, והרגש הסביר את רוב השונות בנכונות השימוש </w:t>
+      </w:r>
+      <w:r>
+        <w:rPr>
+          <w:rFonts w:ascii="Times New Roman" w:cs="Times New Roman" w:hAnsi="Times New Roman"/>
+          <w:b w:val="false"/>
+          <w:bCs w:val="false"/>
+          <w:i w:val="false"/>
+          <w:iCs w:val="false"/>
+          <w:sz w:val="24"/>
+          <w:szCs w:val="24"/>
+          <w:rtl w:val="false"/>
+        </w:rPr>
+        <w:t xml:space="preserve">(Gursoy et al., 2019). </w:t>
+      </w:r>
+      <w:r>
+        <w:rPr>
+          <w:rFonts w:ascii="David" w:cs="David" w:hAnsi="David"/>
+          <w:b w:val="false"/>
+          <w:bCs w:val="false"/>
+          <w:i w:val="false"/>
+          <w:iCs w:val="false"/>
+          <w:sz w:val="24"/>
+          <w:szCs w:val="24"/>
+          <w:rtl/>
+        </w:rPr>
+        <w:t xml:space="preserve">המסקנה התיאורטית היא שאימוץ בינה מלאכותית איננו חישוב תועלת קר אלא תהליך שההכרעה בו עוברת דרך הרגש.</w:t>
       </w:r>
     </w:p>
     <w:p>
@@ -2630,92 +3529,171 @@
           <w:szCs w:val="24"/>
           <w:rtl/>
         </w:rPr>
-        <w:t xml:space="preserve">יושם לאחרונה על מורים בישראל. במחקר שנערך בקרב 270 מורים נמצא שכל ששת ממדי האימוץ שנבדקו קשורים לשימוש מקצועי בבינה מלאכותית יוצרת, אך המנבאים החזקים ביותר היו דווקא המוטיבציה הנהנתנית והנכונות להשתמש, לצד רגשות חיוביים כלפי הטכנולוגיה. הציפייה למאמץ נמצאה קשורה לשימוש בכיוון שלילי, כלומר ככל שהכלי נתפס מסובך יותר כך פחת השימוש בו, והשכלת המורה נמצאה קשורה לשימוש בכיוון חיובי (דשן ואחרים, 2026). החוקרים מסיקים שאימוץ הטכנולוגיה בקרב מורים מונע במידה רבה ממניעים רגשיים וחווייתיים, הנאה, סקרנות ואמון, ולא משיקולי תועלת בלבד, וממליצים לפתח תרבות בית-ספרית המעודדת התנסות, קהילות מורים תומכות והכשרות מעשיות שיפחיתו את המאמץ הנתפס (דשן ואחרים, 2026).</w:t>
-      </w:r>
-    </w:p>
-    <w:p>
-      <w:pPr>
-        <w:bidi/>
-        <w:spacing w:after="120" w:line="360" w:lineRule="auto"/>
-        <w:jc w:val="both"/>
-      </w:pPr>
-      <w:r>
-        <w:rPr>
-          <w:rFonts w:ascii="David" w:cs="David" w:hAnsi="David"/>
-          <w:b w:val="false"/>
-          <w:bCs w:val="false"/>
-          <w:i w:val="false"/>
-          <w:iCs w:val="false"/>
-          <w:sz w:val="24"/>
-          <w:szCs w:val="24"/>
-          <w:rtl/>
-        </w:rPr>
-        <w:t xml:space="preserve">בצד המעכב עומדת חרדת הבינה המלאכותית. לי והואנג (</w:t>
-      </w:r>
-      <w:r>
-        <w:rPr>
-          <w:rFonts w:ascii="Times New Roman" w:cs="Times New Roman" w:hAnsi="Times New Roman"/>
-          <w:b w:val="false"/>
-          <w:bCs w:val="false"/>
-          <w:i w:val="false"/>
-          <w:iCs w:val="false"/>
-          <w:sz w:val="24"/>
-          <w:szCs w:val="24"/>
-          <w:rtl w:val="false"/>
-        </w:rPr>
-        <w:t xml:space="preserve">Li &amp; Huang, 2020) </w:t>
-      </w:r>
-      <w:r>
-        <w:rPr>
-          <w:rFonts w:ascii="David" w:cs="David" w:hAnsi="David"/>
-          <w:b w:val="false"/>
-          <w:bCs w:val="false"/>
-          <w:i w:val="false"/>
-          <w:iCs w:val="false"/>
-          <w:sz w:val="24"/>
-          <w:szCs w:val="24"/>
-          <w:rtl/>
-        </w:rPr>
-        <w:t xml:space="preserve">מיפו שמונה ממדים של חרדה זו, ובהם חשש מהחלפה בעבודה, חרדת למידה של טכנולוגיה מורכבת, חשש מפגיעה בפרטיות, מהטיות, מהיעדר שקיפות ומסוגיות אתיות. הם מראים שחרדת בינה מלאכותית שונה במהותה מחרדת מחשב מסורתית, משום שהטכנולוגיה מקבלת החלטות באופן עצמאי ומתפתחת בעצמה. עם זאת, עוצמת השפעתה של החרדה אינה אחידה: אצל מורים נמצא שדווקא תחושת המסוגלות והרלוונטיות הנתפסת של התחום מנבאות את הכוונה לעסוק בו, ואילו החרדה לא נמצאה מנבא מובהק (</w:t>
-      </w:r>
-      <w:r>
-        <w:rPr>
-          <w:rFonts w:ascii="Times New Roman" w:cs="Times New Roman" w:hAnsi="Times New Roman"/>
-          <w:b w:val="false"/>
-          <w:bCs w:val="false"/>
-          <w:i w:val="false"/>
-          <w:iCs w:val="false"/>
-          <w:sz w:val="24"/>
-          <w:szCs w:val="24"/>
-          <w:rtl w:val="false"/>
-        </w:rPr>
-        <w:t xml:space="preserve">Ayanwale et al., 2022). </w:t>
-      </w:r>
-      <w:r>
-        <w:rPr>
-          <w:rFonts w:ascii="David" w:cs="David" w:hAnsi="David"/>
-          <w:b w:val="false"/>
-          <w:bCs w:val="false"/>
-          <w:i w:val="false"/>
-          <w:iCs w:val="false"/>
-          <w:sz w:val="24"/>
-          <w:szCs w:val="24"/>
-          <w:rtl/>
-        </w:rPr>
-        <w:t xml:space="preserve">ממצאים אלה מחזקים את התפיסה שההתמודדות עם עמדות מורים צריכה להתמקד בהעצמה ובהכשרה ולא רק בהפגת חששות (דשן ואחרים, 2026; </w:t>
-      </w:r>
-      <w:r>
-        <w:rPr>
-          <w:rFonts w:ascii="Times New Roman" w:cs="Times New Roman" w:hAnsi="Times New Roman"/>
-          <w:b w:val="false"/>
-          <w:bCs w:val="false"/>
-          <w:i w:val="false"/>
-          <w:iCs w:val="false"/>
-          <w:sz w:val="24"/>
-          <w:szCs w:val="24"/>
-          <w:rtl w:val="false"/>
-        </w:rPr>
-        <w:t xml:space="preserve">Ayanwale et al., 2022).</w:t>
+        <w:t xml:space="preserve">יושם לאחרונה על מורים בישראל. במחקר כמותני שנערך בקרב 270 מורים, שגילם הממוצע 42, נמצא ש-73 אחוזים מהם משתמשים ביישומי בינה מלאכותית יוצרת, וכמחציתם עושים בהם שימוש לצרכים מקצועיים. כל ששת ממדי האימוץ שנבדקו נמצאו קשורים לשימוש המקצועי, אך המנבאים החזקים ביותר היו דווקא המוטיבציה הנהנתנית והנכונות להשתמש, ואחריהם הרגשות החיוביים כלפי הטכנולוגיה; הציפייה לביצועים וההשפעה החברתית נמצאו קשורות במידה מתונה יותר. הציפייה למאמץ נמצאה קשורה לשימוש בכיוון שלילי, כלומר ככל שהכלי נתפס מסובך ותובעני יותר כך פחת השימוש בו, והשכלת המורה נמצאה קשורה לשימוש בכיוון חיובי, ואילו גיל ומגדר לא נמצאו קשורים כלל (דשן ואחרים, 2026).</w:t>
+      </w:r>
+    </w:p>
+    <w:p>
+      <w:pPr>
+        <w:bidi/>
+        <w:spacing w:after="120" w:line="360" w:lineRule="auto"/>
+        <w:jc w:val="both"/>
+      </w:pPr>
+      <w:r>
+        <w:rPr>
+          <w:rFonts w:ascii="David" w:cs="David" w:hAnsi="David"/>
+          <w:b w:val="false"/>
+          <w:bCs w:val="false"/>
+          <w:i w:val="false"/>
+          <w:iCs w:val="false"/>
+          <w:sz w:val="24"/>
+          <w:szCs w:val="24"/>
+          <w:rtl/>
+        </w:rPr>
+        <w:t xml:space="preserve">החוקרים מסיקים שאימוץ הטכנולוגיה בקרב מורים מונע במידה רבה ממניעים רגשיים וחווייתיים, הנאה, סקרנות, עניין ואמון, ולא משיקולי תועלת בלבד, דפוס המייחד את מגזר ההוראה. מכאן המלצותיהם: לפתח תרבות בית-ספרית המעודדת התנסות וחדשנות ומדגישה הנאה ויצירתיות; לטפח קהילות מורים לשיתוף ידע ולתמיכה הדדית; לבנות הכשרות פדגוגיות ממוקדות המדגימות את הערך ההוראתי של הכלים; ולגבש מדיניות מערכתית הכוללת תמיכה מוסדית ונגישות שוויונית למשאבים (דשן ואחרים, 2026). ממצאים אלה מאששים את מודל </w:t>
+      </w:r>
+      <w:r>
+        <w:rPr>
+          <w:rFonts w:ascii="Times New Roman" w:cs="Times New Roman" w:hAnsi="Times New Roman"/>
+          <w:b w:val="false"/>
+          <w:bCs w:val="false"/>
+          <w:i w:val="false"/>
+          <w:iCs w:val="false"/>
+          <w:sz w:val="24"/>
+          <w:szCs w:val="24"/>
+          <w:rtl w:val="false"/>
+        </w:rPr>
+        <w:t xml:space="preserve">AIDUA </w:t>
+      </w:r>
+      <w:r>
+        <w:rPr>
+          <w:rFonts w:ascii="David" w:cs="David" w:hAnsi="David"/>
+          <w:b w:val="false"/>
+          <w:bCs w:val="false"/>
+          <w:i w:val="false"/>
+          <w:iCs w:val="false"/>
+          <w:sz w:val="24"/>
+          <w:szCs w:val="24"/>
+          <w:rtl/>
+        </w:rPr>
+        <w:t xml:space="preserve">בהקשר של הוראה ולמידה ומצביעים על הפחתת המאמץ הנתפס כמנוף המרכזי להרחבת השימוש (דשן ואחרים, 2026).</w:t>
+      </w:r>
+    </w:p>
+    <w:p>
+      <w:pPr>
+        <w:bidi/>
+        <w:spacing w:after="120" w:line="360" w:lineRule="auto"/>
+        <w:jc w:val="both"/>
+      </w:pPr>
+      <w:r>
+        <w:rPr>
+          <w:rFonts w:ascii="David" w:cs="David" w:hAnsi="David"/>
+          <w:b w:val="false"/>
+          <w:bCs w:val="false"/>
+          <w:i w:val="false"/>
+          <w:iCs w:val="false"/>
+          <w:sz w:val="24"/>
+          <w:szCs w:val="24"/>
+          <w:rtl/>
+        </w:rPr>
+        <w:t xml:space="preserve">בצד המעכב עומדת חרדת הבינה המלאכותית. לי והואנג </w:t>
+      </w:r>
+      <w:r>
+        <w:rPr>
+          <w:rFonts w:ascii="Times New Roman" w:cs="Times New Roman" w:hAnsi="Times New Roman"/>
+          <w:b w:val="false"/>
+          <w:bCs w:val="false"/>
+          <w:i w:val="false"/>
+          <w:iCs w:val="false"/>
+          <w:sz w:val="24"/>
+          <w:szCs w:val="24"/>
+          <w:rtl w:val="false"/>
+        </w:rPr>
+        <w:t xml:space="preserve">(Li &amp; Huang, 2020) </w:t>
+      </w:r>
+      <w:r>
+        <w:rPr>
+          <w:rFonts w:ascii="David" w:cs="David" w:hAnsi="David"/>
+          <w:b w:val="false"/>
+          <w:bCs w:val="false"/>
+          <w:i w:val="false"/>
+          <w:iCs w:val="false"/>
+          <w:sz w:val="24"/>
+          <w:szCs w:val="24"/>
+          <w:rtl/>
+        </w:rPr>
+        <w:t xml:space="preserve">מיפו, על בסיס תיאוריות של רכישת פחד ובמדגם של 494 משיבים, שמונה ממדים של חרדה זו: חשש מפגיעה בפרטיות; חשש מהתנהגות מוטה ומפלה של המערכות; חרדת החלפה בעבודה; חרדת למידה, כלומר החשש שהטכנולוגיה קשה מדי ללמידה; חרדה קיומית; חשש מהפרות אתיקה; חרדה מפני תודעה מלאכותית; וחשש מהיעדר שקיפות בקבלת ההחלטות של המערכות. הם מראים שחרדת בינה מלאכותית שונה במהותה מחרדת מחשב מסורתית, משום שהטכנולוגיה מקבלת החלטות באופן עצמאי, מתפתחת בעצמה ופועלת כ"קופסה שחורה", ולכן ממדים כמו הטיה, שקיפות ותודעה כלל אינם קיימים בחקר חרדת המחשב </w:t>
+      </w:r>
+      <w:r>
+        <w:rPr>
+          <w:rFonts w:ascii="Times New Roman" w:cs="Times New Roman" w:hAnsi="Times New Roman"/>
+          <w:b w:val="false"/>
+          <w:bCs w:val="false"/>
+          <w:i w:val="false"/>
+          <w:iCs w:val="false"/>
+          <w:sz w:val="24"/>
+          <w:szCs w:val="24"/>
+          <w:rtl w:val="false"/>
+        </w:rPr>
+        <w:t xml:space="preserve">(Li &amp; Huang, 2020).</w:t>
+      </w:r>
+    </w:p>
+    <w:p>
+      <w:pPr>
+        <w:bidi/>
+        <w:spacing w:after="120" w:line="360" w:lineRule="auto"/>
+        <w:jc w:val="both"/>
+      </w:pPr>
+      <w:r>
+        <w:rPr>
+          <w:rFonts w:ascii="David" w:cs="David" w:hAnsi="David"/>
+          <w:b w:val="false"/>
+          <w:bCs w:val="false"/>
+          <w:i w:val="false"/>
+          <w:iCs w:val="false"/>
+          <w:sz w:val="24"/>
+          <w:szCs w:val="24"/>
+          <w:rtl/>
+        </w:rPr>
+        <w:t xml:space="preserve">עם זאת, עוצמת השפעתה של החרדה על התנהגות המורים אינה אחידה. במחקר שנסקר לעיל נמצא שרמת החרדה של המורים הייתה נמוכה, ושהיא לא ניבאה את כוונתם לעסוק בתחום; המנבאים המשמעותיים היו תחושת המסוגלות והרלוונטיות הנתפסת </w:t>
+      </w:r>
+      <w:r>
+        <w:rPr>
+          <w:rFonts w:ascii="Times New Roman" w:cs="Times New Roman" w:hAnsi="Times New Roman"/>
+          <w:b w:val="false"/>
+          <w:bCs w:val="false"/>
+          <w:i w:val="false"/>
+          <w:iCs w:val="false"/>
+          <w:sz w:val="24"/>
+          <w:szCs w:val="24"/>
+          <w:rtl w:val="false"/>
+        </w:rPr>
+        <w:t xml:space="preserve">(Ayanwale et al., 2022). </w:t>
+      </w:r>
+      <w:r>
+        <w:rPr>
+          <w:rFonts w:ascii="David" w:cs="David" w:hAnsi="David"/>
+          <w:b w:val="false"/>
+          <w:bCs w:val="false"/>
+          <w:i w:val="false"/>
+          <w:iCs w:val="false"/>
+          <w:sz w:val="24"/>
+          <w:szCs w:val="24"/>
+          <w:rtl/>
+        </w:rPr>
+        <w:t xml:space="preserve">ממצאים אלה מחזקים את התפיסה שההתמודדות עם עמדות מורים צריכה להתמקד בהעצמה, בהכשרה ובחיזוק תחושת המסוגלות, ולא רק בהפגת חששות (דשן ואחרים, 2026; </w:t>
+      </w:r>
+      <w:r>
+        <w:rPr>
+          <w:rFonts w:ascii="Times New Roman" w:cs="Times New Roman" w:hAnsi="Times New Roman"/>
+          <w:b w:val="false"/>
+          <w:bCs w:val="false"/>
+          <w:i w:val="false"/>
+          <w:iCs w:val="false"/>
+          <w:sz w:val="24"/>
+          <w:szCs w:val="24"/>
+          <w:rtl w:val="false"/>
+        </w:rPr>
+        <w:t xml:space="preserve">Ayanwale et al., 2022).</w:t>
       </w:r>
     </w:p>
     <w:p>
@@ -2776,20 +3754,66 @@
           <w:szCs w:val="24"/>
           <w:rtl/>
         </w:rPr>
-        <w:t xml:space="preserve">הספרות הישראלית מתעדת פער עקבי בין עמדות חיוביות של מורים ובין יישום בפועל. מחקר על מורי מתמטיקה בתיכון מצא שרובם רואים בעין יפה שילוב של תכנים מעשירים והוראה בין-תחומית, אך כמעט אינם מיישמים זאת בכיתה בשל לחץ בחינות הבגרות, מחסור בשעות ותכנית לימודים עמוסה (מידז'נסקי ומלמד, 2022). דפוס דומה צפוי גם בשילוב בינה מלאכותית: עמדה חיובית איננה מתורגמת מאליה לפרקטיקה כאשר המשאבים, הזמן והתשתיות מוגבלים. לכך מצטרפים פערי נגישות בין בתי ספר ובין אוכלוסיות, המכונים "פער דיגיטלי מסדר שני", שבו ההבדל אינו רק בגישה לכלים אלא באיכות השימוש בהם (</w:t>
-      </w:r>
-      <w:r>
-        <w:rPr>
-          <w:rFonts w:ascii="Times New Roman" w:cs="Times New Roman" w:hAnsi="Times New Roman"/>
-          <w:b w:val="false"/>
-          <w:bCs w:val="false"/>
-          <w:i w:val="false"/>
-          <w:iCs w:val="false"/>
-          <w:sz w:val="24"/>
-          <w:szCs w:val="24"/>
-          <w:rtl w:val="false"/>
-        </w:rPr>
-        <w:t xml:space="preserve">Mishra et al., 2023).</w:t>
+        <w:t xml:space="preserve">הספרות הישראלית מתעדת פער עקבי בין עמדות חיוביות של מורים ובין יישום בפועל. מחקר איכותני שבו רואיינו 24 מורי מתמטיקה בתיכון מצא שרובם רואים בעין יפה שילוב של תופעות מתמטיות מן הטבע והוראה בין-תחומית, ומכירים בערכן המוטיבציוני, אך כמעט אינם משלבים אותן בכיתה. החסמים שזיהו המורים היו לחץ בחינות הבגרות המכתיב את הנלמד, מחסור בשעות, תכנית לימודים עמוסה שהתכנים המעשירים אינם חלק ממנה, וחוסר ידע בתחומי דעת משיקים (מידז'נסקי ומלמד, 2022). הדפוס הזה, עמדה חיובית שאינה מתורגמת לפרקטיקה בשל אילוצי מערכת, צפוי להופיע גם בשילוב בינה מלאכותית בהוראת האנגלית: מורה יכול להאמין בערכו של הכלי ועדיין להימנע ממנו כאשר הזמן, השעות והתשתיות מוגבלים.</w:t>
+      </w:r>
+    </w:p>
+    <w:p>
+      <w:pPr>
+        <w:bidi/>
+        <w:spacing w:after="120" w:line="360" w:lineRule="auto"/>
+        <w:jc w:val="both"/>
+      </w:pPr>
+      <w:r>
+        <w:rPr>
+          <w:rFonts w:ascii="David" w:cs="David" w:hAnsi="David"/>
+          <w:b w:val="false"/>
+          <w:bCs w:val="false"/>
+          <w:i w:val="false"/>
+          <w:iCs w:val="false"/>
+          <w:sz w:val="24"/>
+          <w:szCs w:val="24"/>
+          <w:rtl/>
+        </w:rPr>
+        <w:t xml:space="preserve">אתגר נוסף הוא פערי נגישות. ההבדלים בין בתי ספר ובין אוכלוסיות אינם מתמצים בשאלה מי מחזיק במחשבים ובחיבור לרשת; הם נוגעים גם לאיכות השימוש, למיומנויות ולליווי, תופעה המכונה "פער דיגיטלי מסדר שני". פערים אלה מאיימים להעמיק דווקא עם כניסת כלים רבי-עוצמה, שכן מי שיודע להשתמש בהם מפיק מהם ערך רב, ומי שאינו יודע נותר מאחור </w:t>
+      </w:r>
+      <w:r>
+        <w:rPr>
+          <w:rFonts w:ascii="Times New Roman" w:cs="Times New Roman" w:hAnsi="Times New Roman"/>
+          <w:b w:val="false"/>
+          <w:bCs w:val="false"/>
+          <w:i w:val="false"/>
+          <w:iCs w:val="false"/>
+          <w:sz w:val="24"/>
+          <w:szCs w:val="24"/>
+          <w:rtl w:val="false"/>
+        </w:rPr>
+        <w:t xml:space="preserve">(Mishra et al., 2023). </w:t>
+      </w:r>
+      <w:r>
+        <w:rPr>
+          <w:rFonts w:ascii="David" w:cs="David" w:hAnsi="David"/>
+          <w:b w:val="false"/>
+          <w:bCs w:val="false"/>
+          <w:i w:val="false"/>
+          <w:iCs w:val="false"/>
+          <w:sz w:val="24"/>
+          <w:szCs w:val="24"/>
+          <w:rtl/>
+        </w:rPr>
+        <w:t xml:space="preserve">בהוראת האנגלית, שבה פערי החשיפה לשפה גדולים ממילא, לפער כזה משמעות מיוחדת </w:t>
+      </w:r>
+      <w:r>
+        <w:rPr>
+          <w:rFonts w:ascii="Times New Roman" w:cs="Times New Roman" w:hAnsi="Times New Roman"/>
+          <w:b w:val="false"/>
+          <w:bCs w:val="false"/>
+          <w:i w:val="false"/>
+          <w:iCs w:val="false"/>
+          <w:sz w:val="24"/>
+          <w:szCs w:val="24"/>
+          <w:rtl w:val="false"/>
+        </w:rPr>
+        <w:t xml:space="preserve">(Ministry of Education, 2020).</w:t>
       </w:r>
     </w:p>
     <w:p>
@@ -2829,33 +3853,33 @@
           <w:szCs w:val="24"/>
           <w:rtl/>
         </w:rPr>
-        <w:t xml:space="preserve">גורם מעכב מרכזי נוסף הוא היעדר הכשרה מתאימה. הציפייה למאמץ נמצאה כאמור חסם ממשי לשימוש מקצועי בבינה מלאכותית יוצרת, ומכאן הצורך בהכשרות מעשיות, בליווי אישי ובמשאבים זמינים שיהפכו את הכלי לנגיש (דשן ואחרים, 2026). גם בקרב מורים שנמצאו חיוביים כלפי הוראת בינה מלאכותית, ההמלצה המחקרית היא פיתוח מקצועי הכולל התנסות מודרכת, חיזוק תחושת המסוגלות וגיבוי מערכתי (</w:t>
-      </w:r>
-      <w:r>
-        <w:rPr>
-          <w:rFonts w:ascii="Times New Roman" w:cs="Times New Roman" w:hAnsi="Times New Roman"/>
-          <w:b w:val="false"/>
-          <w:bCs w:val="false"/>
-          <w:i w:val="false"/>
-          <w:iCs w:val="false"/>
-          <w:sz w:val="24"/>
-          <w:szCs w:val="24"/>
-          <w:rtl w:val="false"/>
-        </w:rPr>
-        <w:t xml:space="preserve">Ayanwale et al., 2022). </w:t>
-      </w:r>
-      <w:r>
-        <w:rPr>
-          <w:rFonts w:ascii="David" w:cs="David" w:hAnsi="David"/>
-          <w:b w:val="false"/>
-          <w:bCs w:val="false"/>
-          <w:i w:val="false"/>
-          <w:iCs w:val="false"/>
-          <w:sz w:val="24"/>
-          <w:szCs w:val="24"/>
-          <w:rtl/>
-        </w:rPr>
-        <w:t xml:space="preserve">ניסיון הקורונה מלמד שכאשר הצורך מיידי והמסגרת תומכת, מורים אכן מסגלים כלים חדשים בקצב מהיר (חיאק ואבידב-אונגר, 2022).</w:t>
+        <w:t xml:space="preserve">גורם מעכב מרכזי נוסף הוא היעדר הכשרה מתאימה. הציפייה למאמץ נמצאה חסם ממשי לשימוש מקצועי בבינה מלאכותית יוצרת: ככל שהכלי נתפס מסובך יותר, פוחת השימוש בו. מכאן הצורך בהכשרות מעשיות והתנסותיות, בליווי אישי ובמשאבים זמינים שיהפכו את הכלי לנגיש ויקטינו את המאמץ הנתפס (דשן ואחרים, 2026). מסקנה דומה עולה מחקר המוכנות: ההמלצה המחקרית היא פיתוח מקצועי הכולל התנסות מודרכת ביסודות התחום, חיזוק תחושת המסוגלות וגיבוי מערכתי, שכן לא די בפיתוח תכנים ויש להשקיע במורים עצמם </w:t>
+      </w:r>
+      <w:r>
+        <w:rPr>
+          <w:rFonts w:ascii="Times New Roman" w:cs="Times New Roman" w:hAnsi="Times New Roman"/>
+          <w:b w:val="false"/>
+          <w:bCs w:val="false"/>
+          <w:i w:val="false"/>
+          <w:iCs w:val="false"/>
+          <w:sz w:val="24"/>
+          <w:szCs w:val="24"/>
+          <w:rtl w:val="false"/>
+        </w:rPr>
+        <w:t xml:space="preserve">(Ayanwale et al., 2022). </w:t>
+      </w:r>
+      <w:r>
+        <w:rPr>
+          <w:rFonts w:ascii="David" w:cs="David" w:hAnsi="David"/>
+          <w:b w:val="false"/>
+          <w:bCs w:val="false"/>
+          <w:i w:val="false"/>
+          <w:iCs w:val="false"/>
+          <w:sz w:val="24"/>
+          <w:szCs w:val="24"/>
+          <w:rtl/>
+        </w:rPr>
+        <w:t xml:space="preserve">ניסיון הקורונה מלמד שהדבר אפשרי: כאשר הצורך היה מיידי והמסגרת תמכה, מורים סיגלו כלים חדשים בקצב מהיר והביקוש להשתלמויות הוכפל (חיאק ואבידב-אונגר, 2022). קהילות מורים מקצועיות, שבהן עמיתים חולקים התנסויות ומודלים לחיקוי, נמצאו אף הן מנוף משמעותי, בהלימה לממצא על כוחה של ההשפעה החברתית (דשן ואחרים, 2026).</w:t>
       </w:r>
     </w:p>
     <w:p>
@@ -2895,72 +3919,92 @@
           <w:szCs w:val="24"/>
           <w:rtl/>
         </w:rPr>
-        <w:t xml:space="preserve">בהוראת שפה מתחדדים חששות ייחודיים: הסתמכות יתר של תלמידים על הכלי בכתיבה עלולה לפגוע בפיתוח מיומנויות היסוד שהשיעור נועד להקנות, והערכת הישגים מסורתית מאבדת מתוקפה כאשר הכלי מסוגל לבצע את המטלה (</w:t>
-      </w:r>
-      <w:r>
-        <w:rPr>
-          <w:rFonts w:ascii="Times New Roman" w:cs="Times New Roman" w:hAnsi="Times New Roman"/>
-          <w:b w:val="false"/>
-          <w:bCs w:val="false"/>
-          <w:i w:val="false"/>
-          <w:iCs w:val="false"/>
-          <w:sz w:val="24"/>
-          <w:szCs w:val="24"/>
-          <w:rtl w:val="false"/>
-        </w:rPr>
-        <w:t xml:space="preserve">Kohnke et al., 2023; Mishra et al., 2023). </w:t>
-      </w:r>
-      <w:r>
-        <w:rPr>
-          <w:rFonts w:ascii="David" w:cs="David" w:hAnsi="David"/>
-          <w:b w:val="false"/>
-          <w:bCs w:val="false"/>
-          <w:i w:val="false"/>
-          <w:iCs w:val="false"/>
-          <w:sz w:val="24"/>
-          <w:szCs w:val="24"/>
-          <w:rtl/>
-        </w:rPr>
-        <w:t xml:space="preserve">נוספים לכך סיכוני מידע שגוי והטיות תרבותיות בטקסטים שהכלי מפיק, סוגיות פרטיות בעבודה עם קטינים והצורך בהסכמת הורים, כפי שמחייבות הנחיות משרד החינוך (משרד החינוך, 2025; </w:t>
-      </w:r>
-      <w:r>
-        <w:rPr>
-          <w:rFonts w:ascii="Times New Roman" w:cs="Times New Roman" w:hAnsi="Times New Roman"/>
-          <w:b w:val="false"/>
-          <w:bCs w:val="false"/>
-          <w:i w:val="false"/>
-          <w:iCs w:val="false"/>
-          <w:sz w:val="24"/>
-          <w:szCs w:val="24"/>
-          <w:rtl w:val="false"/>
-        </w:rPr>
-        <w:t xml:space="preserve">Holmes &amp; Miao, 2023). </w:t>
-      </w:r>
-      <w:r>
-        <w:rPr>
-          <w:rFonts w:ascii="David" w:cs="David" w:hAnsi="David"/>
-          <w:b w:val="false"/>
-          <w:bCs w:val="false"/>
-          <w:i w:val="false"/>
-          <w:iCs w:val="false"/>
-          <w:sz w:val="24"/>
-          <w:szCs w:val="24"/>
-          <w:rtl/>
-        </w:rPr>
-        <w:t xml:space="preserve">האתגר החינוכי איננו רק טכני אלא ערכי: על המורה לתווך ללומדים הצעירים שימוש ביקורתי ואחראי, בגיל שבו החשיבה הביקורתית עודנה מתפתחת (</w:t>
-      </w:r>
-      <w:r>
-        <w:rPr>
-          <w:rFonts w:ascii="Times New Roman" w:cs="Times New Roman" w:hAnsi="Times New Roman"/>
-          <w:b w:val="false"/>
-          <w:bCs w:val="false"/>
-          <w:i w:val="false"/>
-          <w:iCs w:val="false"/>
-          <w:sz w:val="24"/>
-          <w:szCs w:val="24"/>
-          <w:rtl w:val="false"/>
-        </w:rPr>
-        <w:t xml:space="preserve">Ng et al., 2021).</w:t>
+        <w:t xml:space="preserve">בהוראת שפה מתחדדים חששות ייחודיים. הסתמכות יתר של תלמידים על הכלי בכתיבה ובתרגום עלולה לפגוע בפיתוח מיומנויות היסוד שהשיעור נועד להקנות, שהרי מטרת מטלת הכתיבה איננה התוצר אלא התהליך שהלומד עובר; והערכת הישגים מסורתית מאבדת מתוקפה כאשר הכלי מסוגל לבצע את המטלה במקום הלומד </w:t>
+      </w:r>
+      <w:r>
+        <w:rPr>
+          <w:rFonts w:ascii="Times New Roman" w:cs="Times New Roman" w:hAnsi="Times New Roman"/>
+          <w:b w:val="false"/>
+          <w:bCs w:val="false"/>
+          <w:i w:val="false"/>
+          <w:iCs w:val="false"/>
+          <w:sz w:val="24"/>
+          <w:szCs w:val="24"/>
+          <w:rtl w:val="false"/>
+        </w:rPr>
+        <w:t xml:space="preserve">(Kohnke et al., 2023; Mishra et al., 2023). </w:t>
+      </w:r>
+      <w:r>
+        <w:rPr>
+          <w:rFonts w:ascii="David" w:cs="David" w:hAnsi="David"/>
+          <w:b w:val="false"/>
+          <w:bCs w:val="false"/>
+          <w:i w:val="false"/>
+          <w:iCs w:val="false"/>
+          <w:sz w:val="24"/>
+          <w:szCs w:val="24"/>
+          <w:rtl/>
+        </w:rPr>
+        <w:t xml:space="preserve">נוספים לכך סיכוני מידע שגוי והטיות תרבותיות בטקסטים שהכלי מפיק, רגישים במיוחד כאשר הלומדים צעירים ואינם מסוגלים עדיין לזהותם </w:t>
+      </w:r>
+      <w:r>
+        <w:rPr>
+          <w:rFonts w:ascii="Times New Roman" w:cs="Times New Roman" w:hAnsi="Times New Roman"/>
+          <w:b w:val="false"/>
+          <w:bCs w:val="false"/>
+          <w:i w:val="false"/>
+          <w:iCs w:val="false"/>
+          <w:sz w:val="24"/>
+          <w:szCs w:val="24"/>
+          <w:rtl w:val="false"/>
+        </w:rPr>
+        <w:t xml:space="preserve">(Holmes &amp; Miao, 2023; Ng et al., 2021).</w:t>
+      </w:r>
+    </w:p>
+    <w:p>
+      <w:pPr>
+        <w:bidi/>
+        <w:spacing w:after="120" w:line="360" w:lineRule="auto"/>
+        <w:jc w:val="both"/>
+      </w:pPr>
+      <w:r>
+        <w:rPr>
+          <w:rFonts w:ascii="David" w:cs="David" w:hAnsi="David"/>
+          <w:b w:val="false"/>
+          <w:bCs w:val="false"/>
+          <w:i w:val="false"/>
+          <w:iCs w:val="false"/>
+          <w:sz w:val="24"/>
+          <w:szCs w:val="24"/>
+          <w:rtl/>
+        </w:rPr>
+        <w:t xml:space="preserve">בעבודה עם קטינים מצטרפות לכך דרישות הרגולציה: הסכמת הורים מודעת, שמירה על אנונימיות ואיסור הזנת מידע אישי, שימוש בכלים מאושרים בלבד והתאמת השימוש לגיל (משרד החינוך, 2025). האתגר העומד בפני המורה איננו אפוא טכני בלבד אלא ערכי וחינוכי: לתווך ללומדים הצעירים שימוש ביקורתי, אתי ואחראי בטכנולוגיה, בגיל שבו החשיבה הביקורתית עודנה מתפתחת </w:t>
+      </w:r>
+      <w:r>
+        <w:rPr>
+          <w:rFonts w:ascii="Times New Roman" w:cs="Times New Roman" w:hAnsi="Times New Roman"/>
+          <w:b w:val="false"/>
+          <w:bCs w:val="false"/>
+          <w:i w:val="false"/>
+          <w:iCs w:val="false"/>
+          <w:sz w:val="24"/>
+          <w:szCs w:val="24"/>
+          <w:rtl w:val="false"/>
+        </w:rPr>
+        <w:t xml:space="preserve">(Ng et al., 2021). </w:t>
+      </w:r>
+      <w:r>
+        <w:rPr>
+          <w:rFonts w:ascii="David" w:cs="David" w:hAnsi="David"/>
+          <w:b w:val="false"/>
+          <w:bCs w:val="false"/>
+          <w:i w:val="false"/>
+          <w:iCs w:val="false"/>
+          <w:sz w:val="24"/>
+          <w:szCs w:val="24"/>
+          <w:rtl/>
+        </w:rPr>
+        <w:t xml:space="preserve">האופן שבו מורי האנגלית תופסים את מכלול האתגרים הללו, לצד הפוטנציאל, הוא שיעצב את החלטותיהם בכיתה, וזו ליבת המחקר הנוכחי.</w:t>
       </w:r>
     </w:p>
     <w:p>
@@ -3001,157 +4045,190 @@
           <w:szCs w:val="24"/>
           <w:rtl/>
         </w:rPr>
-        <w:t xml:space="preserve">קצה המשפך של סקירה זו הוא המפגש שבין כל הגורמים שנדונו: מורי אנגלית בבית הספר היסודי בישראל העומדים מול כלי בינה מלאכותית יוצרת. הוראת האנגלית היא מקרה מבחן מובהק, משום שהטכנולוגיה פועלת בליבת הדיסציפלינה, ייצור שפה, והיא מציעה למורה בדיוק את מה שקשה להשיג בכיתה הטרוגנית: קלט מדורג, תרגול אישי ומשוב מיידי לכל לומד (</w:t>
-      </w:r>
-      <w:r>
-        <w:rPr>
-          <w:rFonts w:ascii="Times New Roman" w:cs="Times New Roman" w:hAnsi="Times New Roman"/>
-          <w:b w:val="false"/>
-          <w:bCs w:val="false"/>
-          <w:i w:val="false"/>
-          <w:iCs w:val="false"/>
-          <w:sz w:val="24"/>
-          <w:szCs w:val="24"/>
-          <w:rtl w:val="false"/>
-        </w:rPr>
-        <w:t xml:space="preserve">Kohnke et al., 2023; Krashen, 1982). </w:t>
-      </w:r>
-      <w:r>
-        <w:rPr>
-          <w:rFonts w:ascii="David" w:cs="David" w:hAnsi="David"/>
-          <w:b w:val="false"/>
-          <w:bCs w:val="false"/>
-          <w:i w:val="false"/>
-          <w:iCs w:val="false"/>
-          <w:sz w:val="24"/>
-          <w:szCs w:val="24"/>
-          <w:rtl/>
-        </w:rPr>
-        <w:t xml:space="preserve">בה בעת, העבודה עם לומדים צעירים מחדדת את הסיכונים, מדיוק לשוני של הכלי ועד הגנה על פרטיות קטינים, ומחייבת עמידה בהנחיות הרגולציה (משרד החינוך, 2025).</w:t>
-      </w:r>
-    </w:p>
-    <w:p>
-      <w:pPr>
-        <w:bidi/>
-        <w:spacing w:after="120" w:line="360" w:lineRule="auto"/>
-        <w:jc w:val="both"/>
-      </w:pPr>
-      <w:r>
-        <w:rPr>
-          <w:rFonts w:ascii="David" w:cs="David" w:hAnsi="David"/>
-          <w:b w:val="false"/>
-          <w:bCs w:val="false"/>
-          <w:i w:val="false"/>
-          <w:iCs w:val="false"/>
-          <w:sz w:val="24"/>
-          <w:szCs w:val="24"/>
-          <w:rtl/>
-        </w:rPr>
-        <w:t xml:space="preserve">הידע המחקרי הקיים מקיף את מעגלי ההקשר אך טרם הגיע אל מרכזם. ידוע שאימוץ טכנולוגיה בקרב מורים תלוי בתפיסות סובייקטיביות של שימושיות וקלות שימוש (</w:t>
-      </w:r>
-      <w:r>
-        <w:rPr>
-          <w:rFonts w:ascii="Times New Roman" w:cs="Times New Roman" w:hAnsi="Times New Roman"/>
-          <w:b w:val="false"/>
-          <w:bCs w:val="false"/>
-          <w:i w:val="false"/>
-          <w:iCs w:val="false"/>
-          <w:sz w:val="24"/>
-          <w:szCs w:val="24"/>
-          <w:rtl w:val="false"/>
-        </w:rPr>
-        <w:t xml:space="preserve">Davis, 1989), </w:t>
-      </w:r>
-      <w:r>
-        <w:rPr>
-          <w:rFonts w:ascii="David" w:cs="David" w:hAnsi="David"/>
-          <w:b w:val="false"/>
-          <w:bCs w:val="false"/>
-          <w:i w:val="false"/>
-          <w:iCs w:val="false"/>
-          <w:sz w:val="24"/>
-          <w:szCs w:val="24"/>
-          <w:rtl/>
-        </w:rPr>
-        <w:t xml:space="preserve">שבאימוץ בינה מלאכותית ההכרעה עוברת דרך הרגש והחוויה (</w:t>
-      </w:r>
-      <w:r>
-        <w:rPr>
-          <w:rFonts w:ascii="Times New Roman" w:cs="Times New Roman" w:hAnsi="Times New Roman"/>
-          <w:b w:val="false"/>
-          <w:bCs w:val="false"/>
-          <w:i w:val="false"/>
-          <w:iCs w:val="false"/>
-          <w:sz w:val="24"/>
-          <w:szCs w:val="24"/>
-          <w:rtl w:val="false"/>
-        </w:rPr>
-        <w:t xml:space="preserve">Gursoy et al., 2019), </w:t>
-      </w:r>
-      <w:r>
-        <w:rPr>
-          <w:rFonts w:ascii="David" w:cs="David" w:hAnsi="David"/>
-          <w:b w:val="false"/>
-          <w:bCs w:val="false"/>
-          <w:i w:val="false"/>
-          <w:iCs w:val="false"/>
-          <w:sz w:val="24"/>
-          <w:szCs w:val="24"/>
-          <w:rtl/>
-        </w:rPr>
-        <w:t xml:space="preserve">ושבישראל המוטיבציה הנהנתנית והנכונות להתנסות הן המנבאים החזקים של שימוש מקצועי בקרב מורים בכלל (דשן ואחרים, 2026). ידוע גם שמסוגלות ורלוונטיות נתפסת מנבאות כוונת עיסוק בתחום יותר מאשר חרדה (</w:t>
-      </w:r>
-      <w:r>
-        <w:rPr>
-          <w:rFonts w:ascii="Times New Roman" w:cs="Times New Roman" w:hAnsi="Times New Roman"/>
-          <w:b w:val="false"/>
-          <w:bCs w:val="false"/>
-          <w:i w:val="false"/>
-          <w:iCs w:val="false"/>
-          <w:sz w:val="24"/>
-          <w:szCs w:val="24"/>
-          <w:rtl w:val="false"/>
-        </w:rPr>
-        <w:t xml:space="preserve">Ayanwale et al., 2022), </w:t>
-      </w:r>
-      <w:r>
-        <w:rPr>
-          <w:rFonts w:ascii="David" w:cs="David" w:hAnsi="David"/>
-          <w:b w:val="false"/>
-          <w:bCs w:val="false"/>
-          <w:i w:val="false"/>
-          <w:iCs w:val="false"/>
-          <w:sz w:val="24"/>
-          <w:szCs w:val="24"/>
-          <w:rtl/>
-        </w:rPr>
-        <w:t xml:space="preserve">ושבהוראת שפות לכלי יש פוטנציאל פדגוגי ניכר לצד מגבלות (</w:t>
-      </w:r>
-      <w:r>
-        <w:rPr>
-          <w:rFonts w:ascii="Times New Roman" w:cs="Times New Roman" w:hAnsi="Times New Roman"/>
-          <w:b w:val="false"/>
-          <w:bCs w:val="false"/>
-          <w:i w:val="false"/>
-          <w:iCs w:val="false"/>
-          <w:sz w:val="24"/>
-          <w:szCs w:val="24"/>
-          <w:rtl w:val="false"/>
-        </w:rPr>
-        <w:t xml:space="preserve">Kohnke et al., 2023). </w:t>
-      </w:r>
-      <w:r>
-        <w:rPr>
-          <w:rFonts w:ascii="David" w:cs="David" w:hAnsi="David"/>
-          <w:b w:val="false"/>
-          <w:bCs w:val="false"/>
-          <w:i w:val="false"/>
-          <w:iCs w:val="false"/>
-          <w:sz w:val="24"/>
-          <w:szCs w:val="24"/>
-          <w:rtl/>
-        </w:rPr>
-        <w:t xml:space="preserve">ואולם מחקרים אלה עסקו במורים באשר הם, בלומדים בוגרים או בהקשרים שאינם ישראליים, וטרם נבחנו לעומק תפיסותיהם של מורי אנגלית בבית הספר היסודי בישראל, המלמדים שפה זרה ללומדים צעירים בתנאי מערכת ייחודיים. את הפער הזה מבקש המחקר הנוכחי למלא, באמצעות בחינה איכותנית של האופן שבו מורים אלה תופסים את שילוב הכלים בהוראתם, את התועלות ואת החסמים שהם מזהים ואת מה שנדרש להם כדי לשלב את הטכנולוגיה באופן מיטבי.</w:t>
+        <w:t xml:space="preserve">קצה המשפך של סקירה זו הוא המפגש שבין כל הגורמים שנדונו: מורי אנגלית בבית הספר היסודי בישראל העומדים מול כלי בינה מלאכותית יוצרת. הוראת האנגלית היא מקרה מבחן מובהק לשילוב כלים אלה, משום שהטכנולוגיה פועלת בליבת הדיסציפלינה, ייצור שפה, והיא מציעה למורה בדיוק את מה שקשה להשיג בכיתה הטרוגנית: קלט מדורג לכל לומד, תרגול אישי בסביבה נטולת שיפוטיות ומשוב מיידי </w:t>
+      </w:r>
+      <w:r>
+        <w:rPr>
+          <w:rFonts w:ascii="Times New Roman" w:cs="Times New Roman" w:hAnsi="Times New Roman"/>
+          <w:b w:val="false"/>
+          <w:bCs w:val="false"/>
+          <w:i w:val="false"/>
+          <w:iCs w:val="false"/>
+          <w:sz w:val="24"/>
+          <w:szCs w:val="24"/>
+          <w:rtl w:val="false"/>
+        </w:rPr>
+        <w:t xml:space="preserve">(Kohnke et al., 2023; Krashen, 1982). </w:t>
+      </w:r>
+      <w:r>
+        <w:rPr>
+          <w:rFonts w:ascii="David" w:cs="David" w:hAnsi="David"/>
+          <w:b w:val="false"/>
+          <w:bCs w:val="false"/>
+          <w:i w:val="false"/>
+          <w:iCs w:val="false"/>
+          <w:sz w:val="24"/>
+          <w:szCs w:val="24"/>
+          <w:rtl/>
+        </w:rPr>
+        <w:t xml:space="preserve">התאמה עקרונית זו בין יכולות הכלי ובין צורכי ההוראה מסבירה מדוע דווקא מורי השפות נמצאים בחזית הדיון. בה בעת, העבודה עם לומדים צעירים מחדדת את הסיכונים, מדיוק לשוני ותרבותי של התוצרים ועד הגנה על פרטיות קטינים, ומחייבת עמידה בהנחיות רגולטוריות מפורטות (משרד החינוך, 2025).</w:t>
+      </w:r>
+    </w:p>
+    <w:p>
+      <w:pPr>
+        <w:bidi/>
+        <w:spacing w:after="120" w:line="360" w:lineRule="auto"/>
+        <w:jc w:val="both"/>
+      </w:pPr>
+      <w:r>
+        <w:rPr>
+          <w:rFonts w:ascii="David" w:cs="David" w:hAnsi="David"/>
+          <w:b w:val="false"/>
+          <w:bCs w:val="false"/>
+          <w:i w:val="false"/>
+          <w:iCs w:val="false"/>
+          <w:sz w:val="24"/>
+          <w:szCs w:val="24"/>
+          <w:rtl/>
+        </w:rPr>
+        <w:t xml:space="preserve">הידע המחקרי הקיים מקיף את מעגלי ההקשר של השאלה אך טרם הגיע אל מרכזה. ידוע שאימוץ טכנולוגיה בקרב משתמשים תלוי בתפיסות סובייקטיביות של שימושיות ושל קלות שימוש </w:t>
+      </w:r>
+      <w:r>
+        <w:rPr>
+          <w:rFonts w:ascii="Times New Roman" w:cs="Times New Roman" w:hAnsi="Times New Roman"/>
+          <w:b w:val="false"/>
+          <w:bCs w:val="false"/>
+          <w:i w:val="false"/>
+          <w:iCs w:val="false"/>
+          <w:sz w:val="24"/>
+          <w:szCs w:val="24"/>
+          <w:rtl w:val="false"/>
+        </w:rPr>
+        <w:t xml:space="preserve">(Davis, 1989), </w:t>
+      </w:r>
+      <w:r>
+        <w:rPr>
+          <w:rFonts w:ascii="David" w:cs="David" w:hAnsi="David"/>
+          <w:b w:val="false"/>
+          <w:bCs w:val="false"/>
+          <w:i w:val="false"/>
+          <w:iCs w:val="false"/>
+          <w:sz w:val="24"/>
+          <w:szCs w:val="24"/>
+          <w:rtl/>
+        </w:rPr>
+        <w:t xml:space="preserve">ושבאימוץ בינה מלאכותית נוספים לכך תהליך הערכה רב-שלבי שההכרעה בו עוברת דרך הרגש </w:t>
+      </w:r>
+      <w:r>
+        <w:rPr>
+          <w:rFonts w:ascii="Times New Roman" w:cs="Times New Roman" w:hAnsi="Times New Roman"/>
+          <w:b w:val="false"/>
+          <w:bCs w:val="false"/>
+          <w:i w:val="false"/>
+          <w:iCs w:val="false"/>
+          <w:sz w:val="24"/>
+          <w:szCs w:val="24"/>
+          <w:rtl w:val="false"/>
+        </w:rPr>
+        <w:t xml:space="preserve">(Gursoy et al., 2019). </w:t>
+      </w:r>
+      <w:r>
+        <w:rPr>
+          <w:rFonts w:ascii="David" w:cs="David" w:hAnsi="David"/>
+          <w:b w:val="false"/>
+          <w:bCs w:val="false"/>
+          <w:i w:val="false"/>
+          <w:iCs w:val="false"/>
+          <w:sz w:val="24"/>
+          <w:szCs w:val="24"/>
+          <w:rtl/>
+        </w:rPr>
+        <w:t xml:space="preserve">ידוע שבישראל המוטיבציה הנהנתנית, הנכונות להתנסות והרגשות החיוביים הם המנבאים החזקים של שימוש מקצועי בקרב מורים בכלל, ושהמאמץ הנתפס הוא החסם המרכזי (דשן ואחרים, 2026). ידוע שמסוגלות ורלוונטיות נתפסת מנבאות כוונת עיסוק בתחום יותר מאשר חרדה </w:t>
+      </w:r>
+      <w:r>
+        <w:rPr>
+          <w:rFonts w:ascii="Times New Roman" w:cs="Times New Roman" w:hAnsi="Times New Roman"/>
+          <w:b w:val="false"/>
+          <w:bCs w:val="false"/>
+          <w:i w:val="false"/>
+          <w:iCs w:val="false"/>
+          <w:sz w:val="24"/>
+          <w:szCs w:val="24"/>
+          <w:rtl w:val="false"/>
+        </w:rPr>
+        <w:t xml:space="preserve">(Ayanwale et al., 2022), </w:t>
+      </w:r>
+      <w:r>
+        <w:rPr>
+          <w:rFonts w:ascii="David" w:cs="David" w:hAnsi="David"/>
+          <w:b w:val="false"/>
+          <w:bCs w:val="false"/>
+          <w:i w:val="false"/>
+          <w:iCs w:val="false"/>
+          <w:sz w:val="24"/>
+          <w:szCs w:val="24"/>
+          <w:rtl/>
+        </w:rPr>
+        <w:t xml:space="preserve">שהידע ההקשרי מכריע בהצלחת השילוב </w:t>
+      </w:r>
+      <w:r>
+        <w:rPr>
+          <w:rFonts w:ascii="Times New Roman" w:cs="Times New Roman" w:hAnsi="Times New Roman"/>
+          <w:b w:val="false"/>
+          <w:bCs w:val="false"/>
+          <w:i w:val="false"/>
+          <w:iCs w:val="false"/>
+          <w:sz w:val="24"/>
+          <w:szCs w:val="24"/>
+          <w:rtl w:val="false"/>
+        </w:rPr>
+        <w:t xml:space="preserve">(Mishra, 2019; Mishra et al., 2023), </w:t>
+      </w:r>
+      <w:r>
+        <w:rPr>
+          <w:rFonts w:ascii="David" w:cs="David" w:hAnsi="David"/>
+          <w:b w:val="false"/>
+          <w:bCs w:val="false"/>
+          <w:i w:val="false"/>
+          <w:iCs w:val="false"/>
+          <w:sz w:val="24"/>
+          <w:szCs w:val="24"/>
+          <w:rtl/>
+        </w:rPr>
+        <w:t xml:space="preserve">ושבהוראת שפות לכלי פוטנציאל פדגוגי ניכר לצד מגבלות מתועדות </w:t>
+      </w:r>
+      <w:r>
+        <w:rPr>
+          <w:rFonts w:ascii="Times New Roman" w:cs="Times New Roman" w:hAnsi="Times New Roman"/>
+          <w:b w:val="false"/>
+          <w:bCs w:val="false"/>
+          <w:i w:val="false"/>
+          <w:iCs w:val="false"/>
+          <w:sz w:val="24"/>
+          <w:szCs w:val="24"/>
+          <w:rtl w:val="false"/>
+        </w:rPr>
+        <w:t xml:space="preserve">(Kohnke et al., 2023).</w:t>
+      </w:r>
+    </w:p>
+    <w:p>
+      <w:pPr>
+        <w:bidi/>
+        <w:spacing w:after="120" w:line="360" w:lineRule="auto"/>
+        <w:jc w:val="both"/>
+      </w:pPr>
+      <w:r>
+        <w:rPr>
+          <w:rFonts w:ascii="David" w:cs="David" w:hAnsi="David"/>
+          <w:b w:val="false"/>
+          <w:bCs w:val="false"/>
+          <w:i w:val="false"/>
+          <w:iCs w:val="false"/>
+          <w:sz w:val="24"/>
+          <w:szCs w:val="24"/>
+          <w:rtl/>
+        </w:rPr>
+        <w:t xml:space="preserve">ואולם מחקרים אלה עסקו במורים באשר הם, בלומדים בוגרים או בהקשרים שאינם ישראליים. מורי האנגלית בבית הספר היסודי בישראל פועלים בצומת ייחודי: הם מלמדים שפה זרה ללומדים צעירים, בכפוף לתכנית לימודים ארצית ולרגולציה מחייבת, בכיתות הטרוגניות ובתנאי משאבים משתנים, ותפיסותיהם את הכלי החדש טרם נחקרו לעומק. גם הספרות הישראלית שנסקרה מלמדת שעמדה חיובית איננה ערובה ליישום, ושחסמי מערכת עשויים להכריע את הכף (מידז'נסקי ומלמד, 2022). את הפער הזה מבקש המחקר הנוכחי למלא, באמצעות בחינה איכותנית של האופן שבו מורי אנגלית ביסודי תופסים את שילוב כלי הבינה המלאכותית היוצרת בהוראתם: התועלות שהם מזהים, החסמים שהם חווים, הרגשות המלווים את ההתנסות ומה שנדרש להם, להבנתם, כדי לשלב את הטכנולוגיה באופן מיטבי. הבנת תפיסות אלה עשויה לסייע בעיצוב הכשרות, מדיניות בית-ספרית ותכניות הטמעה המותאמות למורי האנגלית ביסודי.</w:t>
       </w:r>
     </w:p>
     <w:p>
@@ -3193,20 +4270,20 @@
           <w:szCs w:val="24"/>
           <w:rtl/>
         </w:rPr>
-        <w:t xml:space="preserve">דשן, מ', הררי, ר' ואהרוני, נ' (2026). אימוץ בינה מלאכותית יוצרת (</w:t>
-      </w:r>
-      <w:r>
-        <w:rPr>
-          <w:rFonts w:ascii="Times New Roman" w:cs="Times New Roman" w:hAnsi="Times New Roman"/>
-          <w:b w:val="false"/>
-          <w:bCs w:val="false"/>
-          <w:i w:val="false"/>
-          <w:iCs w:val="false"/>
-          <w:sz w:val="24"/>
-          <w:szCs w:val="24"/>
-          <w:rtl w:val="false"/>
-        </w:rPr>
-        <w:t xml:space="preserve">GenAI) </w:t>
+        <w:t xml:space="preserve">דשן, מ', הררי, ר' ואהרוני, נ' (2026). אימוץ בינה מלאכותית יוצרת </w:t>
+      </w:r>
+      <w:r>
+        <w:rPr>
+          <w:rFonts w:ascii="Times New Roman" w:cs="Times New Roman" w:hAnsi="Times New Roman"/>
+          <w:b w:val="false"/>
+          <w:bCs w:val="false"/>
+          <w:i w:val="false"/>
+          <w:iCs w:val="false"/>
+          <w:sz w:val="24"/>
+          <w:szCs w:val="24"/>
+          <w:rtl w:val="false"/>
+        </w:rPr>
+        <w:t xml:space="preserve">(GenAI) </w:t>
       </w:r>
       <w:r>
         <w:rPr>

</xml_diff>

<commit_message>
Add table of contents page with dot leaders and page numbers
Single-page RTL chapter outline after the title page, matching the
course example: bold chapter entries, indented sub-chapters, dotted
leaders, verified page numbers.

Co-Authored-By: Claude Fable 5 <noreply@anthropic.com>
Claude-Session: https://claude.ai/code/session_01UxjctmnUe9fGqd8WLWUStd
</commit_message>
<xml_diff>
--- a/seminar/סקירת ספרות - אבו קארם.docx
+++ b/seminar/סקירת ספרות - אבו קארם.docx
@@ -239,6 +239,1231 @@
           <w:rtl/>
         </w:rPr>
         <w:t xml:space="preserve">תאריך הגשה: אב תשפ"ו, אוגוסט 2026</w:t>
+      </w:r>
+    </w:p>
+    <w:p>
+      <w:pPr>
+        <w:pageBreakBefore/>
+        <w:bidi/>
+        <w:spacing w:after="240" w:line="360" w:lineRule="auto"/>
+        <w:jc w:val="both"/>
+      </w:pPr>
+      <w:r>
+        <w:rPr>
+          <w:rFonts w:ascii="David" w:cs="David" w:hAnsi="David"/>
+          <w:b/>
+          <w:bCs/>
+          <w:i w:val="false"/>
+          <w:iCs w:val="false"/>
+          <w:sz w:val="28"/>
+          <w:szCs w:val="28"/>
+          <w:rtl/>
+        </w:rPr>
+        <w:t xml:space="preserve">ראשי פרקים</w:t>
+      </w:r>
+    </w:p>
+    <w:p>
+      <w:pPr>
+        <w:tabs>
+          <w:tab w:val="right" w:pos="9026" w:leader="dot"/>
+        </w:tabs>
+        <w:bidi/>
+        <w:spacing w:after="40" w:line="300" w:lineRule="auto"/>
+      </w:pPr>
+      <w:r>
+        <w:rPr>
+          <w:rFonts w:ascii="David" w:cs="David" w:hAnsi="David"/>
+          <w:b/>
+          <w:bCs/>
+          <w:i w:val="false"/>
+          <w:iCs w:val="false"/>
+          <w:sz w:val="24"/>
+          <w:szCs w:val="24"/>
+          <w:rtl/>
+        </w:rPr>
+        <w:t xml:space="preserve">1. פדגוגיה חדשנית</w:t>
+      </w:r>
+      <w:r>
+        <w:rPr>
+          <w:rFonts w:ascii="David" w:cs="David" w:hAnsi="David"/>
+          <w:b/>
+          <w:bCs/>
+          <w:sz w:val="24"/>
+          <w:szCs w:val="24"/>
+        </w:rPr>
+        <w:tab/>
+        <w:t xml:space="preserve">4</w:t>
+      </w:r>
+    </w:p>
+    <w:p>
+      <w:pPr>
+        <w:tabs>
+          <w:tab w:val="right" w:pos="9026" w:leader="dot"/>
+        </w:tabs>
+        <w:bidi/>
+        <w:spacing w:after="40" w:line="300" w:lineRule="auto"/>
+        <w:ind w:start="450"/>
+      </w:pPr>
+      <w:r>
+        <w:rPr>
+          <w:rFonts w:ascii="David" w:cs="David" w:hAnsi="David"/>
+          <w:b w:val="false"/>
+          <w:bCs w:val="false"/>
+          <w:i w:val="false"/>
+          <w:iCs w:val="false"/>
+          <w:sz w:val="24"/>
+          <w:szCs w:val="24"/>
+          <w:rtl/>
+        </w:rPr>
+        <w:t xml:space="preserve">1.1 הגדרות ועקרונות</w:t>
+      </w:r>
+      <w:r>
+        <w:rPr>
+          <w:rFonts w:ascii="David" w:cs="David" w:hAnsi="David"/>
+          <w:b w:val="false"/>
+          <w:bCs w:val="false"/>
+          <w:sz w:val="24"/>
+          <w:szCs w:val="24"/>
+        </w:rPr>
+        <w:tab/>
+        <w:t xml:space="preserve">4</w:t>
+      </w:r>
+    </w:p>
+    <w:p>
+      <w:pPr>
+        <w:tabs>
+          <w:tab w:val="right" w:pos="9026" w:leader="dot"/>
+        </w:tabs>
+        <w:bidi/>
+        <w:spacing w:after="40" w:line="300" w:lineRule="auto"/>
+        <w:ind w:start="450"/>
+      </w:pPr>
+      <w:r>
+        <w:rPr>
+          <w:rFonts w:ascii="David" w:cs="David" w:hAnsi="David"/>
+          <w:b w:val="false"/>
+          <w:bCs w:val="false"/>
+          <w:i w:val="false"/>
+          <w:iCs w:val="false"/>
+          <w:sz w:val="24"/>
+          <w:szCs w:val="24"/>
+          <w:rtl/>
+        </w:rPr>
+        <w:t xml:space="preserve">1.2 פדגוגיה מוטת עתיד ומיומנויות המאה ה-21</w:t>
+      </w:r>
+      <w:r>
+        <w:rPr>
+          <w:rFonts w:ascii="David" w:cs="David" w:hAnsi="David"/>
+          <w:b w:val="false"/>
+          <w:bCs w:val="false"/>
+          <w:sz w:val="24"/>
+          <w:szCs w:val="24"/>
+        </w:rPr>
+        <w:tab/>
+        <w:t xml:space="preserve">4</w:t>
+      </w:r>
+    </w:p>
+    <w:p>
+      <w:pPr>
+        <w:tabs>
+          <w:tab w:val="right" w:pos="9026" w:leader="dot"/>
+        </w:tabs>
+        <w:bidi/>
+        <w:spacing w:after="40" w:line="300" w:lineRule="auto"/>
+        <w:ind w:start="450"/>
+      </w:pPr>
+      <w:r>
+        <w:rPr>
+          <w:rFonts w:ascii="David" w:cs="David" w:hAnsi="David"/>
+          <w:b w:val="false"/>
+          <w:bCs w:val="false"/>
+          <w:i w:val="false"/>
+          <w:iCs w:val="false"/>
+          <w:sz w:val="24"/>
+          <w:szCs w:val="24"/>
+          <w:rtl/>
+        </w:rPr>
+        <w:t xml:space="preserve">1.3 חדשנות פדגוגית, טכנולוגיה ושינוי תפקידי המורה והלומד</w:t>
+      </w:r>
+      <w:r>
+        <w:rPr>
+          <w:rFonts w:ascii="David" w:cs="David" w:hAnsi="David"/>
+          <w:b w:val="false"/>
+          <w:bCs w:val="false"/>
+          <w:sz w:val="24"/>
+          <w:szCs w:val="24"/>
+        </w:rPr>
+        <w:tab/>
+        <w:t xml:space="preserve">5</w:t>
+      </w:r>
+    </w:p>
+    <w:p>
+      <w:pPr>
+        <w:tabs>
+          <w:tab w:val="right" w:pos="9026" w:leader="dot"/>
+        </w:tabs>
+        <w:bidi/>
+        <w:spacing w:after="40" w:line="300" w:lineRule="auto"/>
+      </w:pPr>
+      <w:r>
+        <w:rPr>
+          <w:rFonts w:ascii="David" w:cs="David" w:hAnsi="David"/>
+          <w:b/>
+          <w:bCs/>
+          <w:i w:val="false"/>
+          <w:iCs w:val="false"/>
+          <w:sz w:val="24"/>
+          <w:szCs w:val="24"/>
+          <w:rtl/>
+        </w:rPr>
+        <w:t xml:space="preserve">2. שילוב טכנולוגיות בלמידה</w:t>
+      </w:r>
+      <w:r>
+        <w:rPr>
+          <w:rFonts w:ascii="David" w:cs="David" w:hAnsi="David"/>
+          <w:b/>
+          <w:bCs/>
+          <w:sz w:val="24"/>
+          <w:szCs w:val="24"/>
+        </w:rPr>
+        <w:tab/>
+        <w:t xml:space="preserve">6</w:t>
+      </w:r>
+    </w:p>
+    <w:p>
+      <w:pPr>
+        <w:tabs>
+          <w:tab w:val="right" w:pos="9026" w:leader="dot"/>
+        </w:tabs>
+        <w:bidi/>
+        <w:spacing w:after="40" w:line="300" w:lineRule="auto"/>
+        <w:ind w:start="450"/>
+      </w:pPr>
+      <w:r>
+        <w:rPr>
+          <w:rFonts w:ascii="David" w:cs="David" w:hAnsi="David"/>
+          <w:b w:val="false"/>
+          <w:bCs w:val="false"/>
+          <w:i w:val="false"/>
+          <w:iCs w:val="false"/>
+          <w:sz w:val="24"/>
+          <w:szCs w:val="24"/>
+          <w:rtl/>
+        </w:rPr>
+        <w:t xml:space="preserve">2.1 סקירה היסטורית בקצרה</w:t>
+      </w:r>
+      <w:r>
+        <w:rPr>
+          <w:rFonts w:ascii="David" w:cs="David" w:hAnsi="David"/>
+          <w:b w:val="false"/>
+          <w:bCs w:val="false"/>
+          <w:sz w:val="24"/>
+          <w:szCs w:val="24"/>
+        </w:rPr>
+        <w:tab/>
+        <w:t xml:space="preserve">6</w:t>
+      </w:r>
+    </w:p>
+    <w:p>
+      <w:pPr>
+        <w:tabs>
+          <w:tab w:val="right" w:pos="9026" w:leader="dot"/>
+        </w:tabs>
+        <w:bidi/>
+        <w:spacing w:after="40" w:line="300" w:lineRule="auto"/>
+        <w:ind w:start="450"/>
+      </w:pPr>
+      <w:r>
+        <w:rPr>
+          <w:rFonts w:ascii="David" w:cs="David" w:hAnsi="David"/>
+          <w:b w:val="false"/>
+          <w:bCs w:val="false"/>
+          <w:i w:val="false"/>
+          <w:iCs w:val="false"/>
+          <w:sz w:val="24"/>
+          <w:szCs w:val="24"/>
+          <w:rtl/>
+        </w:rPr>
+        <w:t xml:space="preserve">2.2 עקרונות להטמעה</w:t>
+      </w:r>
+      <w:r>
+        <w:rPr>
+          <w:rFonts w:ascii="David" w:cs="David" w:hAnsi="David"/>
+          <w:b w:val="false"/>
+          <w:bCs w:val="false"/>
+          <w:sz w:val="24"/>
+          <w:szCs w:val="24"/>
+        </w:rPr>
+        <w:tab/>
+        <w:t xml:space="preserve">6</w:t>
+      </w:r>
+    </w:p>
+    <w:p>
+      <w:pPr>
+        <w:tabs>
+          <w:tab w:val="right" w:pos="9026" w:leader="dot"/>
+        </w:tabs>
+        <w:bidi/>
+        <w:spacing w:after="40" w:line="300" w:lineRule="auto"/>
+        <w:ind w:start="450"/>
+      </w:pPr>
+      <w:r>
+        <w:rPr>
+          <w:rFonts w:ascii="David" w:cs="David" w:hAnsi="David"/>
+          <w:b w:val="false"/>
+          <w:bCs w:val="false"/>
+          <w:i w:val="false"/>
+          <w:iCs w:val="false"/>
+          <w:sz w:val="24"/>
+          <w:szCs w:val="24"/>
+          <w:rtl/>
+        </w:rPr>
+        <w:t xml:space="preserve">2.3 מודלים להערכת שילוב טכנולוגי: </w:t>
+      </w:r>
+      <w:r>
+        <w:rPr>
+          <w:rFonts w:ascii="Times New Roman" w:cs="Times New Roman" w:hAnsi="Times New Roman"/>
+          <w:b w:val="false"/>
+          <w:bCs w:val="false"/>
+          <w:i w:val="false"/>
+          <w:iCs w:val="false"/>
+          <w:sz w:val="24"/>
+          <w:szCs w:val="24"/>
+          <w:rtl w:val="false"/>
+        </w:rPr>
+        <w:t xml:space="preserve">TPACK </w:t>
+      </w:r>
+      <w:r>
+        <w:rPr>
+          <w:rFonts w:ascii="David" w:cs="David" w:hAnsi="David"/>
+          <w:b w:val="false"/>
+          <w:bCs w:val="false"/>
+          <w:i w:val="false"/>
+          <w:iCs w:val="false"/>
+          <w:sz w:val="24"/>
+          <w:szCs w:val="24"/>
+          <w:rtl/>
+        </w:rPr>
+        <w:t xml:space="preserve">ו-</w:t>
+      </w:r>
+      <w:r>
+        <w:rPr>
+          <w:rFonts w:ascii="Times New Roman" w:cs="Times New Roman" w:hAnsi="Times New Roman"/>
+          <w:b w:val="false"/>
+          <w:bCs w:val="false"/>
+          <w:i w:val="false"/>
+          <w:iCs w:val="false"/>
+          <w:sz w:val="24"/>
+          <w:szCs w:val="24"/>
+          <w:rtl w:val="false"/>
+        </w:rPr>
+        <w:t xml:space="preserve">SAMR</w:t>
+      </w:r>
+      <w:r>
+        <w:rPr>
+          <w:rFonts w:ascii="David" w:cs="David" w:hAnsi="David"/>
+          <w:b w:val="false"/>
+          <w:bCs w:val="false"/>
+          <w:sz w:val="24"/>
+          <w:szCs w:val="24"/>
+        </w:rPr>
+        <w:tab/>
+        <w:t xml:space="preserve">7</w:t>
+      </w:r>
+    </w:p>
+    <w:p>
+      <w:pPr>
+        <w:tabs>
+          <w:tab w:val="right" w:pos="9026" w:leader="dot"/>
+        </w:tabs>
+        <w:bidi/>
+        <w:spacing w:after="40" w:line="300" w:lineRule="auto"/>
+      </w:pPr>
+      <w:r>
+        <w:rPr>
+          <w:rFonts w:ascii="David" w:cs="David" w:hAnsi="David"/>
+          <w:b/>
+          <w:bCs/>
+          <w:i w:val="false"/>
+          <w:iCs w:val="false"/>
+          <w:sz w:val="24"/>
+          <w:szCs w:val="24"/>
+          <w:rtl/>
+        </w:rPr>
+        <w:t xml:space="preserve">3. בינה מלאכותית בחינוך</w:t>
+      </w:r>
+      <w:r>
+        <w:rPr>
+          <w:rFonts w:ascii="David" w:cs="David" w:hAnsi="David"/>
+          <w:b/>
+          <w:bCs/>
+          <w:sz w:val="24"/>
+          <w:szCs w:val="24"/>
+        </w:rPr>
+        <w:tab/>
+        <w:t xml:space="preserve">8</w:t>
+      </w:r>
+    </w:p>
+    <w:p>
+      <w:pPr>
+        <w:tabs>
+          <w:tab w:val="right" w:pos="9026" w:leader="dot"/>
+        </w:tabs>
+        <w:bidi/>
+        <w:spacing w:after="40" w:line="300" w:lineRule="auto"/>
+        <w:ind w:start="450"/>
+      </w:pPr>
+      <w:r>
+        <w:rPr>
+          <w:rFonts w:ascii="David" w:cs="David" w:hAnsi="David"/>
+          <w:b w:val="false"/>
+          <w:bCs w:val="false"/>
+          <w:i w:val="false"/>
+          <w:iCs w:val="false"/>
+          <w:sz w:val="24"/>
+          <w:szCs w:val="24"/>
+          <w:rtl/>
+        </w:rPr>
+        <w:t xml:space="preserve">3.1 עקרונות טכנולוגיים ובינה מלאכותית יוצרת</w:t>
+      </w:r>
+      <w:r>
+        <w:rPr>
+          <w:rFonts w:ascii="David" w:cs="David" w:hAnsi="David"/>
+          <w:b w:val="false"/>
+          <w:bCs w:val="false"/>
+          <w:sz w:val="24"/>
+          <w:szCs w:val="24"/>
+        </w:rPr>
+        <w:tab/>
+        <w:t xml:space="preserve">8</w:t>
+      </w:r>
+    </w:p>
+    <w:p>
+      <w:pPr>
+        <w:tabs>
+          <w:tab w:val="right" w:pos="9026" w:leader="dot"/>
+        </w:tabs>
+        <w:bidi/>
+        <w:spacing w:after="40" w:line="300" w:lineRule="auto"/>
+        <w:ind w:start="450"/>
+      </w:pPr>
+      <w:r>
+        <w:rPr>
+          <w:rFonts w:ascii="David" w:cs="David" w:hAnsi="David"/>
+          <w:b w:val="false"/>
+          <w:bCs w:val="false"/>
+          <w:i w:val="false"/>
+          <w:iCs w:val="false"/>
+          <w:sz w:val="24"/>
+          <w:szCs w:val="24"/>
+          <w:rtl/>
+        </w:rPr>
+        <w:t xml:space="preserve">3.2 יישומי בינה מלאכותית בהוראה ובלמידה</w:t>
+      </w:r>
+      <w:r>
+        <w:rPr>
+          <w:rFonts w:ascii="David" w:cs="David" w:hAnsi="David"/>
+          <w:b w:val="false"/>
+          <w:bCs w:val="false"/>
+          <w:sz w:val="24"/>
+          <w:szCs w:val="24"/>
+        </w:rPr>
+        <w:tab/>
+        <w:t xml:space="preserve">8</w:t>
+      </w:r>
+    </w:p>
+    <w:p>
+      <w:pPr>
+        <w:tabs>
+          <w:tab w:val="right" w:pos="9026" w:leader="dot"/>
+        </w:tabs>
+        <w:bidi/>
+        <w:spacing w:after="40" w:line="300" w:lineRule="auto"/>
+        <w:ind w:start="450"/>
+      </w:pPr>
+      <w:r>
+        <w:rPr>
+          <w:rFonts w:ascii="David" w:cs="David" w:hAnsi="David"/>
+          <w:b w:val="false"/>
+          <w:bCs w:val="false"/>
+          <w:i w:val="false"/>
+          <w:iCs w:val="false"/>
+          <w:sz w:val="24"/>
+          <w:szCs w:val="24"/>
+          <w:rtl/>
+        </w:rPr>
+        <w:t xml:space="preserve">3.3 יתרונות, אתגרים ורגולציה</w:t>
+      </w:r>
+      <w:r>
+        <w:rPr>
+          <w:rFonts w:ascii="David" w:cs="David" w:hAnsi="David"/>
+          <w:b w:val="false"/>
+          <w:bCs w:val="false"/>
+          <w:sz w:val="24"/>
+          <w:szCs w:val="24"/>
+        </w:rPr>
+        <w:tab/>
+        <w:t xml:space="preserve">9</w:t>
+      </w:r>
+    </w:p>
+    <w:p>
+      <w:pPr>
+        <w:tabs>
+          <w:tab w:val="right" w:pos="9026" w:leader="dot"/>
+        </w:tabs>
+        <w:bidi/>
+        <w:spacing w:after="40" w:line="300" w:lineRule="auto"/>
+        <w:ind w:start="450"/>
+      </w:pPr>
+      <w:r>
+        <w:rPr>
+          <w:rFonts w:ascii="David" w:cs="David" w:hAnsi="David"/>
+          <w:b w:val="false"/>
+          <w:bCs w:val="false"/>
+          <w:i w:val="false"/>
+          <w:iCs w:val="false"/>
+          <w:sz w:val="24"/>
+          <w:szCs w:val="24"/>
+          <w:rtl/>
+        </w:rPr>
+        <w:t xml:space="preserve">3.4 מודל </w:t>
+      </w:r>
+      <w:r>
+        <w:rPr>
+          <w:rFonts w:ascii="Times New Roman" w:cs="Times New Roman" w:hAnsi="Times New Roman"/>
+          <w:b w:val="false"/>
+          <w:bCs w:val="false"/>
+          <w:i w:val="false"/>
+          <w:iCs w:val="false"/>
+          <w:sz w:val="24"/>
+          <w:szCs w:val="24"/>
+          <w:rtl w:val="false"/>
+        </w:rPr>
+        <w:t xml:space="preserve">AI-TPACK</w:t>
+      </w:r>
+      <w:r>
+        <w:rPr>
+          <w:rFonts w:ascii="David" w:cs="David" w:hAnsi="David"/>
+          <w:b w:val="false"/>
+          <w:bCs w:val="false"/>
+          <w:sz w:val="24"/>
+          <w:szCs w:val="24"/>
+        </w:rPr>
+        <w:tab/>
+        <w:t xml:space="preserve">9</w:t>
+      </w:r>
+    </w:p>
+    <w:p>
+      <w:pPr>
+        <w:tabs>
+          <w:tab w:val="right" w:pos="9026" w:leader="dot"/>
+        </w:tabs>
+        <w:bidi/>
+        <w:spacing w:after="40" w:line="300" w:lineRule="auto"/>
+      </w:pPr>
+      <w:r>
+        <w:rPr>
+          <w:rFonts w:ascii="David" w:cs="David" w:hAnsi="David"/>
+          <w:b/>
+          <w:bCs/>
+          <w:i w:val="false"/>
+          <w:iCs w:val="false"/>
+          <w:sz w:val="24"/>
+          <w:szCs w:val="24"/>
+          <w:rtl/>
+        </w:rPr>
+        <w:t xml:space="preserve">4. אוריינות בינה מלאכותית ומוכנות לבינה מלאכותית</w:t>
+      </w:r>
+      <w:r>
+        <w:rPr>
+          <w:rFonts w:ascii="David" w:cs="David" w:hAnsi="David"/>
+          <w:b/>
+          <w:bCs/>
+          <w:sz w:val="24"/>
+          <w:szCs w:val="24"/>
+        </w:rPr>
+        <w:tab/>
+        <w:t xml:space="preserve">11</w:t>
+      </w:r>
+    </w:p>
+    <w:p>
+      <w:pPr>
+        <w:tabs>
+          <w:tab w:val="right" w:pos="9026" w:leader="dot"/>
+        </w:tabs>
+        <w:bidi/>
+        <w:spacing w:after="40" w:line="300" w:lineRule="auto"/>
+        <w:ind w:start="450"/>
+      </w:pPr>
+      <w:r>
+        <w:rPr>
+          <w:rFonts w:ascii="David" w:cs="David" w:hAnsi="David"/>
+          <w:b w:val="false"/>
+          <w:bCs w:val="false"/>
+          <w:i w:val="false"/>
+          <w:iCs w:val="false"/>
+          <w:sz w:val="24"/>
+          <w:szCs w:val="24"/>
+          <w:rtl/>
+        </w:rPr>
+        <w:t xml:space="preserve">4.1 אוריינות בינה מלאכותית: הגדרה ומרכיבים</w:t>
+      </w:r>
+      <w:r>
+        <w:rPr>
+          <w:rFonts w:ascii="David" w:cs="David" w:hAnsi="David"/>
+          <w:b w:val="false"/>
+          <w:bCs w:val="false"/>
+          <w:sz w:val="24"/>
+          <w:szCs w:val="24"/>
+        </w:rPr>
+        <w:tab/>
+        <w:t xml:space="preserve">11</w:t>
+      </w:r>
+    </w:p>
+    <w:p>
+      <w:pPr>
+        <w:tabs>
+          <w:tab w:val="right" w:pos="9026" w:leader="dot"/>
+        </w:tabs>
+        <w:bidi/>
+        <w:spacing w:after="40" w:line="300" w:lineRule="auto"/>
+        <w:ind w:start="450"/>
+      </w:pPr>
+      <w:r>
+        <w:rPr>
+          <w:rFonts w:ascii="David" w:cs="David" w:hAnsi="David"/>
+          <w:b w:val="false"/>
+          <w:bCs w:val="false"/>
+          <w:i w:val="false"/>
+          <w:iCs w:val="false"/>
+          <w:sz w:val="24"/>
+          <w:szCs w:val="24"/>
+          <w:rtl/>
+        </w:rPr>
+        <w:t xml:space="preserve">4.2 מוכנות לבינה מלאכותית: הגדרות וממדים</w:t>
+      </w:r>
+      <w:r>
+        <w:rPr>
+          <w:rFonts w:ascii="David" w:cs="David" w:hAnsi="David"/>
+          <w:b w:val="false"/>
+          <w:bCs w:val="false"/>
+          <w:sz w:val="24"/>
+          <w:szCs w:val="24"/>
+        </w:rPr>
+        <w:tab/>
+        <w:t xml:space="preserve">11</w:t>
+      </w:r>
+    </w:p>
+    <w:p>
+      <w:pPr>
+        <w:tabs>
+          <w:tab w:val="right" w:pos="9026" w:leader="dot"/>
+        </w:tabs>
+        <w:bidi/>
+        <w:spacing w:after="40" w:line="300" w:lineRule="auto"/>
+        <w:ind w:start="450"/>
+      </w:pPr>
+      <w:r>
+        <w:rPr>
+          <w:rFonts w:ascii="David" w:cs="David" w:hAnsi="David"/>
+          <w:b w:val="false"/>
+          <w:bCs w:val="false"/>
+          <w:i w:val="false"/>
+          <w:iCs w:val="false"/>
+          <w:sz w:val="24"/>
+          <w:szCs w:val="24"/>
+          <w:rtl/>
+        </w:rPr>
+        <w:t xml:space="preserve">4.3 הקשר בין אוריינות למוכנות ותפקיד המורה</w:t>
+      </w:r>
+      <w:r>
+        <w:rPr>
+          <w:rFonts w:ascii="David" w:cs="David" w:hAnsi="David"/>
+          <w:b w:val="false"/>
+          <w:bCs w:val="false"/>
+          <w:sz w:val="24"/>
+          <w:szCs w:val="24"/>
+        </w:rPr>
+        <w:tab/>
+        <w:t xml:space="preserve">11</w:t>
+      </w:r>
+    </w:p>
+    <w:p>
+      <w:pPr>
+        <w:tabs>
+          <w:tab w:val="right" w:pos="9026" w:leader="dot"/>
+        </w:tabs>
+        <w:bidi/>
+        <w:spacing w:after="40" w:line="300" w:lineRule="auto"/>
+      </w:pPr>
+      <w:r>
+        <w:rPr>
+          <w:rFonts w:ascii="David" w:cs="David" w:hAnsi="David"/>
+          <w:b/>
+          <w:bCs/>
+          <w:i w:val="false"/>
+          <w:iCs w:val="false"/>
+          <w:sz w:val="24"/>
+          <w:szCs w:val="24"/>
+          <w:rtl/>
+        </w:rPr>
+        <w:t xml:space="preserve">5. הוראת אנגלית כשפה זרה בבית הספר היסודי</w:t>
+      </w:r>
+      <w:r>
+        <w:rPr>
+          <w:rFonts w:ascii="David" w:cs="David" w:hAnsi="David"/>
+          <w:b/>
+          <w:bCs/>
+          <w:sz w:val="24"/>
+          <w:szCs w:val="24"/>
+        </w:rPr>
+        <w:tab/>
+        <w:t xml:space="preserve">13</w:t>
+      </w:r>
+    </w:p>
+    <w:p>
+      <w:pPr>
+        <w:tabs>
+          <w:tab w:val="right" w:pos="9026" w:leader="dot"/>
+        </w:tabs>
+        <w:bidi/>
+        <w:spacing w:after="40" w:line="300" w:lineRule="auto"/>
+        <w:ind w:start="450"/>
+      </w:pPr>
+      <w:r>
+        <w:rPr>
+          <w:rFonts w:ascii="David" w:cs="David" w:hAnsi="David"/>
+          <w:b w:val="false"/>
+          <w:bCs w:val="false"/>
+          <w:i w:val="false"/>
+          <w:iCs w:val="false"/>
+          <w:sz w:val="24"/>
+          <w:szCs w:val="24"/>
+          <w:rtl/>
+        </w:rPr>
+        <w:t xml:space="preserve">5.1 אנגלית כשפה זרה בישראל</w:t>
+      </w:r>
+      <w:r>
+        <w:rPr>
+          <w:rFonts w:ascii="David" w:cs="David" w:hAnsi="David"/>
+          <w:b w:val="false"/>
+          <w:bCs w:val="false"/>
+          <w:sz w:val="24"/>
+          <w:szCs w:val="24"/>
+        </w:rPr>
+        <w:tab/>
+        <w:t xml:space="preserve">13</w:t>
+      </w:r>
+    </w:p>
+    <w:p>
+      <w:pPr>
+        <w:tabs>
+          <w:tab w:val="right" w:pos="9026" w:leader="dot"/>
+        </w:tabs>
+        <w:bidi/>
+        <w:spacing w:after="40" w:line="300" w:lineRule="auto"/>
+        <w:ind w:start="450"/>
+      </w:pPr>
+      <w:r>
+        <w:rPr>
+          <w:rFonts w:ascii="David" w:cs="David" w:hAnsi="David"/>
+          <w:b w:val="false"/>
+          <w:bCs w:val="false"/>
+          <w:i w:val="false"/>
+          <w:iCs w:val="false"/>
+          <w:sz w:val="24"/>
+          <w:szCs w:val="24"/>
+          <w:rtl/>
+        </w:rPr>
+        <w:t xml:space="preserve">5.2 תכנית הלימודים ודרכי ההוראה בבית הספר היסודי</w:t>
+      </w:r>
+      <w:r>
+        <w:rPr>
+          <w:rFonts w:ascii="David" w:cs="David" w:hAnsi="David"/>
+          <w:b w:val="false"/>
+          <w:bCs w:val="false"/>
+          <w:sz w:val="24"/>
+          <w:szCs w:val="24"/>
+        </w:rPr>
+        <w:tab/>
+        <w:t xml:space="preserve">13</w:t>
+      </w:r>
+    </w:p>
+    <w:p>
+      <w:pPr>
+        <w:tabs>
+          <w:tab w:val="right" w:pos="9026" w:leader="dot"/>
+        </w:tabs>
+        <w:bidi/>
+        <w:spacing w:after="40" w:line="300" w:lineRule="auto"/>
+        <w:ind w:start="450"/>
+      </w:pPr>
+      <w:r>
+        <w:rPr>
+          <w:rFonts w:ascii="David" w:cs="David" w:hAnsi="David"/>
+          <w:b w:val="false"/>
+          <w:bCs w:val="false"/>
+          <w:i w:val="false"/>
+          <w:iCs w:val="false"/>
+          <w:sz w:val="24"/>
+          <w:szCs w:val="24"/>
+          <w:rtl/>
+        </w:rPr>
+        <w:t xml:space="preserve">5.3 מאפייני רכישת אנגלית כשפה זרה בגיל צעיר</w:t>
+      </w:r>
+      <w:r>
+        <w:rPr>
+          <w:rFonts w:ascii="David" w:cs="David" w:hAnsi="David"/>
+          <w:b w:val="false"/>
+          <w:bCs w:val="false"/>
+          <w:sz w:val="24"/>
+          <w:szCs w:val="24"/>
+        </w:rPr>
+        <w:tab/>
+        <w:t xml:space="preserve">13</w:t>
+      </w:r>
+    </w:p>
+    <w:p>
+      <w:pPr>
+        <w:tabs>
+          <w:tab w:val="right" w:pos="9026" w:leader="dot"/>
+        </w:tabs>
+        <w:bidi/>
+        <w:spacing w:after="40" w:line="300" w:lineRule="auto"/>
+        <w:ind w:start="450"/>
+      </w:pPr>
+      <w:r>
+        <w:rPr>
+          <w:rFonts w:ascii="David" w:cs="David" w:hAnsi="David"/>
+          <w:b w:val="false"/>
+          <w:bCs w:val="false"/>
+          <w:i w:val="false"/>
+          <w:iCs w:val="false"/>
+          <w:sz w:val="24"/>
+          <w:szCs w:val="24"/>
+          <w:rtl/>
+        </w:rPr>
+        <w:t xml:space="preserve">5.4 פדגוגיות מתקדמות ושילוב טכנולוגיה בהוראת האנגלית</w:t>
+      </w:r>
+      <w:r>
+        <w:rPr>
+          <w:rFonts w:ascii="David" w:cs="David" w:hAnsi="David"/>
+          <w:b w:val="false"/>
+          <w:bCs w:val="false"/>
+          <w:sz w:val="24"/>
+          <w:szCs w:val="24"/>
+        </w:rPr>
+        <w:tab/>
+        <w:t xml:space="preserve">14</w:t>
+      </w:r>
+    </w:p>
+    <w:p>
+      <w:pPr>
+        <w:tabs>
+          <w:tab w:val="right" w:pos="9026" w:leader="dot"/>
+        </w:tabs>
+        <w:bidi/>
+        <w:spacing w:after="40" w:line="300" w:lineRule="auto"/>
+      </w:pPr>
+      <w:r>
+        <w:rPr>
+          <w:rFonts w:ascii="David" w:cs="David" w:hAnsi="David"/>
+          <w:b/>
+          <w:bCs/>
+          <w:i w:val="false"/>
+          <w:iCs w:val="false"/>
+          <w:sz w:val="24"/>
+          <w:szCs w:val="24"/>
+          <w:rtl/>
+        </w:rPr>
+        <w:t xml:space="preserve">6. תפיסות ועמדות מורים כלפי שילוב בינה מלאכותית</w:t>
+      </w:r>
+      <w:r>
+        <w:rPr>
+          <w:rFonts w:ascii="David" w:cs="David" w:hAnsi="David"/>
+          <w:b/>
+          <w:bCs/>
+          <w:sz w:val="24"/>
+          <w:szCs w:val="24"/>
+        </w:rPr>
+        <w:tab/>
+        <w:t xml:space="preserve">15</w:t>
+      </w:r>
+    </w:p>
+    <w:p>
+      <w:pPr>
+        <w:tabs>
+          <w:tab w:val="right" w:pos="9026" w:leader="dot"/>
+        </w:tabs>
+        <w:bidi/>
+        <w:spacing w:after="40" w:line="300" w:lineRule="auto"/>
+        <w:ind w:start="450"/>
+      </w:pPr>
+      <w:r>
+        <w:rPr>
+          <w:rFonts w:ascii="David" w:cs="David" w:hAnsi="David"/>
+          <w:b w:val="false"/>
+          <w:bCs w:val="false"/>
+          <w:i w:val="false"/>
+          <w:iCs w:val="false"/>
+          <w:sz w:val="24"/>
+          <w:szCs w:val="24"/>
+          <w:rtl/>
+        </w:rPr>
+        <w:t xml:space="preserve">6.1 תפיסות ועמדות: הגדרות ומרכיבים</w:t>
+      </w:r>
+      <w:r>
+        <w:rPr>
+          <w:rFonts w:ascii="David" w:cs="David" w:hAnsi="David"/>
+          <w:b w:val="false"/>
+          <w:bCs w:val="false"/>
+          <w:sz w:val="24"/>
+          <w:szCs w:val="24"/>
+        </w:rPr>
+        <w:tab/>
+        <w:t xml:space="preserve">15</w:t>
+      </w:r>
+    </w:p>
+    <w:p>
+      <w:pPr>
+        <w:tabs>
+          <w:tab w:val="right" w:pos="9026" w:leader="dot"/>
+        </w:tabs>
+        <w:bidi/>
+        <w:spacing w:after="40" w:line="300" w:lineRule="auto"/>
+        <w:ind w:start="450"/>
+      </w:pPr>
+      <w:r>
+        <w:rPr>
+          <w:rFonts w:ascii="David" w:cs="David" w:hAnsi="David"/>
+          <w:b w:val="false"/>
+          <w:bCs w:val="false"/>
+          <w:i w:val="false"/>
+          <w:iCs w:val="false"/>
+          <w:sz w:val="24"/>
+          <w:szCs w:val="24"/>
+          <w:rtl/>
+        </w:rPr>
+        <w:t xml:space="preserve">6.2 מודל קבלת הטכנולוגיה </w:t>
+      </w:r>
+      <w:r>
+        <w:rPr>
+          <w:rFonts w:ascii="Times New Roman" w:cs="Times New Roman" w:hAnsi="Times New Roman"/>
+          <w:b w:val="false"/>
+          <w:bCs w:val="false"/>
+          <w:i w:val="false"/>
+          <w:iCs w:val="false"/>
+          <w:sz w:val="24"/>
+          <w:szCs w:val="24"/>
+          <w:rtl w:val="false"/>
+        </w:rPr>
+        <w:t xml:space="preserve">TAM</w:t>
+      </w:r>
+      <w:r>
+        <w:rPr>
+          <w:rFonts w:ascii="David" w:cs="David" w:hAnsi="David"/>
+          <w:b w:val="false"/>
+          <w:bCs w:val="false"/>
+          <w:sz w:val="24"/>
+          <w:szCs w:val="24"/>
+        </w:rPr>
+        <w:tab/>
+        <w:t xml:space="preserve">15</w:t>
+      </w:r>
+    </w:p>
+    <w:p>
+      <w:pPr>
+        <w:tabs>
+          <w:tab w:val="right" w:pos="9026" w:leader="dot"/>
+        </w:tabs>
+        <w:bidi/>
+        <w:spacing w:after="40" w:line="300" w:lineRule="auto"/>
+        <w:ind w:start="450"/>
+      </w:pPr>
+      <w:r>
+        <w:rPr>
+          <w:rFonts w:ascii="David" w:cs="David" w:hAnsi="David"/>
+          <w:b w:val="false"/>
+          <w:bCs w:val="false"/>
+          <w:i w:val="false"/>
+          <w:iCs w:val="false"/>
+          <w:sz w:val="24"/>
+          <w:szCs w:val="24"/>
+          <w:rtl/>
+        </w:rPr>
+        <w:t xml:space="preserve">6.3 מודל </w:t>
+      </w:r>
+      <w:r>
+        <w:rPr>
+          <w:rFonts w:ascii="Times New Roman" w:cs="Times New Roman" w:hAnsi="Times New Roman"/>
+          <w:b w:val="false"/>
+          <w:bCs w:val="false"/>
+          <w:i w:val="false"/>
+          <w:iCs w:val="false"/>
+          <w:sz w:val="24"/>
+          <w:szCs w:val="24"/>
+          <w:rtl w:val="false"/>
+        </w:rPr>
+        <w:t xml:space="preserve">AIDUA </w:t>
+      </w:r>
+      <w:r>
+        <w:rPr>
+          <w:rFonts w:ascii="David" w:cs="David" w:hAnsi="David"/>
+          <w:b w:val="false"/>
+          <w:bCs w:val="false"/>
+          <w:i w:val="false"/>
+          <w:iCs w:val="false"/>
+          <w:sz w:val="24"/>
+          <w:szCs w:val="24"/>
+          <w:rtl/>
+        </w:rPr>
+        <w:t xml:space="preserve">לאימוץ בינה מלאכותית</w:t>
+      </w:r>
+      <w:r>
+        <w:rPr>
+          <w:rFonts w:ascii="David" w:cs="David" w:hAnsi="David"/>
+          <w:b w:val="false"/>
+          <w:bCs w:val="false"/>
+          <w:sz w:val="24"/>
+          <w:szCs w:val="24"/>
+        </w:rPr>
+        <w:tab/>
+        <w:t xml:space="preserve">16</w:t>
+      </w:r>
+    </w:p>
+    <w:p>
+      <w:pPr>
+        <w:tabs>
+          <w:tab w:val="right" w:pos="9026" w:leader="dot"/>
+        </w:tabs>
+        <w:bidi/>
+        <w:spacing w:after="40" w:line="300" w:lineRule="auto"/>
+        <w:ind w:start="450"/>
+      </w:pPr>
+      <w:r>
+        <w:rPr>
+          <w:rFonts w:ascii="David" w:cs="David" w:hAnsi="David"/>
+          <w:b w:val="false"/>
+          <w:bCs w:val="false"/>
+          <w:i w:val="false"/>
+          <w:iCs w:val="false"/>
+          <w:sz w:val="24"/>
+          <w:szCs w:val="24"/>
+          <w:rtl/>
+        </w:rPr>
+        <w:t xml:space="preserve">6.4 גורמים מקדמים ומעכבים בקרב מורים</w:t>
+      </w:r>
+      <w:r>
+        <w:rPr>
+          <w:rFonts w:ascii="David" w:cs="David" w:hAnsi="David"/>
+          <w:b w:val="false"/>
+          <w:bCs w:val="false"/>
+          <w:sz w:val="24"/>
+          <w:szCs w:val="24"/>
+        </w:rPr>
+        <w:tab/>
+        <w:t xml:space="preserve">16</w:t>
+      </w:r>
+    </w:p>
+    <w:p>
+      <w:pPr>
+        <w:tabs>
+          <w:tab w:val="right" w:pos="9026" w:leader="dot"/>
+        </w:tabs>
+        <w:bidi/>
+        <w:spacing w:after="40" w:line="300" w:lineRule="auto"/>
+      </w:pPr>
+      <w:r>
+        <w:rPr>
+          <w:rFonts w:ascii="David" w:cs="David" w:hAnsi="David"/>
+          <w:b/>
+          <w:bCs/>
+          <w:i w:val="false"/>
+          <w:iCs w:val="false"/>
+          <w:sz w:val="24"/>
+          <w:szCs w:val="24"/>
+          <w:rtl/>
+        </w:rPr>
+        <w:t xml:space="preserve">7. אתגרים בשילוב טכנולוגיות למידה וכלי בינה מלאכותית בהוראת האנגלית</w:t>
+      </w:r>
+      <w:r>
+        <w:rPr>
+          <w:rFonts w:ascii="David" w:cs="David" w:hAnsi="David"/>
+          <w:b/>
+          <w:bCs/>
+          <w:sz w:val="24"/>
+          <w:szCs w:val="24"/>
+        </w:rPr>
+        <w:tab/>
+        <w:t xml:space="preserve">18</w:t>
+      </w:r>
+    </w:p>
+    <w:p>
+      <w:pPr>
+        <w:tabs>
+          <w:tab w:val="right" w:pos="9026" w:leader="dot"/>
+        </w:tabs>
+        <w:bidi/>
+        <w:spacing w:after="40" w:line="300" w:lineRule="auto"/>
+        <w:ind w:start="450"/>
+      </w:pPr>
+      <w:r>
+        <w:rPr>
+          <w:rFonts w:ascii="David" w:cs="David" w:hAnsi="David"/>
+          <w:b w:val="false"/>
+          <w:bCs w:val="false"/>
+          <w:i w:val="false"/>
+          <w:iCs w:val="false"/>
+          <w:sz w:val="24"/>
+          <w:szCs w:val="24"/>
+          <w:rtl/>
+        </w:rPr>
+        <w:t xml:space="preserve">7.1 פער בין עמדות ליישום, משאבים והתאמה דיסציפלינרית</w:t>
+      </w:r>
+      <w:r>
+        <w:rPr>
+          <w:rFonts w:ascii="David" w:cs="David" w:hAnsi="David"/>
+          <w:b w:val="false"/>
+          <w:bCs w:val="false"/>
+          <w:sz w:val="24"/>
+          <w:szCs w:val="24"/>
+        </w:rPr>
+        <w:tab/>
+        <w:t xml:space="preserve">18</w:t>
+      </w:r>
+    </w:p>
+    <w:p>
+      <w:pPr>
+        <w:tabs>
+          <w:tab w:val="right" w:pos="9026" w:leader="dot"/>
+        </w:tabs>
+        <w:bidi/>
+        <w:spacing w:after="40" w:line="300" w:lineRule="auto"/>
+        <w:ind w:start="450"/>
+      </w:pPr>
+      <w:r>
+        <w:rPr>
+          <w:rFonts w:ascii="David" w:cs="David" w:hAnsi="David"/>
+          <w:b w:val="false"/>
+          <w:bCs w:val="false"/>
+          <w:i w:val="false"/>
+          <w:iCs w:val="false"/>
+          <w:sz w:val="24"/>
+          <w:szCs w:val="24"/>
+          <w:rtl/>
+        </w:rPr>
+        <w:t xml:space="preserve">7.2 מחסור בהכשרה מקצועית</w:t>
+      </w:r>
+      <w:r>
+        <w:rPr>
+          <w:rFonts w:ascii="David" w:cs="David" w:hAnsi="David"/>
+          <w:b w:val="false"/>
+          <w:bCs w:val="false"/>
+          <w:sz w:val="24"/>
+          <w:szCs w:val="24"/>
+        </w:rPr>
+        <w:tab/>
+        <w:t xml:space="preserve">18</w:t>
+      </w:r>
+    </w:p>
+    <w:p>
+      <w:pPr>
+        <w:tabs>
+          <w:tab w:val="right" w:pos="9026" w:leader="dot"/>
+        </w:tabs>
+        <w:bidi/>
+        <w:spacing w:after="40" w:line="300" w:lineRule="auto"/>
+        <w:ind w:start="450"/>
+      </w:pPr>
+      <w:r>
+        <w:rPr>
+          <w:rFonts w:ascii="David" w:cs="David" w:hAnsi="David"/>
+          <w:b w:val="false"/>
+          <w:bCs w:val="false"/>
+          <w:i w:val="false"/>
+          <w:iCs w:val="false"/>
+          <w:sz w:val="24"/>
+          <w:szCs w:val="24"/>
+          <w:rtl/>
+        </w:rPr>
+        <w:t xml:space="preserve">7.3 חששות אתיים וחינוכיים</w:t>
+      </w:r>
+      <w:r>
+        <w:rPr>
+          <w:rFonts w:ascii="David" w:cs="David" w:hAnsi="David"/>
+          <w:b w:val="false"/>
+          <w:bCs w:val="false"/>
+          <w:sz w:val="24"/>
+          <w:szCs w:val="24"/>
+        </w:rPr>
+        <w:tab/>
+        <w:t xml:space="preserve">18</w:t>
+      </w:r>
+    </w:p>
+    <w:p>
+      <w:pPr>
+        <w:tabs>
+          <w:tab w:val="right" w:pos="9026" w:leader="dot"/>
+        </w:tabs>
+        <w:bidi/>
+        <w:spacing w:after="40" w:line="300" w:lineRule="auto"/>
+      </w:pPr>
+      <w:r>
+        <w:rPr>
+          <w:rFonts w:ascii="David" w:cs="David" w:hAnsi="David"/>
+          <w:b/>
+          <w:bCs/>
+          <w:i w:val="false"/>
+          <w:iCs w:val="false"/>
+          <w:sz w:val="24"/>
+          <w:szCs w:val="24"/>
+          <w:rtl/>
+        </w:rPr>
+        <w:t xml:space="preserve">8. תפיסות מורי אנגלית בבית הספר היסודי כלפי שילוב בינה מלאכותית יוצרת</w:t>
+      </w:r>
+      <w:r>
+        <w:rPr>
+          <w:rFonts w:ascii="David" w:cs="David" w:hAnsi="David"/>
+          <w:b/>
+          <w:bCs/>
+          <w:sz w:val="24"/>
+          <w:szCs w:val="24"/>
+        </w:rPr>
+        <w:tab/>
+        <w:t xml:space="preserve">20</w:t>
+      </w:r>
+    </w:p>
+    <w:p>
+      <w:pPr>
+        <w:tabs>
+          <w:tab w:val="right" w:pos="9026" w:leader="dot"/>
+        </w:tabs>
+        <w:bidi/>
+        <w:spacing w:after="40" w:line="300" w:lineRule="auto"/>
+      </w:pPr>
+      <w:r>
+        <w:rPr>
+          <w:rFonts w:ascii="David" w:cs="David" w:hAnsi="David"/>
+          <w:b/>
+          <w:bCs/>
+          <w:i w:val="false"/>
+          <w:iCs w:val="false"/>
+          <w:sz w:val="24"/>
+          <w:szCs w:val="24"/>
+          <w:rtl/>
+        </w:rPr>
+        <w:t xml:space="preserve">רשימת מקורות</w:t>
+      </w:r>
+      <w:r>
+        <w:rPr>
+          <w:rFonts w:ascii="David" w:cs="David" w:hAnsi="David"/>
+          <w:b/>
+          <w:bCs/>
+          <w:sz w:val="24"/>
+          <w:szCs w:val="24"/>
+        </w:rPr>
+        <w:tab/>
+        <w:t xml:space="preserve">21</w:t>
       </w:r>
     </w:p>
     <w:p>

</xml_diff>

<commit_message>
Integrate two EFL-specific AI studies into the literature review
Adds Sayici & Aydin (2025) qualitative interviews with EFL teachers and
Itmezieh & Shweiki (2025) Palestinian universities survey: empirical
usage findings in 5.4, training gap in 7.2, EFL-specific drawbacks in
7.3, and a sharpened research-gap paragraph in chapter 8. TOC page
numbers verified unchanged.

Co-Authored-By: Claude Fable 5 <noreply@anthropic.com>
Claude-Session: https://claude.ai/code/session_01UxjctmnUe9fGqd8WLWUStd
</commit_message>
<xml_diff>
--- a/seminar/סקירת ספרות - אבו קארם.docx
+++ b/seminar/סקירת ספרות - אבו קארם.docx
@@ -4141,6 +4141,117 @@
     </w:p>
     <w:p>
       <w:pPr>
+        <w:bidi/>
+        <w:spacing w:after="120" w:line="360" w:lineRule="auto"/>
+        <w:jc w:val="both"/>
+      </w:pPr>
+      <w:r>
+        <w:rPr>
+          <w:rFonts w:ascii="David" w:cs="David" w:hAnsi="David"/>
+          <w:b w:val="false"/>
+          <w:bCs w:val="false"/>
+          <w:i w:val="false"/>
+          <w:iCs w:val="false"/>
+          <w:sz w:val="24"/>
+          <w:szCs w:val="24"/>
+          <w:rtl/>
+        </w:rPr>
+        <w:t xml:space="preserve">ממצאים אמפיריים ראשונים על השימוש בפועל מצטברים בהקשרים שונים. מחקר איכותני שבו רואיינו שבעה מורי אנגלית כשפה זרה מצא ש-</w:t>
+      </w:r>
+      <w:r>
+        <w:rPr>
+          <w:rFonts w:ascii="Times New Roman" w:cs="Times New Roman" w:hAnsi="Times New Roman"/>
+          <w:b w:val="false"/>
+          <w:bCs w:val="false"/>
+          <w:i w:val="false"/>
+          <w:iCs w:val="false"/>
+          <w:sz w:val="24"/>
+          <w:szCs w:val="24"/>
+          <w:rtl w:val="false"/>
+        </w:rPr>
+        <w:t xml:space="preserve">ChatGPT </w:t>
+      </w:r>
+      <w:r>
+        <w:rPr>
+          <w:rFonts w:ascii="David" w:cs="David" w:hAnsi="David"/>
+          <w:b w:val="false"/>
+          <w:bCs w:val="false"/>
+          <w:i w:val="false"/>
+          <w:iCs w:val="false"/>
+          <w:sz w:val="24"/>
+          <w:szCs w:val="24"/>
+          <w:rtl/>
+        </w:rPr>
+        <w:t xml:space="preserve">הוא הכלי הנפוץ ביותר, ושהמורים משתמשים בכלים כעוזר הוראה: להפקת רעיונות למערכי שיעור, ליצירת פעילויות ברמות שונות, לחומרי אוצר מילים, דקדוק, כתיבה ודיבור ולהערכת מיומנויות הפקה. המורים דיווחו על חיסכון ניכר בזמן, על עלייה במעורבות ובמוטיבציה של הלומדים בזכות משחוק ועל האפשרות להתאים חומרים לצרכים אישיים, ואחת המרואיינות ציינה שצ'אטבוטים מעניקים ללומדים הזדמנויות דיבור שאין להם מחוץ לכיתה </w:t>
+      </w:r>
+      <w:r>
+        <w:rPr>
+          <w:rFonts w:ascii="Times New Roman" w:cs="Times New Roman" w:hAnsi="Times New Roman"/>
+          <w:b w:val="false"/>
+          <w:bCs w:val="false"/>
+          <w:i w:val="false"/>
+          <w:iCs w:val="false"/>
+          <w:sz w:val="24"/>
+          <w:szCs w:val="24"/>
+          <w:rtl w:val="false"/>
+        </w:rPr>
+        <w:t xml:space="preserve">(Sayici &amp; Aydin, 2025). </w:t>
+      </w:r>
+      <w:r>
+        <w:rPr>
+          <w:rFonts w:ascii="David" w:cs="David" w:hAnsi="David"/>
+          <w:b w:val="false"/>
+          <w:bCs w:val="false"/>
+          <w:i w:val="false"/>
+          <w:iCs w:val="false"/>
+          <w:sz w:val="24"/>
+          <w:szCs w:val="24"/>
+          <w:rtl/>
+        </w:rPr>
+        <w:t xml:space="preserve">תמונה דומה עולה ממחקר כמותני שנערך בקרב 40 מרצי אנגלית בשלוש אוניברסיטאות פלסטיניות: 87.5 אחוזים מהם השתמשו בכלי בינה מלאכותית בהוראה, ובראשם </w:t>
+      </w:r>
+      <w:r>
+        <w:rPr>
+          <w:rFonts w:ascii="Times New Roman" w:cs="Times New Roman" w:hAnsi="Times New Roman"/>
+          <w:b w:val="false"/>
+          <w:bCs w:val="false"/>
+          <w:i w:val="false"/>
+          <w:iCs w:val="false"/>
+          <w:sz w:val="24"/>
+          <w:szCs w:val="24"/>
+          <w:rtl w:val="false"/>
+        </w:rPr>
+        <w:t xml:space="preserve">ChatGPT, </w:t>
+      </w:r>
+      <w:r>
+        <w:rPr>
+          <w:rFonts w:ascii="David" w:cs="David" w:hAnsi="David"/>
+          <w:b w:val="false"/>
+          <w:bCs w:val="false"/>
+          <w:i w:val="false"/>
+          <w:iCs w:val="false"/>
+          <w:sz w:val="24"/>
+          <w:szCs w:val="24"/>
+          <w:rtl/>
+        </w:rPr>
+        <w:t xml:space="preserve">והיתרונות הבולטים שדווחו היו למידה מותאמת אישית והגברת מעורבות הלומדים </w:t>
+      </w:r>
+      <w:r>
+        <w:rPr>
+          <w:rFonts w:ascii="Times New Roman" w:cs="Times New Roman" w:hAnsi="Times New Roman"/>
+          <w:b w:val="false"/>
+          <w:bCs w:val="false"/>
+          <w:i w:val="false"/>
+          <w:iCs w:val="false"/>
+          <w:sz w:val="24"/>
+          <w:szCs w:val="24"/>
+          <w:rtl w:val="false"/>
+        </w:rPr>
+        <w:t xml:space="preserve">(Itmezieh &amp; Shweiki, 2025).</w:t>
+      </w:r>
+    </w:p>
+    <w:p>
+      <w:pPr>
         <w:pageBreakBefore/>
         <w:bidi/>
         <w:spacing w:after="240" w:line="360" w:lineRule="auto"/>
@@ -5104,7 +5215,20 @@
           <w:szCs w:val="24"/>
           <w:rtl/>
         </w:rPr>
-        <w:t xml:space="preserve">ניסיון הקורונה מלמד שהדבר אפשרי: כאשר הצורך היה מיידי והמסגרת תמכה, מורים סיגלו כלים חדשים בקצב מהיר והביקוש להשתלמויות הוכפל (חיאק ואבידב-אונגר, 2022). קהילות מורים מקצועיות, שבהן עמיתים חולקים התנסויות ומודלים לחיקוי, נמצאו אף הן מנוף משמעותי, בהלימה לממצא על כוחה של ההשפעה החברתית (דשן ואחרים, 2026).</w:t>
+        <w:t xml:space="preserve">ניסיון הקורונה מלמד שהדבר אפשרי: כאשר הצורך היה מיידי והמסגרת תמכה, מורים סיגלו כלים חדשים בקצב מהיר והביקוש להשתלמויות הוכפל (חיאק ואבידב-אונגר, 2022). קהילות מורים מקצועיות, שבהן עמיתים חולקים התנסויות ומודלים לחיקוי, נמצאו אף הן מנוף משמעותי, בהלימה לממצא על כוחה של ההשפעה החברתית (דשן ואחרים, 2026). גם בהוראת האנגלית עצמה זוהה מחסור ההכשרה כחסם מרכזי: מרצי אנגלית דירגו את היעדר ההכשרה הטכנית בראש האתגרים לשילוב הכלים, והחוקרים המליצו על פיתוח מקצועי מתמשך, על מדיניות מערכתית ועל שילוב הכלים בתכניות הלימודים </w:t>
+      </w:r>
+      <w:r>
+        <w:rPr>
+          <w:rFonts w:ascii="Times New Roman" w:cs="Times New Roman" w:hAnsi="Times New Roman"/>
+          <w:b w:val="false"/>
+          <w:bCs w:val="false"/>
+          <w:i w:val="false"/>
+          <w:iCs w:val="false"/>
+          <w:sz w:val="24"/>
+          <w:szCs w:val="24"/>
+          <w:rtl w:val="false"/>
+        </w:rPr>
+        <w:t xml:space="preserve">(Itmezieh &amp; Shweiki, 2025).</w:t>
       </w:r>
     </w:p>
     <w:p>
@@ -5183,7 +5307,33 @@
           <w:szCs w:val="24"/>
           <w:rtl w:val="false"/>
         </w:rPr>
-        <w:t xml:space="preserve">(Holmes &amp; Miao, 2023; Ng et al., 2021).</w:t>
+        <w:t xml:space="preserve">(Holmes &amp; Miao, 2023; Ng et al., 2021). </w:t>
+      </w:r>
+      <w:r>
+        <w:rPr>
+          <w:rFonts w:ascii="David" w:cs="David" w:hAnsi="David"/>
+          <w:b w:val="false"/>
+          <w:bCs w:val="false"/>
+          <w:i w:val="false"/>
+          <w:iCs w:val="false"/>
+          <w:sz w:val="24"/>
+          <w:szCs w:val="24"/>
+          <w:rtl/>
+        </w:rPr>
+        <w:t xml:space="preserve">מורי אנגלית שרואיינו על התנסותם דיווחו על קשיים קרובים לאלה: הסחת דעת של לומדים, חשש מאי-דיוק של תכנים שהכלי מפיק, קושי של הכלי להתאים תוכן לרמת הלומדים, הסתמכות יתר של תלמידים והיחלשות של חשיבה יצירתית וביקורתית, לצד תקלות טכניות </w:t>
+      </w:r>
+      <w:r>
+        <w:rPr>
+          <w:rFonts w:ascii="Times New Roman" w:cs="Times New Roman" w:hAnsi="Times New Roman"/>
+          <w:b w:val="false"/>
+          <w:bCs w:val="false"/>
+          <w:i w:val="false"/>
+          <w:iCs w:val="false"/>
+          <w:sz w:val="24"/>
+          <w:szCs w:val="24"/>
+          <w:rtl w:val="false"/>
+        </w:rPr>
+        <w:t xml:space="preserve">(Sayici &amp; Aydin, 2025).</w:t>
       </w:r>
     </w:p>
     <w:p>
@@ -5453,7 +5603,59 @@
           <w:szCs w:val="24"/>
           <w:rtl/>
         </w:rPr>
-        <w:t xml:space="preserve">ואולם מחקרים אלה עסקו במורים באשר הם, בלומדים בוגרים או בהקשרים שאינם ישראליים. מורי האנגלית בבית הספר היסודי בישראל פועלים בצומת ייחודי: הם מלמדים שפה זרה ללומדים צעירים, בכפוף לתכנית לימודים ארצית ולרגולציה מחייבת, בכיתות הטרוגניות ובתנאי משאבים משתנים, ותפיסותיהם את הכלי החדש טרם נחקרו לעומק. גם הספרות הישראלית שנסקרה מלמדת שעמדה חיובית איננה ערובה ליישום, ושחסמי מערכת עשויים להכריע את הכף (מידז'נסקי ומלמד, 2022). את הפער הזה מבקש המחקר הנוכחי למלא, באמצעות בחינה איכותנית של האופן שבו מורי אנגלית ביסודי תופסים את שילוב כלי הבינה המלאכותית היוצרת בהוראתם: התועלות שהם מזהים, החסמים שהם חווים, הרגשות המלווים את ההתנסות ומה שנדרש להם, להבנתם, כדי לשלב את הטכנולוגיה באופן מיטבי. הבנת תפיסות אלה עשויה לסייע בעיצוב הכשרות, מדיניות בית-ספרית ותכניות הטמעה המותאמות למורי האנגלית ביסודי.</w:t>
+        <w:t xml:space="preserve">מצטברים גם מחקרים ראשונים על מורי אנגלית עצמם: מורים בטורקיה שרואיינו על התנסותם תיארו שימוש מגוון בכלים לצד חששות פדגוגיים </w:t>
+      </w:r>
+      <w:r>
+        <w:rPr>
+          <w:rFonts w:ascii="Times New Roman" w:cs="Times New Roman" w:hAnsi="Times New Roman"/>
+          <w:b w:val="false"/>
+          <w:bCs w:val="false"/>
+          <w:i w:val="false"/>
+          <w:iCs w:val="false"/>
+          <w:sz w:val="24"/>
+          <w:szCs w:val="24"/>
+          <w:rtl w:val="false"/>
+        </w:rPr>
+        <w:t xml:space="preserve">(Sayici &amp; Aydin, 2025), </w:t>
+      </w:r>
+      <w:r>
+        <w:rPr>
+          <w:rFonts w:ascii="David" w:cs="David" w:hAnsi="David"/>
+          <w:b w:val="false"/>
+          <w:bCs w:val="false"/>
+          <w:i w:val="false"/>
+          <w:iCs w:val="false"/>
+          <w:sz w:val="24"/>
+          <w:szCs w:val="24"/>
+          <w:rtl/>
+        </w:rPr>
+        <w:t xml:space="preserve">ומרצים באוניברסיטאות פלסטיניות דיווחו על שימוש נרחב שהחסם המרכזי בו הוא היעדר הכשרה </w:t>
+      </w:r>
+      <w:r>
+        <w:rPr>
+          <w:rFonts w:ascii="Times New Roman" w:cs="Times New Roman" w:hAnsi="Times New Roman"/>
+          <w:b w:val="false"/>
+          <w:bCs w:val="false"/>
+          <w:i w:val="false"/>
+          <w:iCs w:val="false"/>
+          <w:sz w:val="24"/>
+          <w:szCs w:val="24"/>
+          <w:rtl w:val="false"/>
+        </w:rPr>
+        <w:t xml:space="preserve">(Itmezieh &amp; Shweiki, 2025). </w:t>
+      </w:r>
+      <w:r>
+        <w:rPr>
+          <w:rFonts w:ascii="David" w:cs="David" w:hAnsi="David"/>
+          <w:b w:val="false"/>
+          <w:bCs w:val="false"/>
+          <w:i w:val="false"/>
+          <w:iCs w:val="false"/>
+          <w:sz w:val="24"/>
+          <w:szCs w:val="24"/>
+          <w:rtl/>
+        </w:rPr>
+        <w:t xml:space="preserve">ואולם מחקרים אלה עסקו במורים באשר הם, במרצים בהשכלה הגבוהה, בלומדים בוגרים או בהקשרים שאינם ישראליים. מורי האנגלית בבית הספר היסודי בישראל פועלים בצומת ייחודי: הם מלמדים שפה זרה ללומדים צעירים, בכפוף לתכנית לימודים ארצית ולרגולציה מחייבת, בכיתות הטרוגניות ובתנאי משאבים משתנים, ותפיסותיהם את הכלי החדש טרם נחקרו לעומק. גם הספרות הישראלית שנסקרה מלמדת שעמדה חיובית איננה ערובה ליישום, ושחסמי מערכת עשויים להכריע את הכף (מידז'נסקי ומלמד, 2022). את הפער הזה מבקש המחקר הנוכחי למלא, באמצעות בחינה איכותנית של האופן שבו מורי אנגלית ביסודי תופסים את שילוב כלי הבינה המלאכותית היוצרת בהוראתם: התועלות שהם מזהים, החסמים שהם חווים, הרגשות המלווים את ההתנסות ומה שנדרש להם, להבנתם, כדי לשלב את הטכנולוגיה באופן מיטבי. הבנת תפיסות אלה עשויה לסייע בעיצוב הכשרות, מדיניות בית-ספרית ותכניות הטמעה המותאמות למורי האנגלית ביסודי.</w:t>
       </w:r>
     </w:p>
     <w:p>
@@ -6153,7 +6355,7 @@
           <w:szCs w:val="24"/>
           <w:rtl w:val="false"/>
         </w:rPr>
-        <w:t xml:space="preserve">Kohnke, L., Moorhouse, B. L., &amp; Zou, D. (2023). ChatGPT for language teaching and learning. </w:t>
+        <w:t xml:space="preserve">Itmezieh, M. J., &amp; Shweiki, M. M. (2025). Integrating AI tools into English language teaching and learning in Palestinian universities: Reality, potential benefits, and challenges. In </w:t>
       </w:r>
       <w:r>
         <w:rPr>
@@ -6166,20 +6368,20 @@
           <w:szCs w:val="24"/>
           <w:rtl w:val="false"/>
         </w:rPr>
-        <w:t xml:space="preserve">RELC Journal, 54</w:t>
-      </w:r>
-      <w:r>
-        <w:rPr>
-          <w:rFonts w:ascii="David" w:cs="David" w:hAnsi="David"/>
-          <w:b w:val="false"/>
-          <w:bCs w:val="false"/>
-          <w:i w:val="false"/>
-          <w:iCs w:val="false"/>
-          <w:sz w:val="24"/>
-          <w:szCs w:val="24"/>
-          <w:rtl/>
-        </w:rPr>
-        <w:t xml:space="preserve">(2), 537-550.</w:t>
+        <w:t xml:space="preserve">The 10th Annual International Scientific Conference of the Jordanian Association for Educational Sciences</w:t>
+      </w:r>
+      <w:r>
+        <w:rPr>
+          <w:rFonts w:ascii="Times New Roman" w:cs="Times New Roman" w:hAnsi="Times New Roman"/>
+          <w:b w:val="false"/>
+          <w:bCs w:val="false"/>
+          <w:i w:val="false"/>
+          <w:iCs w:val="false"/>
+          <w:sz w:val="24"/>
+          <w:szCs w:val="24"/>
+          <w:rtl w:val="false"/>
+        </w:rPr>
+        <w:t xml:space="preserve"> (pp. 374-393). Jordanian Association for Educational Sciences.</w:t>
       </w:r>
     </w:p>
     <w:p>
@@ -6200,7 +6402,7 @@
           <w:szCs w:val="24"/>
           <w:rtl w:val="false"/>
         </w:rPr>
-        <w:t xml:space="preserve">Krashen, S. D. (1982). </w:t>
+        <w:t xml:space="preserve">Kohnke, L., Moorhouse, B. L., &amp; Zou, D. (2023). ChatGPT for language teaching and learning. </w:t>
       </w:r>
       <w:r>
         <w:rPr>
@@ -6213,20 +6415,20 @@
           <w:szCs w:val="24"/>
           <w:rtl w:val="false"/>
         </w:rPr>
-        <w:t xml:space="preserve">Principles and practice in second language acquisition</w:t>
-      </w:r>
-      <w:r>
-        <w:rPr>
-          <w:rFonts w:ascii="Times New Roman" w:cs="Times New Roman" w:hAnsi="Times New Roman"/>
-          <w:b w:val="false"/>
-          <w:bCs w:val="false"/>
-          <w:i w:val="false"/>
-          <w:iCs w:val="false"/>
-          <w:sz w:val="24"/>
-          <w:szCs w:val="24"/>
-          <w:rtl w:val="false"/>
-        </w:rPr>
-        <w:t xml:space="preserve">. Pergamon Press.</w:t>
+        <w:t xml:space="preserve">RELC Journal, 54</w:t>
+      </w:r>
+      <w:r>
+        <w:rPr>
+          <w:rFonts w:ascii="David" w:cs="David" w:hAnsi="David"/>
+          <w:b w:val="false"/>
+          <w:bCs w:val="false"/>
+          <w:i w:val="false"/>
+          <w:iCs w:val="false"/>
+          <w:sz w:val="24"/>
+          <w:szCs w:val="24"/>
+          <w:rtl/>
+        </w:rPr>
+        <w:t xml:space="preserve">(2), 537-550.</w:t>
       </w:r>
     </w:p>
     <w:p>
@@ -6247,7 +6449,7 @@
           <w:szCs w:val="24"/>
           <w:rtl w:val="false"/>
         </w:rPr>
-        <w:t xml:space="preserve">Li, J., &amp; Huang, J.-S. (2020). Dimensions of artificial intelligence anxiety based on the integrated fear acquisition theory. </w:t>
+        <w:t xml:space="preserve">Krashen, S. D. (1982). </w:t>
       </w:r>
       <w:r>
         <w:rPr>
@@ -6260,20 +6462,20 @@
           <w:szCs w:val="24"/>
           <w:rtl w:val="false"/>
         </w:rPr>
-        <w:t xml:space="preserve">Technology in Society, 63</w:t>
-      </w:r>
-      <w:r>
-        <w:rPr>
-          <w:rFonts w:ascii="Times New Roman" w:cs="Times New Roman" w:hAnsi="Times New Roman"/>
-          <w:b w:val="false"/>
-          <w:bCs w:val="false"/>
-          <w:i w:val="false"/>
-          <w:iCs w:val="false"/>
-          <w:sz w:val="24"/>
-          <w:szCs w:val="24"/>
-          <w:rtl w:val="false"/>
-        </w:rPr>
-        <w:t xml:space="preserve">, Article 101410. https://doi.org/10.1016/j.techsoc.2020.101410</w:t>
+        <w:t xml:space="preserve">Principles and practice in second language acquisition</w:t>
+      </w:r>
+      <w:r>
+        <w:rPr>
+          <w:rFonts w:ascii="Times New Roman" w:cs="Times New Roman" w:hAnsi="Times New Roman"/>
+          <w:b w:val="false"/>
+          <w:bCs w:val="false"/>
+          <w:i w:val="false"/>
+          <w:iCs w:val="false"/>
+          <w:sz w:val="24"/>
+          <w:szCs w:val="24"/>
+          <w:rtl w:val="false"/>
+        </w:rPr>
+        <w:t xml:space="preserve">. Pergamon Press.</w:t>
       </w:r>
     </w:p>
     <w:p>
@@ -6294,7 +6496,7 @@
           <w:szCs w:val="24"/>
           <w:rtl w:val="false"/>
         </w:rPr>
-        <w:t xml:space="preserve">Ministry of Education. (2020). </w:t>
+        <w:t xml:space="preserve">Li, J., &amp; Huang, J.-S. (2020). Dimensions of artificial intelligence anxiety based on the integrated fear acquisition theory. </w:t>
       </w:r>
       <w:r>
         <w:rPr>
@@ -6307,20 +6509,20 @@
           <w:szCs w:val="24"/>
           <w:rtl w:val="false"/>
         </w:rPr>
-        <w:t xml:space="preserve">English curriculum 2020: Principles and standards for learning English as an international language for all grades</w:t>
-      </w:r>
-      <w:r>
-        <w:rPr>
-          <w:rFonts w:ascii="Times New Roman" w:cs="Times New Roman" w:hAnsi="Times New Roman"/>
-          <w:b w:val="false"/>
-          <w:bCs w:val="false"/>
-          <w:i w:val="false"/>
-          <w:iCs w:val="false"/>
-          <w:sz w:val="24"/>
-          <w:szCs w:val="24"/>
-          <w:rtl w:val="false"/>
-        </w:rPr>
-        <w:t xml:space="preserve">. State of Israel, Ministry of Education.</w:t>
+        <w:t xml:space="preserve">Technology in Society, 63</w:t>
+      </w:r>
+      <w:r>
+        <w:rPr>
+          <w:rFonts w:ascii="Times New Roman" w:cs="Times New Roman" w:hAnsi="Times New Roman"/>
+          <w:b w:val="false"/>
+          <w:bCs w:val="false"/>
+          <w:i w:val="false"/>
+          <w:iCs w:val="false"/>
+          <w:sz w:val="24"/>
+          <w:szCs w:val="24"/>
+          <w:rtl w:val="false"/>
+        </w:rPr>
+        <w:t xml:space="preserve">, Article 101410. https://doi.org/10.1016/j.techsoc.2020.101410</w:t>
       </w:r>
     </w:p>
     <w:p>
@@ -6341,7 +6543,7 @@
           <w:szCs w:val="24"/>
           <w:rtl w:val="false"/>
         </w:rPr>
-        <w:t xml:space="preserve">Mishra, P. (2019). Considering contextual knowledge: The TPACK diagram gets an upgrade. </w:t>
+        <w:t xml:space="preserve">Ministry of Education. (2020). </w:t>
       </w:r>
       <w:r>
         <w:rPr>
@@ -6354,20 +6556,20 @@
           <w:szCs w:val="24"/>
           <w:rtl w:val="false"/>
         </w:rPr>
-        <w:t xml:space="preserve">Journal of Digital Learning in Teacher Education, 35</w:t>
-      </w:r>
-      <w:r>
-        <w:rPr>
-          <w:rFonts w:ascii="Times New Roman" w:cs="Times New Roman" w:hAnsi="Times New Roman"/>
-          <w:b w:val="false"/>
-          <w:bCs w:val="false"/>
-          <w:i w:val="false"/>
-          <w:iCs w:val="false"/>
-          <w:sz w:val="24"/>
-          <w:szCs w:val="24"/>
-          <w:rtl w:val="false"/>
-        </w:rPr>
-        <w:t xml:space="preserve">(2), 76-78. https://doi.org/10.1080/21532974.2019.1588611</w:t>
+        <w:t xml:space="preserve">English curriculum 2020: Principles and standards for learning English as an international language for all grades</w:t>
+      </w:r>
+      <w:r>
+        <w:rPr>
+          <w:rFonts w:ascii="Times New Roman" w:cs="Times New Roman" w:hAnsi="Times New Roman"/>
+          <w:b w:val="false"/>
+          <w:bCs w:val="false"/>
+          <w:i w:val="false"/>
+          <w:iCs w:val="false"/>
+          <w:sz w:val="24"/>
+          <w:szCs w:val="24"/>
+          <w:rtl w:val="false"/>
+        </w:rPr>
+        <w:t xml:space="preserve">. State of Israel, Ministry of Education.</w:t>
       </w:r>
     </w:p>
     <w:p>
@@ -6388,7 +6590,7 @@
           <w:szCs w:val="24"/>
           <w:rtl w:val="false"/>
         </w:rPr>
-        <w:t xml:space="preserve">Mishra, P., &amp; Koehler, M. J. (2009). Too cool for school? No way! Using the TPACK framework: You can have your hot tools and teach with them, too. </w:t>
+        <w:t xml:space="preserve">Mishra, P. (2019). Considering contextual knowledge: The TPACK diagram gets an upgrade. </w:t>
       </w:r>
       <w:r>
         <w:rPr>
@@ -6401,20 +6603,20 @@
           <w:szCs w:val="24"/>
           <w:rtl w:val="false"/>
         </w:rPr>
-        <w:t xml:space="preserve">Learning &amp; Leading with Technology, 36</w:t>
-      </w:r>
-      <w:r>
-        <w:rPr>
-          <w:rFonts w:ascii="David" w:cs="David" w:hAnsi="David"/>
-          <w:b w:val="false"/>
-          <w:bCs w:val="false"/>
-          <w:i w:val="false"/>
-          <w:iCs w:val="false"/>
-          <w:sz w:val="24"/>
-          <w:szCs w:val="24"/>
-          <w:rtl/>
-        </w:rPr>
-        <w:t xml:space="preserve">(7), 14-18.</w:t>
+        <w:t xml:space="preserve">Journal of Digital Learning in Teacher Education, 35</w:t>
+      </w:r>
+      <w:r>
+        <w:rPr>
+          <w:rFonts w:ascii="Times New Roman" w:cs="Times New Roman" w:hAnsi="Times New Roman"/>
+          <w:b w:val="false"/>
+          <w:bCs w:val="false"/>
+          <w:i w:val="false"/>
+          <w:iCs w:val="false"/>
+          <w:sz w:val="24"/>
+          <w:szCs w:val="24"/>
+          <w:rtl w:val="false"/>
+        </w:rPr>
+        <w:t xml:space="preserve">(2), 76-78. https://doi.org/10.1080/21532974.2019.1588611</w:t>
       </w:r>
     </w:p>
     <w:p>
@@ -6435,7 +6637,7 @@
           <w:szCs w:val="24"/>
           <w:rtl w:val="false"/>
         </w:rPr>
-        <w:t xml:space="preserve">Mishra, P., Warr, M., &amp; Islam, R. (2023). TPACK in the age of ChatGPT and Generative AI. </w:t>
+        <w:t xml:space="preserve">Mishra, P., &amp; Koehler, M. J. (2009). Too cool for school? No way! Using the TPACK framework: You can have your hot tools and teach with them, too. </w:t>
       </w:r>
       <w:r>
         <w:rPr>
@@ -6448,20 +6650,20 @@
           <w:szCs w:val="24"/>
           <w:rtl w:val="false"/>
         </w:rPr>
-        <w:t xml:space="preserve">Journal of Digital Learning in Teacher Education, 39</w:t>
-      </w:r>
-      <w:r>
-        <w:rPr>
-          <w:rFonts w:ascii="Times New Roman" w:cs="Times New Roman" w:hAnsi="Times New Roman"/>
-          <w:b w:val="false"/>
-          <w:bCs w:val="false"/>
-          <w:i w:val="false"/>
-          <w:iCs w:val="false"/>
-          <w:sz w:val="24"/>
-          <w:szCs w:val="24"/>
-          <w:rtl w:val="false"/>
-        </w:rPr>
-        <w:t xml:space="preserve">(4), 235-250. https://doi.org/10.1080/21532974.2023.2247480</w:t>
+        <w:t xml:space="preserve">Learning &amp; Leading with Technology, 36</w:t>
+      </w:r>
+      <w:r>
+        <w:rPr>
+          <w:rFonts w:ascii="David" w:cs="David" w:hAnsi="David"/>
+          <w:b w:val="false"/>
+          <w:bCs w:val="false"/>
+          <w:i w:val="false"/>
+          <w:iCs w:val="false"/>
+          <w:sz w:val="24"/>
+          <w:szCs w:val="24"/>
+          <w:rtl/>
+        </w:rPr>
+        <w:t xml:space="preserve">(7), 14-18.</w:t>
       </w:r>
     </w:p>
     <w:p>
@@ -6482,7 +6684,7 @@
           <w:szCs w:val="24"/>
           <w:rtl w:val="false"/>
         </w:rPr>
-        <w:t xml:space="preserve">Ng, D. T. K., Leung, J. K. L., Chu, K. W. S., &amp; Qiao, M. S. (2021). AI literacy: Definition, teaching, evaluation and ethical issues. </w:t>
+        <w:t xml:space="preserve">Mishra, P., Warr, M., &amp; Islam, R. (2023). TPACK in the age of ChatGPT and Generative AI. </w:t>
       </w:r>
       <w:r>
         <w:rPr>
@@ -6495,20 +6697,20 @@
           <w:szCs w:val="24"/>
           <w:rtl w:val="false"/>
         </w:rPr>
-        <w:t xml:space="preserve">Proceedings of the Association for Information Science and Technology, 58</w:t>
-      </w:r>
-      <w:r>
-        <w:rPr>
-          <w:rFonts w:ascii="David" w:cs="David" w:hAnsi="David"/>
-          <w:b w:val="false"/>
-          <w:bCs w:val="false"/>
-          <w:i w:val="false"/>
-          <w:iCs w:val="false"/>
-          <w:sz w:val="24"/>
-          <w:szCs w:val="24"/>
-          <w:rtl/>
-        </w:rPr>
-        <w:t xml:space="preserve">(1), 504-509.</w:t>
+        <w:t xml:space="preserve">Journal of Digital Learning in Teacher Education, 39</w:t>
+      </w:r>
+      <w:r>
+        <w:rPr>
+          <w:rFonts w:ascii="Times New Roman" w:cs="Times New Roman" w:hAnsi="Times New Roman"/>
+          <w:b w:val="false"/>
+          <w:bCs w:val="false"/>
+          <w:i w:val="false"/>
+          <w:iCs w:val="false"/>
+          <w:sz w:val="24"/>
+          <w:szCs w:val="24"/>
+          <w:rtl w:val="false"/>
+        </w:rPr>
+        <w:t xml:space="preserve">(4), 235-250. https://doi.org/10.1080/21532974.2023.2247480</w:t>
       </w:r>
     </w:p>
     <w:p>
@@ -6529,7 +6731,7 @@
           <w:szCs w:val="24"/>
           <w:rtl w:val="false"/>
         </w:rPr>
-        <w:t xml:space="preserve">OECD. (2019). </w:t>
+        <w:t xml:space="preserve">Ng, D. T. K., Leung, J. K. L., Chu, K. W. S., &amp; Qiao, M. S. (2021). AI literacy: Definition, teaching, evaluation and ethical issues. </w:t>
       </w:r>
       <w:r>
         <w:rPr>
@@ -6542,20 +6744,20 @@
           <w:szCs w:val="24"/>
           <w:rtl w:val="false"/>
         </w:rPr>
-        <w:t xml:space="preserve">OECD future of education and skills 2030: OECD learning compass 2030. A series of concept notes</w:t>
-      </w:r>
-      <w:r>
-        <w:rPr>
-          <w:rFonts w:ascii="Times New Roman" w:cs="Times New Roman" w:hAnsi="Times New Roman"/>
-          <w:b w:val="false"/>
-          <w:bCs w:val="false"/>
-          <w:i w:val="false"/>
-          <w:iCs w:val="false"/>
-          <w:sz w:val="24"/>
-          <w:szCs w:val="24"/>
-          <w:rtl w:val="false"/>
-        </w:rPr>
-        <w:t xml:space="preserve">. OECD Publishing.</w:t>
+        <w:t xml:space="preserve">Proceedings of the Association for Information Science and Technology, 58</w:t>
+      </w:r>
+      <w:r>
+        <w:rPr>
+          <w:rFonts w:ascii="David" w:cs="David" w:hAnsi="David"/>
+          <w:b w:val="false"/>
+          <w:bCs w:val="false"/>
+          <w:i w:val="false"/>
+          <w:iCs w:val="false"/>
+          <w:sz w:val="24"/>
+          <w:szCs w:val="24"/>
+          <w:rtl/>
+        </w:rPr>
+        <w:t xml:space="preserve">(1), 504-509.</w:t>
       </w:r>
     </w:p>
     <w:p>
@@ -6576,7 +6778,7 @@
           <w:szCs w:val="24"/>
           <w:rtl w:val="false"/>
         </w:rPr>
-        <w:t xml:space="preserve">Prensky, M. (2008). The role of technology in teaching and the classroom. </w:t>
+        <w:t xml:space="preserve">OECD. (2019). </w:t>
       </w:r>
       <w:r>
         <w:rPr>
@@ -6589,20 +6791,20 @@
           <w:szCs w:val="24"/>
           <w:rtl w:val="false"/>
         </w:rPr>
-        <w:t xml:space="preserve">Educational Technology, 48</w:t>
-      </w:r>
-      <w:r>
-        <w:rPr>
-          <w:rFonts w:ascii="David" w:cs="David" w:hAnsi="David"/>
-          <w:b w:val="false"/>
-          <w:bCs w:val="false"/>
-          <w:i w:val="false"/>
-          <w:iCs w:val="false"/>
-          <w:sz w:val="24"/>
-          <w:szCs w:val="24"/>
-          <w:rtl/>
-        </w:rPr>
-        <w:t xml:space="preserve">(6), 1-3.</w:t>
+        <w:t xml:space="preserve">OECD future of education and skills 2030: OECD learning compass 2030. A series of concept notes</w:t>
+      </w:r>
+      <w:r>
+        <w:rPr>
+          <w:rFonts w:ascii="Times New Roman" w:cs="Times New Roman" w:hAnsi="Times New Roman"/>
+          <w:b w:val="false"/>
+          <w:bCs w:val="false"/>
+          <w:i w:val="false"/>
+          <w:iCs w:val="false"/>
+          <w:sz w:val="24"/>
+          <w:szCs w:val="24"/>
+          <w:rtl w:val="false"/>
+        </w:rPr>
+        <w:t xml:space="preserve">. OECD Publishing.</w:t>
       </w:r>
     </w:p>
     <w:p>
@@ -6623,7 +6825,7 @@
           <w:szCs w:val="24"/>
           <w:rtl w:val="false"/>
         </w:rPr>
-        <w:t xml:space="preserve">Puentedura, R. R. (2006). </w:t>
+        <w:t xml:space="preserve">Prensky, M. (2008). The role of technology in teaching and the classroom. </w:t>
       </w:r>
       <w:r>
         <w:rPr>
@@ -6636,6 +6838,53 @@
           <w:szCs w:val="24"/>
           <w:rtl w:val="false"/>
         </w:rPr>
+        <w:t xml:space="preserve">Educational Technology, 48</w:t>
+      </w:r>
+      <w:r>
+        <w:rPr>
+          <w:rFonts w:ascii="David" w:cs="David" w:hAnsi="David"/>
+          <w:b w:val="false"/>
+          <w:bCs w:val="false"/>
+          <w:i w:val="false"/>
+          <w:iCs w:val="false"/>
+          <w:sz w:val="24"/>
+          <w:szCs w:val="24"/>
+          <w:rtl/>
+        </w:rPr>
+        <w:t xml:space="preserve">(6), 1-3.</w:t>
+      </w:r>
+    </w:p>
+    <w:p>
+      <w:pPr>
+        <w:bidi w:val="false"/>
+        <w:spacing w:after="120" w:line="360" w:lineRule="auto"/>
+        <w:ind w:left="709" w:hanging="709"/>
+        <w:jc w:val="both"/>
+      </w:pPr>
+      <w:r>
+        <w:rPr>
+          <w:rFonts w:ascii="Times New Roman" w:cs="Times New Roman" w:hAnsi="Times New Roman"/>
+          <w:b w:val="false"/>
+          <w:bCs w:val="false"/>
+          <w:i w:val="false"/>
+          <w:iCs w:val="false"/>
+          <w:sz w:val="24"/>
+          <w:szCs w:val="24"/>
+          <w:rtl w:val="false"/>
+        </w:rPr>
+        <w:t xml:space="preserve">Puentedura, R. R. (2006). </w:t>
+      </w:r>
+      <w:r>
+        <w:rPr>
+          <w:rFonts w:ascii="Times New Roman" w:cs="Times New Roman" w:hAnsi="Times New Roman"/>
+          <w:b w:val="false"/>
+          <w:bCs w:val="false"/>
+          <w:i/>
+          <w:iCs/>
+          <w:sz w:val="24"/>
+          <w:szCs w:val="24"/>
+          <w:rtl w:val="false"/>
+        </w:rPr>
         <w:t xml:space="preserve">Transformation, technology, and education</w:t>
       </w:r>
       <w:r>
@@ -6650,6 +6899,53 @@
           <w:rtl w:val="false"/>
         </w:rPr>
         <w:t xml:space="preserve"> [Blog post]. Hippasus. http://hippasus.com/resources/tte/</w:t>
+      </w:r>
+    </w:p>
+    <w:p>
+      <w:pPr>
+        <w:bidi w:val="false"/>
+        <w:spacing w:after="120" w:line="360" w:lineRule="auto"/>
+        <w:ind w:left="709" w:hanging="709"/>
+        <w:jc w:val="both"/>
+      </w:pPr>
+      <w:r>
+        <w:rPr>
+          <w:rFonts w:ascii="Times New Roman" w:cs="Times New Roman" w:hAnsi="Times New Roman"/>
+          <w:b w:val="false"/>
+          <w:bCs w:val="false"/>
+          <w:i w:val="false"/>
+          <w:iCs w:val="false"/>
+          <w:sz w:val="24"/>
+          <w:szCs w:val="24"/>
+          <w:rtl w:val="false"/>
+        </w:rPr>
+        <w:t xml:space="preserve">Sayici, S., &amp; Aydin, S. (2025). Using artificial intelligence in foreign language teaching: Teachers' perspectives. </w:t>
+      </w:r>
+      <w:r>
+        <w:rPr>
+          <w:rFonts w:ascii="Times New Roman" w:cs="Times New Roman" w:hAnsi="Times New Roman"/>
+          <w:b w:val="false"/>
+          <w:bCs w:val="false"/>
+          <w:i/>
+          <w:iCs/>
+          <w:sz w:val="24"/>
+          <w:szCs w:val="24"/>
+          <w:rtl w:val="false"/>
+        </w:rPr>
+        <w:t xml:space="preserve">Proceedings of the World Conference on Education and Teaching, 4</w:t>
+      </w:r>
+      <w:r>
+        <w:rPr>
+          <w:rFonts w:ascii="Times New Roman" w:cs="Times New Roman" w:hAnsi="Times New Roman"/>
+          <w:b w:val="false"/>
+          <w:bCs w:val="false"/>
+          <w:i w:val="false"/>
+          <w:iCs w:val="false"/>
+          <w:sz w:val="24"/>
+          <w:szCs w:val="24"/>
+          <w:rtl w:val="false"/>
+        </w:rPr>
+        <w:t xml:space="preserve">(1), 1-10. https://doi.org/10.33422/etconf.v4i1.1016</w:t>
       </w:r>
     </w:p>
     <w:p>

</xml_diff>

<commit_message>
Deepen every sub-chapter and add Ono logo to the cover page
Each sub-chapter now runs two to three paragraphs: TPACK impact
figures and repurposing examples, GenAI unique properties, UNESCO
policy guidance, AI-literacy implications for teachers, readiness
dimensions as diagnosable components, acquisition-learning
distinction, communicative classroom detail, attitude-components
example, TAM indirect-effects logic, AIDUA validation findings,
Israeli study limitations, fear-acquisition pathways, and a
four-paragraph closing chapter. Cover page carries the college
logo; TOC page numbers re-measured and verified.

Co-Authored-By: Claude Fable 5 <noreply@anthropic.com>
Claude-Session: https://claude.ai/code/session_01UxjctmnUe9fGqd8WLWUStd
</commit_message>
<xml_diff>
--- a/seminar/סקירת ספרות - אבו קארם.docx
+++ b/seminar/סקירת ספרות - אבו קארם.docx
@@ -4,8 +4,54 @@
   <w:body>
     <w:p>
       <w:pPr>
-        <w:bidi/>
-        <w:spacing w:after="120" w:before="400" w:line="360" w:lineRule="auto"/>
+        <w:spacing w:after="200" w:before="100"/>
+        <w:jc w:val="center"/>
+      </w:pPr>
+      <w:r>
+        <w:drawing>
+          <wp:inline distT="0" distB="0" distL="0" distR="0">
+            <wp:extent cx="1238250" cy="1238250"/>
+            <wp:effectExtent t="0" r="0" b="0" l="0"/>
+            <wp:docPr id="1" name="" descr="" title=""/>
+            <wp:cNvGraphicFramePr>
+              <a:graphicFrameLocks xmlns:a="http://schemas.openxmlformats.org/drawingml/2006/main" noChangeAspect="1"/>
+            </wp:cNvGraphicFramePr>
+            <a:graphic xmlns:a="http://schemas.openxmlformats.org/drawingml/2006/main">
+              <a:graphicData uri="http://schemas.openxmlformats.org/drawingml/2006/picture">
+                <pic:pic xmlns:pic="http://schemas.openxmlformats.org/drawingml/2006/picture">
+                  <pic:nvPicPr>
+                    <pic:cNvPr id="0" name="" descr=""/>
+                    <pic:cNvPicPr>
+                      <a:picLocks noChangeAspect="1" noChangeArrowheads="1"/>
+                    </pic:cNvPicPr>
+                  </pic:nvPicPr>
+                  <pic:blipFill>
+                    <a:blip r:embed="rId8" cstate="none"/>
+                    <a:srcRect/>
+                    <a:stretch>
+                      <a:fillRect/>
+                    </a:stretch>
+                  </pic:blipFill>
+                  <pic:spPr bwMode="auto">
+                    <a:xfrm>
+                      <a:off x="0" y="0"/>
+                      <a:ext cx="1238250" cy="1238250"/>
+                    </a:xfrm>
+                    <a:prstGeom prst="rect">
+                      <a:avLst/>
+                    </a:prstGeom>
+                  </pic:spPr>
+                </pic:pic>
+              </a:graphicData>
+            </a:graphic>
+          </wp:inline>
+        </w:drawing>
+      </w:r>
+    </w:p>
+    <w:p>
+      <w:pPr>
+        <w:bidi/>
+        <w:spacing w:after="120" w:before="0" w:line="360" w:lineRule="auto"/>
         <w:jc w:val="center"/>
       </w:pPr>
       <w:r>
@@ -45,7 +91,7 @@
     <w:p>
       <w:pPr>
         <w:bidi/>
-        <w:spacing w:after="600" w:before="0" w:line="360" w:lineRule="auto"/>
+        <w:spacing w:after="500" w:before="0" w:line="360" w:lineRule="auto"/>
         <w:jc w:val="center"/>
       </w:pPr>
       <w:r>
@@ -98,7 +144,7 @@
     <w:p>
       <w:pPr>
         <w:bidi/>
-        <w:spacing w:after="600" w:before="0" w:line="360" w:lineRule="auto"/>
+        <w:spacing w:after="500" w:before="0" w:line="360" w:lineRule="auto"/>
         <w:jc w:val="center"/>
       </w:pPr>
       <w:r>
@@ -601,7 +647,7 @@
           <w:szCs w:val="24"/>
         </w:rPr>
         <w:tab/>
-        <w:t xml:space="preserve">8</w:t>
+        <w:t xml:space="preserve">9</w:t>
       </w:r>
     </w:p>
     <w:p>
@@ -635,7 +681,7 @@
           <w:szCs w:val="24"/>
         </w:rPr>
         <w:tab/>
-        <w:t xml:space="preserve">8</w:t>
+        <w:t xml:space="preserve">9</w:t>
       </w:r>
     </w:p>
     <w:p>
@@ -669,7 +715,7 @@
           <w:szCs w:val="24"/>
         </w:rPr>
         <w:tab/>
-        <w:t xml:space="preserve">8</w:t>
+        <w:t xml:space="preserve">9</w:t>
       </w:r>
     </w:p>
     <w:p>
@@ -703,7 +749,7 @@
           <w:szCs w:val="24"/>
         </w:rPr>
         <w:tab/>
-        <w:t xml:space="preserve">9</w:t>
+        <w:t xml:space="preserve">10</w:t>
       </w:r>
     </w:p>
     <w:p>
@@ -750,7 +796,7 @@
           <w:szCs w:val="24"/>
         </w:rPr>
         <w:tab/>
-        <w:t xml:space="preserve">9</w:t>
+        <w:t xml:space="preserve">11</w:t>
       </w:r>
     </w:p>
     <w:p>
@@ -783,7 +829,7 @@
           <w:szCs w:val="24"/>
         </w:rPr>
         <w:tab/>
-        <w:t xml:space="preserve">11</w:t>
+        <w:t xml:space="preserve">12</w:t>
       </w:r>
     </w:p>
     <w:p>
@@ -817,7 +863,7 @@
           <w:szCs w:val="24"/>
         </w:rPr>
         <w:tab/>
-        <w:t xml:space="preserve">11</w:t>
+        <w:t xml:space="preserve">12</w:t>
       </w:r>
     </w:p>
     <w:p>
@@ -851,7 +897,7 @@
           <w:szCs w:val="24"/>
         </w:rPr>
         <w:tab/>
-        <w:t xml:space="preserve">11</w:t>
+        <w:t xml:space="preserve">12</w:t>
       </w:r>
     </w:p>
     <w:p>
@@ -885,7 +931,7 @@
           <w:szCs w:val="24"/>
         </w:rPr>
         <w:tab/>
-        <w:t xml:space="preserve">11</w:t>
+        <w:t xml:space="preserve">12</w:t>
       </w:r>
     </w:p>
     <w:p>
@@ -918,7 +964,7 @@
           <w:szCs w:val="24"/>
         </w:rPr>
         <w:tab/>
-        <w:t xml:space="preserve">13</w:t>
+        <w:t xml:space="preserve">14</w:t>
       </w:r>
     </w:p>
     <w:p>
@@ -952,7 +998,7 @@
           <w:szCs w:val="24"/>
         </w:rPr>
         <w:tab/>
-        <w:t xml:space="preserve">13</w:t>
+        <w:t xml:space="preserve">14</w:t>
       </w:r>
     </w:p>
     <w:p>
@@ -986,7 +1032,7 @@
           <w:szCs w:val="24"/>
         </w:rPr>
         <w:tab/>
-        <w:t xml:space="preserve">13</w:t>
+        <w:t xml:space="preserve">14</w:t>
       </w:r>
     </w:p>
     <w:p>
@@ -1020,7 +1066,7 @@
           <w:szCs w:val="24"/>
         </w:rPr>
         <w:tab/>
-        <w:t xml:space="preserve">13</w:t>
+        <w:t xml:space="preserve">14</w:t>
       </w:r>
     </w:p>
     <w:p>
@@ -1054,7 +1100,7 @@
           <w:szCs w:val="24"/>
         </w:rPr>
         <w:tab/>
-        <w:t xml:space="preserve">14</w:t>
+        <w:t xml:space="preserve">15</w:t>
       </w:r>
     </w:p>
     <w:p>
@@ -1087,7 +1133,7 @@
           <w:szCs w:val="24"/>
         </w:rPr>
         <w:tab/>
-        <w:t xml:space="preserve">15</w:t>
+        <w:t xml:space="preserve">17</w:t>
       </w:r>
     </w:p>
     <w:p>
@@ -1121,7 +1167,7 @@
           <w:szCs w:val="24"/>
         </w:rPr>
         <w:tab/>
-        <w:t xml:space="preserve">15</w:t>
+        <w:t xml:space="preserve">17</w:t>
       </w:r>
     </w:p>
     <w:p>
@@ -1168,7 +1214,7 @@
           <w:szCs w:val="24"/>
         </w:rPr>
         <w:tab/>
-        <w:t xml:space="preserve">15</w:t>
+        <w:t xml:space="preserve">17</w:t>
       </w:r>
     </w:p>
     <w:p>
@@ -1228,7 +1274,7 @@
           <w:szCs w:val="24"/>
         </w:rPr>
         <w:tab/>
-        <w:t xml:space="preserve">16</w:t>
+        <w:t xml:space="preserve">18</w:t>
       </w:r>
     </w:p>
     <w:p>
@@ -1262,7 +1308,7 @@
           <w:szCs w:val="24"/>
         </w:rPr>
         <w:tab/>
-        <w:t xml:space="preserve">16</w:t>
+        <w:t xml:space="preserve">18</w:t>
       </w:r>
     </w:p>
     <w:p>
@@ -1295,7 +1341,7 @@
           <w:szCs w:val="24"/>
         </w:rPr>
         <w:tab/>
-        <w:t xml:space="preserve">18</w:t>
+        <w:t xml:space="preserve">20</w:t>
       </w:r>
     </w:p>
     <w:p>
@@ -1329,7 +1375,7 @@
           <w:szCs w:val="24"/>
         </w:rPr>
         <w:tab/>
-        <w:t xml:space="preserve">18</w:t>
+        <w:t xml:space="preserve">20</w:t>
       </w:r>
     </w:p>
     <w:p>
@@ -1363,7 +1409,7 @@
           <w:szCs w:val="24"/>
         </w:rPr>
         <w:tab/>
-        <w:t xml:space="preserve">18</w:t>
+        <w:t xml:space="preserve">20</w:t>
       </w:r>
     </w:p>
     <w:p>
@@ -1397,7 +1443,7 @@
           <w:szCs w:val="24"/>
         </w:rPr>
         <w:tab/>
-        <w:t xml:space="preserve">18</w:t>
+        <w:t xml:space="preserve">21</w:t>
       </w:r>
     </w:p>
     <w:p>
@@ -1430,7 +1476,7 @@
           <w:szCs w:val="24"/>
         </w:rPr>
         <w:tab/>
-        <w:t xml:space="preserve">20</w:t>
+        <w:t xml:space="preserve">22</w:t>
       </w:r>
     </w:p>
     <w:p>
@@ -1463,7 +1509,7 @@
           <w:szCs w:val="24"/>
         </w:rPr>
         <w:tab/>
-        <w:t xml:space="preserve">21</w:t>
+        <w:t xml:space="preserve">24</w:t>
       </w:r>
     </w:p>
     <w:p>
@@ -1637,20 +1683,33 @@
           <w:szCs w:val="24"/>
           <w:rtl/>
         </w:rPr>
-        <w:t xml:space="preserve">היעד של תפיסה זו איננו שליטה בחומר בלבד אלא למידה איכותית: למידה פעילה ומשמעותית, שבה הלומד בונה ידע, מפתח הבנה עמוקה וחווה שייכות ומסוגלות (לוי עצמון, 2024). הגדרה זו של פדגוגיה חדשנית תשמש בסיס להמשך הסקירה, שכן שאלת שילובן של טכנולוגיות בכלל ושל בינה מלאכותית בפרט נבחנת בספרות תמיד ביחס לפדגוגיה שהטכנולוגיה אמורה לשרת </w:t>
-      </w:r>
-      <w:r>
-        <w:rPr>
-          <w:rFonts w:ascii="Times New Roman" w:cs="Times New Roman" w:hAnsi="Times New Roman"/>
-          <w:b w:val="false"/>
-          <w:bCs w:val="false"/>
-          <w:i w:val="false"/>
-          <w:iCs w:val="false"/>
-          <w:sz w:val="24"/>
-          <w:szCs w:val="24"/>
-          <w:rtl w:val="false"/>
-        </w:rPr>
-        <w:t xml:space="preserve">(Prensky, 2008).</w:t>
+        <w:t xml:space="preserve">היעד של תפיסה זו איננו שליטה בחומר בלבד אלא למידה איכותית: למידה פעילה ומשמעותית, שבה הלומד בונה ידע, מפתח הבנה עמוקה וחווה שייכות ומסוגלות (לוי עצמון, 2024). ההגדרה מנוגדת במכוון לדפוס ההוראה המסורתי, שבו המורה מוסר ידע אחיד לכיתה שלמה והלומד נמדד בעיקר על שינון ושחזור. חשוב להבחין שחדשנות פדגוגית איננה מזוהה עם טכנולוגיה: אפשר ללמד באופן חדשני ללא מחשב, ואפשר להציב מסך בכל כיתה מבלי לשנות דבר בדפוסי ההוראה </w:t>
+      </w:r>
+      <w:r>
+        <w:rPr>
+          <w:rFonts w:ascii="Times New Roman" w:cs="Times New Roman" w:hAnsi="Times New Roman"/>
+          <w:b w:val="false"/>
+          <w:bCs w:val="false"/>
+          <w:i w:val="false"/>
+          <w:iCs w:val="false"/>
+          <w:sz w:val="24"/>
+          <w:szCs w:val="24"/>
+          <w:rtl w:val="false"/>
+        </w:rPr>
+        <w:t xml:space="preserve">(Prensky, 2008). </w:t>
+      </w:r>
+      <w:r>
+        <w:rPr>
+          <w:rFonts w:ascii="David" w:cs="David" w:hAnsi="David"/>
+          <w:b w:val="false"/>
+          <w:bCs w:val="false"/>
+          <w:i w:val="false"/>
+          <w:iCs w:val="false"/>
+          <w:sz w:val="24"/>
+          <w:szCs w:val="24"/>
+          <w:rtl/>
+        </w:rPr>
+        <w:t xml:space="preserve">הגדרה זו תשמש בסיס להמשך הסקירה, שכן שאלת שילובן של טכנולוגיות בכלל ושל בינה מלאכותית בפרט נבחנת בספרות תמיד ביחס לפדגוגיה שהטכנולוגיה אמורה לשרת (לוי עצמון, 2024).</w:t>
       </w:r>
     </w:p>
     <w:p>
@@ -1690,7 +1749,7 @@
           <w:szCs w:val="24"/>
           <w:rtl/>
         </w:rPr>
-        <w:t xml:space="preserve">הרחבה מערכתית של אותה תפיסה מוצעת במסגרת הפדגוגיה מוטת העתיד שפיתח משרד החינוך. זוהי פדגוגיה הנגזרת מניתוח מגמות חברתיות, טכנולוגיות וכלכליות ומחיזוי התנהלותן, והיא מכוונת קדימה, אל צורכי העתיד של הלומדים. בבסיסה עומדת ההנחה שהחינוך חייב להיות רלוונטי ומשמעותי, להכשיר את הלומד למציאות עתידית שאינה ידועה מראש ולהצמיח בוגר משגשג. המסמך מגדיר עקרונות פעולה, ובהם פרסונליות, שיתופיות ואי-פורמליות, ומציע למערכת החינוך דרכי היערכות בתכנים, בדרכי ההוראה ובארגון הלמידה (מורגנשטרן ואחרים, 2020).</w:t>
+        <w:t xml:space="preserve">הרחבה מערכתית של אותה תפיסה מוצעת במסגרת הפדגוגיה מוטת העתיד שפיתח משרד החינוך. זוהי פדגוגיה הנגזרת מניתוח מגמות חברתיות, טכנולוגיות וכלכליות ומחיזוי התנהלותן, והיא מכוונת קדימה, אל צורכי העתיד של הלומדים. בבסיסה עומדת ההנחה שהחינוך חייב להיות רלוונטי ומשמעותי, להכשיר את הלומד למציאות עתידית שאינה ידועה מראש ולהצמיח בוגר משגשג. המסמך מגדיר עקרונות פעולה, ובהם פרסונליות, שיתופיות ואי-פורמליות, ומציע למערכת החינוך דרכי היערכות בתכנים, בדרכי ההוראה ובארגון הלמידה (מורגנשטרן ואחרים, 2020). הבינה המלאכותית מופיעה במסמכים אלה פעמיים: כמגמה טכנולוגית שהמערכת נדרשת להיערך אליה, וככלי שבאמצעותו אפשר לממש עקרונות דוגמת פרסונליזציה של הלמידה (מורגנשטרן ואחרים, 2020).</w:t>
       </w:r>
     </w:p>
     <w:p>
@@ -1900,6 +1959,32 @@
           <w:szCs w:val="24"/>
           <w:rtl/>
         </w:rPr>
+        <w:t xml:space="preserve">חלוקת תפקידים זו מטילה על המורה אחריות חדשה: לא עוד מקור הידע היחיד, אלא מי שמעצב את המשימה, בוחר את הכלים המתאימים לה, מלווה את תהליך הלמידה ומעריך את איכות התוצרים שהלומדים מפיקים בעזרת הטכנולוגיה </w:t>
+      </w:r>
+      <w:r>
+        <w:rPr>
+          <w:rFonts w:ascii="Times New Roman" w:cs="Times New Roman" w:hAnsi="Times New Roman"/>
+          <w:b w:val="false"/>
+          <w:bCs w:val="false"/>
+          <w:i w:val="false"/>
+          <w:iCs w:val="false"/>
+          <w:sz w:val="24"/>
+          <w:szCs w:val="24"/>
+          <w:rtl w:val="false"/>
+        </w:rPr>
+        <w:t xml:space="preserve">(Prensky, 2008). </w:t>
+      </w:r>
+      <w:r>
+        <w:rPr>
+          <w:rFonts w:ascii="David" w:cs="David" w:hAnsi="David"/>
+          <w:b w:val="false"/>
+          <w:bCs w:val="false"/>
+          <w:i w:val="false"/>
+          <w:iCs w:val="false"/>
+          <w:sz w:val="24"/>
+          <w:szCs w:val="24"/>
+          <w:rtl/>
+        </w:rPr>
         <w:t xml:space="preserve">שינוי תפקידים זה הוא הרקע שעליו יש לבחון גם את כניסתה של הבינה המלאכותית היוצרת לכיתה. ככל שהטכנולוגיה עצמאית ומתוחכמת יותר, מתחדדת שאלת חלוקת העבודה בין המורה, הלומד והמכונה: אילו משימות ראוי להעביר לטכנולוגיה, אילו חייבות להישאר בידי האדם, וכיצד מבטיחים שהטכנולוגיה תתמוך בחשיבה של הלומד ולא תחליף אותה </w:t>
       </w:r>
       <w:r>
@@ -2013,7 +2098,7 @@
           <w:szCs w:val="24"/>
           <w:rtl/>
         </w:rPr>
-        <w:t xml:space="preserve">ההסבר לפער זה אינו טכני בעיקרו: שילוב מוצלח תלוי בידע של המורה, בעמדותיו ובהקשר הארגוני שבו הוא פועל </w:t>
+        <w:t xml:space="preserve">ההסבר לפער זה אינו טכני בעיקרו: שילוב מוצלח תלוי בידע של המורה, בעמדותיו ובהקשר הארגוני שבו הוא פועל, ולא רק בזמינות הציוד </w:t>
       </w:r>
       <w:r>
         <w:rPr>
@@ -2046,7 +2131,7 @@
           <w:szCs w:val="24"/>
           <w:rtl/>
         </w:rPr>
-        <w:t xml:space="preserve">נקודת מפנה התרחשה במגפת הקורונה, כאשר המעבר הכפוי להוראה מרחוק חייב את כלל המורים ומכשירי המורים להשתמש בכלים דיגיטליים בבת אחת. מחקר איכותני שנערך בישראל, שבמסגרתו רואיינו 25 בעלי תפקידים בכירים מ-13 מכללות להכשרת מורים, מצא שרובם (19 מתוך 25) תיארו את המגפה כחלון הזדמנויות לצמיחה ולהמצאה מחדש של ההוראה: מרצים "קפצו למים" ולמדו כלים חדשים, ושיעור ההשתתפות בהשתלמויות טכנולוגיות הוכפל, לאחר שלפני המגפה השתלמויות דומות עמדו כמעט ריקות. מיעוט מן המרואיינים חווה את התקופה דווקא כמשבר, ותיאר שיתוק, "כיבוי שרפות" והתמקדות בהישרדות (חיאק ואבידב-אונגר, 2022). המסקנה העולה מן המחקר היא שבעת משבר מצטמצם הקיטוב סביב סוגיות ארגוניות מהותיות, ונוצרת מציאות חדשה המשלבת בין הקטבים (חיאק ואבידב-אונגר, 2022).</w:t>
+        <w:t xml:space="preserve">נקודת מפנה התרחשה במגפת הקורונה, כאשר המעבר הכפוי להוראה מרחוק חייב את כלל המורים ומכשירי המורים להשתמש בכלים דיגיטליים בבת אחת. מחקר איכותני שנערך בישראל, שבמסגרתו רואיינו 25 בעלי תפקידים בכירים מ-13 מכללות להכשרת מורים, מצא שרובם (19 מתוך 25) תיארו את המגפה כחלון הזדמנויות לצמיחה ולהמצאה מחדש של ההוראה: מרצים "קפצו למים" ולמדו כלים חדשים, ושיעור ההשתתפות בהשתלמויות טכנולוגיות הוכפל, לאחר שלפני המגפה השתלמויות דומות עמדו כמעט ריקות. באותן מכללות תוארו גם מאמצי חדשנות מוסדיים: הקמת יחידות ומרחבי חדשנות דיגיטלית, רכישת טכנולוגיות מתקדמות דוגמת רובוטים ומשקפי מציאות מדומה והקצאת תקציבי פיתוח מקצועי. מיעוט מן המרואיינים חווה את התקופה דווקא כמשבר, ותיאר שיתוק, "כיבוי שרפות" והתמקדות בהישרדות, לצד פערי מיומנויות של חלק מהסגל הוותיק (חיאק ואבידב-אונגר, 2022). המסקנה העולה מן המחקר היא שבעת משבר מצטמצם הקיטוב סביב סוגיות ארגוניות מהותיות, ונוצרת מציאות חדשה המשלבת בין הקטבים (חיאק ואבידב-אונגר, 2022).</w:t>
       </w:r>
     </w:p>
     <w:p>
@@ -2086,7 +2171,7 @@
           <w:szCs w:val="24"/>
           <w:rtl/>
         </w:rPr>
-        <w:t xml:space="preserve">אותו מחקר מדגים את המתח המבני המרכזי של תהליכי הטמעה: הטמעה "מלמעלה למטה", ביוזמת ההנהלה והמדיניות, מול צמיחה "מלמטה למעלה", ביוזמת הסגל. 11 מן המרואיינים תיארו מדיניות מחייבת, למשל נשיא מכללה שחייב את כל הסגל להשתתף בהכשרות; 10 הדגישו את החופש האקדמי ואת היוזמה האישית של המרצים; וארבעה תמכו במפורש בשילוב בין הגישות, שכונה "מפגש רצונות" בין חזון ההנהלה ובין האוטונומיה של הסגל. תוצאה דומה עלתה גם בציר של שמרנות מול חדשנות: לצד רוב שתיאר מאמצי חדשנות נרחבים, יחידות חדשנות דיגיטלית, רכישת טכנולוגיות מתקדמות ותקציבי פיתוח מקצועי, תוארו גם קיבעון של חלק מהסגל, עומס דרישות ופערי מיומנויות בסיסיות (חיאק ואבידב-אונגר, 2022). המסקנה המעשית לקובעי מדיניות היא לעבור מניהול משבר להובלת שינוי, באמצעות בניית חזון משותף ודיאלוג פתוח עם הסגל (חיאק ואבידב-אונגר, 2022).</w:t>
+        <w:t xml:space="preserve">אותו מחקר מדגים את המתח המבני המרכזי של תהליכי הטמעה: הטמעה "מלמעלה למטה", ביוזמת ההנהלה והמדיניות, מול צמיחה "מלמטה למעלה", ביוזמת הסגל. 11 מן המרואיינים תיארו מדיניות מחייבת, למשל נשיא מכללה שחייב את כל הסגל להשתתף בהכשרות; 10 הדגישו את החופש האקדמי ואת היוזמה האישית של המרצים; וארבעה תמכו במפורש בשילוב בין הגישות, שכונה "מפגש רצונות" בין חזון ההנהלה ובין האוטונומיה של הסגל (חיאק ואבידב-אונגר, 2022). לקח מרכזי נוסף נוגע לדינמיקה של שמרנות מול חדשנות: התנגדות של מורים איננה בהכרח התנגדות עקרונית לטכנולוגיה, אלא לעיתים תגובה לעומס דרישות, לחוסר ביטחון במיומנויות או להיעדר ליווי, ולכן הטיפול בה עובר דרך תמיכה והדרגתיות ולא דרך כפייה בלבד (חיאק ואבידב-אונגר, 2022).</w:t>
       </w:r>
     </w:p>
     <w:p>
@@ -2132,7 +2217,7 @@
           <w:szCs w:val="24"/>
           <w:rtl/>
         </w:rPr>
-        <w:t xml:space="preserve">עקרונות אלה, שגובשו סביב טכנולוגיות "רגילות", יעמדו למבחן מחודש עם כניסת הבינה המלאכותית היוצרת, שמאפייניה שונים מהותית </w:t>
+        <w:t xml:space="preserve">המסקנה המעשית לקובעי מדיניות היא לעבור מניהול משבר להובלת שינוי, באמצעות בניית חזון משותף ודיאלוג פתוח עם הסגל (חיאק ואבידב-אונגר, 2022). עקרונות אלה, שגובשו סביב טכנולוגיות "רגילות", יעמדו למבחן מחודש עם כניסת הבינה המלאכותית היוצרת, שמאפייניה שונים מהותית </w:t>
       </w:r>
       <w:r>
         <w:rPr>
@@ -2341,6 +2426,91 @@
           <w:szCs w:val="24"/>
           <w:rtl w:val="false"/>
         </w:rPr>
+        <w:t xml:space="preserve">(Mishra &amp; Koehler, 2009). </w:t>
+      </w:r>
+      <w:r>
+        <w:rPr>
+          <w:rFonts w:ascii="David" w:cs="David" w:hAnsi="David"/>
+          <w:b w:val="false"/>
+          <w:bCs w:val="false"/>
+          <w:i w:val="false"/>
+          <w:iCs w:val="false"/>
+          <w:sz w:val="24"/>
+          <w:szCs w:val="24"/>
+          <w:rtl/>
+        </w:rPr>
+        <w:t xml:space="preserve">מאז הוצג המודל הוא הפך לאחת המסגרות הנחקרות ביותר בחינוך: עד שנת 2019 נכתבו עליו יותר מ-1,200 מאמרים ופרקי ספרים ומעל 300 עבודות דוקטורט </w:t>
+      </w:r>
+      <w:r>
+        <w:rPr>
+          <w:rFonts w:ascii="Times New Roman" w:cs="Times New Roman" w:hAnsi="Times New Roman"/>
+          <w:b w:val="false"/>
+          <w:bCs w:val="false"/>
+          <w:i w:val="false"/>
+          <w:iCs w:val="false"/>
+          <w:sz w:val="24"/>
+          <w:szCs w:val="24"/>
+          <w:rtl w:val="false"/>
+        </w:rPr>
+        <w:t xml:space="preserve">(Mishra, 2019).</w:t>
+      </w:r>
+    </w:p>
+    <w:p>
+      <w:pPr>
+        <w:bidi/>
+        <w:spacing w:after="120" w:line="360" w:lineRule="auto"/>
+        <w:jc w:val="both"/>
+      </w:pPr>
+      <w:r>
+        <w:rPr>
+          <w:rFonts w:ascii="David" w:cs="David" w:hAnsi="David"/>
+          <w:b w:val="false"/>
+          <w:bCs w:val="false"/>
+          <w:i w:val="false"/>
+          <w:iCs w:val="false"/>
+          <w:sz w:val="24"/>
+          <w:szCs w:val="24"/>
+          <w:rtl/>
+        </w:rPr>
+        <w:t xml:space="preserve">מישרה וקוהלר </w:t>
+      </w:r>
+      <w:r>
+        <w:rPr>
+          <w:rFonts w:ascii="Times New Roman" w:cs="Times New Roman" w:hAnsi="Times New Roman"/>
+          <w:b w:val="false"/>
+          <w:bCs w:val="false"/>
+          <w:i w:val="false"/>
+          <w:iCs w:val="false"/>
+          <w:sz w:val="24"/>
+          <w:szCs w:val="24"/>
+          <w:rtl w:val="false"/>
+        </w:rPr>
+        <w:t xml:space="preserve">(Mishra &amp; Koehler, 2009) </w:t>
+      </w:r>
+      <w:r>
+        <w:rPr>
+          <w:rFonts w:ascii="David" w:cs="David" w:hAnsi="David"/>
+          <w:b w:val="false"/>
+          <w:bCs w:val="false"/>
+          <w:i w:val="false"/>
+          <w:iCs w:val="false"/>
+          <w:sz w:val="24"/>
+          <w:szCs w:val="24"/>
+          <w:rtl/>
+        </w:rPr>
+        <w:t xml:space="preserve">מדגישים שרוב הטכנולוגיות שמורים משתמשים בהן, מרשתות חברתיות ועד תוכנות משרדיות, לא פותחו כלל לצרכים חינוכיים, ולכן נדרש מהמורה "מיחזור יצירתי" שלהן: להבין אילו כללים אפשר לכופף ואילו לשבור כדי להפוך כלי כללי לכלי הוראה. הם מדגימים זאת, בין השאר, בשימוש ברשת חברתית להרחבת הדיון הכיתתי ובתוכנת מוזיקה להוראת שברים ויחסים. עוד הם מדגישים שהמערכת נמצאת בשיווי משקל דינמי: שינוי באחד הרכיבים, למשל הופעת טכנולוגיה חדשה, מחייב התאמה מחודשת של הפדגוגיה ושל התוכן. העובדה שטכנולוגיה מסוימת חדשנית ופופולרית איננה הופכת אותה לטכנולוגיה חינוכית; ההופך אותה לכזו הוא הידע של המורה המשלב אותה </w:t>
+      </w:r>
+      <w:r>
+        <w:rPr>
+          <w:rFonts w:ascii="Times New Roman" w:cs="Times New Roman" w:hAnsi="Times New Roman"/>
+          <w:b w:val="false"/>
+          <w:bCs w:val="false"/>
+          <w:i w:val="false"/>
+          <w:iCs w:val="false"/>
+          <w:sz w:val="24"/>
+          <w:szCs w:val="24"/>
+          <w:rtl w:val="false"/>
+        </w:rPr>
         <w:t xml:space="preserve">(Mishra &amp; Koehler, 2009).</w:t>
       </w:r>
     </w:p>
@@ -2361,65 +2531,6 @@
           <w:szCs w:val="24"/>
           <w:rtl/>
         </w:rPr>
-        <w:t xml:space="preserve">מישרה וקוהלר </w:t>
-      </w:r>
-      <w:r>
-        <w:rPr>
-          <w:rFonts w:ascii="Times New Roman" w:cs="Times New Roman" w:hAnsi="Times New Roman"/>
-          <w:b w:val="false"/>
-          <w:bCs w:val="false"/>
-          <w:i w:val="false"/>
-          <w:iCs w:val="false"/>
-          <w:sz w:val="24"/>
-          <w:szCs w:val="24"/>
-          <w:rtl w:val="false"/>
-        </w:rPr>
-        <w:t xml:space="preserve">(Mishra &amp; Koehler, 2009) </w:t>
-      </w:r>
-      <w:r>
-        <w:rPr>
-          <w:rFonts w:ascii="David" w:cs="David" w:hAnsi="David"/>
-          <w:b w:val="false"/>
-          <w:bCs w:val="false"/>
-          <w:i w:val="false"/>
-          <w:iCs w:val="false"/>
-          <w:sz w:val="24"/>
-          <w:szCs w:val="24"/>
-          <w:rtl/>
-        </w:rPr>
-        <w:t xml:space="preserve">מדגישים שרוב הטכנולוגיות שמורים משתמשים בהן, מרשתות חברתיות ועד תוכנות משרדיות, לא פותחו כלל לצרכים חינוכיים, ולכן נדרש מהמורה "מיחזור יצירתי" שלהן: להבין אילו כללים אפשר לכופף ואילו לשבור כדי להפוך כלי כללי לכלי הוראה. הם מדגימים זאת, בין השאר, בשימוש ברשת חברתית להרחבת הדיון הכיתתי ובתוכנת מוזיקה להוראת שברים ויחסים. עוד הם מדגישים שהמערכת נמצאת בשיווי משקל דינמי: שינוי באחד הרכיבים, למשל הופעת טכנולוגיה חדשה, מחייב התאמה מחודשת של הפדגוגיה ושל התוכן </w:t>
-      </w:r>
-      <w:r>
-        <w:rPr>
-          <w:rFonts w:ascii="Times New Roman" w:cs="Times New Roman" w:hAnsi="Times New Roman"/>
-          <w:b w:val="false"/>
-          <w:bCs w:val="false"/>
-          <w:i w:val="false"/>
-          <w:iCs w:val="false"/>
-          <w:sz w:val="24"/>
-          <w:szCs w:val="24"/>
-          <w:rtl w:val="false"/>
-        </w:rPr>
-        <w:t xml:space="preserve">(Mishra &amp; Koehler, 2009).</w:t>
-      </w:r>
-    </w:p>
-    <w:p>
-      <w:pPr>
-        <w:bidi/>
-        <w:spacing w:after="120" w:line="360" w:lineRule="auto"/>
-        <w:jc w:val="both"/>
-      </w:pPr>
-      <w:r>
-        <w:rPr>
-          <w:rFonts w:ascii="David" w:cs="David" w:hAnsi="David"/>
-          <w:b w:val="false"/>
-          <w:bCs w:val="false"/>
-          <w:i w:val="false"/>
-          <w:iCs w:val="false"/>
-          <w:sz w:val="24"/>
-          <w:szCs w:val="24"/>
-          <w:rtl/>
-        </w:rPr>
         <w:t xml:space="preserve">בגרסה מעודכנת של המודל שודרג מעגל ההקשר, שהופיע בתרשים המקורי כרקע בלבד, למרחב ידע עצמאי: ידע הקשרי </w:t>
       </w:r>
       <w:r>
@@ -2550,7 +2661,59 @@
           <w:szCs w:val="24"/>
           <w:rtl/>
         </w:rPr>
-        <w:t xml:space="preserve">מודלים אלה מתמקדים בידע ובפרקטיקה של המורה; מודלים שעניינם קבלת הטכנולוגיה על ידי המשתמש, </w:t>
+        <w:t xml:space="preserve">שני המודלים משלימים זה את זה: </w:t>
+      </w:r>
+      <w:r>
+        <w:rPr>
+          <w:rFonts w:ascii="Times New Roman" w:cs="Times New Roman" w:hAnsi="Times New Roman"/>
+          <w:b w:val="false"/>
+          <w:bCs w:val="false"/>
+          <w:i w:val="false"/>
+          <w:iCs w:val="false"/>
+          <w:sz w:val="24"/>
+          <w:szCs w:val="24"/>
+          <w:rtl w:val="false"/>
+        </w:rPr>
+        <w:t xml:space="preserve">SAMR </w:t>
+      </w:r>
+      <w:r>
+        <w:rPr>
+          <w:rFonts w:ascii="David" w:cs="David" w:hAnsi="David"/>
+          <w:b w:val="false"/>
+          <w:bCs w:val="false"/>
+          <w:i w:val="false"/>
+          <w:iCs w:val="false"/>
+          <w:sz w:val="24"/>
+          <w:szCs w:val="24"/>
+          <w:rtl/>
+        </w:rPr>
+        <w:t xml:space="preserve">שואל מה קורה למשימה הלימודית, ו-</w:t>
+      </w:r>
+      <w:r>
+        <w:rPr>
+          <w:rFonts w:ascii="Times New Roman" w:cs="Times New Roman" w:hAnsi="Times New Roman"/>
+          <w:b w:val="false"/>
+          <w:bCs w:val="false"/>
+          <w:i w:val="false"/>
+          <w:iCs w:val="false"/>
+          <w:sz w:val="24"/>
+          <w:szCs w:val="24"/>
+          <w:rtl w:val="false"/>
+        </w:rPr>
+        <w:t xml:space="preserve">TPACK </w:t>
+      </w:r>
+      <w:r>
+        <w:rPr>
+          <w:rFonts w:ascii="David" w:cs="David" w:hAnsi="David"/>
+          <w:b w:val="false"/>
+          <w:bCs w:val="false"/>
+          <w:i w:val="false"/>
+          <w:iCs w:val="false"/>
+          <w:sz w:val="24"/>
+          <w:szCs w:val="24"/>
+          <w:rtl/>
+        </w:rPr>
+        <w:t xml:space="preserve">שואל איזה ידע נדרש למורה כדי לחולל זאת. מודלים שעניינם קבלת הטכנולוגיה על ידי המשתמש, </w:t>
       </w:r>
       <w:r>
         <w:rPr>
@@ -2663,20 +2826,46 @@
           <w:szCs w:val="24"/>
           <w:rtl/>
         </w:rPr>
-        <w:t xml:space="preserve">בינה מלאכותית היא תוכנת מחשב המדמה תהליכי חשיבה אנושיים לשם ביצוע משימות. פעולתה נשענת על ארבעה עקרונות: כריית נתונים בהיקפים גדולים; זיהוי דפוסים והקשרים המאפשר חיזוי מגמות; למידת מכונה, שבה המערכת משפרת את ביצועיה מתוך הנתונים עצמם; ואוטונומיה, כלומר קבלת החלטות עצמאית על בסיס ניתוח הנתונים, תוך למידה, התפתחות ותגובה בזמן אמת </w:t>
-      </w:r>
-      <w:r>
-        <w:rPr>
-          <w:rFonts w:ascii="Times New Roman" w:cs="Times New Roman" w:hAnsi="Times New Roman"/>
-          <w:b w:val="false"/>
-          <w:bCs w:val="false"/>
-          <w:i w:val="false"/>
-          <w:iCs w:val="false"/>
-          <w:sz w:val="24"/>
-          <w:szCs w:val="24"/>
-          <w:rtl w:val="false"/>
-        </w:rPr>
-        <w:t xml:space="preserve">(Holmes &amp; Miao, 2023).</w:t>
+        <w:t xml:space="preserve">בינה מלאכותית היא תוכנת מחשב המדמה תהליכי חשיבה אנושיים לשם ביצוע משימות. פעולתה נשענת על ארבעה עקרונות: כריית נתונים בהיקפים גדולים; זיהוי דפוסים והקשרים המאפשר חיזוי מגמות; למידת מכונה, שבה המערכת משפרת את ביצועיה מתוך הנתונים עצמם ללא תכנות מפורש של כל כלל; ואוטונומיה, כלומר קבלת החלטות עצמאית על בסיס ניתוח הנתונים, תוך למידה, התפתחות ותגובה בזמן אמת </w:t>
+      </w:r>
+      <w:r>
+        <w:rPr>
+          <w:rFonts w:ascii="Times New Roman" w:cs="Times New Roman" w:hAnsi="Times New Roman"/>
+          <w:b w:val="false"/>
+          <w:bCs w:val="false"/>
+          <w:i w:val="false"/>
+          <w:iCs w:val="false"/>
+          <w:sz w:val="24"/>
+          <w:szCs w:val="24"/>
+          <w:rtl w:val="false"/>
+        </w:rPr>
+        <w:t xml:space="preserve">(Holmes &amp; Miao, 2023). </w:t>
+      </w:r>
+      <w:r>
+        <w:rPr>
+          <w:rFonts w:ascii="David" w:cs="David" w:hAnsi="David"/>
+          <w:b w:val="false"/>
+          <w:bCs w:val="false"/>
+          <w:i w:val="false"/>
+          <w:iCs w:val="false"/>
+          <w:sz w:val="24"/>
+          <w:szCs w:val="24"/>
+          <w:rtl/>
+        </w:rPr>
+        <w:t xml:space="preserve">בחינוך פעלו מערכות מסוג זה שנים רבות מאחורי הקלעים, למשל במערכות תרגול מסתגלות ובניתוח נתוני למידה, אך הן היו שקופות לרוב המורים והלומדים </w:t>
+      </w:r>
+      <w:r>
+        <w:rPr>
+          <w:rFonts w:ascii="Times New Roman" w:cs="Times New Roman" w:hAnsi="Times New Roman"/>
+          <w:b w:val="false"/>
+          <w:bCs w:val="false"/>
+          <w:i w:val="false"/>
+          <w:iCs w:val="false"/>
+          <w:sz w:val="24"/>
+          <w:szCs w:val="24"/>
+          <w:rtl w:val="false"/>
+        </w:rPr>
+        <w:t xml:space="preserve">(Celik et al., 2022).</w:t>
       </w:r>
     </w:p>
     <w:p>
@@ -2722,7 +2911,7 @@
           <w:szCs w:val="24"/>
           <w:rtl/>
         </w:rPr>
-        <w:t xml:space="preserve">היא התפתחות חדשה יחסית בתוך התחום: יישומים המייצרים תוכן חדש, טקסט, תמונה, קול, וידאו או קוד, על בסיס דפוסים סטטיסטיים שנלמדו ממאגרי עתק. מודלי שפה גדולים, דוגמת אלה שבבסיס </w:t>
+        <w:t xml:space="preserve">היא התפתחות חדשה יחסית בתוך התחום, והיא שהוציאה את הטכנולוגיה מאחורי הקלעים אל קדמת הכיתה: יישומים המייצרים תוכן חדש, טקסט, תמונה, קול, וידאו או קוד, על בסיס דפוסים סטטיסטיים שנלמדו ממאגרי עתק. מודלי שפה גדולים, דוגמת אלה שבבסיס </w:t>
       </w:r>
       <w:r>
         <w:rPr>
@@ -2774,7 +2963,40 @@
           <w:szCs w:val="24"/>
           <w:rtl/>
         </w:rPr>
-        <w:t xml:space="preserve">מדגישים שאין מדובר במנוע חיפוש: המודל אינו שולף טקסט קיים ממאגר אלא מחולל תשובה חדשה בכל פנייה. לטכנולוגיה זו שלוש תכונות המאפיינות כל טכנולוגיה דיגיטלית אך מופיעות בה בעוצמה יתרה: היא רב-שימושית, כלומר משמשת מטרות רבות ושונות; היא אטומה, שכן דרך פעולתה הפנימית סמויה גם ממפתחיה; והיא בלתי יציבה, נוטה לטעויות ול"הזיות", כלומר להמצאת מידע שנשמע אמין אך אינו נכון. נוסף על אלה, מישרה ואחרים </w:t>
+        <w:t xml:space="preserve">מדגישים שאין מדובר במנוע חיפוש: המודל אינו שולף טקסט קיים ממאגר אלא מחולל תשובה חדשה בכל פנייה. לטכנולוגיה זו שלוש תכונות המאפיינות כל טכנולוגיה דיגיטלית אך מופיעות בה בעוצמה יתרה: היא רב-שימושית, כלומר משמשת מטרות רבות ושונות; היא אטומה, שכן דרך פעולתה הפנימית סמויה גם ממפתחיה; והיא בלתי יציבה, נוטה לטעויות ול"הזיות", כלומר להמצאת מידע שנשמע אמין אך אינו נכון </w:t>
+      </w:r>
+      <w:r>
+        <w:rPr>
+          <w:rFonts w:ascii="Times New Roman" w:cs="Times New Roman" w:hAnsi="Times New Roman"/>
+          <w:b w:val="false"/>
+          <w:bCs w:val="false"/>
+          <w:i w:val="false"/>
+          <w:iCs w:val="false"/>
+          <w:sz w:val="24"/>
+          <w:szCs w:val="24"/>
+          <w:rtl w:val="false"/>
+        </w:rPr>
+        <w:t xml:space="preserve">(Mishra et al., 2023).</w:t>
+      </w:r>
+    </w:p>
+    <w:p>
+      <w:pPr>
+        <w:bidi/>
+        <w:spacing w:after="120" w:line="360" w:lineRule="auto"/>
+        <w:jc w:val="both"/>
+      </w:pPr>
+      <w:r>
+        <w:rPr>
+          <w:rFonts w:ascii="David" w:cs="David" w:hAnsi="David"/>
+          <w:b w:val="false"/>
+          <w:bCs w:val="false"/>
+          <w:i w:val="false"/>
+          <w:iCs w:val="false"/>
+          <w:sz w:val="24"/>
+          <w:szCs w:val="24"/>
+          <w:rtl/>
+        </w:rPr>
+        <w:t xml:space="preserve">נוסף על אלה, מישרה ואחרים </w:t>
       </w:r>
       <w:r>
         <w:rPr>
@@ -2800,7 +3022,20 @@
           <w:szCs w:val="24"/>
           <w:rtl/>
         </w:rPr>
-        <w:t xml:space="preserve">מזהים שתי תכונות מהפכניות ייחודיות לה: היא יוצרת, שכן כל תגובה שלה ייחודית ונוצרת בזמן אמת, באופן שמפתיע לעיתים גם את מתכנניה, והיא חברתית, שכן בני אדם מתקשרים איתה בשפה טבעית ונוטים כמעט אוטומטית להאניש אותה ולייחס לה אישיות וכוונות.</w:t>
+        <w:t xml:space="preserve">מזהים שתי תכונות מהפכניות ייחודיות לבינה המלאכותית היוצרת. היא יוצרת: כל תגובה שלה ייחודית ונוצרת בזמן אמת, באופן שמפתיע לעיתים גם את מתכנניה, ולכן אי אפשר לצפות מראש מה יפיק הכלי בכיתה. והיא חברתית: בני אדם מתקשרים איתה בשפה טבעית ונוטים כמעט אוטומטית להאניש אותה, לייחס לה אישיות, כוונות ומצבי רוח, אף שמדובר במנגנון סטטיסטי. שילוב התכונות הזה, יצירתיות של המכונה לצד נטיית האדם להאנשה, הוא שהופך את הטכנולוגיה למאתגרת כל כך עבור אנשי חינוך, ומחייב יחס ביקורתי כלפי תוצריה </w:t>
+      </w:r>
+      <w:r>
+        <w:rPr>
+          <w:rFonts w:ascii="Times New Roman" w:cs="Times New Roman" w:hAnsi="Times New Roman"/>
+          <w:b w:val="false"/>
+          <w:bCs w:val="false"/>
+          <w:i w:val="false"/>
+          <w:iCs w:val="false"/>
+          <w:sz w:val="24"/>
+          <w:szCs w:val="24"/>
+          <w:rtl w:val="false"/>
+        </w:rPr>
+        <w:t xml:space="preserve">(Mishra et al., 2023).</w:t>
       </w:r>
     </w:p>
     <w:p>
@@ -2866,7 +3101,7 @@
           <w:szCs w:val="24"/>
           <w:rtl/>
         </w:rPr>
-        <w:t xml:space="preserve">המחברים מציינים שהמחקר בתחום נוטה להתמקד בפוטנציאל הטכנולוגי, ושקולם של המורים עצמם, צורכיהם והכשרתם, נשמע בו פחות </w:t>
+        <w:t xml:space="preserve">המחברים מציינים שהמחקר בתחום נוטה להתמקד בפוטנציאל הטכנולוגי, ושקולם של המורים עצמם, צורכיהם והכשרתם, נשמע בו פחות; הם קוראים למחקר שיעמיד את המורה במרכז ויבחן מה נדרש לו כדי להפיק ערך מהכלים </w:t>
       </w:r>
       <w:r>
         <w:rPr>
@@ -2899,7 +3134,7 @@
           <w:szCs w:val="24"/>
           <w:rtl/>
         </w:rPr>
-        <w:t xml:space="preserve">לצד היישומים הממוקדים במורה מתפתח שיח רחב יותר על "תחום התיאום": הממשק וחלוקת התפקידים בין האדם ובין הבינה המלאכותית בהקשרים של למידה וקוגניציה. השאלה המרכזית היא אילו תהליכים קוגניטיביים ראוי שהלומד יבצע בעצמו כדי שתתרחש למידה, ואילו אפשר להפקיד בידי המכונה מבלי לרוקן את הלמידה מתוכן. הפקדה גורפת של החשיבה בידי הכלי עלולה לפגוע דווקא במיומנויות שהלמידה נועדה לפתח </w:t>
+        <w:t xml:space="preserve">לצד היישומים הממוקדים במורה מתפתח שיח רחב יותר על "תחום התיאום": הממשק וחלוקת התפקידים בין האדם ובין הבינה המלאכותית בהקשרים של למידה וקוגניציה. השאלה המרכזית היא אילו תהליכים קוגניטיביים ראוי שהלומד יבצע בעצמו כדי שתתרחש למידה, ואילו אפשר להפקיד בידי המכונה מבלי לרוקן את הלמידה מתוכן. הפקדה גורפת של החשיבה בידי הכלי עלולה לפגוע דווקא במיומנויות שהלמידה נועדה לפתח, ולכן נדרש עיצוב מכוון של המשימות כך שהלומד יישאר הגורם החושב </w:t>
       </w:r>
       <w:r>
         <w:rPr>
@@ -2925,7 +3160,7 @@
           <w:szCs w:val="24"/>
           <w:rtl/>
         </w:rPr>
-        <w:t xml:space="preserve">ברוח דומה, גישת אונסק"ו מדגישה שילוב ממוקד אדם: ההחלטות הפדגוגיות והאחריות עליהן נשארות בידי אנשי החינוך, והטכנולוגיה נבחנת תמיד לפי תרומתה ללמידה וליכולת האנושית </w:t>
+        <w:t xml:space="preserve">ברוח דומה, גישת אונסק"ו מדגישה שילוב ממוקד אדם: מתן עדיפות ליכולת האנושית ולקידום הפדגוגיה בכל החלטה על אופן השימוש, כך שההחלטות הפדגוגיות והאחריות עליהן נשארות בידי אנשי החינוך, והטכנולוגיה נבחנת תמיד לפי תרומתה ללמידה </w:t>
       </w:r>
       <w:r>
         <w:rPr>
@@ -3056,15 +3291,41 @@
           <w:szCs w:val="24"/>
           <w:rtl/>
         </w:rPr>
-        <w:t xml:space="preserve">מזהירים מפני חשיבה דיכוטומית של איסור גורף או אימוץ נלהב: הכלים כאן כדי להישאר, ותפקיד אנשי החינוך הוא להבין את חוזקותיהם ואת חולשותיהם.</w:t>
-      </w:r>
-    </w:p>
-    <w:p>
-      <w:pPr>
-        <w:bidi/>
-        <w:spacing w:after="120" w:line="360" w:lineRule="auto"/>
-        <w:jc w:val="both"/>
-      </w:pPr>
+        <w:t xml:space="preserve">מזהירים מפני חשיבה דיכוטומית של איסור גורף או אימוץ נלהב: הכלים כאן כדי להישאר, ותפקיד אנשי החינוך הוא להבין את חוזקותיהם ואת חולשותיהם ולעצב שימוש מושכל בהם.</w:t>
+      </w:r>
+    </w:p>
+    <w:p>
+      <w:pPr>
+        <w:bidi/>
+        <w:spacing w:after="120" w:line="360" w:lineRule="auto"/>
+        <w:jc w:val="both"/>
+      </w:pPr>
+      <w:r>
+        <w:rPr>
+          <w:rFonts w:ascii="David" w:cs="David" w:hAnsi="David"/>
+          <w:b w:val="false"/>
+          <w:bCs w:val="false"/>
+          <w:i w:val="false"/>
+          <w:iCs w:val="false"/>
+          <w:sz w:val="24"/>
+          <w:szCs w:val="24"/>
+          <w:rtl/>
+        </w:rPr>
+        <w:t xml:space="preserve">ברמת המדיניות הבינלאומית, אונסק"ו קורא למדינות להסדיר את השימוש בכלים אלה בחינוך: לקבוע כללי הגנה על פרטיות הלומדים, להגדיר גיל מינימום לשימוש עצמאי, להכשיר מורים באופן שיטתי ולוודא שהשילוב משרת מטרות פדגוגיות ולא אינטרסים מסחריים </w:t>
+      </w:r>
+      <w:r>
+        <w:rPr>
+          <w:rFonts w:ascii="Times New Roman" w:cs="Times New Roman" w:hAnsi="Times New Roman"/>
+          <w:b w:val="false"/>
+          <w:bCs w:val="false"/>
+          <w:i w:val="false"/>
+          <w:iCs w:val="false"/>
+          <w:sz w:val="24"/>
+          <w:szCs w:val="24"/>
+          <w:rtl w:val="false"/>
+        </w:rPr>
+        <w:t xml:space="preserve">(Holmes &amp; Miao, 2023). </w:t>
+      </w:r>
       <w:r>
         <w:rPr>
           <w:rFonts w:ascii="David" w:cs="David" w:hAnsi="David"/>
@@ -3181,7 +3442,7 @@
           <w:szCs w:val="24"/>
           <w:rtl/>
         </w:rPr>
-        <w:t xml:space="preserve">על הבינה המלאכותית היוצרת ושואלים מה על מורים לדעת כדי להשתמש בה ביעילות. בממד הטכנולוגי-פדגוגי, על המורה להעריך אילו שימושים הולמים תהליכי הוראה ולמידה ואילו אינם הולמים, ולעצב מחדש את ההערכה: למשל, במקום מטלת כתיבה שהכלי מסוגל לבצע, משימה שבה הלומד מבקר, משפר ומעריך טיוטה שיצר הכלי, באופן המזמן חשיבה מסדר גבוה. עליו גם ללמד ניסוח הנחיות מדויק ולסייע ללומדים לעמוד בפני הנטייה להאניש את הכלי, באמצעות חשיבה ביקורתית ואיטית. בממד הטכנולוגי-תוכני, הבינה המלאכותית צפויה לשנות כל מקצוע עתיר ידע, ולכן יש לשוב ולבחון מה ראוי ללמד בכל תחום דעת, בדומה לשאלות שעוררו המחשבונים בהוראת המתמטיקה </w:t>
+        <w:t xml:space="preserve">על הבינה המלאכותית היוצרת ושואלים מה על מורים לדעת כדי להשתמש בה ביעילות. בממד הטכנולוגי-פדגוגי, על המורה להעריך אילו שימושים הולמים תהליכי הוראה ולמידה ואילו אינם הולמים, ולעצב מחדש את ההערכה: למשל, במקום מטלת כתיבה שהכלי מסוגל לבצע, משימה שבה הלומד מבקר, משפר ומעריך טיוטה שיצר הכלי, באופן המזמן חשיבה מסדר גבוה. עליו גם ללמד ניסוח הנחיות מדויק, מיומנות שהפכה בעצמה לאוריינות חדשה, ולסייע ללומדים לעמוד בפני הנטייה להאניש את הכלי באמצעות חשיבה ביקורתית ואיטית. בממד הטכנולוגי-תוכני, הבינה המלאכותית צפויה לשנות כל מקצוע עתיר ידע, ולכן יש לשוב ולבחון מה ראוי ללמד בכל תחום דעת, בדומה לשאלות שעוררו המחשבונים בהוראת המתמטיקה </w:t>
       </w:r>
       <w:r>
         <w:rPr>
@@ -3214,7 +3475,7 @@
           <w:szCs w:val="24"/>
           <w:rtl/>
         </w:rPr>
-        <w:t xml:space="preserve">הממד השלישי, הידע ההקשרי, מקבל במודל זה מעמד מכריע. הצלחת השילוב תלויה בדרישות תכנית הלימודים, בתרבות בית הספר ובחזונו, במשאבים הזמינים ובצרכים הספציפיים של הלומדים, ומדיניות אוסרת עלולה לסכל גם את המורה המיומן ביותר. המחברים מרחיבים את מושג ההקשר עוד יותר: הבינה המלאכותית היוצרת משפיעה על הפרט ועל החברה כולה, ולכן תשנה גם את ההקשר החינוכי הרחב, והידע ההקשרי הוא שיבחין בין הצלחה לכישלון של השילוב. מסקנתם היא שהמורים והבינה המלאכותית הם יוצרים-שותפים, המעצבים זה את זה, ושהגבולות בין האנושי לטכנולוגי הולכים ומיטשטשים </w:t>
+        <w:t xml:space="preserve">הממד השלישי, הידע ההקשרי, מקבל במודל זה מעמד מכריע. הצלחת השילוב תלויה בדרישות תכנית הלימודים, בתרבות בית הספר ובחזונו, במשאבים הזמינים ובצרכים הספציפיים של הלומדים, ומדיניות אוסרת עלולה לסכל גם את המורה המיומן ביותר. המחברים מרחיבים את מושג ההקשר עוד יותר: הבינה המלאכותית היוצרת משפיעה על הפרט ועל החברה כולה, ולכן תשנה גם את ההקשר החינוכי הרחב, והידע ההקשרי הוא שיבחין בין הצלחה לכישלון של השילוב. הם מזכירים את לקח הרשתות החברתיות, שהשפעותיהן החברתיות והנפשיות התבררו רק שנים אחרי אימוצן הנרחב, כטעם לזהירות ולחשיבה מקדימה. מסקנתם היא שהמורים והבינה המלאכותית הם יוצרים-שותפים, המעצבים זה את זה, ושהגבולות בין האנושי לטכנולוגי הולכים ומיטשטשים </w:t>
       </w:r>
       <w:r>
         <w:rPr>
@@ -3314,6 +3575,39 @@
           <w:szCs w:val="24"/>
           <w:rtl/>
         </w:rPr>
+        <w:t xml:space="preserve">עבור מורה, המשמעות מעשית: להבין במה שונה מודל שפה ממנוע חיפוש, לדעת לנסח הנחיה מועילה, לזהות תשובה שגויה או מוטה של הכלי, ולשקול מתי השימוש בו ראוי ומתי הוא פוגע בלמידה </w:t>
+      </w:r>
+      <w:r>
+        <w:rPr>
+          <w:rFonts w:ascii="Times New Roman" w:cs="Times New Roman" w:hAnsi="Times New Roman"/>
+          <w:b w:val="false"/>
+          <w:bCs w:val="false"/>
+          <w:i w:val="false"/>
+          <w:iCs w:val="false"/>
+          <w:sz w:val="24"/>
+          <w:szCs w:val="24"/>
+          <w:rtl w:val="false"/>
+        </w:rPr>
+        <w:t xml:space="preserve">(Mishra et al., 2023; Ng et al., 2021).</w:t>
+      </w:r>
+    </w:p>
+    <w:p>
+      <w:pPr>
+        <w:bidi/>
+        <w:spacing w:after="120" w:line="360" w:lineRule="auto"/>
+        <w:jc w:val="both"/>
+      </w:pPr>
+      <w:r>
+        <w:rPr>
+          <w:rFonts w:ascii="David" w:cs="David" w:hAnsi="David"/>
+          <w:b w:val="false"/>
+          <w:bCs w:val="false"/>
+          <w:i w:val="false"/>
+          <w:iCs w:val="false"/>
+          <w:sz w:val="24"/>
+          <w:szCs w:val="24"/>
+          <w:rtl/>
+        </w:rPr>
         <w:t xml:space="preserve">נג ואחרים </w:t>
       </w:r>
       <w:r>
@@ -3340,7 +3634,20 @@
           <w:szCs w:val="24"/>
           <w:rtl/>
         </w:rPr>
-        <w:t xml:space="preserve">מדגישים שאוריינות בינה מלאכותית איננה שקולה לידע תכנות או לכישורים טכניים: עיקרה הבנה ביקורתית, אתית וחברתית של הטכנולוגיה והשלכותיה, והיא נתפסת כיום כאוריינות אזרחית הנחוצה לכלל האוכלוסייה, בדומה לאוריינות הקריאה והמדיה.</w:t>
+        <w:t xml:space="preserve">מדגישים שאוריינות בינה מלאכותית איננה שקולה לידע תכנות או לכישורים טכניים: עיקרה הבנה ביקורתית, אתית וחברתית של הטכנולוגיה והשלכותיה, והיא נתפסת כיום כאוריינות אזרחית הנחוצה לכלל האוכלוסייה, בדומה לאוריינות הקריאה והמדיה. מכאן נגזרת גם משימה חינוכית כפולה: מערכת החינוך נדרשת לפתח אוריינות זו אצל הלומדים, אך תנאי לכך הוא שהמורים עצמם יהיו אורייני בינה מלאכותית, שכן אי אפשר ללמד חשיבה ביקורתית על כלי שאינך מבין </w:t>
+      </w:r>
+      <w:r>
+        <w:rPr>
+          <w:rFonts w:ascii="Times New Roman" w:cs="Times New Roman" w:hAnsi="Times New Roman"/>
+          <w:b w:val="false"/>
+          <w:bCs w:val="false"/>
+          <w:i w:val="false"/>
+          <w:iCs w:val="false"/>
+          <w:sz w:val="24"/>
+          <w:szCs w:val="24"/>
+          <w:rtl w:val="false"/>
+        </w:rPr>
+        <w:t xml:space="preserve">(Ng et al., 2021).</w:t>
       </w:r>
     </w:p>
     <w:p>
@@ -3406,7 +3713,53 @@
           <w:szCs w:val="24"/>
           <w:rtl/>
         </w:rPr>
-        <w:t xml:space="preserve">ממשיגים את מוכנות המורים בארבעה ממדים: ידע (קוגניציה), כלומר הבנת הטכנולוגיה ואפשרויותיה; יכולת, כלומר מיומנות מעשית להשתמש בה בהוראה; חזון, כלומר תפיסה של האופן שבו הטכנולוגיה יכולה לקדם את הלמידה; ואתיקה, כלומר מודעות לשימוש אחראי. במחקרם האמפירי הם מראים שמורים ברמת מוכנות גבוהה מחזיקים בידע ובמיומנויות הנדרשים לחדשנות, מתנסים בהזדמנויות שהטכנולוגיה מציעה ומשלבים אותן בעבודתם </w:t>
+        <w:t xml:space="preserve">ממשיגים את מוכנות המורים בארבעה ממדים: ידע (קוגניציה), כלומר הבנת הטכנולוגיה ואפשרויותיה; יכולת, כלומר מיומנות מעשית להשתמש בה בהוראה; חזון, כלומר תפיסה של האופן שבו הטכנולוגיה יכולה לקדם את הלמידה ואת ההוראה; ואתיקה, כלומר מודעות לשימוש אחראי ולסיכונים.</w:t>
+      </w:r>
+    </w:p>
+    <w:p>
+      <w:pPr>
+        <w:bidi/>
+        <w:spacing w:after="120" w:line="360" w:lineRule="auto"/>
+        <w:jc w:val="both"/>
+      </w:pPr>
+      <w:r>
+        <w:rPr>
+          <w:rFonts w:ascii="David" w:cs="David" w:hAnsi="David"/>
+          <w:b w:val="false"/>
+          <w:bCs w:val="false"/>
+          <w:i w:val="false"/>
+          <w:iCs w:val="false"/>
+          <w:sz w:val="24"/>
+          <w:szCs w:val="24"/>
+          <w:rtl/>
+        </w:rPr>
+        <w:t xml:space="preserve">במחקרם האמפירי פיתחו וואנג ואחרים </w:t>
+      </w:r>
+      <w:r>
+        <w:rPr>
+          <w:rFonts w:ascii="Times New Roman" w:cs="Times New Roman" w:hAnsi="Times New Roman"/>
+          <w:b w:val="false"/>
+          <w:bCs w:val="false"/>
+          <w:i w:val="false"/>
+          <w:iCs w:val="false"/>
+          <w:sz w:val="24"/>
+          <w:szCs w:val="24"/>
+          <w:rtl w:val="false"/>
+        </w:rPr>
+        <w:t xml:space="preserve">(Wang et al., 2023) </w:t>
+      </w:r>
+      <w:r>
+        <w:rPr>
+          <w:rFonts w:ascii="David" w:cs="David" w:hAnsi="David"/>
+          <w:b w:val="false"/>
+          <w:bCs w:val="false"/>
+          <w:i w:val="false"/>
+          <w:iCs w:val="false"/>
+          <w:sz w:val="24"/>
+          <w:szCs w:val="24"/>
+          <w:rtl/>
+        </w:rPr>
+        <w:t xml:space="preserve">כלי מדידה למוכנות מורים ותיקפו אותו, והראו שמורים ברמת מוכנות גבוהה מחזיקים בידע ובמיומנויות הנדרשים לחדשנות, מתנסים בהזדמנויות שהטכנולוגיה מציעה ומשלבים אותן בעבודתם, ואילו מורים ברמת מוכנות נמוכה נוטים להימנע מהתנסות גם כאשר הכלים זמינים להם. חשיבותו של הממשג בכך שהוא מפרק את השאלה הכללית "האם המורה מוכן" לארבעה רכיבים הניתנים לאבחון ולטיפוח נפרד: אפשר לחזק ידע באמצעות למידה, יכולת באמצעות התנסות מודרכת, חזון באמצעות חשיפה לדוגמאות מוצלחות ואתיקה באמצעות דיון מונחה </w:t>
       </w:r>
       <w:r>
         <w:rPr>
@@ -3485,27 +3838,27 @@
           <w:szCs w:val="24"/>
           <w:rtl/>
         </w:rPr>
-        <w:t xml:space="preserve">מורה יכול להיות אורייני, כלומר להבין היטב מהי בינה מלאכותית ומהן מגבלותיה, ועדיין לא להיות מוכן לשלבה בשיעוריו, ולהפך.</w:t>
-      </w:r>
-    </w:p>
-    <w:p>
-      <w:pPr>
-        <w:bidi/>
-        <w:spacing w:after="120" w:line="360" w:lineRule="auto"/>
-        <w:jc w:val="both"/>
-      </w:pPr>
-      <w:r>
-        <w:rPr>
-          <w:rFonts w:ascii="David" w:cs="David" w:hAnsi="David"/>
-          <w:b w:val="false"/>
-          <w:bCs w:val="false"/>
-          <w:i w:val="false"/>
-          <w:iCs w:val="false"/>
-          <w:sz w:val="24"/>
-          <w:szCs w:val="24"/>
-          <w:rtl/>
-        </w:rPr>
-        <w:t xml:space="preserve">הקשר בין המושגים נבחן גם אמפירית. במחקר שנערך בקרב 368 מורים בפועל, מבית הספר היסודי ועד התיכון, נמצא שאוריינות טכנולוגית כללית מנבאת את מוכנות המורים ללמד בינה מלאכותית, ושתחושת הביטחון של המורה ביכולתו ללמד את התחום היא המנבא החזק ביותר של כוונתו לעשות זאת בפועל. הרלוונטיות הנתפסת של התחום נמצאה המנבא החזק ביותר של המוכנות עצמה, והמודל כולו הסביר כשמונים אחוזים מהשונות בכוונת ההוראה </w:t>
+        <w:t xml:space="preserve">מורה יכול להיות אורייני, כלומר להבין היטב מהי בינה מלאכותית ומהן מגבלותיה, ועדיין לא להיות מוכן לשלבה בשיעוריו, ולהפך: מורה עשוי להשתמש בכלי בשטף מבלי להבין את מגבלותיו, שימוש שאיננו אורייני ועלול להזיק.</w:t>
+      </w:r>
+    </w:p>
+    <w:p>
+      <w:pPr>
+        <w:bidi/>
+        <w:spacing w:after="120" w:line="360" w:lineRule="auto"/>
+        <w:jc w:val="both"/>
+      </w:pPr>
+      <w:r>
+        <w:rPr>
+          <w:rFonts w:ascii="David" w:cs="David" w:hAnsi="David"/>
+          <w:b w:val="false"/>
+          <w:bCs w:val="false"/>
+          <w:i w:val="false"/>
+          <w:iCs w:val="false"/>
+          <w:sz w:val="24"/>
+          <w:szCs w:val="24"/>
+          <w:rtl/>
+        </w:rPr>
+        <w:t xml:space="preserve">הקשר בין המושגים נבחן גם אמפירית. במחקר שנערך בקרב 368 מורים בפועל, מבית הספר היסודי ועד התיכון, ושנשען על תיאוריית ההתנהגות המתוכננת, נמצא שאוריינות טכנולוגית כללית מנבאת את מוכנות המורים ללמד בינה מלאכותית, ושתחושת הביטחון של המורה ביכולתו ללמד את התחום היא המנבא החזק ביותר של כוונתו לעשות זאת בפועל. הרלוונטיות הנתפסת של התחום נמצאה המנבא החזק ביותר של המוכנות עצמה, והמודל כולו הסביר כשמונים אחוזים מהשונות בכוונת ההוראה </w:t>
       </w:r>
       <w:r>
         <w:rPr>
@@ -3531,7 +3884,7 @@
           <w:szCs w:val="24"/>
           <w:rtl/>
         </w:rPr>
-        <w:t xml:space="preserve">מכאן שהמורה נדרש להיות בעצמו לומד אורייני, המעדכן את הידע שלו באופן מתמיד, ושהשקעה בפיתוח מקצועי מעשי היא תנאי לשילוב מוצלח </w:t>
+        <w:t xml:space="preserve">מעניין שהמורים במדגם הפגינו עמדות חיוביות וחרדה נמוכה, ובכל זאת המוכנות לא הייתה מובנת מאליה: עמדה חיובית לבדה לא הספיקה, ומה שהכריע היה הביטחון והרלוונטיות. מכאן שהמורה נדרש להיות בעצמו לומד אורייני, המעדכן את הידע שלו באופן מתמיד, ושהשקעה בפיתוח מקצועי מעשי היא תנאי לשילוב מוצלח </w:t>
       </w:r>
       <w:r>
         <w:rPr>
@@ -3690,7 +4043,7 @@
           <w:szCs w:val="24"/>
           <w:rtl/>
         </w:rPr>
-        <w:t xml:space="preserve">היא קובעת רמות בקיאות מדורגות ואבני דרך מוגדרות לכל שלב גיל, מראשית היסודי ועד סוף התיכון, בארבע מיומנויות השפה, האזנה, דיבור, קריאה וכתיבה, ובצדן יעדי אוצר מילים מדורגים </w:t>
+        <w:t xml:space="preserve">היא קובעת רמות בקיאות מדורגות ואבני דרך מוגדרות לכל שלב גיל, מראשית היסודי ועד סוף התיכון, בארבע מיומנויות השפה, האזנה, דיבור, קריאה וכתיבה, ובצדן רשימות אוצר מילים מדורגות לכל שלב </w:t>
       </w:r>
       <w:r>
         <w:rPr>
@@ -3716,7 +4069,20 @@
           <w:szCs w:val="24"/>
           <w:rtl/>
         </w:rPr>
-        <w:t xml:space="preserve">מבנה זה מאפשר למורה למקם כל לומד על רצף התקדמות ברור, אך גם מחייב הוראה מובחנת בכיתות שבהן פערי הרמות גדולים.</w:t>
+        <w:t xml:space="preserve">מבנה זה מאפשר למורה למקם כל לומד על רצף התקדמות ברור, אך גם מחייב הוראה מובחנת בכיתות שבהן פערי הרמות גדולים: באותה כיתה יושבים לומדים שנחשפים לאנגלית יומיום במדיה ובבית לצד לומדים שפגישתם היחידה עם השפה היא בשיעור </w:t>
+      </w:r>
+      <w:r>
+        <w:rPr>
+          <w:rFonts w:ascii="Times New Roman" w:cs="Times New Roman" w:hAnsi="Times New Roman"/>
+          <w:b w:val="false"/>
+          <w:bCs w:val="false"/>
+          <w:i w:val="false"/>
+          <w:iCs w:val="false"/>
+          <w:sz w:val="24"/>
+          <w:szCs w:val="24"/>
+          <w:rtl w:val="false"/>
+        </w:rPr>
+        <w:t xml:space="preserve">(Cameron, 2001; Ministry of Education, 2020).</w:t>
       </w:r>
     </w:p>
     <w:p>
@@ -3782,6 +4148,39 @@
           <w:szCs w:val="24"/>
           <w:rtl/>
         </w:rPr>
+        <w:t xml:space="preserve">הגישה התקשורתית מכתיבה גם את דמות השיעור: שירים, משחקים, סיפורים, דיאלוגים ומשימות ביצוע קטנות, שבהם הלומד משתמש בשפה כדי להשיג מטרה ולא רק כדי לתרגל מבנה </w:t>
+      </w:r>
+      <w:r>
+        <w:rPr>
+          <w:rFonts w:ascii="Times New Roman" w:cs="Times New Roman" w:hAnsi="Times New Roman"/>
+          <w:b w:val="false"/>
+          <w:bCs w:val="false"/>
+          <w:i w:val="false"/>
+          <w:iCs w:val="false"/>
+          <w:sz w:val="24"/>
+          <w:szCs w:val="24"/>
+          <w:rtl w:val="false"/>
+        </w:rPr>
+        <w:t xml:space="preserve">(Cameron, 2001).</w:t>
+      </w:r>
+    </w:p>
+    <w:p>
+      <w:pPr>
+        <w:bidi/>
+        <w:spacing w:after="120" w:line="360" w:lineRule="auto"/>
+        <w:jc w:val="both"/>
+      </w:pPr>
+      <w:r>
+        <w:rPr>
+          <w:rFonts w:ascii="David" w:cs="David" w:hAnsi="David"/>
+          <w:b w:val="false"/>
+          <w:bCs w:val="false"/>
+          <w:i w:val="false"/>
+          <w:iCs w:val="false"/>
+          <w:sz w:val="24"/>
+          <w:szCs w:val="24"/>
+          <w:rtl/>
+        </w:rPr>
         <w:t xml:space="preserve">המורה לאנגלית ביסודי פועל בתנאים ייחודיים: הוא מתווך שפה זרה ללומדים צעירים שרובם אינם פוגשים אותה בסביבתם היומיומית מחוץ לכיתה, ולכן איכות החשיפה בשיעור, מגוון התרגול והמשוב שהלומד מקבל משפיעים במיוחד על ההתקדמות </w:t>
       </w:r>
       <w:r>
@@ -3808,20 +4207,20 @@
           <w:szCs w:val="24"/>
           <w:rtl/>
         </w:rPr>
-        <w:t xml:space="preserve">בכיתה הטרוגנית, שבה חלק מהלומדים נחשפים לאנגלית גם בבית ובמדיה וחלקם כלל לא, נדרשת מהמורה הוראה מובחנת שקשה לקיימה באמצעים מסורתיים בלבד </w:t>
-      </w:r>
-      <w:r>
-        <w:rPr>
-          <w:rFonts w:ascii="Times New Roman" w:cs="Times New Roman" w:hAnsi="Times New Roman"/>
-          <w:b w:val="false"/>
-          <w:bCs w:val="false"/>
-          <w:i w:val="false"/>
-          <w:iCs w:val="false"/>
-          <w:sz w:val="24"/>
-          <w:szCs w:val="24"/>
-          <w:rtl w:val="false"/>
-        </w:rPr>
-        <w:t xml:space="preserve">(Cameron, 2001).</w:t>
+        <w:t xml:space="preserve">בכיתה הטרוגנית נדרשת מהמורה הוראה מובחנת: התאמת טקסטים, משימות וקצב לרמות שונות בו-זמנית, משימה שקשה לקיימה באמצעים מסורתיים בלבד ושהיא אחת הסיבות לעניין הגובר של מורי שפות בכלים המסוגלים לייצר חומרים מותאמים במהירות </w:t>
+      </w:r>
+      <w:r>
+        <w:rPr>
+          <w:rFonts w:ascii="Times New Roman" w:cs="Times New Roman" w:hAnsi="Times New Roman"/>
+          <w:b w:val="false"/>
+          <w:bCs w:val="false"/>
+          <w:i w:val="false"/>
+          <w:iCs w:val="false"/>
+          <w:sz w:val="24"/>
+          <w:szCs w:val="24"/>
+          <w:rtl w:val="false"/>
+        </w:rPr>
+        <w:t xml:space="preserve">(Cameron, 2001; Kohnke et al., 2023).</w:t>
       </w:r>
     </w:p>
     <w:p>
@@ -3887,7 +4286,7 @@
           <w:szCs w:val="24"/>
           <w:rtl/>
         </w:rPr>
-        <w:t xml:space="preserve">על קלט מובן: הלומד מתקדם כאשר הוא נחשף לשפה ברמה מעט גבוהה מרמתו הנוכחית, באופן שהוא מסוגל להבין מתוך ההקשר. תנאי נוסף הוא מסנן רגשי נמוך: חרדה, לחץ וחשש מטעויות חוסמים את הרכישה, ואילו מוטיבציה, ביטחון ואווירה תומכת מאפשרים אותה. מכאן החשיבות שמייחסת הספרות לסביבת למידה מרובת קלט ודלת איומים, שבה הלומד מעז להתנסות בשפה </w:t>
+        <w:t xml:space="preserve">על קלט מובן: הלומד מתקדם כאשר הוא נחשף לשפה ברמה מעט גבוהה מרמתו הנוכחית, באופן שהוא מסוגל להבין מתוך ההקשר. קראשן מבחין בין רכישה, תהליך בלתי מודע המתרחש דרך שימוש טבעי בשפה, ובין למידה, תהליך מודע של כללים, וטוען שהשטף בשפה נבנה בעיקר מן הרכישה. תנאי נוסף הוא מסנן רגשי נמוך: חרדה, לחץ וחשש מטעויות חוסמים את הרכישה, ואילו מוטיבציה, ביטחון ואווירה תומכת מאפשרים אותה. מכאן החשיבות שמייחסת הספרות לסביבת למידה מרובת קלט ודלת איומים, שבה הלומד מעז להתנסות בשפה </w:t>
       </w:r>
       <w:r>
         <w:rPr>
@@ -3920,7 +4319,7 @@
           <w:szCs w:val="24"/>
           <w:rtl/>
         </w:rPr>
-        <w:t xml:space="preserve">לומדים צעירים נבדלים מלומדים בוגרים בדרכי הלמידה שלהם: הם לומדים דרך פעילות והתנסות, נשענים על הערוץ הדבור לפני הכתוב, מתאפיינים בטווח קשב קצר וזקוקים להקשרים מוחשיים ומשמעותיים. הוראה אפקטיבית בגילים אלה משלבת משחק, סיפור, שיר ותנועה, ומדגישה הצלחות קטנות ותכופות הבונות תחושת מסוגלות </w:t>
+        <w:t xml:space="preserve">לומדים צעירים נבדלים מלומדים בוגרים בדרכי הלמידה שלהם: הם לומדים דרך פעילות והתנסות, נשענים על הערוץ הדבור לפני הכתוב, מתאפיינים בטווח קשב קצר וזקוקים להקשרים מוחשיים ומשמעותיים. הם נוטים לתפוס את השפה דרך המשמעות ולא דרך המבנה, ומודעותם המטא-לשונית, היכולת לדבר על השפה ועל חוקיה, עודנה מתפתחת. הוראה אפקטיבית בגילים אלה משלבת משחק, סיפור, שיר ותנועה, ומדגישה הצלחות קטנות ותכופות הבונות תחושת מסוגלות </w:t>
       </w:r>
       <w:r>
         <w:rPr>
@@ -4090,6 +4489,32 @@
           <w:szCs w:val="24"/>
           <w:rtl w:val="false"/>
         </w:rPr>
+        <w:t xml:space="preserve">(Kohnke et al., 2023). </w:t>
+      </w:r>
+      <w:r>
+        <w:rPr>
+          <w:rFonts w:ascii="David" w:cs="David" w:hAnsi="David"/>
+          <w:b w:val="false"/>
+          <w:bCs w:val="false"/>
+          <w:i w:val="false"/>
+          <w:iCs w:val="false"/>
+          <w:sz w:val="24"/>
+          <w:szCs w:val="24"/>
+          <w:rtl/>
+        </w:rPr>
+        <w:t xml:space="preserve">לצד הפוטנציאל, המחברים מדגישים שהשימוש מחייב כשירויות דיגיטליות של המורה ומודעות למגבלות הכלי: הטקסטים שהוא מפיק עלולים לכלול אי-דיוקים עובדתיים והטיות תרבותיות, איכות התוצר תלויה באיכות ההנחיה, ויכולתו של הכלי לבצע מטלות כתיבה שלמות מחייבת חשיבה מחודשת על דרכי ההערכה בשיעורי השפה </w:t>
+      </w:r>
+      <w:r>
+        <w:rPr>
+          <w:rFonts w:ascii="Times New Roman" w:cs="Times New Roman" w:hAnsi="Times New Roman"/>
+          <w:b w:val="false"/>
+          <w:bCs w:val="false"/>
+          <w:i w:val="false"/>
+          <w:iCs w:val="false"/>
+          <w:sz w:val="24"/>
+          <w:szCs w:val="24"/>
+          <w:rtl w:val="false"/>
+        </w:rPr>
         <w:t xml:space="preserve">(Kohnke et al., 2023).</w:t>
       </w:r>
     </w:p>
@@ -4110,20 +4535,176 @@
           <w:szCs w:val="24"/>
           <w:rtl/>
         </w:rPr>
-        <w:t xml:space="preserve">לצד הפוטנציאל, המחברים מדגישים שהשימוש מחייב כשירויות דיגיטליות של המורה ומודעות למגבלות הכלי: הטקסטים שהוא מפיק עלולים לכלול אי-דיוקים עובדתיים והטיות תרבותיות, איכות התוצר תלויה באיכות ההנחיה, ויכולתו של הכלי לבצע מטלות כתיבה שלמות מחייבת חשיבה מחודשת על דרכי ההערכה בשיעורי השפה </w:t>
-      </w:r>
-      <w:r>
-        <w:rPr>
-          <w:rFonts w:ascii="Times New Roman" w:cs="Times New Roman" w:hAnsi="Times New Roman"/>
-          <w:b w:val="false"/>
-          <w:bCs w:val="false"/>
-          <w:i w:val="false"/>
-          <w:iCs w:val="false"/>
-          <w:sz w:val="24"/>
-          <w:szCs w:val="24"/>
-          <w:rtl w:val="false"/>
-        </w:rPr>
-        <w:t xml:space="preserve">(Kohnke et al., 2023). </w:t>
+        <w:t xml:space="preserve">ממצאים אמפיריים ראשונים על השימוש בפועל מצטברים בהקשרים שונים. מחקר איכותני שבו רואיינו שבעה מורי אנגלית כשפה זרה מצא ש-</w:t>
+      </w:r>
+      <w:r>
+        <w:rPr>
+          <w:rFonts w:ascii="Times New Roman" w:cs="Times New Roman" w:hAnsi="Times New Roman"/>
+          <w:b w:val="false"/>
+          <w:bCs w:val="false"/>
+          <w:i w:val="false"/>
+          <w:iCs w:val="false"/>
+          <w:sz w:val="24"/>
+          <w:szCs w:val="24"/>
+          <w:rtl w:val="false"/>
+        </w:rPr>
+        <w:t xml:space="preserve">ChatGPT </w:t>
+      </w:r>
+      <w:r>
+        <w:rPr>
+          <w:rFonts w:ascii="David" w:cs="David" w:hAnsi="David"/>
+          <w:b w:val="false"/>
+          <w:bCs w:val="false"/>
+          <w:i w:val="false"/>
+          <w:iCs w:val="false"/>
+          <w:sz w:val="24"/>
+          <w:szCs w:val="24"/>
+          <w:rtl/>
+        </w:rPr>
+        <w:t xml:space="preserve">הוא הכלי הנפוץ ביותר, לצד כלים דוגמת </w:t>
+      </w:r>
+      <w:r>
+        <w:rPr>
+          <w:rFonts w:ascii="Times New Roman" w:cs="Times New Roman" w:hAnsi="Times New Roman"/>
+          <w:b w:val="false"/>
+          <w:bCs w:val="false"/>
+          <w:i w:val="false"/>
+          <w:iCs w:val="false"/>
+          <w:sz w:val="24"/>
+          <w:szCs w:val="24"/>
+          <w:rtl w:val="false"/>
+        </w:rPr>
+        <w:t xml:space="preserve">Quizlet, Kahoot, Mentimeter </w:t>
+      </w:r>
+      <w:r>
+        <w:rPr>
+          <w:rFonts w:ascii="David" w:cs="David" w:hAnsi="David"/>
+          <w:b w:val="false"/>
+          <w:bCs w:val="false"/>
+          <w:i w:val="false"/>
+          <w:iCs w:val="false"/>
+          <w:sz w:val="24"/>
+          <w:szCs w:val="24"/>
+          <w:rtl/>
+        </w:rPr>
+        <w:t xml:space="preserve">וצ'אטבוטים לימודיים, ושהמורים משתמשים בכלים כעוזר הוראה: להפקת רעיונות למערכי שיעור, ליצירת פעילויות ברמות שונות, לחומרי אוצר מילים, דקדוק, כתיבה ודיבור ולהערכת מיומנויות הפקה. המורים דיווחו על חיסכון ניכר בזמן, על עלייה במעורבות ובמוטיבציה של הלומדים בזכות משחוק ועל האפשרות להתאים חומרים לצרכים אישיים, ואחת המרואיינות ציינה שצ'אטבוטים מעניקים ללומדים הזדמנויות דיבור שאין להם מחוץ לכיתה </w:t>
+      </w:r>
+      <w:r>
+        <w:rPr>
+          <w:rFonts w:ascii="Times New Roman" w:cs="Times New Roman" w:hAnsi="Times New Roman"/>
+          <w:b w:val="false"/>
+          <w:bCs w:val="false"/>
+          <w:i w:val="false"/>
+          <w:iCs w:val="false"/>
+          <w:sz w:val="24"/>
+          <w:szCs w:val="24"/>
+          <w:rtl w:val="false"/>
+        </w:rPr>
+        <w:t xml:space="preserve">(Sayici &amp; Aydin, 2025). </w:t>
+      </w:r>
+      <w:r>
+        <w:rPr>
+          <w:rFonts w:ascii="David" w:cs="David" w:hAnsi="David"/>
+          <w:b w:val="false"/>
+          <w:bCs w:val="false"/>
+          <w:i w:val="false"/>
+          <w:iCs w:val="false"/>
+          <w:sz w:val="24"/>
+          <w:szCs w:val="24"/>
+          <w:rtl/>
+        </w:rPr>
+        <w:t xml:space="preserve">תמונה דומה עולה ממחקר כמותני שנערך בקרב 40 מרצי אנגלית בשלוש אוניברסיטאות פלסטיניות: 87.5 אחוזים מהם השתמשו בכלי בינה מלאכותית בהוראה, ובראשם </w:t>
+      </w:r>
+      <w:r>
+        <w:rPr>
+          <w:rFonts w:ascii="Times New Roman" w:cs="Times New Roman" w:hAnsi="Times New Roman"/>
+          <w:b w:val="false"/>
+          <w:bCs w:val="false"/>
+          <w:i w:val="false"/>
+          <w:iCs w:val="false"/>
+          <w:sz w:val="24"/>
+          <w:szCs w:val="24"/>
+          <w:rtl w:val="false"/>
+        </w:rPr>
+        <w:t xml:space="preserve">ChatGPT </w:t>
+      </w:r>
+      <w:r>
+        <w:rPr>
+          <w:rFonts w:ascii="David" w:cs="David" w:hAnsi="David"/>
+          <w:b w:val="false"/>
+          <w:bCs w:val="false"/>
+          <w:i w:val="false"/>
+          <w:iCs w:val="false"/>
+          <w:sz w:val="24"/>
+          <w:szCs w:val="24"/>
+          <w:rtl/>
+        </w:rPr>
+        <w:t xml:space="preserve">ולצדו כלים דוגמת </w:t>
+      </w:r>
+      <w:r>
+        <w:rPr>
+          <w:rFonts w:ascii="Times New Roman" w:cs="Times New Roman" w:hAnsi="Times New Roman"/>
+          <w:b w:val="false"/>
+          <w:bCs w:val="false"/>
+          <w:i w:val="false"/>
+          <w:iCs w:val="false"/>
+          <w:sz w:val="24"/>
+          <w:szCs w:val="24"/>
+          <w:rtl w:val="false"/>
+        </w:rPr>
+        <w:t xml:space="preserve">Grammarly, Duolingo </w:t>
+      </w:r>
+      <w:r>
+        <w:rPr>
+          <w:rFonts w:ascii="David" w:cs="David" w:hAnsi="David"/>
+          <w:b w:val="false"/>
+          <w:bCs w:val="false"/>
+          <w:i w:val="false"/>
+          <w:iCs w:val="false"/>
+          <w:sz w:val="24"/>
+          <w:szCs w:val="24"/>
+          <w:rtl/>
+        </w:rPr>
+        <w:t xml:space="preserve">ו-</w:t>
+      </w:r>
+      <w:r>
+        <w:rPr>
+          <w:rFonts w:ascii="Times New Roman" w:cs="Times New Roman" w:hAnsi="Times New Roman"/>
+          <w:b w:val="false"/>
+          <w:bCs w:val="false"/>
+          <w:i w:val="false"/>
+          <w:iCs w:val="false"/>
+          <w:sz w:val="24"/>
+          <w:szCs w:val="24"/>
+          <w:rtl w:val="false"/>
+        </w:rPr>
+        <w:t xml:space="preserve">Canva, </w:t>
+      </w:r>
+      <w:r>
+        <w:rPr>
+          <w:rFonts w:ascii="David" w:cs="David" w:hAnsi="David"/>
+          <w:b w:val="false"/>
+          <w:bCs w:val="false"/>
+          <w:i w:val="false"/>
+          <w:iCs w:val="false"/>
+          <w:sz w:val="24"/>
+          <w:szCs w:val="24"/>
+          <w:rtl/>
+        </w:rPr>
+        <w:t xml:space="preserve">והיתרונות הבולטים שדווחו היו למידה מותאמת אישית והגברת מעורבות הלומדים </w:t>
+      </w:r>
+      <w:r>
+        <w:rPr>
+          <w:rFonts w:ascii="Times New Roman" w:cs="Times New Roman" w:hAnsi="Times New Roman"/>
+          <w:b w:val="false"/>
+          <w:bCs w:val="false"/>
+          <w:i w:val="false"/>
+          <w:iCs w:val="false"/>
+          <w:sz w:val="24"/>
+          <w:szCs w:val="24"/>
+          <w:rtl w:val="false"/>
+        </w:rPr>
+        <w:t xml:space="preserve">(Itmezieh &amp; Shweiki, 2025). </w:t>
       </w:r>
       <w:r>
         <w:rPr>
@@ -4137,117 +4718,6 @@
           <w:rtl/>
         </w:rPr>
         <w:t xml:space="preserve">שאלת המפתח, כפי שעולה גם מהפרקים הקודמים, איננה אם הכלי מסוגל לתרום להוראת האנגלית אלא כיצד המורים תופסים אותו ומה יקבע אם ישלבו אותו בפועל, וזהו עניינו של הפרק הבא.</w:t>
-      </w:r>
-    </w:p>
-    <w:p>
-      <w:pPr>
-        <w:bidi/>
-        <w:spacing w:after="120" w:line="360" w:lineRule="auto"/>
-        <w:jc w:val="both"/>
-      </w:pPr>
-      <w:r>
-        <w:rPr>
-          <w:rFonts w:ascii="David" w:cs="David" w:hAnsi="David"/>
-          <w:b w:val="false"/>
-          <w:bCs w:val="false"/>
-          <w:i w:val="false"/>
-          <w:iCs w:val="false"/>
-          <w:sz w:val="24"/>
-          <w:szCs w:val="24"/>
-          <w:rtl/>
-        </w:rPr>
-        <w:t xml:space="preserve">ממצאים אמפיריים ראשונים על השימוש בפועל מצטברים בהקשרים שונים. מחקר איכותני שבו רואיינו שבעה מורי אנגלית כשפה זרה מצא ש-</w:t>
-      </w:r>
-      <w:r>
-        <w:rPr>
-          <w:rFonts w:ascii="Times New Roman" w:cs="Times New Roman" w:hAnsi="Times New Roman"/>
-          <w:b w:val="false"/>
-          <w:bCs w:val="false"/>
-          <w:i w:val="false"/>
-          <w:iCs w:val="false"/>
-          <w:sz w:val="24"/>
-          <w:szCs w:val="24"/>
-          <w:rtl w:val="false"/>
-        </w:rPr>
-        <w:t xml:space="preserve">ChatGPT </w:t>
-      </w:r>
-      <w:r>
-        <w:rPr>
-          <w:rFonts w:ascii="David" w:cs="David" w:hAnsi="David"/>
-          <w:b w:val="false"/>
-          <w:bCs w:val="false"/>
-          <w:i w:val="false"/>
-          <w:iCs w:val="false"/>
-          <w:sz w:val="24"/>
-          <w:szCs w:val="24"/>
-          <w:rtl/>
-        </w:rPr>
-        <w:t xml:space="preserve">הוא הכלי הנפוץ ביותר, ושהמורים משתמשים בכלים כעוזר הוראה: להפקת רעיונות למערכי שיעור, ליצירת פעילויות ברמות שונות, לחומרי אוצר מילים, דקדוק, כתיבה ודיבור ולהערכת מיומנויות הפקה. המורים דיווחו על חיסכון ניכר בזמן, על עלייה במעורבות ובמוטיבציה של הלומדים בזכות משחוק ועל האפשרות להתאים חומרים לצרכים אישיים, ואחת המרואיינות ציינה שצ'אטבוטים מעניקים ללומדים הזדמנויות דיבור שאין להם מחוץ לכיתה </w:t>
-      </w:r>
-      <w:r>
-        <w:rPr>
-          <w:rFonts w:ascii="Times New Roman" w:cs="Times New Roman" w:hAnsi="Times New Roman"/>
-          <w:b w:val="false"/>
-          <w:bCs w:val="false"/>
-          <w:i w:val="false"/>
-          <w:iCs w:val="false"/>
-          <w:sz w:val="24"/>
-          <w:szCs w:val="24"/>
-          <w:rtl w:val="false"/>
-        </w:rPr>
-        <w:t xml:space="preserve">(Sayici &amp; Aydin, 2025). </w:t>
-      </w:r>
-      <w:r>
-        <w:rPr>
-          <w:rFonts w:ascii="David" w:cs="David" w:hAnsi="David"/>
-          <w:b w:val="false"/>
-          <w:bCs w:val="false"/>
-          <w:i w:val="false"/>
-          <w:iCs w:val="false"/>
-          <w:sz w:val="24"/>
-          <w:szCs w:val="24"/>
-          <w:rtl/>
-        </w:rPr>
-        <w:t xml:space="preserve">תמונה דומה עולה ממחקר כמותני שנערך בקרב 40 מרצי אנגלית בשלוש אוניברסיטאות פלסטיניות: 87.5 אחוזים מהם השתמשו בכלי בינה מלאכותית בהוראה, ובראשם </w:t>
-      </w:r>
-      <w:r>
-        <w:rPr>
-          <w:rFonts w:ascii="Times New Roman" w:cs="Times New Roman" w:hAnsi="Times New Roman"/>
-          <w:b w:val="false"/>
-          <w:bCs w:val="false"/>
-          <w:i w:val="false"/>
-          <w:iCs w:val="false"/>
-          <w:sz w:val="24"/>
-          <w:szCs w:val="24"/>
-          <w:rtl w:val="false"/>
-        </w:rPr>
-        <w:t xml:space="preserve">ChatGPT, </w:t>
-      </w:r>
-      <w:r>
-        <w:rPr>
-          <w:rFonts w:ascii="David" w:cs="David" w:hAnsi="David"/>
-          <w:b w:val="false"/>
-          <w:bCs w:val="false"/>
-          <w:i w:val="false"/>
-          <w:iCs w:val="false"/>
-          <w:sz w:val="24"/>
-          <w:szCs w:val="24"/>
-          <w:rtl/>
-        </w:rPr>
-        <w:t xml:space="preserve">והיתרונות הבולטים שדווחו היו למידה מותאמת אישית והגברת מעורבות הלומדים </w:t>
-      </w:r>
-      <w:r>
-        <w:rPr>
-          <w:rFonts w:ascii="Times New Roman" w:cs="Times New Roman" w:hAnsi="Times New Roman"/>
-          <w:b w:val="false"/>
-          <w:bCs w:val="false"/>
-          <w:i w:val="false"/>
-          <w:iCs w:val="false"/>
-          <w:sz w:val="24"/>
-          <w:szCs w:val="24"/>
-          <w:rtl w:val="false"/>
-        </w:rPr>
-        <w:t xml:space="preserve">(Itmezieh &amp; Shweiki, 2025).</w:t>
       </w:r>
     </w:p>
     <w:p>
@@ -4360,27 +4830,27 @@
           <w:szCs w:val="24"/>
           <w:rtl/>
         </w:rPr>
-        <w:t xml:space="preserve">היא מערכת של אמונות, רגשות ונטיות התנהגותיות כלפי מושא מסוים. לעמדה שלושה מרכיבים: קוגניטיבי, הכולל את דעותיו, מחשבותיו ואמונותיו של הפרט על נשוא העמדה; רגשי, הנוגע למה שהפרט מרגיש כלפיו; והתנהגותי, המבטא את נטייתו לפעול ביחס אליו, להבדיל מהתנהגותו בפועל. עמדות הן כלליות ואינן מתייחסות לאירוע יחיד, הן חיוביות או שליליות, עוצמתן משתנה מנושא לנושא, והן יציבות לרוב אך ניתנות לשינוי (לוי עצמון ורונן, 2026).</w:t>
-      </w:r>
-    </w:p>
-    <w:p>
-      <w:pPr>
-        <w:bidi/>
-        <w:spacing w:after="120" w:line="360" w:lineRule="auto"/>
-        <w:jc w:val="both"/>
-      </w:pPr>
-      <w:r>
-        <w:rPr>
-          <w:rFonts w:ascii="David" w:cs="David" w:hAnsi="David"/>
-          <w:b w:val="false"/>
-          <w:bCs w:val="false"/>
-          <w:i w:val="false"/>
-          <w:iCs w:val="false"/>
-          <w:sz w:val="24"/>
-          <w:szCs w:val="24"/>
-          <w:rtl/>
-        </w:rPr>
-        <w:t xml:space="preserve">ההבחנה בין המושגים חשובה לעיצוב מחקר: מחקר תפיסות בוחן כיצד אנשים חווים, קולטים ומפרשים תופעה, ואילו מחקר עמדות בוחן מה הם חושבים עליה וכיצד בכוונתם לנהוג. שני הסוגים נחקרים הן בכלים איכותניים, ובראשם ראיונות עומק המאפשרים להבין את עולמם של המשתתפים במילותיהם שלהם, הן בכלים כמותניים דוגמת שאלונים (לוי עצמון ורונן, 2026). מודלים תיאורטיים של אימוץ טכנולוגיה מספקים למחקרים אלה מסגרת מושגית: הם מגדירים אילו תפיסות ועמדות משפיעות על ההחלטה להשתמש בטכנולוגיה, ומאפשרים לנתח ממצאים ולגבש המלצות (לוי עצמון ורונן, 2026).</w:t>
+        <w:t xml:space="preserve">היא מערכת של אמונות, רגשות ונטיות התנהגותיות כלפי מושא מסוים. לעמדה שלושה מרכיבים: קוגניטיבי, הכולל את דעותיו, מחשבותיו ואמונותיו של הפרט על נשוא העמדה; רגשי, הנוגע למה שהפרט מרגיש כלפיו; והתנהגותי, המבטא את נטייתו לפעול ביחס אליו, להבדיל מהתנהגותו בפועל. עמדות הן כלליות ואינן מתייחסות לאירוע יחיד, הן חיוביות או שליליות, עוצמתן משתנה מנושא לנושא, והן יציבות לרוב אך ניתנות לשינוי (לוי עצמון ורונן, 2026). כך, למשל, מורה עשויה לחשוב שכלי בינה מלאכותית חוסך זמן (מרכיב קוגניטיבי), לחוש חשש מפני טעויות שלו (מרכיב רגשי) ולתכנן להשתמש בו רק להכנת חומרים ולא מול התלמידים (מרכיב התנהגותי), ושלושת המרכיבים יחד מרכיבים את עמדתה.</w:t>
+      </w:r>
+    </w:p>
+    <w:p>
+      <w:pPr>
+        <w:bidi/>
+        <w:spacing w:after="120" w:line="360" w:lineRule="auto"/>
+        <w:jc w:val="both"/>
+      </w:pPr>
+      <w:r>
+        <w:rPr>
+          <w:rFonts w:ascii="David" w:cs="David" w:hAnsi="David"/>
+          <w:b w:val="false"/>
+          <w:bCs w:val="false"/>
+          <w:i w:val="false"/>
+          <w:iCs w:val="false"/>
+          <w:sz w:val="24"/>
+          <w:szCs w:val="24"/>
+          <w:rtl/>
+        </w:rPr>
+        <w:t xml:space="preserve">ההבחנה בין המושגים חשובה לעיצוב מחקר: מחקר תפיסות בוחן כיצד אנשים חווים, קולטים ומפרשים תופעה, ואילו מחקר עמדות בוחן מה הם חושבים עליה וכיצד בכוונתם לנהוג. שני הסוגים נחקרים הן בכלים איכותניים, ובראשם ראיונות עומק המאפשרים להבין את עולמם של המשתתפים במילותיהם שלהם, הן בכלים כמותניים דוגמת שאלונים (לוי עצמון ורונן, 2026). מודלים תיאורטיים של אימוץ טכנולוגיה מספקים למחקרים אלה מסגרת מושגית: הם מגדירים אילו תפיסות ועמדות משפיעות על ההחלטה להשתמש בטכנולוגיה, ומאפשרים לבנות את המחקר, לנתח ממצאים ולגבש המלצות מעשיות לשדה החינוכי (לוי עצמון ורונן, 2026).</w:t>
       </w:r>
     </w:p>
     <w:p>
@@ -4498,6 +4968,32 @@
           <w:szCs w:val="24"/>
           <w:rtl w:val="false"/>
         </w:rPr>
+        <w:t xml:space="preserve">(Davis, 1989). </w:t>
+      </w:r>
+      <w:r>
+        <w:rPr>
+          <w:rFonts w:ascii="David" w:cs="David" w:hAnsi="David"/>
+          <w:b w:val="false"/>
+          <w:bCs w:val="false"/>
+          <w:i w:val="false"/>
+          <w:iCs w:val="false"/>
+          <w:sz w:val="24"/>
+          <w:szCs w:val="24"/>
+          <w:rtl/>
+        </w:rPr>
+        <w:t xml:space="preserve">מאפייני העיצוב של המערכת עצמה משפיעים על השימוש רק בעקיפין, דרך שתי התפיסות, ולכן שני כלים בעלי יכולות זהות יכולים לזכות לגורל שונה לחלוטין אצל אותם משתמשים </w:t>
+      </w:r>
+      <w:r>
+        <w:rPr>
+          <w:rFonts w:ascii="Times New Roman" w:cs="Times New Roman" w:hAnsi="Times New Roman"/>
+          <w:b w:val="false"/>
+          <w:bCs w:val="false"/>
+          <w:i w:val="false"/>
+          <w:iCs w:val="false"/>
+          <w:sz w:val="24"/>
+          <w:szCs w:val="24"/>
+          <w:rtl w:val="false"/>
+        </w:rPr>
         <w:t xml:space="preserve">(Davis, 1989).</w:t>
       </w:r>
     </w:p>
@@ -4544,7 +5040,7 @@
           <w:szCs w:val="24"/>
           <w:rtl/>
         </w:rPr>
-        <w:t xml:space="preserve">הוא שתפיסת השימושיות משפיעה על השימוש יותר מקלות השימוש: משתמשים מוכנים להתמודד עם כלי מסובך אם הם משוכנעים בתועלתו, אך שום קלות שימוש לא תפצה על כלי הנתפס חסר תועלת. חשוב שמדובר בתפיסות סובייקטיביות ובאמונות אישיות, ולא בתכונות אובייקטיביות של הטכנולוגיה: אותו כלי עצמו יכול להיתפס שימושי בעיני מורה אחד וחסר ערך בעיני אחר, ולכן חקר התפיסות הוא המפתח להבנת האימוץ. עם זאת, המודל פותח עבור טכנולוגיות מידע שגרתיות, שהמשתמש נדרש ללמוד ולתפעל, והספרות העדכנית מטילה ספק בדיותו לטכנולוגיות בעלות מאפיינים אנושיים </w:t>
+        <w:t xml:space="preserve">הוא שתפיסת השימושיות משפיעה על השימוש יותר מקלות השימוש: משתמשים מוכנים להתמודד עם כלי מסובך אם הם משוכנעים בתועלתו, אך שום קלות שימוש לא תפצה על כלי הנתפס חסר תועלת. חשוב שמדובר בתפיסות סובייקטיביות ובאמונות אישיות, ולא בתכונות אובייקטיביות של הטכנולוגיה: אותו כלי עצמו יכול להיתפס שימושי בעיני מורה אחד וחסר ערך בעיני אחר, ולכן חקר התפיסות הוא המפתח להבנת האימוץ. בהקשר ההוראה, תפיסת השימושיות עשויה להתבטא בחיסכון בזמן הכנה, בשיפור חומרי הלמידה או בקידום הישגי התלמידים, ותפיסת קלות השימוש בשאלה כמה זמן ומאמץ ידרשו לימוד הכלי והפעלתו בשגרה. עם זאת, המודל פותח עבור טכנולוגיות מידע שגרתיות, שהמשתמש נדרש ללמוד ולתפעל, והספרות העדכנית מטילה ספק בדיותו לטכנולוגיות בעלות מאפיינים אנושיים </w:t>
       </w:r>
       <w:r>
         <w:rPr>
@@ -4760,6 +5256,39 @@
           <w:szCs w:val="24"/>
           <w:rtl w:val="false"/>
         </w:rPr>
+        <w:t xml:space="preserve">(Gursoy et al., 2019).</w:t>
+      </w:r>
+    </w:p>
+    <w:p>
+      <w:pPr>
+        <w:bidi/>
+        <w:spacing w:after="120" w:line="360" w:lineRule="auto"/>
+        <w:jc w:val="both"/>
+      </w:pPr>
+      <w:r>
+        <w:rPr>
+          <w:rFonts w:ascii="David" w:cs="David" w:hAnsi="David"/>
+          <w:b w:val="false"/>
+          <w:bCs w:val="false"/>
+          <w:i w:val="false"/>
+          <w:iCs w:val="false"/>
+          <w:sz w:val="24"/>
+          <w:szCs w:val="24"/>
+          <w:rtl/>
+        </w:rPr>
+        <w:t xml:space="preserve">במחקר האימות, שנערך בקרב 439 משתתפים, נתמכו שמונה מעשר ההשערות: המוטיבציה הנהנתנית ניבאה בעוצמה את הציפייה לביצועים והפחיתה את המאמץ הצפוי, הציפייה לביצועים ניבאה רגש חיובי, וההאנשה דווקא העלתה את המאמץ הצפוי, ממצא המלמד שדמיון לאדם עשוי להיתפס גם כמאיים או כמסבך. הרגש הסביר את רוב השונות בנכונות השימוש, כשלושה רבעים ממנה </w:t>
+      </w:r>
+      <w:r>
+        <w:rPr>
+          <w:rFonts w:ascii="Times New Roman" w:cs="Times New Roman" w:hAnsi="Times New Roman"/>
+          <w:b w:val="false"/>
+          <w:bCs w:val="false"/>
+          <w:i w:val="false"/>
+          <w:iCs w:val="false"/>
+          <w:sz w:val="24"/>
+          <w:szCs w:val="24"/>
+          <w:rtl w:val="false"/>
+        </w:rPr>
         <w:t xml:space="preserve">(Gursoy et al., 2019). </w:t>
       </w:r>
       <w:r>
@@ -4773,33 +5302,20 @@
           <w:szCs w:val="24"/>
           <w:rtl/>
         </w:rPr>
-        <w:t xml:space="preserve">במחקר האימות, שנערך בקרב 439 משתתפים, נתמכו שמונה מעשר ההשערות: המוטיבציה הנהנתנית ניבאה בעוצמה את הציפייה לביצועים והפחיתה את המאמץ הצפוי, ההאנשה דווקא העלתה את המאמץ הצפוי, והרגש הסביר את רוב השונות בנכונות השימוש </w:t>
-      </w:r>
-      <w:r>
-        <w:rPr>
-          <w:rFonts w:ascii="Times New Roman" w:cs="Times New Roman" w:hAnsi="Times New Roman"/>
-          <w:b w:val="false"/>
-          <w:bCs w:val="false"/>
-          <w:i w:val="false"/>
-          <w:iCs w:val="false"/>
-          <w:sz w:val="24"/>
-          <w:szCs w:val="24"/>
-          <w:rtl w:val="false"/>
-        </w:rPr>
-        <w:t xml:space="preserve">(Gursoy et al., 2019). </w:t>
-      </w:r>
-      <w:r>
-        <w:rPr>
-          <w:rFonts w:ascii="David" w:cs="David" w:hAnsi="David"/>
-          <w:b w:val="false"/>
-          <w:bCs w:val="false"/>
-          <w:i w:val="false"/>
-          <w:iCs w:val="false"/>
-          <w:sz w:val="24"/>
-          <w:szCs w:val="24"/>
-          <w:rtl/>
-        </w:rPr>
-        <w:t xml:space="preserve">המסקנה התיאורטית היא שאימוץ בינה מלאכותית איננו חישוב תועלת קר אלא תהליך שההכרעה בו עוברת דרך הרגש.</w:t>
+        <w:t xml:space="preserve">המסקנה התיאורטית היא שאימוץ בינה מלאכותית איננו חישוב תועלת קר אלא תהליך שההכרעה בו עוברת דרך הרגש, ולכן חקר עמדות מורים כלפי הכלים חייב לתת מקום לרגשות, לחוויה ולסביבה החברתית, ולא רק לשיקולי תועלת </w:t>
+      </w:r>
+      <w:r>
+        <w:rPr>
+          <w:rFonts w:ascii="Times New Roman" w:cs="Times New Roman" w:hAnsi="Times New Roman"/>
+          <w:b w:val="false"/>
+          <w:bCs w:val="false"/>
+          <w:i w:val="false"/>
+          <w:iCs w:val="false"/>
+          <w:sz w:val="24"/>
+          <w:szCs w:val="24"/>
+          <w:rtl w:val="false"/>
+        </w:rPr>
+        <w:t xml:space="preserve">(Gursoy et al., 2019).</w:t>
       </w:r>
     </w:p>
     <w:p>
@@ -4865,7 +5381,7 @@
           <w:szCs w:val="24"/>
           <w:rtl/>
         </w:rPr>
-        <w:t xml:space="preserve">יושם לאחרונה על מורים בישראל. במחקר כמותני שנערך בקרב 270 מורים, שגילם הממוצע 42, נמצא ש-73 אחוזים מהם משתמשים ביישומי בינה מלאכותית יוצרת, וכמחציתם עושים בהם שימוש לצרכים מקצועיים. כל ששת ממדי האימוץ שנבדקו נמצאו קשורים לשימוש המקצועי, אך המנבאים החזקים ביותר היו דווקא המוטיבציה הנהנתנית והנכונות להשתמש, ואחריהם הרגשות החיוביים כלפי הטכנולוגיה; הציפייה לביצועים וההשפעה החברתית נמצאו קשורות במידה מתונה יותר. הציפייה למאמץ נמצאה קשורה לשימוש בכיוון שלילי, כלומר ככל שהכלי נתפס מסובך ותובעני יותר כך פחת השימוש בו, והשכלת המורה נמצאה קשורה לשימוש בכיוון חיובי, ואילו גיל ומגדר לא נמצאו קשורים כלל (דשן ואחרים, 2026).</w:t>
+        <w:t xml:space="preserve">יושם לאחרונה על מורים בישראל. במחקר כמותני שנערך בקרב 270 מורים, שגילם הממוצע 42 ורובם נשים, נמצא ש-73 אחוזים מהם משתמשים ביישומי בינה מלאכותית יוצרת, וכמחציתם עושים בהם שימוש לצרכים מקצועיים. כל ששת ממדי האימוץ שנבדקו נמצאו קשורים לשימוש המקצועי, אך המנבאים החזקים ביותר היו דווקא המוטיבציה הנהנתנית והנכונות להשתמש, ואחריהם הרגשות החיוביים כלפי הטכנולוגיה; הציפייה לביצועים וההשפעה החברתית נמצאו קשורות במידה מתונה יותר. הציפייה למאמץ נמצאה קשורה לשימוש בכיוון שלילי, כלומר ככל שהכלי נתפס מסובך ותובעני יותר כך פחת השימוש בו, והשכלת המורה נמצאה קשורה לשימוש בכיוון חיובי, ואילו גיל ומגדר לא נמצאו קשורים כלל (דשן ואחרים, 2026).</w:t>
       </w:r>
     </w:p>
     <w:p>
@@ -4911,7 +5427,7 @@
           <w:szCs w:val="24"/>
           <w:rtl/>
         </w:rPr>
-        <w:t xml:space="preserve">בהקשר של הוראה ולמידה ומצביעים על הפחתת המאמץ הנתפס כמנוף המרכזי להרחבת השימוש (דשן ואחרים, 2026).</w:t>
+        <w:t xml:space="preserve">בהקשר של הוראה ולמידה ומצביעים על הפחתת המאמץ הנתפס כמנוף המרכזי להרחבת השימוש. החוקרים מציינים גם את מגבלות המחקר: הטכנולוגיה נמצאת בשלבי חדירה מוקדמים, הנתונים נשענים על דיווח עצמי, וגורמים מערכתיים דוגמת מדיניות מוסדית ועומס עבודה לא נכללו בבדיקה (דשן ואחרים, 2026).</w:t>
       </w:r>
     </w:p>
     <w:p>
@@ -4957,7 +5473,7 @@
           <w:szCs w:val="24"/>
           <w:rtl/>
         </w:rPr>
-        <w:t xml:space="preserve">מיפו, על בסיס תיאוריות של רכישת פחד ובמדגם של 494 משיבים, שמונה ממדים של חרדה זו: חשש מפגיעה בפרטיות; חשש מהתנהגות מוטה ומפלה של המערכות; חרדת החלפה בעבודה; חרדת למידה, כלומר החשש שהטכנולוגיה קשה מדי ללמידה; חרדה קיומית; חשש מהפרות אתיקה; חרדה מפני תודעה מלאכותית; וחשש מהיעדר שקיפות בקבלת ההחלטות של המערכות. הם מראים שחרדת בינה מלאכותית שונה במהותה מחרדת מחשב מסורתית, משום שהטכנולוגיה מקבלת החלטות באופן עצמאי, מתפתחת בעצמה ופועלת כ"קופסה שחורה", ולכן ממדים כמו הטיה, שקיפות ותודעה כלל אינם קיימים בחקר חרדת המחשב </w:t>
+        <w:t xml:space="preserve">מיפו, על בסיס תיאוריות של רכישת פחד ובמדגם של 494 משיבים, שמונה ממדים של חרדה זו: חשש מפגיעה בפרטיות; חשש מהתנהגות מוטה ומפלה של המערכות; חרדת החלפה בעבודה; חרדת למידה, כלומר החשש שהטכנולוגיה קשה מדי ללמידה; חרדה קיומית; חשש מהפרות אתיקה; חרדה מפני תודעה מלאכותית; וחשש מהיעדר שקיפות בקבלת ההחלטות של המערכות. שמונת הממדים נמצאו מתקבצים לארבעה מסלולים שבהם נרכש פחד: התנסות ישירה, צפייה באחרים, מידע ומסרים מהסביבה ומהתקשורת, וחרדה מולדת מפני הלא-נודע </w:t>
       </w:r>
       <w:r>
         <w:rPr>
@@ -4990,7 +5506,33 @@
           <w:szCs w:val="24"/>
           <w:rtl/>
         </w:rPr>
-        <w:t xml:space="preserve">עם זאת, עוצמת השפעתה של החרדה על התנהגות המורים אינה אחידה. במחקר שנסקר לעיל נמצא שרמת החרדה של המורים הייתה נמוכה, ושהיא לא ניבאה את כוונתם לעסוק בתחום; המנבאים המשמעותיים היו תחושת המסוגלות והרלוונטיות הנתפסת </w:t>
+        <w:t xml:space="preserve">לי והואנג </w:t>
+      </w:r>
+      <w:r>
+        <w:rPr>
+          <w:rFonts w:ascii="Times New Roman" w:cs="Times New Roman" w:hAnsi="Times New Roman"/>
+          <w:b w:val="false"/>
+          <w:bCs w:val="false"/>
+          <w:i w:val="false"/>
+          <w:iCs w:val="false"/>
+          <w:sz w:val="24"/>
+          <w:szCs w:val="24"/>
+          <w:rtl w:val="false"/>
+        </w:rPr>
+        <w:t xml:space="preserve">(Li &amp; Huang, 2020) </w:t>
+      </w:r>
+      <w:r>
+        <w:rPr>
+          <w:rFonts w:ascii="David" w:cs="David" w:hAnsi="David"/>
+          <w:b w:val="false"/>
+          <w:bCs w:val="false"/>
+          <w:i w:val="false"/>
+          <w:iCs w:val="false"/>
+          <w:sz w:val="24"/>
+          <w:szCs w:val="24"/>
+          <w:rtl/>
+        </w:rPr>
+        <w:t xml:space="preserve">מראים שחרדת בינה מלאכותית שונה במהותה מחרדת מחשב מסורתית, משום שהטכנולוגיה מקבלת החלטות באופן עצמאי, מתפתחת בעצמה ופועלת כ"קופסה שחורה", ולכן ממדים כמו הטיה, שקיפות ותודעה כלל אינם קיימים בחקר חרדת המחשב. עם זאת, עוצמת השפעתה של החרדה על התנהגות המורים אינה אחידה. במחקר שנסקר לעיל נמצא שרמת החרדה של המורים הייתה נמוכה, ושהיא לא ניבאה את כוונתם לעסוק בתחום; המנבאים המשמעותיים היו תחושת המסוגלות והרלוונטיות הנתפסת </w:t>
       </w:r>
       <w:r>
         <w:rPr>
@@ -5090,7 +5632,7 @@
           <w:szCs w:val="24"/>
           <w:rtl/>
         </w:rPr>
-        <w:t xml:space="preserve">הספרות הישראלית מתעדת פער עקבי בין עמדות חיוביות של מורים ובין יישום בפועל. מחקר איכותני שבו רואיינו 24 מורי מתמטיקה בתיכון מצא שרובם רואים בעין יפה שילוב של תופעות מתמטיות מן הטבע והוראה בין-תחומית, ומכירים בערכן המוטיבציוני, אך כמעט אינם משלבים אותן בכיתה. החסמים שזיהו המורים היו לחץ בחינות הבגרות המכתיב את הנלמד, מחסור בשעות, תכנית לימודים עמוסה שהתכנים המעשירים אינם חלק ממנה, וחוסר ידע בתחומי דעת משיקים (מידז'נסקי ומלמד, 2022). הדפוס הזה, עמדה חיובית שאינה מתורגמת לפרקטיקה בשל אילוצי מערכת, צפוי להופיע גם בשילוב בינה מלאכותית בהוראת האנגלית: מורה יכול להאמין בערכו של הכלי ועדיין להימנע ממנו כאשר הזמן, השעות והתשתיות מוגבלים.</w:t>
+        <w:t xml:space="preserve">הספרות הישראלית מתעדת פער עקבי בין עמדות חיוביות של מורים ובין יישום בפועל. מחקר איכותני שבו רואיינו 24 מורי מתמטיקה בתיכון, בגישה פנומנולוגית שניתחה אלפי היגדים לחמש תמות, מצא שרובם רואים בעין יפה שילוב של תופעות מתמטיות מן הטבע והוראה בין-תחומית, מכירים בערכן המוטיבציוני ויודעים לתת דוגמאות, אך כמעט אינם משלבים אותן בכיתה. החסמים שזיהו המורים היו לחץ בחינות הבגרות המכתיב את הנלמד, מחסור בשעות, תכנית לימודים עמוסה שהתכנים המעשירים אינם חלק ממנה, וחוסר ידע בתחומי דעת משיקים (מידז'נסקי ומלמד, 2022). המורים אף תיארו שההוראה בפועל נותרת ברובה פרונטלית ומבוססת תרגול, בעיקר ברמות הלימוד הנמוכות, אף שבידיהם כלים דיגיטליים מגוונים (מידז'נסקי ומלמד, 2022). הדפוס הזה, עמדה חיובית שאינה מתורגמת לפרקטיקה בשל אילוצי מערכת, צפוי להופיע גם בשילוב בינה מלאכותית בהוראת האנגלית: מורה יכול להאמין בערכו של הכלי ועדיין להימנע ממנו כאשר הזמן, השעות והתשתיות מוגבלים.</w:t>
       </w:r>
     </w:p>
     <w:p>
@@ -5136,20 +5678,20 @@
           <w:szCs w:val="24"/>
           <w:rtl/>
         </w:rPr>
-        <w:t xml:space="preserve">בהוראת האנגלית, שבה פערי החשיפה לשפה גדולים ממילא, לפער כזה משמעות מיוחדת </w:t>
-      </w:r>
-      <w:r>
-        <w:rPr>
-          <w:rFonts w:ascii="Times New Roman" w:cs="Times New Roman" w:hAnsi="Times New Roman"/>
-          <w:b w:val="false"/>
-          <w:bCs w:val="false"/>
-          <w:i w:val="false"/>
-          <w:iCs w:val="false"/>
-          <w:sz w:val="24"/>
-          <w:szCs w:val="24"/>
-          <w:rtl w:val="false"/>
-        </w:rPr>
-        <w:t xml:space="preserve">(Ministry of Education, 2020).</w:t>
+        <w:t xml:space="preserve">בהוראת האנגלית, שבה פערי החשיפה לשפה גדולים ממילא, לפער כזה משמעות מיוחדת: הכלים עשויים לצמצם פערים אם ישמשו את כלל הלומדים, או להרחיבם אם יישארו נחלת המבוססים </w:t>
+      </w:r>
+      <w:r>
+        <w:rPr>
+          <w:rFonts w:ascii="Times New Roman" w:cs="Times New Roman" w:hAnsi="Times New Roman"/>
+          <w:b w:val="false"/>
+          <w:bCs w:val="false"/>
+          <w:i w:val="false"/>
+          <w:iCs w:val="false"/>
+          <w:sz w:val="24"/>
+          <w:szCs w:val="24"/>
+          <w:rtl w:val="false"/>
+        </w:rPr>
+        <w:t xml:space="preserve">(Ministry of Education, 2020; Mishra et al., 2023).</w:t>
       </w:r>
     </w:p>
     <w:p>
@@ -5202,33 +5744,66 @@
           <w:szCs w:val="24"/>
           <w:rtl w:val="false"/>
         </w:rPr>
-        <w:t xml:space="preserve">(Ayanwale et al., 2022). </w:t>
-      </w:r>
-      <w:r>
-        <w:rPr>
-          <w:rFonts w:ascii="David" w:cs="David" w:hAnsi="David"/>
-          <w:b w:val="false"/>
-          <w:bCs w:val="false"/>
-          <w:i w:val="false"/>
-          <w:iCs w:val="false"/>
-          <w:sz w:val="24"/>
-          <w:szCs w:val="24"/>
-          <w:rtl/>
-        </w:rPr>
-        <w:t xml:space="preserve">ניסיון הקורונה מלמד שהדבר אפשרי: כאשר הצורך היה מיידי והמסגרת תמכה, מורים סיגלו כלים חדשים בקצב מהיר והביקוש להשתלמויות הוכפל (חיאק ואבידב-אונגר, 2022). קהילות מורים מקצועיות, שבהן עמיתים חולקים התנסויות ומודלים לחיקוי, נמצאו אף הן מנוף משמעותי, בהלימה לממצא על כוחה של ההשפעה החברתית (דשן ואחרים, 2026). גם בהוראת האנגלית עצמה זוהה מחסור ההכשרה כחסם מרכזי: מרצי אנגלית דירגו את היעדר ההכשרה הטכנית בראש האתגרים לשילוב הכלים, והחוקרים המליצו על פיתוח מקצועי מתמשך, על מדיניות מערכתית ועל שילוב הכלים בתכניות הלימודים </w:t>
-      </w:r>
-      <w:r>
-        <w:rPr>
-          <w:rFonts w:ascii="Times New Roman" w:cs="Times New Roman" w:hAnsi="Times New Roman"/>
-          <w:b w:val="false"/>
-          <w:bCs w:val="false"/>
-          <w:i w:val="false"/>
-          <w:iCs w:val="false"/>
-          <w:sz w:val="24"/>
-          <w:szCs w:val="24"/>
-          <w:rtl w:val="false"/>
-        </w:rPr>
-        <w:t xml:space="preserve">(Itmezieh &amp; Shweiki, 2025).</w:t>
+        <w:t xml:space="preserve">(Ayanwale et al., 2022).</w:t>
+      </w:r>
+    </w:p>
+    <w:p>
+      <w:pPr>
+        <w:bidi/>
+        <w:spacing w:after="120" w:line="360" w:lineRule="auto"/>
+        <w:jc w:val="both"/>
+      </w:pPr>
+      <w:r>
+        <w:rPr>
+          <w:rFonts w:ascii="David" w:cs="David" w:hAnsi="David"/>
+          <w:b w:val="false"/>
+          <w:bCs w:val="false"/>
+          <w:i w:val="false"/>
+          <w:iCs w:val="false"/>
+          <w:sz w:val="24"/>
+          <w:szCs w:val="24"/>
+          <w:rtl/>
+        </w:rPr>
+        <w:t xml:space="preserve">ניסיון הקורונה מלמד שהדבר אפשרי: כאשר הצורך היה מיידי והמסגרת תמכה, מורים סיגלו כלים חדשים בקצב מהיר והביקוש להשתלמויות הוכפל (חיאק ואבידב-אונגר, 2022). קהילות מורים מקצועיות, שבהן עמיתים חולקים התנסויות ומודלים לחיקוי, נמצאו אף הן מנוף משמעותי, בהלימה לממצא על כוחה של ההשפעה החברתית (דשן ואחרים, 2026). גם בהוראת האנגלית עצמה זוהה מחסור ההכשרה כחסם מרכזי: מרצי אנגלית דירגו את היעדר ההכשרה הטכנית בראש האתגרים לשילוב הכלים, והחוקרים המליצו על פיתוח מקצועי מתמשך, על מדיניות מערכתית ועל שילוב הכלים בתכניות הלימודים ובהכשרת המורים </w:t>
+      </w:r>
+      <w:r>
+        <w:rPr>
+          <w:rFonts w:ascii="Times New Roman" w:cs="Times New Roman" w:hAnsi="Times New Roman"/>
+          <w:b w:val="false"/>
+          <w:bCs w:val="false"/>
+          <w:i w:val="false"/>
+          <w:iCs w:val="false"/>
+          <w:sz w:val="24"/>
+          <w:szCs w:val="24"/>
+          <w:rtl w:val="false"/>
+        </w:rPr>
+        <w:t xml:space="preserve">(Itmezieh &amp; Shweiki, 2025). </w:t>
+      </w:r>
+      <w:r>
+        <w:rPr>
+          <w:rFonts w:ascii="David" w:cs="David" w:hAnsi="David"/>
+          <w:b w:val="false"/>
+          <w:bCs w:val="false"/>
+          <w:i w:val="false"/>
+          <w:iCs w:val="false"/>
+          <w:sz w:val="24"/>
+          <w:szCs w:val="24"/>
+          <w:rtl/>
+        </w:rPr>
+        <w:t xml:space="preserve">חשוב שהכשרה כזו תהיה פדגוגית ולא טכנית בלבד: מטרתה איננה הפעלת הכלי אלא שילובו המושכל בהוראה, ברוח מודל </w:t>
+      </w:r>
+      <w:r>
+        <w:rPr>
+          <w:rFonts w:ascii="Times New Roman" w:cs="Times New Roman" w:hAnsi="Times New Roman"/>
+          <w:b w:val="false"/>
+          <w:bCs w:val="false"/>
+          <w:i w:val="false"/>
+          <w:iCs w:val="false"/>
+          <w:sz w:val="24"/>
+          <w:szCs w:val="24"/>
+          <w:rtl w:val="false"/>
+        </w:rPr>
+        <w:t xml:space="preserve">TPACK (Mishra &amp; Koehler, 2009).</w:t>
       </w:r>
     </w:p>
     <w:p>
@@ -5353,7 +5928,33 @@
           <w:szCs w:val="24"/>
           <w:rtl/>
         </w:rPr>
-        <w:t xml:space="preserve">בעבודה עם קטינים מצטרפות לכך דרישות הרגולציה: הסכמת הורים מודעת, שמירה על אנונימיות ואיסור הזנת מידע אישי, שימוש בכלים מאושרים בלבד והתאמת השימוש לגיל (משרד החינוך, 2025). האתגר העומד בפני המורה איננו אפוא טכני בלבד אלא ערכי וחינוכי: לתווך ללומדים הצעירים שימוש ביקורתי, אתי ואחראי בטכנולוגיה, בגיל שבו החשיבה הביקורתית עודנה מתפתחת </w:t>
+        <w:t xml:space="preserve">בעבודה עם קטינים מצטרפות לכך דרישות הרגולציה: הסכמת הורים מודעת, שמירה על אנונימיות ואיסור הזנת מידע אישי, שימוש בכלים מאושרים בלבד והתאמת השימוש לגיל (משרד החינוך, 2025). דרישות אלה אינן פורמליות בלבד; הן משקפות את העיקרון שטובת הלומד קודמת לנוחות הטכנולוגית, ברוח הגישה ממוקדת האדם </w:t>
+      </w:r>
+      <w:r>
+        <w:rPr>
+          <w:rFonts w:ascii="Times New Roman" w:cs="Times New Roman" w:hAnsi="Times New Roman"/>
+          <w:b w:val="false"/>
+          <w:bCs w:val="false"/>
+          <w:i w:val="false"/>
+          <w:iCs w:val="false"/>
+          <w:sz w:val="24"/>
+          <w:szCs w:val="24"/>
+          <w:rtl w:val="false"/>
+        </w:rPr>
+        <w:t xml:space="preserve">(Holmes &amp; Miao, 2023). </w:t>
+      </w:r>
+      <w:r>
+        <w:rPr>
+          <w:rFonts w:ascii="David" w:cs="David" w:hAnsi="David"/>
+          <w:b w:val="false"/>
+          <w:bCs w:val="false"/>
+          <w:i w:val="false"/>
+          <w:iCs w:val="false"/>
+          <w:sz w:val="24"/>
+          <w:szCs w:val="24"/>
+          <w:rtl/>
+        </w:rPr>
+        <w:t xml:space="preserve">האתגר העומד בפני המורה איננו אפוא טכני בלבד אלא ערכי וחינוכי: לתווך ללומדים הצעירים שימוש ביקורתי, אתי ואחראי בטכנולוגיה, בגיל שבו החשיבה הביקורתית עודנה מתפתחת </w:t>
       </w:r>
       <w:r>
         <w:rPr>
@@ -5655,7 +6256,27 @@
           <w:szCs w:val="24"/>
           <w:rtl/>
         </w:rPr>
-        <w:t xml:space="preserve">ואולם מחקרים אלה עסקו במורים באשר הם, במרצים בהשכלה הגבוהה, בלומדים בוגרים או בהקשרים שאינם ישראליים. מורי האנגלית בבית הספר היסודי בישראל פועלים בצומת ייחודי: הם מלמדים שפה זרה ללומדים צעירים, בכפוף לתכנית לימודים ארצית ולרגולציה מחייבת, בכיתות הטרוגניות ובתנאי משאבים משתנים, ותפיסותיהם את הכלי החדש טרם נחקרו לעומק. גם הספרות הישראלית שנסקרה מלמדת שעמדה חיובית איננה ערובה ליישום, ושחסמי מערכת עשויים להכריע את הכף (מידז'נסקי ומלמד, 2022). את הפער הזה מבקש המחקר הנוכחי למלא, באמצעות בחינה איכותנית של האופן שבו מורי אנגלית ביסודי תופסים את שילוב כלי הבינה המלאכותית היוצרת בהוראתם: התועלות שהם מזהים, החסמים שהם חווים, הרגשות המלווים את ההתנסות ומה שנדרש להם, להבנתם, כדי לשלב את הטכנולוגיה באופן מיטבי. הבנת תפיסות אלה עשויה לסייע בעיצוב הכשרות, מדיניות בית-ספרית ותכניות הטמעה המותאמות למורי האנגלית ביסודי.</w:t>
+        <w:t xml:space="preserve">ואולם מחקרים אלה עסקו במורים באשר הם, במרצים בהשכלה הגבוהה, בלומדים בוגרים או בהקשרים שאינם ישראליים. מורי האנגלית בבית הספר היסודי בישראל פועלים בצומת ייחודי: הם מלמדים שפה זרה ללומדים צעירים, בכפוף לתכנית לימודים ארצית ולרגולציה מחייבת, בכיתות הטרוגניות ובתנאי משאבים משתנים, ותפיסותיהם את הכלי החדש טרם נחקרו לעומק. גם הספרות הישראלית שנסקרה מלמדת שעמדה חיובית איננה ערובה ליישום, ושחסמי מערכת עשויים להכריע את הכף (מידז'נסקי ומלמד, 2022).</w:t>
+      </w:r>
+    </w:p>
+    <w:p>
+      <w:pPr>
+        <w:bidi/>
+        <w:spacing w:after="120" w:line="360" w:lineRule="auto"/>
+        <w:jc w:val="both"/>
+      </w:pPr>
+      <w:r>
+        <w:rPr>
+          <w:rFonts w:ascii="David" w:cs="David" w:hAnsi="David"/>
+          <w:b w:val="false"/>
+          <w:bCs w:val="false"/>
+          <w:i w:val="false"/>
+          <w:iCs w:val="false"/>
+          <w:sz w:val="24"/>
+          <w:szCs w:val="24"/>
+          <w:rtl/>
+        </w:rPr>
+        <w:t xml:space="preserve">את הפער הזה מבקש המחקר הנוכחי למלא, באמצעות בחינה איכותנית של האופן שבו מורי אנגלית ביסודי תופסים את שילוב כלי הבינה המלאכותית היוצרת בהוראתם: התועלות שהם מזהים, החסמים שהם חווים, הרגשות המלווים את ההתנסות ומה שנדרש להם, להבנתם, כדי לשלב את הטכנולוגיה באופן מיטבי. הבנת תפיסות אלה עשויה לסייע בעיצוב הכשרות, מדיניות בית-ספרית ותכניות הטמעה המותאמות למורי האנגלית ביסודי, ולתרום נדבך ישראלי לספרות מחקר צעירה המתגבשת בימים אלה.</w:t>
       </w:r>
     </w:p>
     <w:p>

</xml_diff>